<commit_message>
docs(sprint4): add my-videos and update-video to all sprint 4 docs and Word guide
- API_TEST_FLOW.md: inserted STEP 4 (my-videos), STEP 7 (update video), renumbered
  feed/like/delete to STEP 6/8/9; added duration and update error table rows
- CODE_REFERENCE.md: added MyVideosView and VideoUpdateView sections; fixed
  VideoDetailView vendor-visibility doc; corrected duration validation note
- POSTMAN_GUIDE.md: added requests 3 (My Videos) and 4 (Update Video), renumbered
  rest to 5-8; added duration and update error entries
- TESTING_CHECKLIST.md: added My Videos (5 items) and Update Video (5 items) sections;
  added duration_seconds>60 confirm-upload check
- Word guide: API table rows 25-30 updated; added STEP 26 (My Videos) and STEP 27
  (Update Video); renumbered feed/like/delete to STEP 29/30/31; added 2 new video
  error rows; updated Postman collection structure to show all 8 video requests

Co-Authored-By: Claude Sonnet 4.6 <noreply@anthropic.com>
</commit_message>
<xml_diff>
--- a/nearkart_backend/docs/NearKart_Master_API_Testing_Guide.docx
+++ b/nearkart_backend/docs/NearKart_Master_API_Testing_Guide.docx
@@ -4608,7 +4608,7 @@
               <w:rPr>
                 <w:sz w:val="19"/>
               </w:rPr>
-              <w:t>/videos/feed/</w:t>
+              <w:t>/videos/my-videos/</w:t>
             </w:r>
           </w:p>
         </w:tc>
@@ -4622,7 +4622,7 @@
               <w:rPr>
                 <w:sz w:val="19"/>
               </w:rPr>
-              <w:t>None (public)</w:t>
+              <w:t>Vendor JWT only</w:t>
             </w:r>
           </w:p>
         </w:tc>
@@ -4664,7 +4664,7 @@
               <w:rPr>
                 <w:sz w:val="19"/>
               </w:rPr>
-              <w:t>GET</w:t>
+              <w:t>PATCH</w:t>
             </w:r>
           </w:p>
         </w:tc>
@@ -4677,7 +4677,7 @@
               <w:rPr>
                 <w:sz w:val="19"/>
               </w:rPr>
-              <w:t>/videos/&lt;uuid&gt;/</w:t>
+              <w:t>/videos/&lt;uuid&gt;/update/</w:t>
             </w:r>
           </w:p>
         </w:tc>
@@ -4690,7 +4690,7 @@
               <w:rPr>
                 <w:sz w:val="19"/>
               </w:rPr>
-              <w:t>None (public)</w:t>
+              <w:t>Vendor JWT only</w:t>
             </w:r>
           </w:p>
         </w:tc>
@@ -4733,7 +4733,7 @@
               <w:rPr>
                 <w:sz w:val="19"/>
               </w:rPr>
-              <w:t>DELETE</w:t>
+              <w:t>GET</w:t>
             </w:r>
           </w:p>
         </w:tc>
@@ -4747,7 +4747,7 @@
               <w:rPr>
                 <w:sz w:val="19"/>
               </w:rPr>
-              <w:t>/videos/&lt;uuid&gt;/delete/</w:t>
+              <w:t>/videos/feed/</w:t>
             </w:r>
           </w:p>
         </w:tc>
@@ -4761,7 +4761,7 @@
               <w:rPr>
                 <w:sz w:val="19"/>
               </w:rPr>
-              <w:t>Vendor JWT only</w:t>
+              <w:t>None (public)</w:t>
             </w:r>
           </w:p>
         </w:tc>
@@ -4791,6 +4791,145 @@
                 <w:sz w:val="19"/>
               </w:rPr>
               <w:t>28</w:t>
+            </w:r>
+          </w:p>
+        </w:tc>
+        <w:tc>
+          <w:tcPr>
+            <w:tcW w:type="dxa" w:w="1008"/>
+          </w:tcPr>
+          <w:p>
+            <w:r>
+              <w:rPr>
+                <w:sz w:val="19"/>
+              </w:rPr>
+              <w:t>GET</w:t>
+            </w:r>
+          </w:p>
+        </w:tc>
+        <w:tc>
+          <w:tcPr>
+            <w:tcW w:type="dxa" w:w="4032"/>
+          </w:tcPr>
+          <w:p>
+            <w:r>
+              <w:rPr>
+                <w:sz w:val="19"/>
+              </w:rPr>
+              <w:t>/videos/&lt;uuid&gt;/</w:t>
+            </w:r>
+          </w:p>
+        </w:tc>
+        <w:tc>
+          <w:tcPr>
+            <w:tcW w:type="dxa" w:w="2016"/>
+          </w:tcPr>
+          <w:p>
+            <w:r>
+              <w:rPr>
+                <w:sz w:val="19"/>
+              </w:rPr>
+              <w:t>None (public)</w:t>
+            </w:r>
+          </w:p>
+        </w:tc>
+        <w:tc>
+          <w:tcPr>
+            <w:tcW w:type="dxa" w:w="576"/>
+          </w:tcPr>
+          <w:p>
+            <w:r>
+              <w:rPr>
+                <w:sz w:val="19"/>
+              </w:rPr>
+              <w:t>S4</w:t>
+            </w:r>
+          </w:p>
+        </w:tc>
+      </w:tr>
+      <w:tr>
+        <w:tc>
+          <w:tcPr>
+            <w:tcW w:type="dxa" w:w="432"/>
+            <w:shd w:val="clear" w:color="auto" w:fill="DEEAF1"/>
+          </w:tcPr>
+          <w:p>
+            <w:r>
+              <w:rPr>
+                <w:sz w:val="19"/>
+              </w:rPr>
+              <w:t>29</w:t>
+            </w:r>
+          </w:p>
+        </w:tc>
+        <w:tc>
+          <w:tcPr>
+            <w:tcW w:type="dxa" w:w="1008"/>
+            <w:shd w:val="clear" w:color="auto" w:fill="DEEAF1"/>
+          </w:tcPr>
+          <w:p>
+            <w:r>
+              <w:rPr>
+                <w:sz w:val="19"/>
+              </w:rPr>
+              <w:t>DELETE</w:t>
+            </w:r>
+          </w:p>
+        </w:tc>
+        <w:tc>
+          <w:tcPr>
+            <w:tcW w:type="dxa" w:w="4032"/>
+            <w:shd w:val="clear" w:color="auto" w:fill="DEEAF1"/>
+          </w:tcPr>
+          <w:p>
+            <w:r>
+              <w:rPr>
+                <w:sz w:val="19"/>
+              </w:rPr>
+              <w:t>/videos/&lt;uuid&gt;/delete/</w:t>
+            </w:r>
+          </w:p>
+        </w:tc>
+        <w:tc>
+          <w:tcPr>
+            <w:tcW w:type="dxa" w:w="2016"/>
+            <w:shd w:val="clear" w:color="auto" w:fill="DEEAF1"/>
+          </w:tcPr>
+          <w:p>
+            <w:r>
+              <w:rPr>
+                <w:sz w:val="19"/>
+              </w:rPr>
+              <w:t>Vendor JWT only</w:t>
+            </w:r>
+          </w:p>
+        </w:tc>
+        <w:tc>
+          <w:tcPr>
+            <w:tcW w:type="dxa" w:w="576"/>
+            <w:shd w:val="clear" w:color="auto" w:fill="DEEAF1"/>
+          </w:tcPr>
+          <w:p>
+            <w:r>
+              <w:rPr>
+                <w:sz w:val="19"/>
+              </w:rPr>
+              <w:t>S4</w:t>
+            </w:r>
+          </w:p>
+        </w:tc>
+      </w:tr>
+      <w:tr>
+        <w:tc>
+          <w:tcPr>
+            <w:tcW w:type="dxa" w:w="432"/>
+          </w:tcPr>
+          <w:p>
+            <w:r>
+              <w:rPr>
+                <w:sz w:val="19"/>
+              </w:rPr>
+              <w:t>30</w:t>
             </w:r>
           </w:p>
         </w:tc>
@@ -9391,7 +9530,7 @@
           <w:b w:val="0"/>
           <w:sz w:val="22"/>
         </w:rPr>
-        <w:t>Follow Steps 24–29 after completing Step 23. Vendor must have a store (Step 10).</w:t>
+        <w:t>Follow Steps 24–31 after completing Step 23. Vendor must have a store (Step 10).</w:t>
       </w:r>
     </w:p>
     <w:p>
@@ -9817,7 +9956,7 @@
         <w:pStyle w:val="Heading2"/>
       </w:pPr>
       <w:r>
-        <w:t>STEP 26 — Video Detail  (Public)</w:t>
+        <w:t>STEP 26 — My Videos  (Vendor Library)</w:t>
       </w:r>
     </w:p>
     <w:p>
@@ -9839,7 +9978,7 @@
           <w:color w:val="1F4E79"/>
           <w:sz w:val="20"/>
         </w:rPr>
-        <w:t xml:space="preserve">  {{base_url}}/videos/{{video_id}}/</w:t>
+        <w:t xml:space="preserve">  {{base_url}}/videos/my-videos/</w:t>
       </w:r>
       <w:r>
         <w:rPr>
@@ -9847,16 +9986,19 @@
           <w:color w:val="777777"/>
           <w:sz w:val="18"/>
         </w:rPr>
-        <w:t xml:space="preserve">   [No Auth]   [Sprint 4]</w:t>
-      </w:r>
-    </w:p>
-    <w:p>
+        <w:t xml:space="preserve">   [Vendor JWT]   [Sprint 4]</w:t>
+      </w:r>
+    </w:p>
+    <w:p>
+      <w:pPr>
+        <w:ind w:left="288"/>
+      </w:pPr>
       <w:r>
         <w:rPr>
           <w:b w:val="0"/>
-          <w:sz w:val="22"/>
-        </w:rPr>
-        <w:t>No body. Replace {{video_id}} with UUID from Step 24.</w:t>
+          <w:sz w:val="20"/>
+        </w:rPr>
+        <w:t>Authorization: Bearer {{vendor_token}}</w:t>
       </w:r>
     </w:p>
     <w:p>
@@ -9865,149 +10007,7 @@
           <w:b/>
           <w:sz w:val="20"/>
         </w:rPr>
-        <w:t>Expected Response  200 OK:</w:t>
-      </w:r>
-    </w:p>
-    <w:p>
-      <w:pPr>
-        <w:spacing w:before="40" w:after="40"/>
-        <w:ind w:left="288"/>
-        <w:shd w:val="clear" w:color="auto" w:fill="F0F0F0"/>
-      </w:pPr>
-      <w:r>
-        <w:rPr>
-          <w:rFonts w:ascii="Courier New" w:hAnsi="Courier New"/>
-          <w:color w:val="1A1A8C"/>
-          <w:sz w:val="18"/>
-        </w:rPr>
-        <w:t>{</w:t>
-        <w:br/>
-        <w:t xml:space="preserve">  "id": "82d5ede8-...",</w:t>
-        <w:br/>
-        <w:t xml:space="preserve">  "store_id": "6c8adfdd-...",</w:t>
-        <w:br/>
-        <w:t xml:space="preserve">  "store_name": "Fashion Hub",</w:t>
-        <w:br/>
-        <w:t xml:space="preserve">  "title": "Summer Kurta Collection",</w:t>
-        <w:br/>
-        <w:t xml:space="preserve">  "description": "Handwoven cotton kurtas for the season",</w:t>
-        <w:br/>
-        <w:t xml:space="preserve">  "video_url": "https://mock-s3.dev/videos/hls/.../master.m3u8?dev=true",</w:t>
-        <w:br/>
-        <w:t xml:space="preserve">  "thumbnail_url": "https://mock-s3.dev/videos/thumbnails/.../thumb.jpg?dev=true",</w:t>
-        <w:br/>
-        <w:t xml:space="preserve">  "status": "ready",</w:t>
-        <w:br/>
-        <w:t xml:space="preserve">  "duration_seconds": 45,</w:t>
-        <w:br/>
-        <w:t xml:space="preserve">  "view_count": 1,</w:t>
-        <w:br/>
-        <w:t xml:space="preserve">  "like_count": 0,</w:t>
-        <w:br/>
-        <w:t xml:space="preserve">  "is_liked": false,</w:t>
-        <w:br/>
-        <w:t xml:space="preserve">  "locality": "Anna Salai",</w:t>
-        <w:br/>
-        <w:t xml:space="preserve">  "distance_km": null,</w:t>
-        <w:br/>
-        <w:t xml:space="preserve">  "is_visible": true,</w:t>
-        <w:br/>
-        <w:t xml:space="preserve">  "expires_at": "2026-06-14T...",</w:t>
-        <w:br/>
-        <w:t xml:space="preserve">  "created_at": "2026-05-15T..."</w:t>
-        <w:br/>
-        <w:t>}</w:t>
-      </w:r>
-    </w:p>
-    <w:p>
-      <w:pPr>
-        <w:ind w:left="288"/>
-        <w:shd w:val="clear" w:color="auto" w:fill="D1ECF1"/>
-      </w:pPr>
-      <w:r>
-        <w:rPr>
-          <w:i/>
-          <w:color w:val="0C5460"/>
-          <w:sz w:val="20"/>
-        </w:rPr>
-        <w:t xml:space="preserve">  💡  view_count increments by 1 on every GET call.</w:t>
-        <w:br/>
-        <w:t>Add Authorization header to see is_liked = true/false for the current user.</w:t>
-      </w:r>
-    </w:p>
-    <w:p>
-      <w:pPr>
-        <w:ind w:left="288"/>
-        <w:shd w:val="clear" w:color="auto" w:fill="FFF3CD"/>
-      </w:pPr>
-      <w:r>
-        <w:rPr>
-          <w:i/>
-          <w:color w:val="7D4E00"/>
-          <w:sz w:val="20"/>
-        </w:rPr>
-        <w:t xml:space="preserve">  ⚠️  Only videos with status=ready AND is_visible=true are returned.</w:t>
-        <w:br/>
-        <w:t>Videos still processing → 404 not_found (check back after transcoding).</w:t>
-      </w:r>
-    </w:p>
-    <w:p>
-      <w:pPr>
-        <w:spacing w:before="40" w:after="40"/>
-      </w:pPr>
-      <w:r>
-        <w:rPr>
-          <w:color w:val="CCCCCC"/>
-          <w:sz w:val="14"/>
-        </w:rPr>
-        <w:t>──────────────────────────────────────────────────────────────────────────────────────────</w:t>
-      </w:r>
-    </w:p>
-    <w:p>
-      <w:pPr>
-        <w:pStyle w:val="Heading2"/>
-      </w:pPr>
-      <w:r>
-        <w:t>STEP 27 — Video Feed  (Public — Location-based)</w:t>
-      </w:r>
-    </w:p>
-    <w:p>
-      <w:pPr>
-        <w:spacing w:before="120"/>
-        <w:shd w:val="clear" w:color="auto" w:fill="D4EDDA"/>
-      </w:pPr>
-      <w:r>
-        <w:rPr>
-          <w:b/>
-          <w:color w:val="155524"/>
-          <w:sz w:val="20"/>
-        </w:rPr>
-        <w:t xml:space="preserve">  GET  </w:t>
-      </w:r>
-      <w:r>
-        <w:rPr>
-          <w:b/>
-          <w:color w:val="1F4E79"/>
-          <w:sz w:val="20"/>
-        </w:rPr>
-        <w:t xml:space="preserve">  {{base_url}}/videos/feed/</w:t>
-      </w:r>
-      <w:r>
-        <w:rPr>
-          <w:i/>
-          <w:color w:val="777777"/>
-          <w:sz w:val="18"/>
-        </w:rPr>
-        <w:t xml:space="preserve">   [No Auth]   [Sprint 4]</w:t>
-      </w:r>
-    </w:p>
-    <w:p>
-      <w:r>
-        <w:rPr>
-          <w:b/>
-          <w:sz w:val="20"/>
-        </w:rPr>
-        <w:t>No body. Query parameters:</w:t>
+        <w:t>No request body. Optional query parameter:</w:t>
       </w:r>
     </w:p>
     <w:tbl>
@@ -10026,7 +10026,7 @@
       <w:tr>
         <w:tc>
           <w:tcPr>
-            <w:tcW w:type="dxa" w:w="1728"/>
+            <w:tcW w:type="dxa" w:w="1440"/>
             <w:shd w:val="clear" w:color="auto" w:fill="1F4E79"/>
           </w:tcPr>
           <w:p>
@@ -10058,7 +10058,7 @@
         </w:tc>
         <w:tc>
           <w:tcPr>
-            <w:tcW w:type="dxa" w:w="864"/>
+            <w:tcW w:type="dxa" w:w="3744"/>
             <w:shd w:val="clear" w:color="auto" w:fill="1F4E79"/>
           </w:tcPr>
           <w:p>
@@ -10068,13 +10068,13 @@
                 <w:color w:val="FFFFFF"/>
                 <w:sz w:val="20"/>
               </w:rPr>
-              <w:t>Default</w:t>
-            </w:r>
-          </w:p>
-        </w:tc>
-        <w:tc>
-          <w:tcPr>
-            <w:tcW w:type="dxa" w:w="5616"/>
+              <w:t>Values</w:t>
+            </w:r>
+          </w:p>
+        </w:tc>
+        <w:tc>
+          <w:tcPr>
+            <w:tcW w:type="dxa" w:w="3024"/>
             <w:shd w:val="clear" w:color="auto" w:fill="1F4E79"/>
           </w:tcPr>
           <w:p>
@@ -10092,7 +10092,7 @@
       <w:tr>
         <w:tc>
           <w:tcPr>
-            <w:tcW w:type="dxa" w:w="1728"/>
+            <w:tcW w:type="dxa" w:w="1440"/>
             <w:shd w:val="clear" w:color="auto" w:fill="DEEAF1"/>
           </w:tcPr>
           <w:p>
@@ -10100,7 +10100,7 @@
               <w:rPr>
                 <w:sz w:val="19"/>
               </w:rPr>
-              <w:t>lat</w:t>
+              <w:t>status</w:t>
             </w:r>
           </w:p>
         </w:tc>
@@ -10114,13 +10114,13 @@
               <w:rPr>
                 <w:sz w:val="19"/>
               </w:rPr>
-              <w:t>Yes</w:t>
-            </w:r>
-          </w:p>
-        </w:tc>
-        <w:tc>
-          <w:tcPr>
-            <w:tcW w:type="dxa" w:w="864"/>
+              <w:t>No</w:t>
+            </w:r>
+          </w:p>
+        </w:tc>
+        <w:tc>
+          <w:tcPr>
+            <w:tcW w:type="dxa" w:w="3744"/>
             <w:shd w:val="clear" w:color="auto" w:fill="DEEAF1"/>
           </w:tcPr>
           <w:p>
@@ -10128,13 +10128,13 @@
               <w:rPr>
                 <w:sz w:val="19"/>
               </w:rPr>
-              <w:t>—</w:t>
-            </w:r>
-          </w:p>
-        </w:tc>
-        <w:tc>
-          <w:tcPr>
-            <w:tcW w:type="dxa" w:w="5616"/>
+              <w:t>pending_upload | processing | ready | failed | expired</w:t>
+            </w:r>
+          </w:p>
+        </w:tc>
+        <w:tc>
+          <w:tcPr>
+            <w:tcW w:type="dxa" w:w="3024"/>
             <w:shd w:val="clear" w:color="auto" w:fill="DEEAF1"/>
           </w:tcPr>
           <w:p>
@@ -10142,173 +10142,7 @@
               <w:rPr>
                 <w:sz w:val="19"/>
               </w:rPr>
-              <w:t>User latitude (e.g. 13.0418 for Chennai)</w:t>
-            </w:r>
-          </w:p>
-        </w:tc>
-      </w:tr>
-      <w:tr>
-        <w:tc>
-          <w:tcPr>
-            <w:tcW w:type="dxa" w:w="1728"/>
-          </w:tcPr>
-          <w:p>
-            <w:r>
-              <w:rPr>
-                <w:sz w:val="19"/>
-              </w:rPr>
-              <w:t>lng</w:t>
-            </w:r>
-          </w:p>
-        </w:tc>
-        <w:tc>
-          <w:tcPr>
-            <w:tcW w:type="dxa" w:w="1152"/>
-          </w:tcPr>
-          <w:p>
-            <w:r>
-              <w:rPr>
-                <w:sz w:val="19"/>
-              </w:rPr>
-              <w:t>Yes</w:t>
-            </w:r>
-          </w:p>
-        </w:tc>
-        <w:tc>
-          <w:tcPr>
-            <w:tcW w:type="dxa" w:w="864"/>
-          </w:tcPr>
-          <w:p>
-            <w:r>
-              <w:rPr>
-                <w:sz w:val="19"/>
-              </w:rPr>
-              <w:t>—</w:t>
-            </w:r>
-          </w:p>
-        </w:tc>
-        <w:tc>
-          <w:tcPr>
-            <w:tcW w:type="dxa" w:w="5616"/>
-          </w:tcPr>
-          <w:p>
-            <w:r>
-              <w:rPr>
-                <w:sz w:val="19"/>
-              </w:rPr>
-              <w:t>User longitude (e.g. 80.2341 for Chennai)</w:t>
-            </w:r>
-          </w:p>
-        </w:tc>
-      </w:tr>
-      <w:tr>
-        <w:tc>
-          <w:tcPr>
-            <w:tcW w:type="dxa" w:w="1728"/>
-            <w:shd w:val="clear" w:color="auto" w:fill="DEEAF1"/>
-          </w:tcPr>
-          <w:p>
-            <w:r>
-              <w:rPr>
-                <w:sz w:val="19"/>
-              </w:rPr>
-              <w:t>radius</w:t>
-            </w:r>
-          </w:p>
-        </w:tc>
-        <w:tc>
-          <w:tcPr>
-            <w:tcW w:type="dxa" w:w="1152"/>
-            <w:shd w:val="clear" w:color="auto" w:fill="DEEAF1"/>
-          </w:tcPr>
-          <w:p>
-            <w:r>
-              <w:rPr>
-                <w:sz w:val="19"/>
-              </w:rPr>
-              <w:t>No</w:t>
-            </w:r>
-          </w:p>
-        </w:tc>
-        <w:tc>
-          <w:tcPr>
-            <w:tcW w:type="dxa" w:w="864"/>
-            <w:shd w:val="clear" w:color="auto" w:fill="DEEAF1"/>
-          </w:tcPr>
-          <w:p>
-            <w:r>
-              <w:rPr>
-                <w:sz w:val="19"/>
-              </w:rPr>
-              <w:t>5</w:t>
-            </w:r>
-          </w:p>
-        </w:tc>
-        <w:tc>
-          <w:tcPr>
-            <w:tcW w:type="dxa" w:w="5616"/>
-            <w:shd w:val="clear" w:color="auto" w:fill="DEEAF1"/>
-          </w:tcPr>
-          <w:p>
-            <w:r>
-              <w:rPr>
-                <w:sz w:val="19"/>
-              </w:rPr>
-              <w:t>Search radius in km (default 5, no max limit)</w:t>
-            </w:r>
-          </w:p>
-        </w:tc>
-      </w:tr>
-      <w:tr>
-        <w:tc>
-          <w:tcPr>
-            <w:tcW w:type="dxa" w:w="1728"/>
-          </w:tcPr>
-          <w:p>
-            <w:r>
-              <w:rPr>
-                <w:sz w:val="19"/>
-              </w:rPr>
-              <w:t>store_id</w:t>
-            </w:r>
-          </w:p>
-        </w:tc>
-        <w:tc>
-          <w:tcPr>
-            <w:tcW w:type="dxa" w:w="1152"/>
-          </w:tcPr>
-          <w:p>
-            <w:r>
-              <w:rPr>
-                <w:sz w:val="19"/>
-              </w:rPr>
-              <w:t>No</w:t>
-            </w:r>
-          </w:p>
-        </w:tc>
-        <w:tc>
-          <w:tcPr>
-            <w:tcW w:type="dxa" w:w="864"/>
-          </w:tcPr>
-          <w:p>
-            <w:r>
-              <w:rPr>
-                <w:sz w:val="19"/>
-              </w:rPr>
-              <w:t>all</w:t>
-            </w:r>
-          </w:p>
-        </w:tc>
-        <w:tc>
-          <w:tcPr>
-            <w:tcW w:type="dxa" w:w="5616"/>
-          </w:tcPr>
-          <w:p>
-            <w:r>
-              <w:rPr>
-                <w:sz w:val="19"/>
-              </w:rPr>
-              <w:t>Filter to a specific store UUID</w:t>
+              <w:t>Filter to a specific status</w:t>
             </w:r>
           </w:p>
         </w:tc>
@@ -10327,9 +10161,9 @@
           <w:color w:val="1A1A8C"/>
           <w:sz w:val="18"/>
         </w:rPr>
-        <w:t>GET {{base_url}}/videos/feed/?lat=13.0418&amp;lng=80.2341&amp;radius=10</w:t>
-        <w:br/>
-        <w:t>GET {{base_url}}/videos/feed/?lat=13.0418&amp;lng=80.2341&amp;store_id={{store_id}}</w:t>
+        <w:t>GET {{base_url}}/videos/my-videos/</w:t>
+        <w:br/>
+        <w:t>GET {{base_url}}/videos/my-videos/?status=ready</w:t>
       </w:r>
     </w:p>
     <w:p>
@@ -10359,6 +10193,800 @@
         <w:br/>
         <w:t xml:space="preserve">    "id": "82d5ede8-...",</w:t>
         <w:br/>
+        <w:t xml:space="preserve">    "title": "Summer Kurta Collection",</w:t>
+        <w:br/>
+        <w:t xml:space="preserve">    "status": "ready",</w:t>
+        <w:br/>
+        <w:t xml:space="preserve">    "video_url": "https://mock-s3.dev/...",</w:t>
+        <w:br/>
+        <w:t xml:space="preserve">    "duration_seconds": 45,</w:t>
+        <w:br/>
+        <w:t xml:space="preserve">    "view_count": 1,</w:t>
+        <w:br/>
+        <w:t xml:space="preserve">    "like_count": 0,</w:t>
+        <w:br/>
+        <w:t xml:space="preserve">    "is_visible": true,</w:t>
+        <w:br/>
+        <w:t xml:space="preserve">    "expires_at": "2026-06-14T...",</w:t>
+        <w:br/>
+        <w:t xml:space="preserve">    "created_at": "2026-05-15T..."</w:t>
+        <w:br/>
+        <w:t xml:space="preserve">  }</w:t>
+        <w:br/>
+        <w:t>]</w:t>
+      </w:r>
+    </w:p>
+    <w:p>
+      <w:pPr>
+        <w:ind w:left="288"/>
+        <w:shd w:val="clear" w:color="auto" w:fill="D1ECF1"/>
+      </w:pPr>
+      <w:r>
+        <w:rPr>
+          <w:i/>
+          <w:color w:val="0C5460"/>
+          <w:sz w:val="20"/>
+        </w:rPr>
+        <w:t xml:space="preserve">  💡  Use ?status=processing after confirm-upload to monitor transcoding progress.</w:t>
+        <w:br/>
+        <w:t>Returns [] (empty array) if vendor has no store yet — no error.</w:t>
+      </w:r>
+    </w:p>
+    <w:p>
+      <w:pPr>
+        <w:ind w:left="288"/>
+        <w:shd w:val="clear" w:color="auto" w:fill="F8D7DA"/>
+      </w:pPr>
+      <w:r>
+        <w:rPr>
+          <w:i/>
+          <w:color w:val="7B1D1D"/>
+          <w:sz w:val="20"/>
+        </w:rPr>
+        <w:t xml:space="preserve">  🚫  Customer token → 403 Vendor access only.</w:t>
+      </w:r>
+    </w:p>
+    <w:p>
+      <w:pPr>
+        <w:spacing w:before="40" w:after="40"/>
+      </w:pPr>
+      <w:r>
+        <w:rPr>
+          <w:color w:val="CCCCCC"/>
+          <w:sz w:val="14"/>
+        </w:rPr>
+        <w:t>──────────────────────────────────────────────────────────────────────────────────────────</w:t>
+      </w:r>
+    </w:p>
+    <w:p>
+      <w:pPr>
+        <w:pStyle w:val="Heading2"/>
+      </w:pPr>
+      <w:r>
+        <w:t>STEP 27 — Update Video  (Vendor Only)</w:t>
+      </w:r>
+    </w:p>
+    <w:p>
+      <w:pPr>
+        <w:spacing w:before="120"/>
+        <w:shd w:val="clear" w:color="auto" w:fill="FFF3CD"/>
+      </w:pPr>
+      <w:r>
+        <w:rPr>
+          <w:b/>
+          <w:color w:val="7D4E00"/>
+          <w:sz w:val="20"/>
+        </w:rPr>
+        <w:t xml:space="preserve">  PATCH  </w:t>
+      </w:r>
+      <w:r>
+        <w:rPr>
+          <w:b/>
+          <w:color w:val="1F4E79"/>
+          <w:sz w:val="20"/>
+        </w:rPr>
+        <w:t xml:space="preserve">  {{base_url}}/videos/{{video_id}}/update/</w:t>
+      </w:r>
+      <w:r>
+        <w:rPr>
+          <w:i/>
+          <w:color w:val="777777"/>
+          <w:sz w:val="18"/>
+        </w:rPr>
+        <w:t xml:space="preserve">   [Vendor JWT]   [Sprint 4]</w:t>
+      </w:r>
+    </w:p>
+    <w:p>
+      <w:pPr>
+        <w:ind w:left="288"/>
+      </w:pPr>
+      <w:r>
+        <w:rPr>
+          <w:b w:val="0"/>
+          <w:sz w:val="20"/>
+        </w:rPr>
+        <w:t>Authorization: Bearer {{vendor_token}}</w:t>
+      </w:r>
+    </w:p>
+    <w:p>
+      <w:pPr>
+        <w:ind w:left="288"/>
+      </w:pPr>
+      <w:r>
+        <w:rPr>
+          <w:b w:val="0"/>
+          <w:sz w:val="20"/>
+        </w:rPr>
+        <w:t>Content-Type: application/json</w:t>
+      </w:r>
+    </w:p>
+    <w:p>
+      <w:r>
+        <w:rPr>
+          <w:b/>
+          <w:sz w:val="20"/>
+        </w:rPr>
+        <w:t>Request Body (send only the fields you want to change):</w:t>
+      </w:r>
+    </w:p>
+    <w:p>
+      <w:pPr>
+        <w:spacing w:before="40" w:after="40"/>
+        <w:ind w:left="288"/>
+        <w:shd w:val="clear" w:color="auto" w:fill="F0F0F0"/>
+      </w:pPr>
+      <w:r>
+        <w:rPr>
+          <w:rFonts w:ascii="Courier New" w:hAnsi="Courier New"/>
+          <w:color w:val="1A1A8C"/>
+          <w:sz w:val="18"/>
+        </w:rPr>
+        <w:t>{</w:t>
+        <w:br/>
+        <w:t xml:space="preserve">  "title": "Revised Summer Collection",</w:t>
+        <w:br/>
+        <w:t xml:space="preserve">  "is_visible": false</w:t>
+        <w:br/>
+        <w:t>}</w:t>
+      </w:r>
+    </w:p>
+    <w:p>
+      <w:pPr>
+        <w:ind w:left="288"/>
+      </w:pPr>
+      <w:r>
+        <w:rPr>
+          <w:b w:val="0"/>
+          <w:sz w:val="20"/>
+        </w:rPr>
+        <w:t>Patchable fields: title, description, is_visible</w:t>
+      </w:r>
+    </w:p>
+    <w:p>
+      <w:r>
+        <w:rPr>
+          <w:b/>
+          <w:sz w:val="20"/>
+        </w:rPr>
+        <w:t>Expected Response  200 OK:</w:t>
+      </w:r>
+    </w:p>
+    <w:p>
+      <w:pPr>
+        <w:spacing w:before="40" w:after="40"/>
+        <w:ind w:left="288"/>
+        <w:shd w:val="clear" w:color="auto" w:fill="F0F0F0"/>
+      </w:pPr>
+      <w:r>
+        <w:rPr>
+          <w:rFonts w:ascii="Courier New" w:hAnsi="Courier New"/>
+          <w:color w:val="1A1A8C"/>
+          <w:sz w:val="18"/>
+        </w:rPr>
+        <w:t>{</w:t>
+        <w:br/>
+        <w:t xml:space="preserve">  "id": "82d5ede8-...",</w:t>
+        <w:br/>
+        <w:t xml:space="preserve">  "title": "Revised Summer Collection",</w:t>
+        <w:br/>
+        <w:t xml:space="preserve">  "is_visible": false,</w:t>
+        <w:br/>
+        <w:t xml:space="preserve">  ...</w:t>
+        <w:br/>
+        <w:t>}</w:t>
+      </w:r>
+    </w:p>
+    <w:p>
+      <w:pPr>
+        <w:ind w:left="288"/>
+        <w:shd w:val="clear" w:color="auto" w:fill="D1ECF1"/>
+      </w:pPr>
+      <w:r>
+        <w:rPr>
+          <w:i/>
+          <w:color w:val="0C5460"/>
+          <w:sz w:val="20"/>
+        </w:rPr>
+        <w:t xml:space="preserve">  💡  Set is_visible: false to hide a video from the public feed without deleting it.</w:t>
+        <w:br/>
+        <w:t>Set is_visible: true to re-publish it.</w:t>
+      </w:r>
+    </w:p>
+    <w:p>
+      <w:pPr>
+        <w:ind w:left="288"/>
+        <w:shd w:val="clear" w:color="auto" w:fill="F8D7DA"/>
+      </w:pPr>
+      <w:r>
+        <w:rPr>
+          <w:i/>
+          <w:color w:val="7B1D1D"/>
+          <w:sz w:val="20"/>
+        </w:rPr>
+        <w:t xml:space="preserve">  🚫  Another vendor's video_id → 404 not_found (filtered to own store).</w:t>
+        <w:br/>
+        <w:t xml:space="preserve">     Customer token → 403 Vendor access only.</w:t>
+      </w:r>
+    </w:p>
+    <w:p>
+      <w:pPr>
+        <w:spacing w:before="40" w:after="40"/>
+      </w:pPr>
+      <w:r>
+        <w:rPr>
+          <w:color w:val="CCCCCC"/>
+          <w:sz w:val="14"/>
+        </w:rPr>
+        <w:t>──────────────────────────────────────────────────────────────────────────────────────────</w:t>
+      </w:r>
+    </w:p>
+    <w:p>
+      <w:pPr>
+        <w:pStyle w:val="Heading2"/>
+      </w:pPr>
+      <w:r>
+        <w:t>STEP 28 — Video Detail  (Public)</w:t>
+      </w:r>
+    </w:p>
+    <w:p>
+      <w:pPr>
+        <w:spacing w:before="120"/>
+        <w:shd w:val="clear" w:color="auto" w:fill="D4EDDA"/>
+      </w:pPr>
+      <w:r>
+        <w:rPr>
+          <w:b/>
+          <w:color w:val="155524"/>
+          <w:sz w:val="20"/>
+        </w:rPr>
+        <w:t xml:space="preserve">  GET  </w:t>
+      </w:r>
+      <w:r>
+        <w:rPr>
+          <w:b/>
+          <w:color w:val="1F4E79"/>
+          <w:sz w:val="20"/>
+        </w:rPr>
+        <w:t xml:space="preserve">  {{base_url}}/videos/{{video_id}}/</w:t>
+      </w:r>
+      <w:r>
+        <w:rPr>
+          <w:i/>
+          <w:color w:val="777777"/>
+          <w:sz w:val="18"/>
+        </w:rPr>
+        <w:t xml:space="preserve">   [No Auth]   [Sprint 4]</w:t>
+      </w:r>
+    </w:p>
+    <w:p>
+      <w:r>
+        <w:rPr>
+          <w:b w:val="0"/>
+          <w:sz w:val="22"/>
+        </w:rPr>
+        <w:t>No body. Replace {{video_id}} with UUID from Step 24.</w:t>
+      </w:r>
+    </w:p>
+    <w:p>
+      <w:r>
+        <w:rPr>
+          <w:b/>
+          <w:sz w:val="20"/>
+        </w:rPr>
+        <w:t>Expected Response  200 OK:</w:t>
+      </w:r>
+    </w:p>
+    <w:p>
+      <w:pPr>
+        <w:spacing w:before="40" w:after="40"/>
+        <w:ind w:left="288"/>
+        <w:shd w:val="clear" w:color="auto" w:fill="F0F0F0"/>
+      </w:pPr>
+      <w:r>
+        <w:rPr>
+          <w:rFonts w:ascii="Courier New" w:hAnsi="Courier New"/>
+          <w:color w:val="1A1A8C"/>
+          <w:sz w:val="18"/>
+        </w:rPr>
+        <w:t>{</w:t>
+        <w:br/>
+        <w:t xml:space="preserve">  "id": "82d5ede8-...",</w:t>
+        <w:br/>
+        <w:t xml:space="preserve">  "store_id": "6c8adfdd-...",</w:t>
+        <w:br/>
+        <w:t xml:space="preserve">  "store_name": "Fashion Hub",</w:t>
+        <w:br/>
+        <w:t xml:space="preserve">  "title": "Summer Kurta Collection",</w:t>
+        <w:br/>
+        <w:t xml:space="preserve">  "description": "Handwoven cotton kurtas for the season",</w:t>
+        <w:br/>
+        <w:t xml:space="preserve">  "video_url": "https://mock-s3.dev/videos/hls/.../master.m3u8?dev=true",</w:t>
+        <w:br/>
+        <w:t xml:space="preserve">  "thumbnail_url": "https://mock-s3.dev/videos/thumbnails/.../thumb.jpg?dev=true",</w:t>
+        <w:br/>
+        <w:t xml:space="preserve">  "status": "ready",</w:t>
+        <w:br/>
+        <w:t xml:space="preserve">  "duration_seconds": 45,</w:t>
+        <w:br/>
+        <w:t xml:space="preserve">  "view_count": 1,</w:t>
+        <w:br/>
+        <w:t xml:space="preserve">  "like_count": 0,</w:t>
+        <w:br/>
+        <w:t xml:space="preserve">  "is_liked": false,</w:t>
+        <w:br/>
+        <w:t xml:space="preserve">  "locality": "Anna Salai",</w:t>
+        <w:br/>
+        <w:t xml:space="preserve">  "distance_km": null,</w:t>
+        <w:br/>
+        <w:t xml:space="preserve">  "is_visible": true,</w:t>
+        <w:br/>
+        <w:t xml:space="preserve">  "expires_at": "2026-06-14T...",</w:t>
+        <w:br/>
+        <w:t xml:space="preserve">  "created_at": "2026-05-15T..."</w:t>
+        <w:br/>
+        <w:t>}</w:t>
+      </w:r>
+    </w:p>
+    <w:p>
+      <w:pPr>
+        <w:ind w:left="288"/>
+        <w:shd w:val="clear" w:color="auto" w:fill="D1ECF1"/>
+      </w:pPr>
+      <w:r>
+        <w:rPr>
+          <w:i/>
+          <w:color w:val="0C5460"/>
+          <w:sz w:val="20"/>
+        </w:rPr>
+        <w:t xml:space="preserve">  💡  view_count increments by 1 on every GET call.</w:t>
+        <w:br/>
+        <w:t>Add Authorization header to see is_liked = true/false for the current user.</w:t>
+      </w:r>
+    </w:p>
+    <w:p>
+      <w:pPr>
+        <w:ind w:left="288"/>
+        <w:shd w:val="clear" w:color="auto" w:fill="FFF3CD"/>
+      </w:pPr>
+      <w:r>
+        <w:rPr>
+          <w:i/>
+          <w:color w:val="7D4E00"/>
+          <w:sz w:val="20"/>
+        </w:rPr>
+        <w:t xml:space="preserve">  ⚠️  Only videos with status=ready AND is_visible=true are returned.</w:t>
+        <w:br/>
+        <w:t>Videos still processing → 404 not_found (check back after transcoding).</w:t>
+      </w:r>
+    </w:p>
+    <w:p>
+      <w:pPr>
+        <w:spacing w:before="40" w:after="40"/>
+      </w:pPr>
+      <w:r>
+        <w:rPr>
+          <w:color w:val="CCCCCC"/>
+          <w:sz w:val="14"/>
+        </w:rPr>
+        <w:t>──────────────────────────────────────────────────────────────────────────────────────────</w:t>
+      </w:r>
+    </w:p>
+    <w:p>
+      <w:pPr>
+        <w:pStyle w:val="Heading2"/>
+      </w:pPr>
+      <w:r>
+        <w:t>STEP 29 — Video Feed  (Public — Location-based)</w:t>
+      </w:r>
+    </w:p>
+    <w:p>
+      <w:pPr>
+        <w:spacing w:before="120"/>
+        <w:shd w:val="clear" w:color="auto" w:fill="D4EDDA"/>
+      </w:pPr>
+      <w:r>
+        <w:rPr>
+          <w:b/>
+          <w:color w:val="155524"/>
+          <w:sz w:val="20"/>
+        </w:rPr>
+        <w:t xml:space="preserve">  GET  </w:t>
+      </w:r>
+      <w:r>
+        <w:rPr>
+          <w:b/>
+          <w:color w:val="1F4E79"/>
+          <w:sz w:val="20"/>
+        </w:rPr>
+        <w:t xml:space="preserve">  {{base_url}}/videos/feed/</w:t>
+      </w:r>
+      <w:r>
+        <w:rPr>
+          <w:i/>
+          <w:color w:val="777777"/>
+          <w:sz w:val="18"/>
+        </w:rPr>
+        <w:t xml:space="preserve">   [No Auth]   [Sprint 4]</w:t>
+      </w:r>
+    </w:p>
+    <w:p>
+      <w:r>
+        <w:rPr>
+          <w:b/>
+          <w:sz w:val="20"/>
+        </w:rPr>
+        <w:t>No body. Query parameters:</w:t>
+      </w:r>
+    </w:p>
+    <w:tbl>
+      <w:tblPr>
+        <w:tblStyle w:val="TableGrid"/>
+        <w:tblW w:type="auto" w:w="0"/>
+        <w:jc w:val="left"/>
+        <w:tblLook w:firstColumn="1" w:firstRow="1" w:lastColumn="0" w:lastRow="0" w:noHBand="0" w:noVBand="1" w:val="04A0"/>
+      </w:tblPr>
+      <w:tblGrid>
+        <w:gridCol w:w="2412"/>
+        <w:gridCol w:w="2412"/>
+        <w:gridCol w:w="2412"/>
+        <w:gridCol w:w="2412"/>
+      </w:tblGrid>
+      <w:tr>
+        <w:tc>
+          <w:tcPr>
+            <w:tcW w:type="dxa" w:w="1728"/>
+            <w:shd w:val="clear" w:color="auto" w:fill="1F4E79"/>
+          </w:tcPr>
+          <w:p>
+            <w:r>
+              <w:rPr>
+                <w:b/>
+                <w:color w:val="FFFFFF"/>
+                <w:sz w:val="20"/>
+              </w:rPr>
+              <w:t>Parameter</w:t>
+            </w:r>
+          </w:p>
+        </w:tc>
+        <w:tc>
+          <w:tcPr>
+            <w:tcW w:type="dxa" w:w="1152"/>
+            <w:shd w:val="clear" w:color="auto" w:fill="1F4E79"/>
+          </w:tcPr>
+          <w:p>
+            <w:r>
+              <w:rPr>
+                <w:b/>
+                <w:color w:val="FFFFFF"/>
+                <w:sz w:val="20"/>
+              </w:rPr>
+              <w:t>Required</w:t>
+            </w:r>
+          </w:p>
+        </w:tc>
+        <w:tc>
+          <w:tcPr>
+            <w:tcW w:type="dxa" w:w="864"/>
+            <w:shd w:val="clear" w:color="auto" w:fill="1F4E79"/>
+          </w:tcPr>
+          <w:p>
+            <w:r>
+              <w:rPr>
+                <w:b/>
+                <w:color w:val="FFFFFF"/>
+                <w:sz w:val="20"/>
+              </w:rPr>
+              <w:t>Default</w:t>
+            </w:r>
+          </w:p>
+        </w:tc>
+        <w:tc>
+          <w:tcPr>
+            <w:tcW w:type="dxa" w:w="5616"/>
+            <w:shd w:val="clear" w:color="auto" w:fill="1F4E79"/>
+          </w:tcPr>
+          <w:p>
+            <w:r>
+              <w:rPr>
+                <w:b/>
+                <w:color w:val="FFFFFF"/>
+                <w:sz w:val="20"/>
+              </w:rPr>
+              <w:t>Description</w:t>
+            </w:r>
+          </w:p>
+        </w:tc>
+      </w:tr>
+      <w:tr>
+        <w:tc>
+          <w:tcPr>
+            <w:tcW w:type="dxa" w:w="1728"/>
+            <w:shd w:val="clear" w:color="auto" w:fill="DEEAF1"/>
+          </w:tcPr>
+          <w:p>
+            <w:r>
+              <w:rPr>
+                <w:sz w:val="19"/>
+              </w:rPr>
+              <w:t>lat</w:t>
+            </w:r>
+          </w:p>
+        </w:tc>
+        <w:tc>
+          <w:tcPr>
+            <w:tcW w:type="dxa" w:w="1152"/>
+            <w:shd w:val="clear" w:color="auto" w:fill="DEEAF1"/>
+          </w:tcPr>
+          <w:p>
+            <w:r>
+              <w:rPr>
+                <w:sz w:val="19"/>
+              </w:rPr>
+              <w:t>Yes</w:t>
+            </w:r>
+          </w:p>
+        </w:tc>
+        <w:tc>
+          <w:tcPr>
+            <w:tcW w:type="dxa" w:w="864"/>
+            <w:shd w:val="clear" w:color="auto" w:fill="DEEAF1"/>
+          </w:tcPr>
+          <w:p>
+            <w:r>
+              <w:rPr>
+                <w:sz w:val="19"/>
+              </w:rPr>
+              <w:t>—</w:t>
+            </w:r>
+          </w:p>
+        </w:tc>
+        <w:tc>
+          <w:tcPr>
+            <w:tcW w:type="dxa" w:w="5616"/>
+            <w:shd w:val="clear" w:color="auto" w:fill="DEEAF1"/>
+          </w:tcPr>
+          <w:p>
+            <w:r>
+              <w:rPr>
+                <w:sz w:val="19"/>
+              </w:rPr>
+              <w:t>User latitude (e.g. 13.0418 for Chennai)</w:t>
+            </w:r>
+          </w:p>
+        </w:tc>
+      </w:tr>
+      <w:tr>
+        <w:tc>
+          <w:tcPr>
+            <w:tcW w:type="dxa" w:w="1728"/>
+          </w:tcPr>
+          <w:p>
+            <w:r>
+              <w:rPr>
+                <w:sz w:val="19"/>
+              </w:rPr>
+              <w:t>lng</w:t>
+            </w:r>
+          </w:p>
+        </w:tc>
+        <w:tc>
+          <w:tcPr>
+            <w:tcW w:type="dxa" w:w="1152"/>
+          </w:tcPr>
+          <w:p>
+            <w:r>
+              <w:rPr>
+                <w:sz w:val="19"/>
+              </w:rPr>
+              <w:t>Yes</w:t>
+            </w:r>
+          </w:p>
+        </w:tc>
+        <w:tc>
+          <w:tcPr>
+            <w:tcW w:type="dxa" w:w="864"/>
+          </w:tcPr>
+          <w:p>
+            <w:r>
+              <w:rPr>
+                <w:sz w:val="19"/>
+              </w:rPr>
+              <w:t>—</w:t>
+            </w:r>
+          </w:p>
+        </w:tc>
+        <w:tc>
+          <w:tcPr>
+            <w:tcW w:type="dxa" w:w="5616"/>
+          </w:tcPr>
+          <w:p>
+            <w:r>
+              <w:rPr>
+                <w:sz w:val="19"/>
+              </w:rPr>
+              <w:t>User longitude (e.g. 80.2341 for Chennai)</w:t>
+            </w:r>
+          </w:p>
+        </w:tc>
+      </w:tr>
+      <w:tr>
+        <w:tc>
+          <w:tcPr>
+            <w:tcW w:type="dxa" w:w="1728"/>
+            <w:shd w:val="clear" w:color="auto" w:fill="DEEAF1"/>
+          </w:tcPr>
+          <w:p>
+            <w:r>
+              <w:rPr>
+                <w:sz w:val="19"/>
+              </w:rPr>
+              <w:t>radius</w:t>
+            </w:r>
+          </w:p>
+        </w:tc>
+        <w:tc>
+          <w:tcPr>
+            <w:tcW w:type="dxa" w:w="1152"/>
+            <w:shd w:val="clear" w:color="auto" w:fill="DEEAF1"/>
+          </w:tcPr>
+          <w:p>
+            <w:r>
+              <w:rPr>
+                <w:sz w:val="19"/>
+              </w:rPr>
+              <w:t>No</w:t>
+            </w:r>
+          </w:p>
+        </w:tc>
+        <w:tc>
+          <w:tcPr>
+            <w:tcW w:type="dxa" w:w="864"/>
+            <w:shd w:val="clear" w:color="auto" w:fill="DEEAF1"/>
+          </w:tcPr>
+          <w:p>
+            <w:r>
+              <w:rPr>
+                <w:sz w:val="19"/>
+              </w:rPr>
+              <w:t>5</w:t>
+            </w:r>
+          </w:p>
+        </w:tc>
+        <w:tc>
+          <w:tcPr>
+            <w:tcW w:type="dxa" w:w="5616"/>
+            <w:shd w:val="clear" w:color="auto" w:fill="DEEAF1"/>
+          </w:tcPr>
+          <w:p>
+            <w:r>
+              <w:rPr>
+                <w:sz w:val="19"/>
+              </w:rPr>
+              <w:t>Search radius in km (default 5, no max limit)</w:t>
+            </w:r>
+          </w:p>
+        </w:tc>
+      </w:tr>
+      <w:tr>
+        <w:tc>
+          <w:tcPr>
+            <w:tcW w:type="dxa" w:w="1728"/>
+          </w:tcPr>
+          <w:p>
+            <w:r>
+              <w:rPr>
+                <w:sz w:val="19"/>
+              </w:rPr>
+              <w:t>store_id</w:t>
+            </w:r>
+          </w:p>
+        </w:tc>
+        <w:tc>
+          <w:tcPr>
+            <w:tcW w:type="dxa" w:w="1152"/>
+          </w:tcPr>
+          <w:p>
+            <w:r>
+              <w:rPr>
+                <w:sz w:val="19"/>
+              </w:rPr>
+              <w:t>No</w:t>
+            </w:r>
+          </w:p>
+        </w:tc>
+        <w:tc>
+          <w:tcPr>
+            <w:tcW w:type="dxa" w:w="864"/>
+          </w:tcPr>
+          <w:p>
+            <w:r>
+              <w:rPr>
+                <w:sz w:val="19"/>
+              </w:rPr>
+              <w:t>all</w:t>
+            </w:r>
+          </w:p>
+        </w:tc>
+        <w:tc>
+          <w:tcPr>
+            <w:tcW w:type="dxa" w:w="5616"/>
+          </w:tcPr>
+          <w:p>
+            <w:r>
+              <w:rPr>
+                <w:sz w:val="19"/>
+              </w:rPr>
+              <w:t>Filter to a specific store UUID</w:t>
+            </w:r>
+          </w:p>
+        </w:tc>
+      </w:tr>
+    </w:tbl>
+    <w:p/>
+    <w:p>
+      <w:pPr>
+        <w:spacing w:before="40" w:after="40"/>
+        <w:ind w:left="288"/>
+        <w:shd w:val="clear" w:color="auto" w:fill="F0F0F0"/>
+      </w:pPr>
+      <w:r>
+        <w:rPr>
+          <w:rFonts w:ascii="Courier New" w:hAnsi="Courier New"/>
+          <w:color w:val="1A1A8C"/>
+          <w:sz w:val="18"/>
+        </w:rPr>
+        <w:t>GET {{base_url}}/videos/feed/?lat=13.0418&amp;lng=80.2341&amp;radius=10</w:t>
+        <w:br/>
+        <w:t>GET {{base_url}}/videos/feed/?lat=13.0418&amp;lng=80.2341&amp;store_id={{store_id}}</w:t>
+      </w:r>
+    </w:p>
+    <w:p>
+      <w:r>
+        <w:rPr>
+          <w:b/>
+          <w:sz w:val="20"/>
+        </w:rPr>
+        <w:t>Expected Response  200 OK:</w:t>
+      </w:r>
+    </w:p>
+    <w:p>
+      <w:pPr>
+        <w:spacing w:before="40" w:after="40"/>
+        <w:ind w:left="288"/>
+        <w:shd w:val="clear" w:color="auto" w:fill="F0F0F0"/>
+      </w:pPr>
+      <w:r>
+        <w:rPr>
+          <w:rFonts w:ascii="Courier New" w:hAnsi="Courier New"/>
+          <w:color w:val="1A1A8C"/>
+          <w:sz w:val="18"/>
+        </w:rPr>
+        <w:t>[</w:t>
+        <w:br/>
+        <w:t xml:space="preserve">  {</w:t>
+        <w:br/>
+        <w:t xml:space="preserve">    "id": "82d5ede8-...",</w:t>
+        <w:br/>
         <w:t xml:space="preserve">    "store_name": "Fashion Hub",</w:t>
         <w:br/>
         <w:t xml:space="preserve">    "title": "Summer Kurta Collection",</w:t>
@@ -10429,7 +11057,7 @@
         <w:pStyle w:val="Heading2"/>
       </w:pPr>
       <w:r>
-        <w:t>STEP 28 — Like / Unlike Video  (Toggle)</w:t>
+        <w:t>STEP 30 — Like / Unlike Video  (Toggle)</w:t>
       </w:r>
     </w:p>
     <w:p>
@@ -10588,7 +11216,7 @@
         <w:pStyle w:val="Heading2"/>
       </w:pPr>
       <w:r>
-        <w:t>STEP 29 — Delete Video  (Store Owner Only)</w:t>
+        <w:t>STEP 31 — Delete Video  (Store Owner Only)</w:t>
       </w:r>
     </w:p>
     <w:p>
@@ -12542,7 +13170,7 @@
               <w:rPr>
                 <w:sz w:val="19"/>
               </w:rPr>
-              <w:t>Confirm another vendor video</w:t>
+              <w:t>Duration too long</w:t>
             </w:r>
           </w:p>
         </w:tc>
@@ -12556,7 +13184,7 @@
               <w:rPr>
                 <w:sz w:val="19"/>
               </w:rPr>
-              <w:t>POST /videos/&lt;id&gt;/confirm-upload/ — wrong vendor</w:t>
+              <w:t>POST /videos/&lt;id&gt;/confirm-upload/ — duration_seconds=120</w:t>
             </w:r>
           </w:p>
         </w:tc>
@@ -12570,7 +13198,7 @@
               <w:rPr>
                 <w:sz w:val="19"/>
               </w:rPr>
-              <w:t>404 — not_found</w:t>
+              <w:t>400 — cannot exceed 60 seconds</w:t>
             </w:r>
           </w:p>
         </w:tc>
@@ -12585,7 +13213,7 @@
               <w:rPr>
                 <w:sz w:val="19"/>
               </w:rPr>
-              <w:t>Feed without lat/lng</w:t>
+              <w:t>Confirm another vendor video</w:t>
             </w:r>
           </w:p>
         </w:tc>
@@ -12598,7 +13226,7 @@
               <w:rPr>
                 <w:sz w:val="19"/>
               </w:rPr>
-              <w:t>GET /videos/feed/ — no ?lat=&amp;lng= params</w:t>
+              <w:t>POST /videos/&lt;id&gt;/confirm-upload/ — wrong vendor</w:t>
             </w:r>
           </w:p>
         </w:tc>
@@ -12611,7 +13239,7 @@
               <w:rPr>
                 <w:sz w:val="19"/>
               </w:rPr>
-              <w:t>400 — lat and lng are required numbers</w:t>
+              <w:t>404 — not_found</w:t>
             </w:r>
           </w:p>
         </w:tc>
@@ -12627,7 +13255,7 @@
               <w:rPr>
                 <w:sz w:val="19"/>
               </w:rPr>
-              <w:t>Detail on processing video</w:t>
+              <w:t>Feed without lat/lng</w:t>
             </w:r>
           </w:p>
         </w:tc>
@@ -12641,7 +13269,7 @@
               <w:rPr>
                 <w:sz w:val="19"/>
               </w:rPr>
-              <w:t>GET /videos/&lt;id&gt;/ while status=processing</w:t>
+              <w:t>GET /videos/feed/ — no ?lat=&amp;lng= params</w:t>
             </w:r>
           </w:p>
         </w:tc>
@@ -12655,7 +13283,7 @@
               <w:rPr>
                 <w:sz w:val="19"/>
               </w:rPr>
-              <w:t>404 — not_found (only ready shown)</w:t>
+              <w:t>400 — lat and lng are required numbers</w:t>
             </w:r>
           </w:p>
         </w:tc>
@@ -12670,6 +13298,48 @@
               <w:rPr>
                 <w:sz w:val="19"/>
               </w:rPr>
+              <w:t>Detail on processing video</w:t>
+            </w:r>
+          </w:p>
+        </w:tc>
+        <w:tc>
+          <w:tcPr>
+            <w:tcW w:type="dxa" w:w="3456"/>
+          </w:tcPr>
+          <w:p>
+            <w:r>
+              <w:rPr>
+                <w:sz w:val="19"/>
+              </w:rPr>
+              <w:t>GET /videos/&lt;id&gt;/ while status=processing</w:t>
+            </w:r>
+          </w:p>
+        </w:tc>
+        <w:tc>
+          <w:tcPr>
+            <w:tcW w:type="dxa" w:w="3168"/>
+          </w:tcPr>
+          <w:p>
+            <w:r>
+              <w:rPr>
+                <w:sz w:val="19"/>
+              </w:rPr>
+              <w:t>404 — not_found (only ready shown)</w:t>
+            </w:r>
+          </w:p>
+        </w:tc>
+      </w:tr>
+      <w:tr>
+        <w:tc>
+          <w:tcPr>
+            <w:tcW w:type="dxa" w:w="2880"/>
+            <w:shd w:val="clear" w:color="auto" w:fill="DEEAF1"/>
+          </w:tcPr>
+          <w:p>
+            <w:r>
+              <w:rPr>
+                <w:sz w:val="19"/>
+              </w:rPr>
               <w:t>Like without auth</w:t>
             </w:r>
           </w:p>
@@ -12677,6 +13347,7 @@
         <w:tc>
           <w:tcPr>
             <w:tcW w:type="dxa" w:w="3456"/>
+            <w:shd w:val="clear" w:color="auto" w:fill="DEEAF1"/>
           </w:tcPr>
           <w:p>
             <w:r>
@@ -12690,6 +13361,7 @@
         <w:tc>
           <w:tcPr>
             <w:tcW w:type="dxa" w:w="3168"/>
+            <w:shd w:val="clear" w:color="auto" w:fill="DEEAF1"/>
           </w:tcPr>
           <w:p>
             <w:r>
@@ -12697,6 +13369,47 @@
                 <w:sz w:val="19"/>
               </w:rPr>
               <w:t>401 — authentication_failed</w:t>
+            </w:r>
+          </w:p>
+        </w:tc>
+      </w:tr>
+      <w:tr>
+        <w:tc>
+          <w:tcPr>
+            <w:tcW w:type="dxa" w:w="2880"/>
+          </w:tcPr>
+          <w:p>
+            <w:r>
+              <w:rPr>
+                <w:sz w:val="19"/>
+              </w:rPr>
+              <w:t>Update another vendor video</w:t>
+            </w:r>
+          </w:p>
+        </w:tc>
+        <w:tc>
+          <w:tcPr>
+            <w:tcW w:type="dxa" w:w="3456"/>
+          </w:tcPr>
+          <w:p>
+            <w:r>
+              <w:rPr>
+                <w:sz w:val="19"/>
+              </w:rPr>
+              <w:t>PATCH /videos/&lt;id&gt;/update/ — different vendor token</w:t>
+            </w:r>
+          </w:p>
+        </w:tc>
+        <w:tc>
+          <w:tcPr>
+            <w:tcW w:type="dxa" w:w="3168"/>
+          </w:tcPr>
+          <w:p>
+            <w:r>
+              <w:rPr>
+                <w:sz w:val="19"/>
+              </w:rPr>
+              <w:t>404 — not_found</w:t>
             </w:r>
           </w:p>
         </w:tc>
@@ -12884,6 +13597,10 @@
         <w:t xml:space="preserve">    ├── Request Upload URL ← Tests script saves video_id</w:t>
         <w:br/>
         <w:t xml:space="preserve">    ├── Confirm Upload</w:t>
+        <w:br/>
+        <w:t xml:space="preserve">    ├── My Videos (Vendor Library)</w:t>
+        <w:br/>
+        <w:t xml:space="preserve">    ├── Update Video</w:t>
         <w:br/>
         <w:t xml:space="preserve">    ├── Video Feed</w:t>
         <w:br/>

</xml_diff>

<commit_message>
docs: add Swagger placeholder UUID warning throughout master guide
Section 1.3: large red error box explaining the 3fa85f64-... dummy UUID issue —
what it is, why it causes 404, and the correct workflow (create first, copy id,
then paste into path field before executing).

Individual step warnings added on:
  - STEP 12 (Store Detail)
  - STEP 20 (Product Detail)
  - STEP 28 (Video Detail)
  - STEP 35 (Message History)
  - STEP 36 (Mark as Read)

Section 1.9 common errors: 404 description updated to call out Swagger
placeholder UUID as a known cause.

Co-Authored-By: Claude Sonnet 4.6 <noreply@anthropic.com>
</commit_message>
<xml_diff>
--- a/nearkart_backend/docs/NearKart_Master_API_Testing_Guide.docx
+++ b/nearkart_backend/docs/NearKart_Master_API_Testing_Guide.docx
@@ -251,6 +251,54 @@
         <w:t xml:space="preserve">  4. Click the "Authorize" button (top of page) → paste:  Bearer eyJhbGci...</w:t>
         <w:br/>
         <w:t xml:space="preserve">  5. Now all protected endpoints will use your token automatically</w:t>
+      </w:r>
+    </w:p>
+    <w:p>
+      <w:pPr>
+        <w:ind w:left="288"/>
+        <w:shd w:val="clear" w:color="auto" w:fill="F8D7DA"/>
+      </w:pPr>
+      <w:r>
+        <w:rPr>
+          <w:i/>
+          <w:color w:val="7B1D1D"/>
+          <w:sz w:val="20"/>
+        </w:rPr>
+        <w:t xml:space="preserve">  🚫  SWAGGER UUID PLACEHOLDER — VERY COMMON MISTAKE:</w:t>
+        <w:br/>
+        <w:br/>
+        <w:t xml:space="preserve">     Swagger auto-fills a dummy UUID in every &lt;uuid&gt; path field:</w:t>
+        <w:br/>
+        <w:t xml:space="preserve">       3fa85f64-5717-4562-b3fc-2c963f66afa6</w:t>
+        <w:br/>
+        <w:br/>
+        <w:t xml:space="preserve">     This UUID does NOT exist in your database.</w:t>
+        <w:br/>
+        <w:t xml:space="preserve">     If you click Execute without replacing it, you will always get:</w:t>
+        <w:br/>
+        <w:t xml:space="preserve">       404 — "not_found" or "Conversation not found" or "Video not found"</w:t>
+        <w:br/>
+        <w:br/>
+        <w:t xml:space="preserve">     CORRECT WORKFLOW in Swagger:</w:t>
+        <w:br/>
+        <w:t xml:space="preserve">       Step 1 — Run the CREATE endpoint first  (e.g. POST /conversations/start/)</w:t>
+        <w:br/>
+        <w:t xml:space="preserve">       Step 2 — Copy the "id" field from that response</w:t>
+        <w:br/>
+        <w:t xml:space="preserve">       Step 3 — Paste it into the UUID field of the next endpoint</w:t>
+        <w:br/>
+        <w:t xml:space="preserve">       Step 4 — Then click Execute</w:t>
+        <w:br/>
+        <w:br/>
+        <w:t xml:space="preserve">     Examples of what to replace:</w:t>
+        <w:br/>
+        <w:t xml:space="preserve">       /conversations/{conversation_id}/messages/  → paste real conversation id</w:t>
+        <w:br/>
+        <w:t xml:space="preserve">       /videos/{video_id}/                         → paste real video id</w:t>
+        <w:br/>
+        <w:t xml:space="preserve">       /stores/{id}/                               → paste real store id</w:t>
+        <w:br/>
+        <w:t xml:space="preserve">       /products/{id}/                             → paste real product id</w:t>
       </w:r>
     </w:p>
     <w:p>
@@ -2758,7 +2806,7 @@
               <w:rPr>
                 <w:sz w:val="19"/>
               </w:rPr>
-              <w:t>UUID does not exist, resource is inactive, or wrong URL</w:t>
+              <w:t>UUID does not exist, resource is inactive, wrong URL, OR Swagger placeholder UUID used</w:t>
             </w:r>
           </w:p>
         </w:tc>
@@ -2771,7 +2819,7 @@
               <w:rPr>
                 <w:sz w:val="19"/>
               </w:rPr>
-              <w:t>Check UUID and that resource is active/visible</w:t>
+              <w:t>Check UUID is real (not 3fa85f64-...). Copy id from the CREATE response first.</w:t>
             </w:r>
           </w:p>
         </w:tc>
@@ -7559,6 +7607,20 @@
       </w:r>
     </w:p>
     <w:p>
+      <w:pPr>
+        <w:ind w:left="288"/>
+        <w:shd w:val="clear" w:color="auto" w:fill="FFF3CD"/>
+      </w:pPr>
+      <w:r>
+        <w:rPr>
+          <w:i/>
+          <w:color w:val="7D4E00"/>
+          <w:sz w:val="20"/>
+        </w:rPr>
+        <w:t xml:space="preserve">  ⚠️  In Swagger: replace the placeholder UUID 3fa85f64-... with the real store_id from Step 10.</w:t>
+      </w:r>
+    </w:p>
+    <w:p>
       <w:r>
         <w:rPr>
           <w:b/>
@@ -9373,6 +9435,20 @@
       </w:r>
     </w:p>
     <w:p>
+      <w:pPr>
+        <w:ind w:left="288"/>
+        <w:shd w:val="clear" w:color="auto" w:fill="FFF3CD"/>
+      </w:pPr>
+      <w:r>
+        <w:rPr>
+          <w:i/>
+          <w:color w:val="7D4E00"/>
+          <w:sz w:val="20"/>
+        </w:rPr>
+        <w:t xml:space="preserve">  ⚠️  In Swagger: replace the placeholder UUID 3fa85f64-... with the real product_id from Step 17.</w:t>
+      </w:r>
+    </w:p>
+    <w:p>
       <w:r>
         <w:rPr>
           <w:b/>
@@ -10810,6 +10886,20 @@
       </w:r>
     </w:p>
     <w:p>
+      <w:pPr>
+        <w:ind w:left="288"/>
+        <w:shd w:val="clear" w:color="auto" w:fill="FFF3CD"/>
+      </w:pPr>
+      <w:r>
+        <w:rPr>
+          <w:i/>
+          <w:color w:val="7D4E00"/>
+          <w:sz w:val="20"/>
+        </w:rPr>
+        <w:t xml:space="preserve">  ⚠️  In Swagger: replace the placeholder UUID 3fa85f64-... with the real video_id from Step 24.</w:t>
+      </w:r>
+    </w:p>
+    <w:p>
       <w:r>
         <w:rPr>
           <w:b/>
@@ -12271,6 +12361,20 @@
     <w:p>
       <w:pPr>
         <w:ind w:left="288"/>
+        <w:shd w:val="clear" w:color="auto" w:fill="FFF3CD"/>
+      </w:pPr>
+      <w:r>
+        <w:rPr>
+          <w:i/>
+          <w:color w:val="7D4E00"/>
+          <w:sz w:val="20"/>
+        </w:rPr>
+        <w:t xml:space="preserve">  ⚠️  In Swagger: replace the placeholder UUID 3fa85f64-... with the real conversation_id from Step 32.</w:t>
+      </w:r>
+    </w:p>
+    <w:p>
+      <w:pPr>
+        <w:ind w:left="288"/>
       </w:pPr>
       <w:r>
         <w:rPr>
@@ -12546,6 +12650,20 @@
           <w:sz w:val="18"/>
         </w:rPr>
         <w:t xml:space="preserve">   [Bearer JWT]   [Sprint 5]</w:t>
+      </w:r>
+    </w:p>
+    <w:p>
+      <w:pPr>
+        <w:ind w:left="288"/>
+        <w:shd w:val="clear" w:color="auto" w:fill="FFF3CD"/>
+      </w:pPr>
+      <w:r>
+        <w:rPr>
+          <w:i/>
+          <w:color w:val="7D4E00"/>
+          <w:sz w:val="20"/>
+        </w:rPr>
+        <w:t xml:space="preserve">  ⚠️  In Swagger: replace the placeholder UUID 3fa85f64-... with the real conversation_id from Step 32.</w:t>
       </w:r>
     </w:p>
     <w:p>

</xml_diff>

<commit_message>
feat(swagger): add sample request bodies and improve auth UX
- Add OpenApiExample entries to StoreCreateView, StoreReviewView,
  ProductCreateView, and ProductUpdateView so every write endpoint
  has a pre-filled testable body in Swagger
- Enable tryItOutEnabled=true so "Try it out" is pre-clicked on
  every endpoint — no manual click needed before testing
- Add defaultModelsExpandDepth=-1 to collapse schema models panel
- Fix misleading auth description: Swagger's http/bearer scheme
  prepends "Bearer " automatically — users should paste just the
  raw token, not "Bearer <token>"
- Update master Word guide with all Swagger UX changes

Co-Authored-By: Claude Sonnet 4.6 <noreply@anthropic.com>
</commit_message>
<xml_diff>
--- a/nearkart_backend/docs/NearKart_Master_API_Testing_Guide.docx
+++ b/nearkart_backend/docs/NearKart_Master_API_Testing_Guide.docx
@@ -244,13 +244,34 @@
         <w:br/>
         <w:t xml:space="preserve">  1. Open http://localhost:8000/api/docs/ in browser</w:t>
         <w:br/>
-        <w:t xml:space="preserve">  2. Each endpoint has pre-filled example request bodies — click the endpoint, then "Try it out"</w:t>
+        <w:t xml:space="preserve">  2. Each endpoint has pre-filled example request bodies — "Try it out" is ON by default</w:t>
+        <w:br/>
+        <w:t xml:space="preserve">     (no need to click "Try it out" manually — just click Execute)</w:t>
         <w:br/>
         <w:t xml:space="preserve">  3. For protected endpoints: first run OTP send + verify → copy "access" token</w:t>
         <w:br/>
-        <w:t xml:space="preserve">  4. Click the "Authorize" button (top of page) → paste:  Bearer eyJhbGci...</w:t>
-        <w:br/>
-        <w:t xml:space="preserve">  5. Now all protected endpoints will use your token automatically</w:t>
+        <w:t xml:space="preserve">  4. Click the lock icon "Authorize" (top right of page)</w:t>
+        <w:br/>
+        <w:t xml:space="preserve">     → Paste JUST the token in the Value field — do NOT add "Bearer " prefix</w:t>
+        <w:br/>
+        <w:t xml:space="preserve">       Swagger adds "Bearer " automatically for you</w:t>
+        <w:br/>
+        <w:t xml:space="preserve">     → Click Authorize → Close</w:t>
+        <w:br/>
+        <w:t xml:space="preserve">  5. All protected endpoints will now work — token survives page refresh</w:t>
+        <w:br/>
+        <w:br/>
+        <w:t>Swagger improvements active:</w:t>
+        <w:br/>
+        <w:t xml:space="preserve">  • tryItOutEnabled=true  — "Try it out" pre-clicked on all endpoints</w:t>
+        <w:br/>
+        <w:t xml:space="preserve">  • persistAuthorization=true  — your token survives page refresh</w:t>
+        <w:br/>
+        <w:t xml:space="preserve">  • defaultModelsExpandDepth=-1  — schema models panel collapsed (less clutter)</w:t>
+        <w:br/>
+        <w:t xml:space="preserve">  • Pre-filled examples on: OTP send/verify, Store create/review, Product create/update,</w:t>
+        <w:br/>
+        <w:t xml:space="preserve">    Video upload/confirm/update, Start Conversation</w:t>
       </w:r>
     </w:p>
     <w:p>
@@ -5879,11 +5900,11 @@
         <w:t xml:space="preserve">  pm.environment.set("vendor_refresh", r.refresh);</w:t>
         <w:br/>
         <w:br/>
-        <w:t>In Swagger UI: copy the "access" value → click Authorize (top of page)</w:t>
-        <w:br/>
-        <w:t xml:space="preserve">  → paste:  Bearer eyJhbGci...</w:t>
-        <w:br/>
-        <w:t xml:space="preserve">  → now protected endpoints will work for 1 hour.</w:t>
+        <w:t>In Swagger UI: copy the "access" value → click Authorize (lock icon, top right)</w:t>
+        <w:br/>
+        <w:t xml:space="preserve">  → paste JUST the token — do NOT add "Bearer " prefix (Swagger adds it automatically)</w:t>
+        <w:br/>
+        <w:t xml:space="preserve">  → Click Authorize → Close — protected endpoints now work for 1 hour.</w:t>
       </w:r>
     </w:p>
     <w:p>
@@ -6932,6 +6953,22 @@
         <w:t xml:space="preserve">  "banner_url": "https://example.com/banner.png"</w:t>
         <w:br/>
         <w:t>}</w:t>
+      </w:r>
+    </w:p>
+    <w:p>
+      <w:pPr>
+        <w:ind w:left="288"/>
+        <w:shd w:val="clear" w:color="auto" w:fill="D1ECF1"/>
+      </w:pPr>
+      <w:r>
+        <w:rPr>
+          <w:i/>
+          <w:color w:val="0C5460"/>
+          <w:sz w:val="20"/>
+        </w:rPr>
+        <w:t xml:space="preserve">  💡  Swagger has a pre-filled sample body for this endpoint ("Sample store (Chennai)").</w:t>
+        <w:br/>
+        <w:t>Open Swagger → POST /stores/ → the body is pre-filled with name, address, coords — just click Execute.</w:t>
       </w:r>
     </w:p>
     <w:p>
@@ -8123,6 +8160,22 @@
     <w:p>
       <w:pPr>
         <w:ind w:left="288"/>
+        <w:shd w:val="clear" w:color="auto" w:fill="D1ECF1"/>
+      </w:pPr>
+      <w:r>
+        <w:rPr>
+          <w:i/>
+          <w:color w:val="0C5460"/>
+          <w:sz w:val="20"/>
+        </w:rPr>
+        <w:t xml:space="preserve">  💡  Swagger has two pre-filled examples for this endpoint: "Five-star review" and "Three-star review".</w:t>
+        <w:br/>
+        <w:t>Click the dropdown in Swagger to switch between them.</w:t>
+      </w:r>
+    </w:p>
+    <w:p>
+      <w:pPr>
+        <w:ind w:left="288"/>
       </w:pPr>
       <w:r>
         <w:rPr>
@@ -8468,6 +8521,28 @@
         <w:t xml:space="preserve">  ]</w:t>
         <w:br/>
         <w:t>}</w:t>
+      </w:r>
+    </w:p>
+    <w:p>
+      <w:pPr>
+        <w:ind w:left="288"/>
+        <w:shd w:val="clear" w:color="auto" w:fill="D1ECF1"/>
+      </w:pPr>
+      <w:r>
+        <w:rPr>
+          <w:i/>
+          <w:color w:val="0C5460"/>
+          <w:sz w:val="20"/>
+        </w:rPr>
+        <w:t xml:space="preserve">  💡  Swagger has two pre-filled examples for this endpoint:</w:t>
+        <w:br/>
+        <w:t xml:space="preserve">  "Kurta with variants" — fashion product with 3 size variants</w:t>
+        <w:br/>
+        <w:t xml:space="preserve">  "Simple product (no variants)" — food product with no variants</w:t>
+        <w:br/>
+        <w:t>Select from the Examples dropdown in Swagger before clicking Execute.</w:t>
+        <w:br/>
+        <w:t>Note: SKUs must be globally unique — if you run this more than once, change the SKU values.</w:t>
       </w:r>
     </w:p>
     <w:p>
@@ -9628,6 +9703,24 @@
         <w:t xml:space="preserve">  "status": "active"</w:t>
         <w:br/>
         <w:t>}</w:t>
+      </w:r>
+    </w:p>
+    <w:p>
+      <w:pPr>
+        <w:ind w:left="288"/>
+        <w:shd w:val="clear" w:color="auto" w:fill="D1ECF1"/>
+      </w:pPr>
+      <w:r>
+        <w:rPr>
+          <w:i/>
+          <w:color w:val="0C5460"/>
+          <w:sz w:val="20"/>
+        </w:rPr>
+        <w:t xml:space="preserve">  💡  Swagger has two pre-filled examples for this endpoint:</w:t>
+        <w:br/>
+        <w:t xml:space="preserve">  "Update price and visibility" — changes base_price and is_visible</w:t>
+        <w:br/>
+        <w:t xml:space="preserve">  "Mark product inactive" — sets status=inactive and is_visible=false</w:t>
       </w:r>
     </w:p>
     <w:p>

</xml_diff>

<commit_message>
docs(sprint6): update master API guide with Blacklist Engine
- Add Sprint 6 endpoints to API reference table (rows 35-36)
- Add STEP 37 (Block/Unblock) and STEP 38 (List Blocked) test steps
- Add Blacklist Error Cases table (10 scenarios)
- Update Postman folder structure with Sprint 6 Blacklist folder
- Add auto-save customer_id script for blacklist testing
- Update cover and footer: Sprint 1-6, May 2026

Co-Authored-By: Claude Sonnet 4.6 <noreply@anthropic.com>
</commit_message>
<xml_diff>
--- a/nearkart_backend/docs/NearKart_Master_API_Testing_Guide.docx
+++ b/nearkart_backend/docs/NearKart_Master_API_Testing_Guide.docx
@@ -50,7 +50,7 @@
           <w:color w:val="888888"/>
           <w:sz w:val="20"/>
         </w:rPr>
-        <w:t>Sprint 1 → Sprint 5   |   Last updated: May 2026</w:t>
+        <w:t>Sprint 1 → Sprint 6   |   Last updated: May 2026</w:t>
       </w:r>
     </w:p>
     <w:p/>
@@ -5377,6 +5377,145 @@
           </w:p>
         </w:tc>
       </w:tr>
+      <w:tr>
+        <w:tc>
+          <w:tcPr>
+            <w:tcW w:type="dxa" w:w="432"/>
+            <w:shd w:val="clear" w:color="auto" w:fill="DEEAF1"/>
+          </w:tcPr>
+          <w:p>
+            <w:r>
+              <w:rPr>
+                <w:sz w:val="19"/>
+              </w:rPr>
+              <w:t>35</w:t>
+            </w:r>
+          </w:p>
+        </w:tc>
+        <w:tc>
+          <w:tcPr>
+            <w:tcW w:type="dxa" w:w="1008"/>
+            <w:shd w:val="clear" w:color="auto" w:fill="DEEAF1"/>
+          </w:tcPr>
+          <w:p>
+            <w:r>
+              <w:rPr>
+                <w:sz w:val="19"/>
+              </w:rPr>
+              <w:t>POST</w:t>
+            </w:r>
+          </w:p>
+        </w:tc>
+        <w:tc>
+          <w:tcPr>
+            <w:tcW w:type="dxa" w:w="4032"/>
+            <w:shd w:val="clear" w:color="auto" w:fill="DEEAF1"/>
+          </w:tcPr>
+          <w:p>
+            <w:r>
+              <w:rPr>
+                <w:sz w:val="19"/>
+              </w:rPr>
+              <w:t>/stores/&lt;uuid&gt;/blacklist/&lt;uuid&gt;/</w:t>
+            </w:r>
+          </w:p>
+        </w:tc>
+        <w:tc>
+          <w:tcPr>
+            <w:tcW w:type="dxa" w:w="2016"/>
+            <w:shd w:val="clear" w:color="auto" w:fill="DEEAF1"/>
+          </w:tcPr>
+          <w:p>
+            <w:r>
+              <w:rPr>
+                <w:sz w:val="19"/>
+              </w:rPr>
+              <w:t>Vendor JWT only</w:t>
+            </w:r>
+          </w:p>
+        </w:tc>
+        <w:tc>
+          <w:tcPr>
+            <w:tcW w:type="dxa" w:w="576"/>
+            <w:shd w:val="clear" w:color="auto" w:fill="DEEAF1"/>
+          </w:tcPr>
+          <w:p>
+            <w:r>
+              <w:rPr>
+                <w:sz w:val="19"/>
+              </w:rPr>
+              <w:t>S6</w:t>
+            </w:r>
+          </w:p>
+        </w:tc>
+      </w:tr>
+      <w:tr>
+        <w:tc>
+          <w:tcPr>
+            <w:tcW w:type="dxa" w:w="432"/>
+          </w:tcPr>
+          <w:p>
+            <w:r>
+              <w:rPr>
+                <w:sz w:val="19"/>
+              </w:rPr>
+              <w:t>36</w:t>
+            </w:r>
+          </w:p>
+        </w:tc>
+        <w:tc>
+          <w:tcPr>
+            <w:tcW w:type="dxa" w:w="1008"/>
+          </w:tcPr>
+          <w:p>
+            <w:r>
+              <w:rPr>
+                <w:sz w:val="19"/>
+              </w:rPr>
+              <w:t>GET</w:t>
+            </w:r>
+          </w:p>
+        </w:tc>
+        <w:tc>
+          <w:tcPr>
+            <w:tcW w:type="dxa" w:w="4032"/>
+          </w:tcPr>
+          <w:p>
+            <w:r>
+              <w:rPr>
+                <w:sz w:val="19"/>
+              </w:rPr>
+              <w:t>/stores/&lt;uuid&gt;/blacklist/</w:t>
+            </w:r>
+          </w:p>
+        </w:tc>
+        <w:tc>
+          <w:tcPr>
+            <w:tcW w:type="dxa" w:w="2016"/>
+          </w:tcPr>
+          <w:p>
+            <w:r>
+              <w:rPr>
+                <w:sz w:val="19"/>
+              </w:rPr>
+              <w:t>Vendor JWT only</w:t>
+            </w:r>
+          </w:p>
+        </w:tc>
+        <w:tc>
+          <w:tcPr>
+            <w:tcW w:type="dxa" w:w="576"/>
+          </w:tcPr>
+          <w:p>
+            <w:r>
+              <w:rPr>
+                <w:sz w:val="19"/>
+              </w:rPr>
+              <w:t>S6</w:t>
+            </w:r>
+          </w:p>
+        </w:tc>
+      </w:tr>
     </w:tbl>
     <w:p/>
     <w:p>
@@ -12850,6 +12989,419 @@
         <w:pStyle w:val="Heading1"/>
       </w:pPr>
       <w:r>
+        <w:t>Sprint 6 — Blacklist Engine</w:t>
+      </w:r>
+    </w:p>
+    <w:p>
+      <w:r>
+        <w:rPr>
+          <w:b w:val="0"/>
+          <w:sz w:val="22"/>
+        </w:rPr>
+        <w:t>Follow Steps 37–38 after completing Step 10 (Create Store). Vendor must own a store.</w:t>
+      </w:r>
+    </w:p>
+    <w:p>
+      <w:pPr>
+        <w:ind w:left="288"/>
+        <w:shd w:val="clear" w:color="auto" w:fill="D1ECF1"/>
+      </w:pPr>
+      <w:r>
+        <w:rPr>
+          <w:i/>
+          <w:color w:val="0C5460"/>
+          <w:sz w:val="20"/>
+        </w:rPr>
+        <w:t xml:space="preserve">  💡  Blacklist is per store — a vendor blocks a specific customer from interacting with their store.</w:t>
+        <w:br/>
+        <w:t>A blocked customer cannot: follow the store, review it, start a new chat, or connect via WebSocket.</w:t>
+        <w:br/>
+        <w:t>Blocking and unblocking both use the same endpoint — it toggles on each call.</w:t>
+      </w:r>
+    </w:p>
+    <w:p>
+      <w:pPr>
+        <w:spacing w:before="40" w:after="40"/>
+      </w:pPr>
+      <w:r>
+        <w:rPr>
+          <w:color w:val="CCCCCC"/>
+          <w:sz w:val="14"/>
+        </w:rPr>
+        <w:t>──────────────────────────────────────────────────────────────────────────────────────────</w:t>
+      </w:r>
+    </w:p>
+    <w:p>
+      <w:pPr>
+        <w:pStyle w:val="Heading2"/>
+      </w:pPr>
+      <w:r>
+        <w:t>STEP 37 — Block / Unblock a Customer  (Toggle)</w:t>
+      </w:r>
+    </w:p>
+    <w:p>
+      <w:pPr>
+        <w:spacing w:before="120"/>
+        <w:shd w:val="clear" w:color="auto" w:fill="CCE5FF"/>
+      </w:pPr>
+      <w:r>
+        <w:rPr>
+          <w:b/>
+          <w:color w:val="004DAA"/>
+          <w:sz w:val="20"/>
+        </w:rPr>
+        <w:t xml:space="preserve">  POST  </w:t>
+      </w:r>
+      <w:r>
+        <w:rPr>
+          <w:b/>
+          <w:color w:val="1F4E79"/>
+          <w:sz w:val="20"/>
+        </w:rPr>
+        <w:t xml:space="preserve">  {{base_url}}/stores/{{store_id}}/blacklist/{{customer_id}}/</w:t>
+      </w:r>
+      <w:r>
+        <w:rPr>
+          <w:i/>
+          <w:color w:val="777777"/>
+          <w:sz w:val="18"/>
+        </w:rPr>
+        <w:t xml:space="preserve">   [Vendor JWT]   [Sprint 6]</w:t>
+      </w:r>
+    </w:p>
+    <w:p>
+      <w:pPr>
+        <w:ind w:left="288"/>
+      </w:pPr>
+      <w:r>
+        <w:rPr>
+          <w:b w:val="0"/>
+          <w:sz w:val="20"/>
+        </w:rPr>
+        <w:t>Authorization: Bearer {{vendor_token}}</w:t>
+      </w:r>
+    </w:p>
+    <w:p>
+      <w:pPr>
+        <w:ind w:left="288"/>
+      </w:pPr>
+      <w:r>
+        <w:rPr>
+          <w:b w:val="0"/>
+          <w:sz w:val="20"/>
+        </w:rPr>
+        <w:t>Content-Type: application/json</w:t>
+      </w:r>
+    </w:p>
+    <w:p>
+      <w:r>
+        <w:rPr>
+          <w:b/>
+          <w:sz w:val="20"/>
+        </w:rPr>
+        <w:t>Request Body (reason is optional):</w:t>
+      </w:r>
+    </w:p>
+    <w:p>
+      <w:pPr>
+        <w:spacing w:before="40" w:after="40"/>
+        <w:ind w:left="288"/>
+        <w:shd w:val="clear" w:color="auto" w:fill="F0F0F0"/>
+      </w:pPr>
+      <w:r>
+        <w:rPr>
+          <w:rFonts w:ascii="Courier New" w:hAnsi="Courier New"/>
+          <w:color w:val="1A1A8C"/>
+          <w:sz w:val="18"/>
+        </w:rPr>
+        <w:t>{</w:t>
+        <w:br/>
+        <w:t xml:space="preserve">  "reason": "Spamming and abusive messages"</w:t>
+        <w:br/>
+        <w:t>}</w:t>
+      </w:r>
+    </w:p>
+    <w:p>
+      <w:pPr>
+        <w:ind w:left="288"/>
+        <w:shd w:val="clear" w:color="auto" w:fill="D1ECF1"/>
+      </w:pPr>
+      <w:r>
+        <w:rPr>
+          <w:i/>
+          <w:color w:val="0C5460"/>
+          <w:sz w:val="20"/>
+        </w:rPr>
+        <w:t xml:space="preserve">  💡  Swagger has two pre-filled examples: "Block with reason" and "Block no reason".</w:t>
+        <w:br/>
+        <w:t>Replace {{store_id}} with real store UUID and {{customer_id}} with the customer UUID</w:t>
+        <w:br/>
+        <w:t>(get customer UUID from GET /auth/me/ using the customer token).</w:t>
+      </w:r>
+    </w:p>
+    <w:p>
+      <w:r>
+        <w:rPr>
+          <w:b/>
+          <w:sz w:val="20"/>
+        </w:rPr>
+        <w:t>Expected Response  200 OK — first call (blocks):</w:t>
+      </w:r>
+    </w:p>
+    <w:p>
+      <w:pPr>
+        <w:spacing w:before="40" w:after="40"/>
+        <w:ind w:left="288"/>
+        <w:shd w:val="clear" w:color="auto" w:fill="F0F0F0"/>
+      </w:pPr>
+      <w:r>
+        <w:rPr>
+          <w:rFonts w:ascii="Courier New" w:hAnsi="Courier New"/>
+          <w:color w:val="1A1A8C"/>
+          <w:sz w:val="18"/>
+        </w:rPr>
+        <w:t>{</w:t>
+        <w:br/>
+        <w:t xml:space="preserve">  "is_blocked": true,</w:t>
+        <w:br/>
+        <w:t xml:space="preserve">  "message": "Customer blocked."</w:t>
+        <w:br/>
+        <w:t>}</w:t>
+      </w:r>
+    </w:p>
+    <w:p>
+      <w:r>
+        <w:rPr>
+          <w:b/>
+          <w:sz w:val="20"/>
+        </w:rPr>
+        <w:t>Expected Response  200 OK — second call (unblocks):</w:t>
+      </w:r>
+    </w:p>
+    <w:p>
+      <w:pPr>
+        <w:spacing w:before="40" w:after="40"/>
+        <w:ind w:left="288"/>
+        <w:shd w:val="clear" w:color="auto" w:fill="F0F0F0"/>
+      </w:pPr>
+      <w:r>
+        <w:rPr>
+          <w:rFonts w:ascii="Courier New" w:hAnsi="Courier New"/>
+          <w:color w:val="1A1A8C"/>
+          <w:sz w:val="18"/>
+        </w:rPr>
+        <w:t>{</w:t>
+        <w:br/>
+        <w:t xml:space="preserve">  "is_blocked": false,</w:t>
+        <w:br/>
+        <w:t xml:space="preserve">  "message": "Customer unblocked."</w:t>
+        <w:br/>
+        <w:t>}</w:t>
+      </w:r>
+    </w:p>
+    <w:p>
+      <w:pPr>
+        <w:ind w:left="288"/>
+        <w:shd w:val="clear" w:color="auto" w:fill="D4EDDA"/>
+      </w:pPr>
+      <w:r>
+        <w:rPr>
+          <w:i/>
+          <w:color w:val="155724"/>
+          <w:sz w:val="20"/>
+        </w:rPr>
+        <w:t xml:space="preserve">  ✅  Toggle — first call blocks, second call unblocks. No separate unblock endpoint.</w:t>
+      </w:r>
+    </w:p>
+    <w:p>
+      <w:pPr>
+        <w:ind w:left="288"/>
+        <w:shd w:val="clear" w:color="auto" w:fill="FFF3CD"/>
+      </w:pPr>
+      <w:r>
+        <w:rPr>
+          <w:i/>
+          <w:color w:val="7D4E00"/>
+          <w:sz w:val="20"/>
+        </w:rPr>
+        <w:t xml:space="preserve">  ⚠️  Only the vendor who OWNS the store can block customers.</w:t>
+        <w:br/>
+        <w:t>Trying to block from a store you don't own → 403 permission_denied.</w:t>
+        <w:br/>
+        <w:t>The customer_id must belong to a user with role=customer → 404 if not found.</w:t>
+      </w:r>
+    </w:p>
+    <w:p>
+      <w:pPr>
+        <w:ind w:left="288"/>
+        <w:shd w:val="clear" w:color="auto" w:fill="F8D7DA"/>
+      </w:pPr>
+      <w:r>
+        <w:rPr>
+          <w:i/>
+          <w:color w:val="7B1D1D"/>
+          <w:sz w:val="20"/>
+        </w:rPr>
+        <w:t xml:space="preserve">  🚫  403 blacklisted — what a blocked customer gets when they try to:</w:t>
+        <w:br/>
+        <w:t xml:space="preserve">     POST /stores/&lt;id&gt;/follow/       → 403 — You cannot follow this store.</w:t>
+        <w:br/>
+        <w:t xml:space="preserve">     POST /stores/&lt;id&gt;/review/       → 403 — You cannot review this store.</w:t>
+        <w:br/>
+        <w:t xml:space="preserve">     POST /conversations/start/      → 403 — You cannot start a conversation with this store.</w:t>
+        <w:br/>
+        <w:t xml:space="preserve">     WebSocket connect               → close code 4003</w:t>
+      </w:r>
+    </w:p>
+    <w:p>
+      <w:pPr>
+        <w:spacing w:before="40" w:after="40"/>
+      </w:pPr>
+      <w:r>
+        <w:rPr>
+          <w:color w:val="CCCCCC"/>
+          <w:sz w:val="14"/>
+        </w:rPr>
+        <w:t>──────────────────────────────────────────────────────────────────────────────────────────</w:t>
+      </w:r>
+    </w:p>
+    <w:p>
+      <w:pPr>
+        <w:pStyle w:val="Heading2"/>
+      </w:pPr>
+      <w:r>
+        <w:t>STEP 38 — List Blocked Customers</w:t>
+      </w:r>
+    </w:p>
+    <w:p>
+      <w:pPr>
+        <w:spacing w:before="120"/>
+        <w:shd w:val="clear" w:color="auto" w:fill="D4EDDA"/>
+      </w:pPr>
+      <w:r>
+        <w:rPr>
+          <w:b/>
+          <w:color w:val="155524"/>
+          <w:sz w:val="20"/>
+        </w:rPr>
+        <w:t xml:space="preserve">  GET  </w:t>
+      </w:r>
+      <w:r>
+        <w:rPr>
+          <w:b/>
+          <w:color w:val="1F4E79"/>
+          <w:sz w:val="20"/>
+        </w:rPr>
+        <w:t xml:space="preserve">  {{base_url}}/stores/{{store_id}}/blacklist/</w:t>
+      </w:r>
+      <w:r>
+        <w:rPr>
+          <w:i/>
+          <w:color w:val="777777"/>
+          <w:sz w:val="18"/>
+        </w:rPr>
+        <w:t xml:space="preserve">   [Vendor JWT]   [Sprint 6]</w:t>
+      </w:r>
+    </w:p>
+    <w:p>
+      <w:pPr>
+        <w:ind w:left="288"/>
+      </w:pPr>
+      <w:r>
+        <w:rPr>
+          <w:b w:val="0"/>
+          <w:sz w:val="20"/>
+        </w:rPr>
+        <w:t>Authorization: Bearer {{vendor_token}}</w:t>
+      </w:r>
+    </w:p>
+    <w:p>
+      <w:r>
+        <w:rPr>
+          <w:b w:val="0"/>
+          <w:sz w:val="22"/>
+        </w:rPr>
+        <w:t>No request body needed.</w:t>
+      </w:r>
+    </w:p>
+    <w:p>
+      <w:r>
+        <w:rPr>
+          <w:b/>
+          <w:sz w:val="20"/>
+        </w:rPr>
+        <w:t>Expected Response  200 OK:</w:t>
+      </w:r>
+    </w:p>
+    <w:p>
+      <w:pPr>
+        <w:spacing w:before="40" w:after="40"/>
+        <w:ind w:left="288"/>
+        <w:shd w:val="clear" w:color="auto" w:fill="F0F0F0"/>
+      </w:pPr>
+      <w:r>
+        <w:rPr>
+          <w:rFonts w:ascii="Courier New" w:hAnsi="Courier New"/>
+          <w:color w:val="1A1A8C"/>
+          <w:sz w:val="18"/>
+        </w:rPr>
+        <w:t>[</w:t>
+        <w:br/>
+        <w:t xml:space="preserve">  {</w:t>
+        <w:br/>
+        <w:t xml:space="preserve">    "id": "92b1f816-a34a-488b-9c36-867e020db838",</w:t>
+        <w:br/>
+        <w:t xml:space="preserve">    "customer_phone": "+916000000001",</w:t>
+        <w:br/>
+        <w:t xml:space="preserve">    "customer_name": "",</w:t>
+        <w:br/>
+        <w:t xml:space="preserve">    "reason": "Spamming and abusive messages",</w:t>
+        <w:br/>
+        <w:t xml:space="preserve">    "created_at": "2026-05-15T17:31:25Z"</w:t>
+        <w:br/>
+        <w:t xml:space="preserve">  }</w:t>
+        <w:br/>
+        <w:t>]</w:t>
+      </w:r>
+    </w:p>
+    <w:p>
+      <w:pPr>
+        <w:ind w:left="288"/>
+        <w:shd w:val="clear" w:color="auto" w:fill="D4EDDA"/>
+      </w:pPr>
+      <w:r>
+        <w:rPr>
+          <w:i/>
+          <w:color w:val="155724"/>
+          <w:sz w:val="20"/>
+        </w:rPr>
+        <w:t xml:space="preserve">  ✅  Returns [] when no customers are blocked.</w:t>
+      </w:r>
+    </w:p>
+    <w:p>
+      <w:pPr>
+        <w:ind w:left="288"/>
+        <w:shd w:val="clear" w:color="auto" w:fill="FFF3CD"/>
+      </w:pPr>
+      <w:r>
+        <w:rPr>
+          <w:i/>
+          <w:color w:val="7D4E00"/>
+          <w:sz w:val="20"/>
+        </w:rPr>
+        <w:t xml:space="preserve">  ⚠️  In Swagger: replace the placeholder UUID 3fa85f64-... with the real store_id from Step 10.</w:t>
+      </w:r>
+    </w:p>
+    <w:p>
+      <w:r>
+        <w:br w:type="page"/>
+      </w:r>
+    </w:p>
+    <w:p>
+      <w:pPr>
+        <w:pStyle w:val="Heading1"/>
+      </w:pPr>
+      <w:r>
         <w:t>4. Error Cases to Test</w:t>
       </w:r>
     </w:p>
@@ -14952,7 +15504,7 @@
         <w:pStyle w:val="Heading2"/>
       </w:pPr>
       <w:r>
-        <w:t>Video Error Cases  (Sprint 4)</w:t>
+        <w:t>Blacklist Error Cases  (Sprint 6)</w:t>
       </w:r>
     </w:p>
     <w:tbl>
@@ -14970,7 +15522,7 @@
       <w:tr>
         <w:tc>
           <w:tcPr>
-            <w:tcW w:type="dxa" w:w="2880"/>
+            <w:tcW w:type="dxa" w:w="2736"/>
             <w:shd w:val="clear" w:color="auto" w:fill="1F4E79"/>
           </w:tcPr>
           <w:p>
@@ -14986,7 +15538,7 @@
         </w:tc>
         <w:tc>
           <w:tcPr>
-            <w:tcW w:type="dxa" w:w="3456"/>
+            <w:tcW w:type="dxa" w:w="3744"/>
             <w:shd w:val="clear" w:color="auto" w:fill="1F4E79"/>
           </w:tcPr>
           <w:p>
@@ -14996,13 +15548,13 @@
                 <w:color w:val="FFFFFF"/>
                 <w:sz w:val="20"/>
               </w:rPr>
-              <w:t>Request</w:t>
-            </w:r>
-          </w:p>
-        </w:tc>
-        <w:tc>
-          <w:tcPr>
-            <w:tcW w:type="dxa" w:w="3168"/>
+              <w:t>Request / Situation</w:t>
+            </w:r>
+          </w:p>
+        </w:tc>
+        <w:tc>
+          <w:tcPr>
+            <w:tcW w:type="dxa" w:w="3024"/>
             <w:shd w:val="clear" w:color="auto" w:fill="1F4E79"/>
           </w:tcPr>
           <w:p>
@@ -15020,7 +15572,7 @@
       <w:tr>
         <w:tc>
           <w:tcPr>
-            <w:tcW w:type="dxa" w:w="2880"/>
+            <w:tcW w:type="dxa" w:w="2736"/>
             <w:shd w:val="clear" w:color="auto" w:fill="DEEAF1"/>
           </w:tcPr>
           <w:p>
@@ -15028,13 +15580,13 @@
               <w:rPr>
                 <w:sz w:val="19"/>
               </w:rPr>
-              <w:t>No store — request upload</w:t>
-            </w:r>
-          </w:p>
-        </w:tc>
-        <w:tc>
-          <w:tcPr>
-            <w:tcW w:type="dxa" w:w="3456"/>
+              <w:t>Block — not store owner</w:t>
+            </w:r>
+          </w:p>
+        </w:tc>
+        <w:tc>
+          <w:tcPr>
+            <w:tcW w:type="dxa" w:w="3744"/>
             <w:shd w:val="clear" w:color="auto" w:fill="DEEAF1"/>
           </w:tcPr>
           <w:p>
@@ -15042,13 +15594,13 @@
               <w:rPr>
                 <w:sz w:val="19"/>
               </w:rPr>
-              <w:t>POST /videos/request-upload/ before store created</w:t>
-            </w:r>
-          </w:p>
-        </w:tc>
-        <w:tc>
-          <w:tcPr>
-            <w:tcW w:type="dxa" w:w="3168"/>
+              <w:t>POST /stores/&lt;id&gt;/blacklist/&lt;cust_id&gt;/ — different vendor</w:t>
+            </w:r>
+          </w:p>
+        </w:tc>
+        <w:tc>
+          <w:tcPr>
+            <w:tcW w:type="dxa" w:w="3024"/>
             <w:shd w:val="clear" w:color="auto" w:fill="DEEAF1"/>
           </w:tcPr>
           <w:p>
@@ -15056,7 +15608,7 @@
               <w:rPr>
                 <w:sz w:val="19"/>
               </w:rPr>
-              <w:t>400 — Create a store first</w:t>
+              <w:t>403 — permission_denied</w:t>
             </w:r>
           </w:p>
         </w:tc>
@@ -15064,40 +15616,40 @@
       <w:tr>
         <w:tc>
           <w:tcPr>
-            <w:tcW w:type="dxa" w:w="2880"/>
-          </w:tcPr>
-          <w:p>
-            <w:r>
-              <w:rPr>
-                <w:sz w:val="19"/>
-              </w:rPr>
-              <w:t>Missing title</w:t>
-            </w:r>
-          </w:p>
-        </w:tc>
-        <w:tc>
-          <w:tcPr>
-            <w:tcW w:type="dxa" w:w="3456"/>
-          </w:tcPr>
-          <w:p>
-            <w:r>
-              <w:rPr>
-                <w:sz w:val="19"/>
-              </w:rPr>
-              <w:t>POST /videos/request-upload/ with no title field</w:t>
-            </w:r>
-          </w:p>
-        </w:tc>
-        <w:tc>
-          <w:tcPr>
-            <w:tcW w:type="dxa" w:w="3168"/>
-          </w:tcPr>
-          <w:p>
-            <w:r>
-              <w:rPr>
-                <w:sz w:val="19"/>
-              </w:rPr>
-              <w:t>400 — This field is required</w:t>
+            <w:tcW w:type="dxa" w:w="2736"/>
+          </w:tcPr>
+          <w:p>
+            <w:r>
+              <w:rPr>
+                <w:sz w:val="19"/>
+              </w:rPr>
+              <w:t>Block — customer not found</w:t>
+            </w:r>
+          </w:p>
+        </w:tc>
+        <w:tc>
+          <w:tcPr>
+            <w:tcW w:type="dxa" w:w="3744"/>
+          </w:tcPr>
+          <w:p>
+            <w:r>
+              <w:rPr>
+                <w:sz w:val="19"/>
+              </w:rPr>
+              <w:t>POST /stores/&lt;id&gt;/blacklist/&lt;bad_uuid&gt;/</w:t>
+            </w:r>
+          </w:p>
+        </w:tc>
+        <w:tc>
+          <w:tcPr>
+            <w:tcW w:type="dxa" w:w="3024"/>
+          </w:tcPr>
+          <w:p>
+            <w:r>
+              <w:rPr>
+                <w:sz w:val="19"/>
+              </w:rPr>
+              <w:t>404 — Customer not found</w:t>
             </w:r>
           </w:p>
         </w:tc>
@@ -15105,7 +15657,7 @@
       <w:tr>
         <w:tc>
           <w:tcPr>
-            <w:tcW w:type="dxa" w:w="2880"/>
+            <w:tcW w:type="dxa" w:w="2736"/>
             <w:shd w:val="clear" w:color="auto" w:fill="DEEAF1"/>
           </w:tcPr>
           <w:p>
@@ -15113,13 +15665,13 @@
               <w:rPr>
                 <w:sz w:val="19"/>
               </w:rPr>
-              <w:t>Customer calls request-upload</w:t>
-            </w:r>
-          </w:p>
-        </w:tc>
-        <w:tc>
-          <w:tcPr>
-            <w:tcW w:type="dxa" w:w="3456"/>
+              <w:t>Block — store not found</w:t>
+            </w:r>
+          </w:p>
+        </w:tc>
+        <w:tc>
+          <w:tcPr>
+            <w:tcW w:type="dxa" w:w="3744"/>
             <w:shd w:val="clear" w:color="auto" w:fill="DEEAF1"/>
           </w:tcPr>
           <w:p>
@@ -15127,13 +15679,13 @@
               <w:rPr>
                 <w:sz w:val="19"/>
               </w:rPr>
-              <w:t>POST /videos/request-upload/ with customer token</w:t>
-            </w:r>
-          </w:p>
-        </w:tc>
-        <w:tc>
-          <w:tcPr>
-            <w:tcW w:type="dxa" w:w="3168"/>
+              <w:t>POST /stores/&lt;bad_uuid&gt;/blacklist/&lt;cust_id&gt;/</w:t>
+            </w:r>
+          </w:p>
+        </w:tc>
+        <w:tc>
+          <w:tcPr>
+            <w:tcW w:type="dxa" w:w="3024"/>
             <w:shd w:val="clear" w:color="auto" w:fill="DEEAF1"/>
           </w:tcPr>
           <w:p>
@@ -15141,7 +15693,7 @@
               <w:rPr>
                 <w:sz w:val="19"/>
               </w:rPr>
-              <w:t>403 — Vendor access only</w:t>
+              <w:t>404 — Store not found</w:t>
             </w:r>
           </w:p>
         </w:tc>
@@ -15149,40 +15701,40 @@
       <w:tr>
         <w:tc>
           <w:tcPr>
-            <w:tcW w:type="dxa" w:w="2880"/>
-          </w:tcPr>
-          <w:p>
-            <w:r>
-              <w:rPr>
-                <w:sz w:val="19"/>
-              </w:rPr>
-              <w:t>Confirm already-ready video</w:t>
-            </w:r>
-          </w:p>
-        </w:tc>
-        <w:tc>
-          <w:tcPr>
-            <w:tcW w:type="dxa" w:w="3456"/>
-          </w:tcPr>
-          <w:p>
-            <w:r>
-              <w:rPr>
-                <w:sz w:val="19"/>
-              </w:rPr>
-              <w:t>POST /videos/&lt;id&gt;/confirm-upload/ on ready video</w:t>
-            </w:r>
-          </w:p>
-        </w:tc>
-        <w:tc>
-          <w:tcPr>
-            <w:tcW w:type="dxa" w:w="3168"/>
-          </w:tcPr>
-          <w:p>
-            <w:r>
-              <w:rPr>
-                <w:sz w:val="19"/>
-              </w:rPr>
-              <w:t>400 — Video already in "ready" state</w:t>
+            <w:tcW w:type="dxa" w:w="2736"/>
+          </w:tcPr>
+          <w:p>
+            <w:r>
+              <w:rPr>
+                <w:sz w:val="19"/>
+              </w:rPr>
+              <w:t>Block — with customer token</w:t>
+            </w:r>
+          </w:p>
+        </w:tc>
+        <w:tc>
+          <w:tcPr>
+            <w:tcW w:type="dxa" w:w="3744"/>
+          </w:tcPr>
+          <w:p>
+            <w:r>
+              <w:rPr>
+                <w:sz w:val="19"/>
+              </w:rPr>
+              <w:t>POST /stores/&lt;id&gt;/blacklist/&lt;id&gt;/ — customer token</w:t>
+            </w:r>
+          </w:p>
+        </w:tc>
+        <w:tc>
+          <w:tcPr>
+            <w:tcW w:type="dxa" w:w="3024"/>
+          </w:tcPr>
+          <w:p>
+            <w:r>
+              <w:rPr>
+                <w:sz w:val="19"/>
+              </w:rPr>
+              <w:t>403 — Vendor access only</w:t>
             </w:r>
           </w:p>
         </w:tc>
@@ -15190,7 +15742,7 @@
       <w:tr>
         <w:tc>
           <w:tcPr>
-            <w:tcW w:type="dxa" w:w="2880"/>
+            <w:tcW w:type="dxa" w:w="2736"/>
             <w:shd w:val="clear" w:color="auto" w:fill="DEEAF1"/>
           </w:tcPr>
           <w:p>
@@ -15198,13 +15750,13 @@
               <w:rPr>
                 <w:sz w:val="19"/>
               </w:rPr>
-              <w:t>Duration too long</w:t>
-            </w:r>
-          </w:p>
-        </w:tc>
-        <w:tc>
-          <w:tcPr>
-            <w:tcW w:type="dxa" w:w="3456"/>
+              <w:t>Block — no auth</w:t>
+            </w:r>
+          </w:p>
+        </w:tc>
+        <w:tc>
+          <w:tcPr>
+            <w:tcW w:type="dxa" w:w="3744"/>
             <w:shd w:val="clear" w:color="auto" w:fill="DEEAF1"/>
           </w:tcPr>
           <w:p>
@@ -15212,13 +15764,13 @@
               <w:rPr>
                 <w:sz w:val="19"/>
               </w:rPr>
-              <w:t>POST /videos/&lt;id&gt;/confirm-upload/ — duration_seconds=120</w:t>
-            </w:r>
-          </w:p>
-        </w:tc>
-        <w:tc>
-          <w:tcPr>
-            <w:tcW w:type="dxa" w:w="3168"/>
+              <w:t>POST /stores/&lt;id&gt;/blacklist/&lt;id&gt;/ — no header</w:t>
+            </w:r>
+          </w:p>
+        </w:tc>
+        <w:tc>
+          <w:tcPr>
+            <w:tcW w:type="dxa" w:w="3024"/>
             <w:shd w:val="clear" w:color="auto" w:fill="DEEAF1"/>
           </w:tcPr>
           <w:p>
@@ -15226,7 +15778,7 @@
               <w:rPr>
                 <w:sz w:val="19"/>
               </w:rPr>
-              <w:t>400 — cannot exceed 60 seconds</w:t>
+              <w:t>401 — authentication_failed</w:t>
             </w:r>
           </w:p>
         </w:tc>
@@ -15234,40 +15786,40 @@
       <w:tr>
         <w:tc>
           <w:tcPr>
-            <w:tcW w:type="dxa" w:w="2880"/>
-          </w:tcPr>
-          <w:p>
-            <w:r>
-              <w:rPr>
-                <w:sz w:val="19"/>
-              </w:rPr>
-              <w:t>Confirm another vendor video</w:t>
-            </w:r>
-          </w:p>
-        </w:tc>
-        <w:tc>
-          <w:tcPr>
-            <w:tcW w:type="dxa" w:w="3456"/>
-          </w:tcPr>
-          <w:p>
-            <w:r>
-              <w:rPr>
-                <w:sz w:val="19"/>
-              </w:rPr>
-              <w:t>POST /videos/&lt;id&gt;/confirm-upload/ — wrong vendor</w:t>
-            </w:r>
-          </w:p>
-        </w:tc>
-        <w:tc>
-          <w:tcPr>
-            <w:tcW w:type="dxa" w:w="3168"/>
-          </w:tcPr>
-          <w:p>
-            <w:r>
-              <w:rPr>
-                <w:sz w:val="19"/>
-              </w:rPr>
-              <w:t>404 — not_found</w:t>
+            <w:tcW w:type="dxa" w:w="2736"/>
+          </w:tcPr>
+          <w:p>
+            <w:r>
+              <w:rPr>
+                <w:sz w:val="19"/>
+              </w:rPr>
+              <w:t>List — not store owner</w:t>
+            </w:r>
+          </w:p>
+        </w:tc>
+        <w:tc>
+          <w:tcPr>
+            <w:tcW w:type="dxa" w:w="3744"/>
+          </w:tcPr>
+          <w:p>
+            <w:r>
+              <w:rPr>
+                <w:sz w:val="19"/>
+              </w:rPr>
+              <w:t>GET /stores/&lt;id&gt;/blacklist/ — different vendor</w:t>
+            </w:r>
+          </w:p>
+        </w:tc>
+        <w:tc>
+          <w:tcPr>
+            <w:tcW w:type="dxa" w:w="3024"/>
+          </w:tcPr>
+          <w:p>
+            <w:r>
+              <w:rPr>
+                <w:sz w:val="19"/>
+              </w:rPr>
+              <w:t>403 — permission_denied</w:t>
             </w:r>
           </w:p>
         </w:tc>
@@ -15275,7 +15827,7 @@
       <w:tr>
         <w:tc>
           <w:tcPr>
-            <w:tcW w:type="dxa" w:w="2880"/>
+            <w:tcW w:type="dxa" w:w="2736"/>
             <w:shd w:val="clear" w:color="auto" w:fill="DEEAF1"/>
           </w:tcPr>
           <w:p>
@@ -15283,13 +15835,13 @@
               <w:rPr>
                 <w:sz w:val="19"/>
               </w:rPr>
-              <w:t>Feed without lat/lng</w:t>
-            </w:r>
-          </w:p>
-        </w:tc>
-        <w:tc>
-          <w:tcPr>
-            <w:tcW w:type="dxa" w:w="3456"/>
+              <w:t>Blocked follows store</w:t>
+            </w:r>
+          </w:p>
+        </w:tc>
+        <w:tc>
+          <w:tcPr>
+            <w:tcW w:type="dxa" w:w="3744"/>
             <w:shd w:val="clear" w:color="auto" w:fill="DEEAF1"/>
           </w:tcPr>
           <w:p>
@@ -15297,13 +15849,13 @@
               <w:rPr>
                 <w:sz w:val="19"/>
               </w:rPr>
-              <w:t>GET /videos/feed/ — no ?lat=&amp;lng= params</w:t>
-            </w:r>
-          </w:p>
-        </w:tc>
-        <w:tc>
-          <w:tcPr>
-            <w:tcW w:type="dxa" w:w="3168"/>
+              <w:t>POST /stores/&lt;id&gt;/follow/ — blocked customer token</w:t>
+            </w:r>
+          </w:p>
+        </w:tc>
+        <w:tc>
+          <w:tcPr>
+            <w:tcW w:type="dxa" w:w="3024"/>
             <w:shd w:val="clear" w:color="auto" w:fill="DEEAF1"/>
           </w:tcPr>
           <w:p>
@@ -15311,7 +15863,7 @@
               <w:rPr>
                 <w:sz w:val="19"/>
               </w:rPr>
-              <w:t>400 — lat and lng are required numbers</w:t>
+              <w:t>403 — blacklisted</w:t>
             </w:r>
           </w:p>
         </w:tc>
@@ -15319,40 +15871,40 @@
       <w:tr>
         <w:tc>
           <w:tcPr>
-            <w:tcW w:type="dxa" w:w="2880"/>
-          </w:tcPr>
-          <w:p>
-            <w:r>
-              <w:rPr>
-                <w:sz w:val="19"/>
-              </w:rPr>
-              <w:t>Detail on processing video</w:t>
-            </w:r>
-          </w:p>
-        </w:tc>
-        <w:tc>
-          <w:tcPr>
-            <w:tcW w:type="dxa" w:w="3456"/>
-          </w:tcPr>
-          <w:p>
-            <w:r>
-              <w:rPr>
-                <w:sz w:val="19"/>
-              </w:rPr>
-              <w:t>GET /videos/&lt;id&gt;/ while status=processing</w:t>
-            </w:r>
-          </w:p>
-        </w:tc>
-        <w:tc>
-          <w:tcPr>
-            <w:tcW w:type="dxa" w:w="3168"/>
-          </w:tcPr>
-          <w:p>
-            <w:r>
-              <w:rPr>
-                <w:sz w:val="19"/>
-              </w:rPr>
-              <w:t>404 — not_found (only ready shown)</w:t>
+            <w:tcW w:type="dxa" w:w="2736"/>
+          </w:tcPr>
+          <w:p>
+            <w:r>
+              <w:rPr>
+                <w:sz w:val="19"/>
+              </w:rPr>
+              <w:t>Blocked reviews store</w:t>
+            </w:r>
+          </w:p>
+        </w:tc>
+        <w:tc>
+          <w:tcPr>
+            <w:tcW w:type="dxa" w:w="3744"/>
+          </w:tcPr>
+          <w:p>
+            <w:r>
+              <w:rPr>
+                <w:sz w:val="19"/>
+              </w:rPr>
+              <w:t>POST /stores/&lt;id&gt;/review/ — blocked customer token</w:t>
+            </w:r>
+          </w:p>
+        </w:tc>
+        <w:tc>
+          <w:tcPr>
+            <w:tcW w:type="dxa" w:w="3024"/>
+          </w:tcPr>
+          <w:p>
+            <w:r>
+              <w:rPr>
+                <w:sz w:val="19"/>
+              </w:rPr>
+              <w:t>403 — blacklisted</w:t>
             </w:r>
           </w:p>
         </w:tc>
@@ -15360,7 +15912,7 @@
       <w:tr>
         <w:tc>
           <w:tcPr>
-            <w:tcW w:type="dxa" w:w="2880"/>
+            <w:tcW w:type="dxa" w:w="2736"/>
             <w:shd w:val="clear" w:color="auto" w:fill="DEEAF1"/>
           </w:tcPr>
           <w:p>
@@ -15368,13 +15920,13 @@
               <w:rPr>
                 <w:sz w:val="19"/>
               </w:rPr>
-              <w:t>Like without auth</w:t>
-            </w:r>
-          </w:p>
-        </w:tc>
-        <w:tc>
-          <w:tcPr>
-            <w:tcW w:type="dxa" w:w="3456"/>
+              <w:t>Blocked starts conversation</w:t>
+            </w:r>
+          </w:p>
+        </w:tc>
+        <w:tc>
+          <w:tcPr>
+            <w:tcW w:type="dxa" w:w="3744"/>
             <w:shd w:val="clear" w:color="auto" w:fill="DEEAF1"/>
           </w:tcPr>
           <w:p>
@@ -15382,13 +15934,13 @@
               <w:rPr>
                 <w:sz w:val="19"/>
               </w:rPr>
-              <w:t>POST /videos/&lt;id&gt;/like/ — no auth header</w:t>
-            </w:r>
-          </w:p>
-        </w:tc>
-        <w:tc>
-          <w:tcPr>
-            <w:tcW w:type="dxa" w:w="3168"/>
+              <w:t>POST /conversations/start/ — blocked customer token</w:t>
+            </w:r>
+          </w:p>
+        </w:tc>
+        <w:tc>
+          <w:tcPr>
+            <w:tcW w:type="dxa" w:w="3024"/>
             <w:shd w:val="clear" w:color="auto" w:fill="DEEAF1"/>
           </w:tcPr>
           <w:p>
@@ -15396,7 +15948,7 @@
               <w:rPr>
                 <w:sz w:val="19"/>
               </w:rPr>
-              <w:t>401 — authentication_failed</w:t>
+              <w:t>403 — blacklisted</w:t>
             </w:r>
           </w:p>
         </w:tc>
@@ -15404,125 +15956,40 @@
       <w:tr>
         <w:tc>
           <w:tcPr>
-            <w:tcW w:type="dxa" w:w="2880"/>
-          </w:tcPr>
-          <w:p>
-            <w:r>
-              <w:rPr>
-                <w:sz w:val="19"/>
-              </w:rPr>
-              <w:t>Update another vendor video</w:t>
-            </w:r>
-          </w:p>
-        </w:tc>
-        <w:tc>
-          <w:tcPr>
-            <w:tcW w:type="dxa" w:w="3456"/>
-          </w:tcPr>
-          <w:p>
-            <w:r>
-              <w:rPr>
-                <w:sz w:val="19"/>
-              </w:rPr>
-              <w:t>PATCH /videos/&lt;id&gt;/update/ — different vendor token</w:t>
-            </w:r>
-          </w:p>
-        </w:tc>
-        <w:tc>
-          <w:tcPr>
-            <w:tcW w:type="dxa" w:w="3168"/>
-          </w:tcPr>
-          <w:p>
-            <w:r>
-              <w:rPr>
-                <w:sz w:val="19"/>
-              </w:rPr>
-              <w:t>404 — not_found</w:t>
-            </w:r>
-          </w:p>
-        </w:tc>
-      </w:tr>
-      <w:tr>
-        <w:tc>
-          <w:tcPr>
-            <w:tcW w:type="dxa" w:w="2880"/>
-            <w:shd w:val="clear" w:color="auto" w:fill="DEEAF1"/>
-          </w:tcPr>
-          <w:p>
-            <w:r>
-              <w:rPr>
-                <w:sz w:val="19"/>
-              </w:rPr>
-              <w:t>Delete another vendor video</w:t>
-            </w:r>
-          </w:p>
-        </w:tc>
-        <w:tc>
-          <w:tcPr>
-            <w:tcW w:type="dxa" w:w="3456"/>
-            <w:shd w:val="clear" w:color="auto" w:fill="DEEAF1"/>
-          </w:tcPr>
-          <w:p>
-            <w:r>
-              <w:rPr>
-                <w:sz w:val="19"/>
-              </w:rPr>
-              <w:t>DELETE /videos/&lt;id&gt;/delete/ — different vendor</w:t>
-            </w:r>
-          </w:p>
-        </w:tc>
-        <w:tc>
-          <w:tcPr>
-            <w:tcW w:type="dxa" w:w="3168"/>
-            <w:shd w:val="clear" w:color="auto" w:fill="DEEAF1"/>
-          </w:tcPr>
-          <w:p>
-            <w:r>
-              <w:rPr>
-                <w:sz w:val="19"/>
-              </w:rPr>
-              <w:t>404 — not_found</w:t>
-            </w:r>
-          </w:p>
-        </w:tc>
-      </w:tr>
-      <w:tr>
-        <w:tc>
-          <w:tcPr>
-            <w:tcW w:type="dxa" w:w="2880"/>
-          </w:tcPr>
-          <w:p>
-            <w:r>
-              <w:rPr>
-                <w:sz w:val="19"/>
-              </w:rPr>
-              <w:t>Delete with customer token</w:t>
-            </w:r>
-          </w:p>
-        </w:tc>
-        <w:tc>
-          <w:tcPr>
-            <w:tcW w:type="dxa" w:w="3456"/>
-          </w:tcPr>
-          <w:p>
-            <w:r>
-              <w:rPr>
-                <w:sz w:val="19"/>
-              </w:rPr>
-              <w:t>DELETE /videos/&lt;id&gt;/delete/ — customer token</w:t>
-            </w:r>
-          </w:p>
-        </w:tc>
-        <w:tc>
-          <w:tcPr>
-            <w:tcW w:type="dxa" w:w="3168"/>
-          </w:tcPr>
-          <w:p>
-            <w:r>
-              <w:rPr>
-                <w:sz w:val="19"/>
-              </w:rPr>
-              <w:t>403 — Vendor access only</w:t>
+            <w:tcW w:type="dxa" w:w="2736"/>
+          </w:tcPr>
+          <w:p>
+            <w:r>
+              <w:rPr>
+                <w:sz w:val="19"/>
+              </w:rPr>
+              <w:t>Blocked connects via WS</w:t>
+            </w:r>
+          </w:p>
+        </w:tc>
+        <w:tc>
+          <w:tcPr>
+            <w:tcW w:type="dxa" w:w="3744"/>
+          </w:tcPr>
+          <w:p>
+            <w:r>
+              <w:rPr>
+                <w:sz w:val="19"/>
+              </w:rPr>
+              <w:t>ws://.../ws/conversations/&lt;id&gt;/?token=&lt;blocked_token&gt;</w:t>
+            </w:r>
+          </w:p>
+        </w:tc>
+        <w:tc>
+          <w:tcPr>
+            <w:tcW w:type="dxa" w:w="3024"/>
+          </w:tcPr>
+          <w:p>
+            <w:r>
+              <w:rPr>
+                <w:sz w:val="19"/>
+              </w:rPr>
+              <w:t>WS close code 4003</w:t>
             </w:r>
           </w:p>
         </w:tc>
@@ -15530,470 +15997,11 @@
     </w:tbl>
     <w:p/>
     <w:p>
-      <w:r>
-        <w:br w:type="page"/>
-      </w:r>
-    </w:p>
-    <w:p>
-      <w:pPr>
-        <w:pStyle w:val="Heading1"/>
-      </w:pPr>
-      <w:r>
-        <w:t>5. Postman Quick Setup</w:t>
-      </w:r>
-    </w:p>
-    <w:p>
       <w:pPr>
         <w:pStyle w:val="Heading2"/>
       </w:pPr>
       <w:r>
-        <w:t>Collection Folder Structure (recommended)</w:t>
-      </w:r>
-    </w:p>
-    <w:p>
-      <w:pPr>
-        <w:spacing w:before="40" w:after="40"/>
-        <w:ind w:left="288"/>
-        <w:shd w:val="clear" w:color="auto" w:fill="F0F0F0"/>
-      </w:pPr>
-      <w:r>
-        <w:rPr>
-          <w:rFonts w:ascii="Courier New" w:hAnsi="Courier New"/>
-          <w:color w:val="1A1A8C"/>
-          <w:sz w:val="18"/>
-        </w:rPr>
-        <w:t>NearKart Local</w:t>
-        <w:br/>
-        <w:t>├── 0. Setup</w:t>
-        <w:br/>
-        <w:t>│   └── Health Check</w:t>
-        <w:br/>
-        <w:t>├── 1. Auth</w:t>
-        <w:br/>
-        <w:t>│   ├── Send OTP (Vendor)</w:t>
-        <w:br/>
-        <w:t>│   ├── Verify OTP (Vendor) ← Tests script saves vendor_token</w:t>
-        <w:br/>
-        <w:t>│   ├── Send OTP (Customer)</w:t>
-        <w:br/>
-        <w:t>│   ├── Verify OTP (Customer) ← Tests script saves customer_token</w:t>
-        <w:br/>
-        <w:t>│   ├── Get Profile</w:t>
-        <w:br/>
-        <w:t>│   ├── Update Profile</w:t>
-        <w:br/>
-        <w:t>│   ├── Update Location</w:t>
-        <w:br/>
-        <w:t>│   ├── Refresh Token</w:t>
-        <w:br/>
-        <w:t>│   └── Logout</w:t>
-        <w:br/>
-        <w:t>├── 2. Stores</w:t>
-        <w:br/>
-        <w:t>│   ├── Create Store ← Tests script saves store_id</w:t>
-        <w:br/>
-        <w:t>│   ├── Nearby Stores</w:t>
-        <w:br/>
-        <w:t>│   ├── Store Detail</w:t>
-        <w:br/>
-        <w:t>│   ├── Update Store</w:t>
-        <w:br/>
-        <w:t>│   ├── Follow Store</w:t>
-        <w:br/>
-        <w:t>│   ├── Review Store</w:t>
-        <w:br/>
-        <w:t>│   └── QR Code</w:t>
-        <w:br/>
-        <w:t>├── 3. Products</w:t>
-        <w:br/>
-        <w:t>│   ├── Create Product ← Tests script saves product_id</w:t>
-        <w:br/>
-        <w:t>│   ├── Nearby Products</w:t>
-        <w:br/>
-        <w:t>│   ├── Search Products</w:t>
-        <w:br/>
-        <w:t>│   ├── Product Detail</w:t>
-        <w:br/>
-        <w:t>│   ├── Update Product</w:t>
-        <w:br/>
-        <w:t>│   ├── Delete Product</w:t>
-        <w:br/>
-        <w:t>│   └── Wishlist Toggle</w:t>
-        <w:br/>
-        <w:t>├── 4. Videos</w:t>
-        <w:br/>
-        <w:t>│   ├── Request Upload URL ← Tests script saves video_id</w:t>
-        <w:br/>
-        <w:t>│   ├── Confirm Upload</w:t>
-        <w:br/>
-        <w:t>│   ├── My Videos (Vendor Library)</w:t>
-        <w:br/>
-        <w:t>│   ├── Update Video</w:t>
-        <w:br/>
-        <w:t>│   ├── Video Feed</w:t>
-        <w:br/>
-        <w:t>│   ├── Video Detail</w:t>
-        <w:br/>
-        <w:t>│   ├── Like / Unlike Video</w:t>
-        <w:br/>
-        <w:t>│   └── Delete Video</w:t>
-        <w:br/>
-        <w:t>└── 5. Chat</w:t>
-        <w:br/>
-        <w:t xml:space="preserve">    ├── Start Conversation ← Tests script saves conversation_id</w:t>
-        <w:br/>
-        <w:t xml:space="preserve">    ├── List Conversations (Inbox)</w:t>
-        <w:br/>
-        <w:t xml:space="preserve">    ├── Message History</w:t>
-        <w:br/>
-        <w:t xml:space="preserve">    ├── Mark as Read</w:t>
-        <w:br/>
-        <w:t xml:space="preserve">    └── [WebSocket] Connect + Send  (use Postman WS tab or wscat)</w:t>
-      </w:r>
-    </w:p>
-    <w:p>
-      <w:pPr>
-        <w:pStyle w:val="Heading2"/>
-      </w:pPr>
-      <w:r>
-        <w:t>Auto-Save Token Script  (paste in Tests tab of Verify OTP request)</w:t>
-      </w:r>
-    </w:p>
-    <w:p>
-      <w:pPr>
-        <w:spacing w:before="40" w:after="40"/>
-        <w:ind w:left="288"/>
-        <w:shd w:val="clear" w:color="auto" w:fill="F0F0F0"/>
-      </w:pPr>
-      <w:r>
-        <w:rPr>
-          <w:rFonts w:ascii="Courier New" w:hAnsi="Courier New"/>
-          <w:color w:val="1A1A8C"/>
-          <w:sz w:val="18"/>
-        </w:rPr>
-        <w:t>// For VENDOR verify OTP request:</w:t>
-        <w:br/>
-        <w:t>const r = pm.response.json();</w:t>
-        <w:br/>
-        <w:t>if (r.access) {</w:t>
-        <w:br/>
-        <w:t xml:space="preserve">    pm.environment.set("vendor_token", r.access);</w:t>
-        <w:br/>
-        <w:t xml:space="preserve">    pm.environment.set("vendor_refresh", r.refresh);</w:t>
-        <w:br/>
-        <w:t xml:space="preserve">    console.log("Vendor token saved:", r.access.substring(0, 30) + "...");</w:t>
-        <w:br/>
-        <w:t>}</w:t>
-        <w:br/>
-        <w:br/>
-        <w:t>// For CUSTOMER verify OTP request — use this instead:</w:t>
-        <w:br/>
-        <w:t>// pm.environment.set("customer_token", r.access);</w:t>
-        <w:br/>
-        <w:t>// pm.environment.set("customer_refresh", r.refresh);</w:t>
-      </w:r>
-    </w:p>
-    <w:p>
-      <w:pPr>
-        <w:pStyle w:val="Heading2"/>
-      </w:pPr>
-      <w:r>
-        <w:t>Auto-Save Store ID  (paste in Tests tab of Create Store request)</w:t>
-      </w:r>
-    </w:p>
-    <w:p>
-      <w:pPr>
-        <w:spacing w:before="40" w:after="40"/>
-        <w:ind w:left="288"/>
-        <w:shd w:val="clear" w:color="auto" w:fill="F0F0F0"/>
-      </w:pPr>
-      <w:r>
-        <w:rPr>
-          <w:rFonts w:ascii="Courier New" w:hAnsi="Courier New"/>
-          <w:color w:val="1A1A8C"/>
-          <w:sz w:val="18"/>
-        </w:rPr>
-        <w:t>const r = pm.response.json();</w:t>
-        <w:br/>
-        <w:t>if (r.id) {</w:t>
-        <w:br/>
-        <w:t xml:space="preserve">    pm.environment.set("store_id", r.id);</w:t>
-        <w:br/>
-        <w:t xml:space="preserve">    console.log("store_id saved:", r.id);</w:t>
-        <w:br/>
-        <w:t>}</w:t>
-      </w:r>
-    </w:p>
-    <w:p>
-      <w:pPr>
-        <w:pStyle w:val="Heading2"/>
-      </w:pPr>
-      <w:r>
-        <w:t>Auto-Save Product ID  (paste in Tests tab of Create Product request)</w:t>
-      </w:r>
-    </w:p>
-    <w:p>
-      <w:pPr>
-        <w:spacing w:before="40" w:after="40"/>
-        <w:ind w:left="288"/>
-        <w:shd w:val="clear" w:color="auto" w:fill="F0F0F0"/>
-      </w:pPr>
-      <w:r>
-        <w:rPr>
-          <w:rFonts w:ascii="Courier New" w:hAnsi="Courier New"/>
-          <w:color w:val="1A1A8C"/>
-          <w:sz w:val="18"/>
-        </w:rPr>
-        <w:t>const r = pm.response.json();</w:t>
-        <w:br/>
-        <w:t>if (r.id) {</w:t>
-        <w:br/>
-        <w:t xml:space="preserve">    pm.environment.set("product_id", r.id);</w:t>
-        <w:br/>
-        <w:t xml:space="preserve">    console.log("product_id saved:", r.id);</w:t>
-        <w:br/>
-        <w:t>}</w:t>
-      </w:r>
-    </w:p>
-    <w:p>
-      <w:pPr>
-        <w:pStyle w:val="Heading2"/>
-      </w:pPr>
-      <w:r>
-        <w:t>Auto-Save Video ID  (paste in Tests tab of Request Upload URL request)</w:t>
-      </w:r>
-    </w:p>
-    <w:p>
-      <w:pPr>
-        <w:spacing w:before="40" w:after="40"/>
-        <w:ind w:left="288"/>
-        <w:shd w:val="clear" w:color="auto" w:fill="F0F0F0"/>
-      </w:pPr>
-      <w:r>
-        <w:rPr>
-          <w:rFonts w:ascii="Courier New" w:hAnsi="Courier New"/>
-          <w:color w:val="1A1A8C"/>
-          <w:sz w:val="18"/>
-        </w:rPr>
-        <w:t>const r = pm.response.json();</w:t>
-        <w:br/>
-        <w:t>if (r.video_id) {</w:t>
-        <w:br/>
-        <w:t xml:space="preserve">    pm.environment.set("video_id", r.video_id);</w:t>
-        <w:br/>
-        <w:t xml:space="preserve">    pm.environment.set("upload_url", r.upload_url);</w:t>
-        <w:br/>
-        <w:t xml:space="preserve">    console.log("video_id saved:", r.video_id);</w:t>
-        <w:br/>
-        <w:t>}</w:t>
-      </w:r>
-    </w:p>
-    <w:p>
-      <w:pPr>
-        <w:pStyle w:val="Heading2"/>
-      </w:pPr>
-      <w:r>
-        <w:t>Auto-Save Conversation ID  (paste in Tests tab of Start Conversation request)</w:t>
-      </w:r>
-    </w:p>
-    <w:p>
-      <w:pPr>
-        <w:spacing w:before="40" w:after="40"/>
-        <w:ind w:left="288"/>
-        <w:shd w:val="clear" w:color="auto" w:fill="F0F0F0"/>
-      </w:pPr>
-      <w:r>
-        <w:rPr>
-          <w:rFonts w:ascii="Courier New" w:hAnsi="Courier New"/>
-          <w:color w:val="1A1A8C"/>
-          <w:sz w:val="18"/>
-        </w:rPr>
-        <w:t>const r = pm.response.json();</w:t>
-        <w:br/>
-        <w:t>if (r.id) {</w:t>
-        <w:br/>
-        <w:t xml:space="preserve">    pm.environment.set("conversation_id", r.id);</w:t>
-        <w:br/>
-        <w:t xml:space="preserve">    console.log("conversation_id saved:", r.id);</w:t>
-        <w:br/>
-        <w:t>}</w:t>
-      </w:r>
-    </w:p>
-    <w:p>
-      <w:pPr>
-        <w:pStyle w:val="Heading2"/>
-      </w:pPr>
-      <w:r>
-        <w:t>Quick Test — All Public Endpoints via curl</w:t>
-      </w:r>
-    </w:p>
-    <w:p>
-      <w:r>
-        <w:rPr>
-          <w:b w:val="0"/>
-          <w:sz w:val="22"/>
-        </w:rPr>
-        <w:t>Copy-paste these into terminal to test without Postman:</w:t>
-      </w:r>
-    </w:p>
-    <w:p>
-      <w:pPr>
-        <w:spacing w:before="40" w:after="40"/>
-        <w:ind w:left="288"/>
-        <w:shd w:val="clear" w:color="auto" w:fill="F0F0F0"/>
-      </w:pPr>
-      <w:r>
-        <w:rPr>
-          <w:rFonts w:ascii="Courier New" w:hAnsi="Courier New"/>
-          <w:color w:val="1A1A8C"/>
-          <w:sz w:val="18"/>
-        </w:rPr>
-        <w:t># Health check</w:t>
-        <w:br/>
-        <w:t>curl -s http://localhost:8000/api/v1/health/ | python3 -m json.tool</w:t>
-        <w:br/>
-        <w:br/>
-        <w:t># Send OTP</w:t>
-        <w:br/>
-        <w:t>curl -s -X POST http://localhost:8000/api/v1/auth/otp/send/ \</w:t>
-        <w:br/>
-        <w:t xml:space="preserve">  -H "Content-Type: application/json" \</w:t>
-        <w:br/>
-        <w:t xml:space="preserve">  -d '{"phone_number": "+919999999999"}'</w:t>
-        <w:br/>
-        <w:br/>
-        <w:t># Verify OTP (copy access token from response)</w:t>
-        <w:br/>
-        <w:t>curl -s -X POST http://localhost:8000/api/v1/auth/otp/verify/ \</w:t>
-        <w:br/>
-        <w:t xml:space="preserve">  -H "Content-Type: application/json" \</w:t>
-        <w:br/>
-        <w:t xml:space="preserve">  -d '{"phone_number": "+919999999999", "otp": "123456"}'</w:t>
-        <w:br/>
-        <w:br/>
-        <w:t># Get profile (replace TOKEN with your access token)</w:t>
-        <w:br/>
-        <w:t>curl -s http://localhost:8000/api/v1/auth/me/ \</w:t>
-        <w:br/>
-        <w:t xml:space="preserve">  -H "Authorization: Bearer TOKEN"</w:t>
-      </w:r>
-    </w:p>
-    <w:p>
-      <w:r>
-        <w:br w:type="page"/>
-      </w:r>
-    </w:p>
-    <w:p>
-      <w:pPr>
-        <w:pStyle w:val="Heading1"/>
-      </w:pPr>
-      <w:r>
-        <w:t>6. How to Update This Document (Future Sprints)</w:t>
-      </w:r>
-    </w:p>
-    <w:p>
-      <w:pPr>
-        <w:ind w:left="288"/>
-        <w:shd w:val="clear" w:color="auto" w:fill="D1ECF1"/>
-      </w:pPr>
-      <w:r>
-        <w:rPr>
-          <w:i/>
-          <w:color w:val="0C5460"/>
-          <w:sz w:val="20"/>
-        </w:rPr>
-        <w:t xml:space="preserve">  📌  IMPORTANT: When a new sprint adds new API endpoints, update this document.</w:t>
-        <w:br/>
-        <w:t xml:space="preserve">     Do NOT create a separate doc — keep everything in this single file.</w:t>
-      </w:r>
-    </w:p>
-    <w:p/>
-    <w:p>
-      <w:pPr>
-        <w:pStyle w:val="Heading2"/>
-      </w:pPr>
-      <w:r>
-        <w:t>Checklist for each new sprint:</w:t>
-      </w:r>
-    </w:p>
-    <w:p>
-      <w:pPr>
-        <w:pStyle w:val="ListBullet"/>
-        <w:ind w:left="432"/>
-      </w:pPr>
-      <w:r>
-        <w:rPr>
-          <w:sz w:val="21"/>
-        </w:rPr>
-        <w:t>Add new endpoint rows to Section 2 — Complete API Reference table</w:t>
-      </w:r>
-    </w:p>
-    <w:p>
-      <w:pPr>
-        <w:pStyle w:val="ListBullet"/>
-        <w:ind w:left="432"/>
-      </w:pPr>
-      <w:r>
-        <w:rPr>
-          <w:sz w:val="21"/>
-        </w:rPr>
-        <w:t>Add new STEP sections in Section 3 — Step-by-Step Test Flow</w:t>
-      </w:r>
-    </w:p>
-    <w:p>
-      <w:pPr>
-        <w:pStyle w:val="ListBullet"/>
-        <w:ind w:left="432"/>
-      </w:pPr>
-      <w:r>
-        <w:rPr>
-          <w:sz w:val="21"/>
-        </w:rPr>
-        <w:t>Add new error cases in Section 4 — Error Cases to Test</w:t>
-      </w:r>
-    </w:p>
-    <w:p>
-      <w:pPr>
-        <w:pStyle w:val="ListBullet"/>
-        <w:ind w:left="432"/>
-      </w:pPr>
-      <w:r>
-        <w:rPr>
-          <w:sz w:val="21"/>
-        </w:rPr>
-        <w:t>Add new Postman folder in Section 5 — Postman Quick Setup</w:t>
-      </w:r>
-    </w:p>
-    <w:p>
-      <w:pPr>
-        <w:pStyle w:val="ListBullet"/>
-        <w:ind w:left="432"/>
-      </w:pPr>
-      <w:r>
-        <w:rPr>
-          <w:sz w:val="21"/>
-        </w:rPr>
-        <w:t>Update the cover page "Last updated" date and sprint range</w:t>
-      </w:r>
-    </w:p>
-    <w:p>
-      <w:pPr>
-        <w:pStyle w:val="ListBullet"/>
-        <w:ind w:left="432"/>
-      </w:pPr>
-      <w:r>
-        <w:rPr>
-          <w:sz w:val="21"/>
-        </w:rPr>
-        <w:t>If new field types are introduced (e.g. file uploads), add a format rules subsection in Section 1</w:t>
-      </w:r>
-    </w:p>
-    <w:p>
-      <w:pPr>
-        <w:pStyle w:val="Heading2"/>
-      </w:pPr>
-      <w:r>
-        <w:t>Upcoming Sprints to Add Here</w:t>
+        <w:t>Video Error Cases  (Sprint 4)</w:t>
       </w:r>
     </w:p>
     <w:tbl>
@@ -16011,7 +16019,7 @@
       <w:tr>
         <w:tc>
           <w:tcPr>
-            <w:tcW w:type="dxa" w:w="1152"/>
+            <w:tcW w:type="dxa" w:w="2880"/>
             <w:shd w:val="clear" w:color="auto" w:fill="1F4E79"/>
           </w:tcPr>
           <w:p>
@@ -16021,13 +16029,13 @@
                 <w:color w:val="FFFFFF"/>
                 <w:sz w:val="20"/>
               </w:rPr>
-              <w:t>Sprint</w:t>
-            </w:r>
-          </w:p>
-        </w:tc>
-        <w:tc>
-          <w:tcPr>
-            <w:tcW w:type="dxa" w:w="2160"/>
+              <w:t>Test</w:t>
+            </w:r>
+          </w:p>
+        </w:tc>
+        <w:tc>
+          <w:tcPr>
+            <w:tcW w:type="dxa" w:w="3456"/>
             <w:shd w:val="clear" w:color="auto" w:fill="1F4E79"/>
           </w:tcPr>
           <w:p>
@@ -16037,13 +16045,13 @@
                 <w:color w:val="FFFFFF"/>
                 <w:sz w:val="20"/>
               </w:rPr>
-              <w:t>Module</w:t>
-            </w:r>
-          </w:p>
-        </w:tc>
-        <w:tc>
-          <w:tcPr>
-            <w:tcW w:type="dxa" w:w="6048"/>
+              <w:t>Request</w:t>
+            </w:r>
+          </w:p>
+        </w:tc>
+        <w:tc>
+          <w:tcPr>
+            <w:tcW w:type="dxa" w:w="3168"/>
             <w:shd w:val="clear" w:color="auto" w:fill="1F4E79"/>
           </w:tcPr>
           <w:p>
@@ -16053,7 +16061,7 @@
                 <w:color w:val="FFFFFF"/>
                 <w:sz w:val="20"/>
               </w:rPr>
-              <w:t>APIs to Add</w:t>
+              <w:t>Expected Response</w:t>
             </w:r>
           </w:p>
         </w:tc>
@@ -16061,6 +16069,1104 @@
       <w:tr>
         <w:tc>
           <w:tcPr>
+            <w:tcW w:type="dxa" w:w="2880"/>
+            <w:shd w:val="clear" w:color="auto" w:fill="DEEAF1"/>
+          </w:tcPr>
+          <w:p>
+            <w:r>
+              <w:rPr>
+                <w:sz w:val="19"/>
+              </w:rPr>
+              <w:t>No store — request upload</w:t>
+            </w:r>
+          </w:p>
+        </w:tc>
+        <w:tc>
+          <w:tcPr>
+            <w:tcW w:type="dxa" w:w="3456"/>
+            <w:shd w:val="clear" w:color="auto" w:fill="DEEAF1"/>
+          </w:tcPr>
+          <w:p>
+            <w:r>
+              <w:rPr>
+                <w:sz w:val="19"/>
+              </w:rPr>
+              <w:t>POST /videos/request-upload/ before store created</w:t>
+            </w:r>
+          </w:p>
+        </w:tc>
+        <w:tc>
+          <w:tcPr>
+            <w:tcW w:type="dxa" w:w="3168"/>
+            <w:shd w:val="clear" w:color="auto" w:fill="DEEAF1"/>
+          </w:tcPr>
+          <w:p>
+            <w:r>
+              <w:rPr>
+                <w:sz w:val="19"/>
+              </w:rPr>
+              <w:t>400 — Create a store first</w:t>
+            </w:r>
+          </w:p>
+        </w:tc>
+      </w:tr>
+      <w:tr>
+        <w:tc>
+          <w:tcPr>
+            <w:tcW w:type="dxa" w:w="2880"/>
+          </w:tcPr>
+          <w:p>
+            <w:r>
+              <w:rPr>
+                <w:sz w:val="19"/>
+              </w:rPr>
+              <w:t>Missing title</w:t>
+            </w:r>
+          </w:p>
+        </w:tc>
+        <w:tc>
+          <w:tcPr>
+            <w:tcW w:type="dxa" w:w="3456"/>
+          </w:tcPr>
+          <w:p>
+            <w:r>
+              <w:rPr>
+                <w:sz w:val="19"/>
+              </w:rPr>
+              <w:t>POST /videos/request-upload/ with no title field</w:t>
+            </w:r>
+          </w:p>
+        </w:tc>
+        <w:tc>
+          <w:tcPr>
+            <w:tcW w:type="dxa" w:w="3168"/>
+          </w:tcPr>
+          <w:p>
+            <w:r>
+              <w:rPr>
+                <w:sz w:val="19"/>
+              </w:rPr>
+              <w:t>400 — This field is required</w:t>
+            </w:r>
+          </w:p>
+        </w:tc>
+      </w:tr>
+      <w:tr>
+        <w:tc>
+          <w:tcPr>
+            <w:tcW w:type="dxa" w:w="2880"/>
+            <w:shd w:val="clear" w:color="auto" w:fill="DEEAF1"/>
+          </w:tcPr>
+          <w:p>
+            <w:r>
+              <w:rPr>
+                <w:sz w:val="19"/>
+              </w:rPr>
+              <w:t>Customer calls request-upload</w:t>
+            </w:r>
+          </w:p>
+        </w:tc>
+        <w:tc>
+          <w:tcPr>
+            <w:tcW w:type="dxa" w:w="3456"/>
+            <w:shd w:val="clear" w:color="auto" w:fill="DEEAF1"/>
+          </w:tcPr>
+          <w:p>
+            <w:r>
+              <w:rPr>
+                <w:sz w:val="19"/>
+              </w:rPr>
+              <w:t>POST /videos/request-upload/ with customer token</w:t>
+            </w:r>
+          </w:p>
+        </w:tc>
+        <w:tc>
+          <w:tcPr>
+            <w:tcW w:type="dxa" w:w="3168"/>
+            <w:shd w:val="clear" w:color="auto" w:fill="DEEAF1"/>
+          </w:tcPr>
+          <w:p>
+            <w:r>
+              <w:rPr>
+                <w:sz w:val="19"/>
+              </w:rPr>
+              <w:t>403 — Vendor access only</w:t>
+            </w:r>
+          </w:p>
+        </w:tc>
+      </w:tr>
+      <w:tr>
+        <w:tc>
+          <w:tcPr>
+            <w:tcW w:type="dxa" w:w="2880"/>
+          </w:tcPr>
+          <w:p>
+            <w:r>
+              <w:rPr>
+                <w:sz w:val="19"/>
+              </w:rPr>
+              <w:t>Confirm already-ready video</w:t>
+            </w:r>
+          </w:p>
+        </w:tc>
+        <w:tc>
+          <w:tcPr>
+            <w:tcW w:type="dxa" w:w="3456"/>
+          </w:tcPr>
+          <w:p>
+            <w:r>
+              <w:rPr>
+                <w:sz w:val="19"/>
+              </w:rPr>
+              <w:t>POST /videos/&lt;id&gt;/confirm-upload/ on ready video</w:t>
+            </w:r>
+          </w:p>
+        </w:tc>
+        <w:tc>
+          <w:tcPr>
+            <w:tcW w:type="dxa" w:w="3168"/>
+          </w:tcPr>
+          <w:p>
+            <w:r>
+              <w:rPr>
+                <w:sz w:val="19"/>
+              </w:rPr>
+              <w:t>400 — Video already in "ready" state</w:t>
+            </w:r>
+          </w:p>
+        </w:tc>
+      </w:tr>
+      <w:tr>
+        <w:tc>
+          <w:tcPr>
+            <w:tcW w:type="dxa" w:w="2880"/>
+            <w:shd w:val="clear" w:color="auto" w:fill="DEEAF1"/>
+          </w:tcPr>
+          <w:p>
+            <w:r>
+              <w:rPr>
+                <w:sz w:val="19"/>
+              </w:rPr>
+              <w:t>Duration too long</w:t>
+            </w:r>
+          </w:p>
+        </w:tc>
+        <w:tc>
+          <w:tcPr>
+            <w:tcW w:type="dxa" w:w="3456"/>
+            <w:shd w:val="clear" w:color="auto" w:fill="DEEAF1"/>
+          </w:tcPr>
+          <w:p>
+            <w:r>
+              <w:rPr>
+                <w:sz w:val="19"/>
+              </w:rPr>
+              <w:t>POST /videos/&lt;id&gt;/confirm-upload/ — duration_seconds=120</w:t>
+            </w:r>
+          </w:p>
+        </w:tc>
+        <w:tc>
+          <w:tcPr>
+            <w:tcW w:type="dxa" w:w="3168"/>
+            <w:shd w:val="clear" w:color="auto" w:fill="DEEAF1"/>
+          </w:tcPr>
+          <w:p>
+            <w:r>
+              <w:rPr>
+                <w:sz w:val="19"/>
+              </w:rPr>
+              <w:t>400 — cannot exceed 60 seconds</w:t>
+            </w:r>
+          </w:p>
+        </w:tc>
+      </w:tr>
+      <w:tr>
+        <w:tc>
+          <w:tcPr>
+            <w:tcW w:type="dxa" w:w="2880"/>
+          </w:tcPr>
+          <w:p>
+            <w:r>
+              <w:rPr>
+                <w:sz w:val="19"/>
+              </w:rPr>
+              <w:t>Confirm another vendor video</w:t>
+            </w:r>
+          </w:p>
+        </w:tc>
+        <w:tc>
+          <w:tcPr>
+            <w:tcW w:type="dxa" w:w="3456"/>
+          </w:tcPr>
+          <w:p>
+            <w:r>
+              <w:rPr>
+                <w:sz w:val="19"/>
+              </w:rPr>
+              <w:t>POST /videos/&lt;id&gt;/confirm-upload/ — wrong vendor</w:t>
+            </w:r>
+          </w:p>
+        </w:tc>
+        <w:tc>
+          <w:tcPr>
+            <w:tcW w:type="dxa" w:w="3168"/>
+          </w:tcPr>
+          <w:p>
+            <w:r>
+              <w:rPr>
+                <w:sz w:val="19"/>
+              </w:rPr>
+              <w:t>404 — not_found</w:t>
+            </w:r>
+          </w:p>
+        </w:tc>
+      </w:tr>
+      <w:tr>
+        <w:tc>
+          <w:tcPr>
+            <w:tcW w:type="dxa" w:w="2880"/>
+            <w:shd w:val="clear" w:color="auto" w:fill="DEEAF1"/>
+          </w:tcPr>
+          <w:p>
+            <w:r>
+              <w:rPr>
+                <w:sz w:val="19"/>
+              </w:rPr>
+              <w:t>Feed without lat/lng</w:t>
+            </w:r>
+          </w:p>
+        </w:tc>
+        <w:tc>
+          <w:tcPr>
+            <w:tcW w:type="dxa" w:w="3456"/>
+            <w:shd w:val="clear" w:color="auto" w:fill="DEEAF1"/>
+          </w:tcPr>
+          <w:p>
+            <w:r>
+              <w:rPr>
+                <w:sz w:val="19"/>
+              </w:rPr>
+              <w:t>GET /videos/feed/ — no ?lat=&amp;lng= params</w:t>
+            </w:r>
+          </w:p>
+        </w:tc>
+        <w:tc>
+          <w:tcPr>
+            <w:tcW w:type="dxa" w:w="3168"/>
+            <w:shd w:val="clear" w:color="auto" w:fill="DEEAF1"/>
+          </w:tcPr>
+          <w:p>
+            <w:r>
+              <w:rPr>
+                <w:sz w:val="19"/>
+              </w:rPr>
+              <w:t>400 — lat and lng are required numbers</w:t>
+            </w:r>
+          </w:p>
+        </w:tc>
+      </w:tr>
+      <w:tr>
+        <w:tc>
+          <w:tcPr>
+            <w:tcW w:type="dxa" w:w="2880"/>
+          </w:tcPr>
+          <w:p>
+            <w:r>
+              <w:rPr>
+                <w:sz w:val="19"/>
+              </w:rPr>
+              <w:t>Detail on processing video</w:t>
+            </w:r>
+          </w:p>
+        </w:tc>
+        <w:tc>
+          <w:tcPr>
+            <w:tcW w:type="dxa" w:w="3456"/>
+          </w:tcPr>
+          <w:p>
+            <w:r>
+              <w:rPr>
+                <w:sz w:val="19"/>
+              </w:rPr>
+              <w:t>GET /videos/&lt;id&gt;/ while status=processing</w:t>
+            </w:r>
+          </w:p>
+        </w:tc>
+        <w:tc>
+          <w:tcPr>
+            <w:tcW w:type="dxa" w:w="3168"/>
+          </w:tcPr>
+          <w:p>
+            <w:r>
+              <w:rPr>
+                <w:sz w:val="19"/>
+              </w:rPr>
+              <w:t>404 — not_found (only ready shown)</w:t>
+            </w:r>
+          </w:p>
+        </w:tc>
+      </w:tr>
+      <w:tr>
+        <w:tc>
+          <w:tcPr>
+            <w:tcW w:type="dxa" w:w="2880"/>
+            <w:shd w:val="clear" w:color="auto" w:fill="DEEAF1"/>
+          </w:tcPr>
+          <w:p>
+            <w:r>
+              <w:rPr>
+                <w:sz w:val="19"/>
+              </w:rPr>
+              <w:t>Like without auth</w:t>
+            </w:r>
+          </w:p>
+        </w:tc>
+        <w:tc>
+          <w:tcPr>
+            <w:tcW w:type="dxa" w:w="3456"/>
+            <w:shd w:val="clear" w:color="auto" w:fill="DEEAF1"/>
+          </w:tcPr>
+          <w:p>
+            <w:r>
+              <w:rPr>
+                <w:sz w:val="19"/>
+              </w:rPr>
+              <w:t>POST /videos/&lt;id&gt;/like/ — no auth header</w:t>
+            </w:r>
+          </w:p>
+        </w:tc>
+        <w:tc>
+          <w:tcPr>
+            <w:tcW w:type="dxa" w:w="3168"/>
+            <w:shd w:val="clear" w:color="auto" w:fill="DEEAF1"/>
+          </w:tcPr>
+          <w:p>
+            <w:r>
+              <w:rPr>
+                <w:sz w:val="19"/>
+              </w:rPr>
+              <w:t>401 — authentication_failed</w:t>
+            </w:r>
+          </w:p>
+        </w:tc>
+      </w:tr>
+      <w:tr>
+        <w:tc>
+          <w:tcPr>
+            <w:tcW w:type="dxa" w:w="2880"/>
+          </w:tcPr>
+          <w:p>
+            <w:r>
+              <w:rPr>
+                <w:sz w:val="19"/>
+              </w:rPr>
+              <w:t>Update another vendor video</w:t>
+            </w:r>
+          </w:p>
+        </w:tc>
+        <w:tc>
+          <w:tcPr>
+            <w:tcW w:type="dxa" w:w="3456"/>
+          </w:tcPr>
+          <w:p>
+            <w:r>
+              <w:rPr>
+                <w:sz w:val="19"/>
+              </w:rPr>
+              <w:t>PATCH /videos/&lt;id&gt;/update/ — different vendor token</w:t>
+            </w:r>
+          </w:p>
+        </w:tc>
+        <w:tc>
+          <w:tcPr>
+            <w:tcW w:type="dxa" w:w="3168"/>
+          </w:tcPr>
+          <w:p>
+            <w:r>
+              <w:rPr>
+                <w:sz w:val="19"/>
+              </w:rPr>
+              <w:t>404 — not_found</w:t>
+            </w:r>
+          </w:p>
+        </w:tc>
+      </w:tr>
+      <w:tr>
+        <w:tc>
+          <w:tcPr>
+            <w:tcW w:type="dxa" w:w="2880"/>
+            <w:shd w:val="clear" w:color="auto" w:fill="DEEAF1"/>
+          </w:tcPr>
+          <w:p>
+            <w:r>
+              <w:rPr>
+                <w:sz w:val="19"/>
+              </w:rPr>
+              <w:t>Delete another vendor video</w:t>
+            </w:r>
+          </w:p>
+        </w:tc>
+        <w:tc>
+          <w:tcPr>
+            <w:tcW w:type="dxa" w:w="3456"/>
+            <w:shd w:val="clear" w:color="auto" w:fill="DEEAF1"/>
+          </w:tcPr>
+          <w:p>
+            <w:r>
+              <w:rPr>
+                <w:sz w:val="19"/>
+              </w:rPr>
+              <w:t>DELETE /videos/&lt;id&gt;/delete/ — different vendor</w:t>
+            </w:r>
+          </w:p>
+        </w:tc>
+        <w:tc>
+          <w:tcPr>
+            <w:tcW w:type="dxa" w:w="3168"/>
+            <w:shd w:val="clear" w:color="auto" w:fill="DEEAF1"/>
+          </w:tcPr>
+          <w:p>
+            <w:r>
+              <w:rPr>
+                <w:sz w:val="19"/>
+              </w:rPr>
+              <w:t>404 — not_found</w:t>
+            </w:r>
+          </w:p>
+        </w:tc>
+      </w:tr>
+      <w:tr>
+        <w:tc>
+          <w:tcPr>
+            <w:tcW w:type="dxa" w:w="2880"/>
+          </w:tcPr>
+          <w:p>
+            <w:r>
+              <w:rPr>
+                <w:sz w:val="19"/>
+              </w:rPr>
+              <w:t>Delete with customer token</w:t>
+            </w:r>
+          </w:p>
+        </w:tc>
+        <w:tc>
+          <w:tcPr>
+            <w:tcW w:type="dxa" w:w="3456"/>
+          </w:tcPr>
+          <w:p>
+            <w:r>
+              <w:rPr>
+                <w:sz w:val="19"/>
+              </w:rPr>
+              <w:t>DELETE /videos/&lt;id&gt;/delete/ — customer token</w:t>
+            </w:r>
+          </w:p>
+        </w:tc>
+        <w:tc>
+          <w:tcPr>
+            <w:tcW w:type="dxa" w:w="3168"/>
+          </w:tcPr>
+          <w:p>
+            <w:r>
+              <w:rPr>
+                <w:sz w:val="19"/>
+              </w:rPr>
+              <w:t>403 — Vendor access only</w:t>
+            </w:r>
+          </w:p>
+        </w:tc>
+      </w:tr>
+    </w:tbl>
+    <w:p/>
+    <w:p>
+      <w:r>
+        <w:br w:type="page"/>
+      </w:r>
+    </w:p>
+    <w:p>
+      <w:pPr>
+        <w:pStyle w:val="Heading1"/>
+      </w:pPr>
+      <w:r>
+        <w:t>5. Postman Quick Setup</w:t>
+      </w:r>
+    </w:p>
+    <w:p>
+      <w:pPr>
+        <w:pStyle w:val="Heading2"/>
+      </w:pPr>
+      <w:r>
+        <w:t>Collection Folder Structure (recommended)</w:t>
+      </w:r>
+    </w:p>
+    <w:p>
+      <w:pPr>
+        <w:spacing w:before="40" w:after="40"/>
+        <w:ind w:left="288"/>
+        <w:shd w:val="clear" w:color="auto" w:fill="F0F0F0"/>
+      </w:pPr>
+      <w:r>
+        <w:rPr>
+          <w:rFonts w:ascii="Courier New" w:hAnsi="Courier New"/>
+          <w:color w:val="1A1A8C"/>
+          <w:sz w:val="18"/>
+        </w:rPr>
+        <w:t>NearKart Local</w:t>
+        <w:br/>
+        <w:t>├── 0. Setup</w:t>
+        <w:br/>
+        <w:t>│   └── Health Check</w:t>
+        <w:br/>
+        <w:t>├── 1. Auth</w:t>
+        <w:br/>
+        <w:t>│   ├── Send OTP (Vendor)</w:t>
+        <w:br/>
+        <w:t>│   ├── Verify OTP (Vendor) ← Tests script saves vendor_token</w:t>
+        <w:br/>
+        <w:t>│   ├── Send OTP (Customer)</w:t>
+        <w:br/>
+        <w:t>│   ├── Verify OTP (Customer) ← Tests script saves customer_token + customer_id</w:t>
+        <w:br/>
+        <w:t>│   ├── Get Profile</w:t>
+        <w:br/>
+        <w:t>│   ├── Update Profile</w:t>
+        <w:br/>
+        <w:t>│   ├── Update Location</w:t>
+        <w:br/>
+        <w:t>│   ├── Refresh Token</w:t>
+        <w:br/>
+        <w:t>│   └── Logout</w:t>
+        <w:br/>
+        <w:t>├── 2. Stores</w:t>
+        <w:br/>
+        <w:t>│   ├── Create Store ← Tests script saves store_id</w:t>
+        <w:br/>
+        <w:t>│   ├── Nearby Stores</w:t>
+        <w:br/>
+        <w:t>│   ├── Store Detail</w:t>
+        <w:br/>
+        <w:t>│   ├── Update Store</w:t>
+        <w:br/>
+        <w:t>│   ├── Follow Store</w:t>
+        <w:br/>
+        <w:t>│   ├── Review Store</w:t>
+        <w:br/>
+        <w:t>│   └── QR Code</w:t>
+        <w:br/>
+        <w:t>├── 3. Products</w:t>
+        <w:br/>
+        <w:t>│   ├── Create Product ← Tests script saves product_id</w:t>
+        <w:br/>
+        <w:t>│   ├── Nearby Products</w:t>
+        <w:br/>
+        <w:t>│   ├── Search Products</w:t>
+        <w:br/>
+        <w:t>│   ├── Product Detail</w:t>
+        <w:br/>
+        <w:t>│   ├── Update Product</w:t>
+        <w:br/>
+        <w:t>│   ├── Delete Product</w:t>
+        <w:br/>
+        <w:t>│   └── Wishlist Toggle</w:t>
+        <w:br/>
+        <w:t>├── 4. Videos</w:t>
+        <w:br/>
+        <w:t>│   ├── Request Upload URL ← Tests script saves video_id</w:t>
+        <w:br/>
+        <w:t>│   ├── Confirm Upload</w:t>
+        <w:br/>
+        <w:t>│   ├── My Videos (Vendor Library)</w:t>
+        <w:br/>
+        <w:t>│   ├── Update Video</w:t>
+        <w:br/>
+        <w:t>│   ├── Video Feed</w:t>
+        <w:br/>
+        <w:t>│   ├── Video Detail</w:t>
+        <w:br/>
+        <w:t>│   ├── Like / Unlike Video</w:t>
+        <w:br/>
+        <w:t>│   └── Delete Video</w:t>
+        <w:br/>
+        <w:t>├── 5. Chat</w:t>
+        <w:br/>
+        <w:t>│   ├── Start Conversation ← Tests script saves conversation_id</w:t>
+        <w:br/>
+        <w:t>│   ├── List Conversations (Inbox)</w:t>
+        <w:br/>
+        <w:t>│   ├── Message History</w:t>
+        <w:br/>
+        <w:t>│   ├── Mark as Read</w:t>
+        <w:br/>
+        <w:t>│   └── [WebSocket] Connect + Send  (use Postman WS tab or wscat)</w:t>
+        <w:br/>
+        <w:t>└── 6. Blacklist</w:t>
+        <w:br/>
+        <w:t xml:space="preserve">    ├── Block Customer  (vendor token + store_id + customer_id)</w:t>
+        <w:br/>
+        <w:t xml:space="preserve">    ├── List Blocked Customers  (vendor token + store_id)</w:t>
+        <w:br/>
+        <w:t xml:space="preserve">    └── Unblock Customer  (same endpoint as Block — toggle)</w:t>
+      </w:r>
+    </w:p>
+    <w:p>
+      <w:pPr>
+        <w:pStyle w:val="Heading2"/>
+      </w:pPr>
+      <w:r>
+        <w:t>Auto-Save Token Script  (paste in Tests tab of Verify OTP request)</w:t>
+      </w:r>
+    </w:p>
+    <w:p>
+      <w:pPr>
+        <w:spacing w:before="40" w:after="40"/>
+        <w:ind w:left="288"/>
+        <w:shd w:val="clear" w:color="auto" w:fill="F0F0F0"/>
+      </w:pPr>
+      <w:r>
+        <w:rPr>
+          <w:rFonts w:ascii="Courier New" w:hAnsi="Courier New"/>
+          <w:color w:val="1A1A8C"/>
+          <w:sz w:val="18"/>
+        </w:rPr>
+        <w:t>// For VENDOR verify OTP request:</w:t>
+        <w:br/>
+        <w:t>const r = pm.response.json();</w:t>
+        <w:br/>
+        <w:t>if (r.access) {</w:t>
+        <w:br/>
+        <w:t xml:space="preserve">    pm.environment.set("vendor_token", r.access);</w:t>
+        <w:br/>
+        <w:t xml:space="preserve">    pm.environment.set("vendor_refresh", r.refresh);</w:t>
+        <w:br/>
+        <w:t xml:space="preserve">    console.log("Vendor token saved:", r.access.substring(0, 30) + "...");</w:t>
+        <w:br/>
+        <w:t>}</w:t>
+        <w:br/>
+        <w:br/>
+        <w:t>// For CUSTOMER verify OTP request — use this instead:</w:t>
+        <w:br/>
+        <w:t>// pm.environment.set("customer_token", r.access);</w:t>
+        <w:br/>
+        <w:t>// pm.environment.set("customer_refresh", r.refresh);</w:t>
+      </w:r>
+    </w:p>
+    <w:p>
+      <w:pPr>
+        <w:pStyle w:val="Heading2"/>
+      </w:pPr>
+      <w:r>
+        <w:t>Auto-Save Store ID  (paste in Tests tab of Create Store request)</w:t>
+      </w:r>
+    </w:p>
+    <w:p>
+      <w:pPr>
+        <w:spacing w:before="40" w:after="40"/>
+        <w:ind w:left="288"/>
+        <w:shd w:val="clear" w:color="auto" w:fill="F0F0F0"/>
+      </w:pPr>
+      <w:r>
+        <w:rPr>
+          <w:rFonts w:ascii="Courier New" w:hAnsi="Courier New"/>
+          <w:color w:val="1A1A8C"/>
+          <w:sz w:val="18"/>
+        </w:rPr>
+        <w:t>const r = pm.response.json();</w:t>
+        <w:br/>
+        <w:t>if (r.id) {</w:t>
+        <w:br/>
+        <w:t xml:space="preserve">    pm.environment.set("store_id", r.id);</w:t>
+        <w:br/>
+        <w:t xml:space="preserve">    console.log("store_id saved:", r.id);</w:t>
+        <w:br/>
+        <w:t>}</w:t>
+      </w:r>
+    </w:p>
+    <w:p>
+      <w:pPr>
+        <w:pStyle w:val="Heading2"/>
+      </w:pPr>
+      <w:r>
+        <w:t>Auto-Save Product ID  (paste in Tests tab of Create Product request)</w:t>
+      </w:r>
+    </w:p>
+    <w:p>
+      <w:pPr>
+        <w:spacing w:before="40" w:after="40"/>
+        <w:ind w:left="288"/>
+        <w:shd w:val="clear" w:color="auto" w:fill="F0F0F0"/>
+      </w:pPr>
+      <w:r>
+        <w:rPr>
+          <w:rFonts w:ascii="Courier New" w:hAnsi="Courier New"/>
+          <w:color w:val="1A1A8C"/>
+          <w:sz w:val="18"/>
+        </w:rPr>
+        <w:t>const r = pm.response.json();</w:t>
+        <w:br/>
+        <w:t>if (r.id) {</w:t>
+        <w:br/>
+        <w:t xml:space="preserve">    pm.environment.set("product_id", r.id);</w:t>
+        <w:br/>
+        <w:t xml:space="preserve">    console.log("product_id saved:", r.id);</w:t>
+        <w:br/>
+        <w:t>}</w:t>
+      </w:r>
+    </w:p>
+    <w:p>
+      <w:pPr>
+        <w:pStyle w:val="Heading2"/>
+      </w:pPr>
+      <w:r>
+        <w:t>Auto-Save Video ID  (paste in Tests tab of Request Upload URL request)</w:t>
+      </w:r>
+    </w:p>
+    <w:p>
+      <w:pPr>
+        <w:spacing w:before="40" w:after="40"/>
+        <w:ind w:left="288"/>
+        <w:shd w:val="clear" w:color="auto" w:fill="F0F0F0"/>
+      </w:pPr>
+      <w:r>
+        <w:rPr>
+          <w:rFonts w:ascii="Courier New" w:hAnsi="Courier New"/>
+          <w:color w:val="1A1A8C"/>
+          <w:sz w:val="18"/>
+        </w:rPr>
+        <w:t>const r = pm.response.json();</w:t>
+        <w:br/>
+        <w:t>if (r.video_id) {</w:t>
+        <w:br/>
+        <w:t xml:space="preserve">    pm.environment.set("video_id", r.video_id);</w:t>
+        <w:br/>
+        <w:t xml:space="preserve">    pm.environment.set("upload_url", r.upload_url);</w:t>
+        <w:br/>
+        <w:t xml:space="preserve">    console.log("video_id saved:", r.video_id);</w:t>
+        <w:br/>
+        <w:t>}</w:t>
+      </w:r>
+    </w:p>
+    <w:p>
+      <w:pPr>
+        <w:pStyle w:val="Heading2"/>
+      </w:pPr>
+      <w:r>
+        <w:t>Auto-Save Conversation ID  (paste in Tests tab of Start Conversation request)</w:t>
+      </w:r>
+    </w:p>
+    <w:p>
+      <w:pPr>
+        <w:spacing w:before="40" w:after="40"/>
+        <w:ind w:left="288"/>
+        <w:shd w:val="clear" w:color="auto" w:fill="F0F0F0"/>
+      </w:pPr>
+      <w:r>
+        <w:rPr>
+          <w:rFonts w:ascii="Courier New" w:hAnsi="Courier New"/>
+          <w:color w:val="1A1A8C"/>
+          <w:sz w:val="18"/>
+        </w:rPr>
+        <w:t>const r = pm.response.json();</w:t>
+        <w:br/>
+        <w:t>if (r.id) {</w:t>
+        <w:br/>
+        <w:t xml:space="preserve">    pm.environment.set("conversation_id", r.id);</w:t>
+        <w:br/>
+        <w:t xml:space="preserve">    console.log("conversation_id saved:", r.id);</w:t>
+        <w:br/>
+        <w:t>}</w:t>
+      </w:r>
+    </w:p>
+    <w:p>
+      <w:pPr>
+        <w:pStyle w:val="Heading2"/>
+      </w:pPr>
+      <w:r>
+        <w:t>Auto-Save Customer ID  (paste in Tests tab of Verify OTP Customer request)</w:t>
+      </w:r>
+    </w:p>
+    <w:p>
+      <w:pPr>
+        <w:spacing w:before="40" w:after="40"/>
+        <w:ind w:left="288"/>
+        <w:shd w:val="clear" w:color="auto" w:fill="F0F0F0"/>
+      </w:pPr>
+      <w:r>
+        <w:rPr>
+          <w:rFonts w:ascii="Courier New" w:hAnsi="Courier New"/>
+          <w:color w:val="1A1A8C"/>
+          <w:sz w:val="18"/>
+        </w:rPr>
+        <w:t>// Add this to the existing customer verify OTP Tests script:</w:t>
+        <w:br/>
+        <w:t>const r = pm.response.json();</w:t>
+        <w:br/>
+        <w:t>if (r.user &amp;&amp; r.user.id) {</w:t>
+        <w:br/>
+        <w:t xml:space="preserve">    pm.environment.set("customer_id", r.user.id);</w:t>
+        <w:br/>
+        <w:t xml:space="preserve">    console.log("customer_id saved:", r.user.id);</w:t>
+        <w:br/>
+        <w:t>}</w:t>
+      </w:r>
+    </w:p>
+    <w:p>
+      <w:pPr>
+        <w:ind w:left="288"/>
+        <w:shd w:val="clear" w:color="auto" w:fill="D1ECF1"/>
+      </w:pPr>
+      <w:r>
+        <w:rPr>
+          <w:i/>
+          <w:color w:val="0C5460"/>
+          <w:sz w:val="20"/>
+        </w:rPr>
+        <w:t xml:space="preserve">  💡  customer_id is needed for Sprint 6 blacklist endpoint:</w:t>
+        <w:br/>
+        <w:t xml:space="preserve">  POST /stores/{{store_id}}/blacklist/{{customer_id}}/</w:t>
+      </w:r>
+    </w:p>
+    <w:p>
+      <w:pPr>
+        <w:pStyle w:val="Heading2"/>
+      </w:pPr>
+      <w:r>
+        <w:t>Quick Test — All Public Endpoints via curl</w:t>
+      </w:r>
+    </w:p>
+    <w:p>
+      <w:r>
+        <w:rPr>
+          <w:b w:val="0"/>
+          <w:sz w:val="22"/>
+        </w:rPr>
+        <w:t>Copy-paste these into terminal to test without Postman:</w:t>
+      </w:r>
+    </w:p>
+    <w:p>
+      <w:pPr>
+        <w:spacing w:before="40" w:after="40"/>
+        <w:ind w:left="288"/>
+        <w:shd w:val="clear" w:color="auto" w:fill="F0F0F0"/>
+      </w:pPr>
+      <w:r>
+        <w:rPr>
+          <w:rFonts w:ascii="Courier New" w:hAnsi="Courier New"/>
+          <w:color w:val="1A1A8C"/>
+          <w:sz w:val="18"/>
+        </w:rPr>
+        <w:t># Health check</w:t>
+        <w:br/>
+        <w:t>curl -s http://localhost:8000/api/v1/health/ | python3 -m json.tool</w:t>
+        <w:br/>
+        <w:br/>
+        <w:t># Send OTP</w:t>
+        <w:br/>
+        <w:t>curl -s -X POST http://localhost:8000/api/v1/auth/otp/send/ \</w:t>
+        <w:br/>
+        <w:t xml:space="preserve">  -H "Content-Type: application/json" \</w:t>
+        <w:br/>
+        <w:t xml:space="preserve">  -d '{"phone_number": "+919999999999"}'</w:t>
+        <w:br/>
+        <w:br/>
+        <w:t># Verify OTP (copy access token from response)</w:t>
+        <w:br/>
+        <w:t>curl -s -X POST http://localhost:8000/api/v1/auth/otp/verify/ \</w:t>
+        <w:br/>
+        <w:t xml:space="preserve">  -H "Content-Type: application/json" \</w:t>
+        <w:br/>
+        <w:t xml:space="preserve">  -d '{"phone_number": "+919999999999", "otp": "123456"}'</w:t>
+        <w:br/>
+        <w:br/>
+        <w:t># Get profile (replace TOKEN with your access token)</w:t>
+        <w:br/>
+        <w:t>curl -s http://localhost:8000/api/v1/auth/me/ \</w:t>
+        <w:br/>
+        <w:t xml:space="preserve">  -H "Authorization: Bearer TOKEN"</w:t>
+      </w:r>
+    </w:p>
+    <w:p>
+      <w:r>
+        <w:br w:type="page"/>
+      </w:r>
+    </w:p>
+    <w:p>
+      <w:pPr>
+        <w:pStyle w:val="Heading1"/>
+      </w:pPr>
+      <w:r>
+        <w:t>6. How to Update This Document (Future Sprints)</w:t>
+      </w:r>
+    </w:p>
+    <w:p>
+      <w:pPr>
+        <w:ind w:left="288"/>
+        <w:shd w:val="clear" w:color="auto" w:fill="D1ECF1"/>
+      </w:pPr>
+      <w:r>
+        <w:rPr>
+          <w:i/>
+          <w:color w:val="0C5460"/>
+          <w:sz w:val="20"/>
+        </w:rPr>
+        <w:t xml:space="preserve">  📌  IMPORTANT: When a new sprint adds new API endpoints, update this document.</w:t>
+        <w:br/>
+        <w:t xml:space="preserve">     Do NOT create a separate doc — keep everything in this single file.</w:t>
+      </w:r>
+    </w:p>
+    <w:p/>
+    <w:p>
+      <w:pPr>
+        <w:pStyle w:val="Heading2"/>
+      </w:pPr>
+      <w:r>
+        <w:t>Checklist for each new sprint:</w:t>
+      </w:r>
+    </w:p>
+    <w:p>
+      <w:pPr>
+        <w:pStyle w:val="ListBullet"/>
+        <w:ind w:left="432"/>
+      </w:pPr>
+      <w:r>
+        <w:rPr>
+          <w:sz w:val="21"/>
+        </w:rPr>
+        <w:t>Add new endpoint rows to Section 2 — Complete API Reference table</w:t>
+      </w:r>
+    </w:p>
+    <w:p>
+      <w:pPr>
+        <w:pStyle w:val="ListBullet"/>
+        <w:ind w:left="432"/>
+      </w:pPr>
+      <w:r>
+        <w:rPr>
+          <w:sz w:val="21"/>
+        </w:rPr>
+        <w:t>Add new STEP sections in Section 3 — Step-by-Step Test Flow</w:t>
+      </w:r>
+    </w:p>
+    <w:p>
+      <w:pPr>
+        <w:pStyle w:val="ListBullet"/>
+        <w:ind w:left="432"/>
+      </w:pPr>
+      <w:r>
+        <w:rPr>
+          <w:sz w:val="21"/>
+        </w:rPr>
+        <w:t>Add new error cases in Section 4 — Error Cases to Test</w:t>
+      </w:r>
+    </w:p>
+    <w:p>
+      <w:pPr>
+        <w:pStyle w:val="ListBullet"/>
+        <w:ind w:left="432"/>
+      </w:pPr>
+      <w:r>
+        <w:rPr>
+          <w:sz w:val="21"/>
+        </w:rPr>
+        <w:t>Add new Postman folder in Section 5 — Postman Quick Setup</w:t>
+      </w:r>
+    </w:p>
+    <w:p>
+      <w:pPr>
+        <w:pStyle w:val="ListBullet"/>
+        <w:ind w:left="432"/>
+      </w:pPr>
+      <w:r>
+        <w:rPr>
+          <w:sz w:val="21"/>
+        </w:rPr>
+        <w:t>Update the cover page "Last updated" date and sprint range</w:t>
+      </w:r>
+    </w:p>
+    <w:p>
+      <w:pPr>
+        <w:pStyle w:val="ListBullet"/>
+        <w:ind w:left="432"/>
+      </w:pPr>
+      <w:r>
+        <w:rPr>
+          <w:sz w:val="21"/>
+        </w:rPr>
+        <w:t>If new field types are introduced (e.g. file uploads), add a format rules subsection in Section 1</w:t>
+      </w:r>
+    </w:p>
+    <w:p>
+      <w:pPr>
+        <w:pStyle w:val="Heading2"/>
+      </w:pPr>
+      <w:r>
+        <w:t>Upcoming Sprints to Add Here</w:t>
+      </w:r>
+    </w:p>
+    <w:tbl>
+      <w:tblPr>
+        <w:tblStyle w:val="TableGrid"/>
+        <w:tblW w:type="auto" w:w="0"/>
+        <w:jc w:val="left"/>
+        <w:tblLook w:firstColumn="1" w:firstRow="1" w:lastColumn="0" w:lastRow="0" w:noHBand="0" w:noVBand="1" w:val="04A0"/>
+      </w:tblPr>
+      <w:tblGrid>
+        <w:gridCol w:w="3216"/>
+        <w:gridCol w:w="3216"/>
+        <w:gridCol w:w="3216"/>
+      </w:tblGrid>
+      <w:tr>
+        <w:tc>
+          <w:tcPr>
+            <w:tcW w:type="dxa" w:w="1152"/>
+            <w:shd w:val="clear" w:color="auto" w:fill="1F4E79"/>
+          </w:tcPr>
+          <w:p>
+            <w:r>
+              <w:rPr>
+                <w:b/>
+                <w:color w:val="FFFFFF"/>
+                <w:sz w:val="20"/>
+              </w:rPr>
+              <w:t>Sprint</w:t>
+            </w:r>
+          </w:p>
+        </w:tc>
+        <w:tc>
+          <w:tcPr>
+            <w:tcW w:type="dxa" w:w="2160"/>
+            <w:shd w:val="clear" w:color="auto" w:fill="1F4E79"/>
+          </w:tcPr>
+          <w:p>
+            <w:r>
+              <w:rPr>
+                <w:b/>
+                <w:color w:val="FFFFFF"/>
+                <w:sz w:val="20"/>
+              </w:rPr>
+              <w:t>Module</w:t>
+            </w:r>
+          </w:p>
+        </w:tc>
+        <w:tc>
+          <w:tcPr>
+            <w:tcW w:type="dxa" w:w="6048"/>
+            <w:shd w:val="clear" w:color="auto" w:fill="1F4E79"/>
+          </w:tcPr>
+          <w:p>
+            <w:r>
+              <w:rPr>
+                <w:b/>
+                <w:color w:val="FFFFFF"/>
+                <w:sz w:val="20"/>
+              </w:rPr>
+              <w:t>APIs to Add</w:t>
+            </w:r>
+          </w:p>
+        </w:tc>
+      </w:tr>
+      <w:tr>
+        <w:tc>
+          <w:tcPr>
             <w:tcW w:type="dxa" w:w="1152"/>
             <w:shd w:val="clear" w:color="auto" w:fill="DEEAF1"/>
           </w:tcPr>
@@ -16182,7 +17288,7 @@
               <w:rPr>
                 <w:sz w:val="19"/>
               </w:rPr>
-              <w:t>POST /blacklist/&lt;store_id&gt;/, GET /blacklist/, DELETE /blacklist/&lt;store_id&gt;/</w:t>
+              <w:t>✅ DONE — Steps 37–38 in this document</w:t>
             </w:r>
           </w:p>
         </w:tc>
@@ -16496,7 +17602,7 @@
           <w:color w:val="999999"/>
           <w:sz w:val="18"/>
         </w:rPr>
-        <w:t>NearKart Backend — Master API Testing Guide   |   Sprint 1–4   |   Use Postman or curl for testing</w:t>
+        <w:t>NearKart Backend — Master API Testing Guide   |   Sprint 1–6   |   Use Postman or curl for testing</w:t>
       </w:r>
     </w:p>
     <w:sectPr>

</xml_diff>

<commit_message>
feat(sprint7): implement Billing + Wallet module
Vendors can top up a wallet and subscribe to Free/Basic/Premium plans.
Plan limits are enforced at upload/create time for videos and products.
Celery Beat task expires overdue subscriptions daily at midnight IST.

- apps/billing: Plan, Subscription, Transaction models + BillingService
- apps/billing: 6 REST endpoints (plans, wallet, topup, subscribe, subscription, transactions)
- apps/billing: seed_plans management command + expire_subscriptions Celery task
- apps/products/views.py + apps/videos/views.py: plan limit enforcement (403 plan_limit_reached)
- config/settings/base.py: CELERY_BEAT_SCHEDULE added
- docs/sprint_7_billing/: README, TESTING_CHECKLIST, POSTMAN_GUIDE
- docs/NearKart_Master_API_Testing_Guide.docx: updated to Sprint 1-7

Co-Authored-By: Claude Sonnet 4.6 <noreply@anthropic.com>
</commit_message>
<xml_diff>
--- a/nearkart_backend/docs/NearKart_Master_API_Testing_Guide.docx
+++ b/nearkart_backend/docs/NearKart_Master_API_Testing_Guide.docx
@@ -50,7 +50,7 @@
           <w:color w:val="888888"/>
           <w:sz w:val="20"/>
         </w:rPr>
-        <w:t>Sprint 1 → Sprint 6   |   Last updated: May 2026</w:t>
+        <w:t>Sprint 1 → Sprint 7   |   Last updated: May 2026</w:t>
       </w:r>
     </w:p>
     <w:p/>
@@ -5516,6 +5516,423 @@
           </w:p>
         </w:tc>
       </w:tr>
+      <w:tr>
+        <w:tc>
+          <w:tcPr>
+            <w:tcW w:type="dxa" w:w="432"/>
+            <w:shd w:val="clear" w:color="auto" w:fill="DEEAF1"/>
+          </w:tcPr>
+          <w:p>
+            <w:r>
+              <w:rPr>
+                <w:sz w:val="19"/>
+              </w:rPr>
+              <w:t>37</w:t>
+            </w:r>
+          </w:p>
+        </w:tc>
+        <w:tc>
+          <w:tcPr>
+            <w:tcW w:type="dxa" w:w="1008"/>
+            <w:shd w:val="clear" w:color="auto" w:fill="DEEAF1"/>
+          </w:tcPr>
+          <w:p>
+            <w:r>
+              <w:rPr>
+                <w:sz w:val="19"/>
+              </w:rPr>
+              <w:t>GET</w:t>
+            </w:r>
+          </w:p>
+        </w:tc>
+        <w:tc>
+          <w:tcPr>
+            <w:tcW w:type="dxa" w:w="4032"/>
+            <w:shd w:val="clear" w:color="auto" w:fill="DEEAF1"/>
+          </w:tcPr>
+          <w:p>
+            <w:r>
+              <w:rPr>
+                <w:sz w:val="19"/>
+              </w:rPr>
+              <w:t>/billing/plans/</w:t>
+            </w:r>
+          </w:p>
+        </w:tc>
+        <w:tc>
+          <w:tcPr>
+            <w:tcW w:type="dxa" w:w="2016"/>
+            <w:shd w:val="clear" w:color="auto" w:fill="DEEAF1"/>
+          </w:tcPr>
+          <w:p>
+            <w:r>
+              <w:rPr>
+                <w:sz w:val="19"/>
+              </w:rPr>
+              <w:t>None (public)</w:t>
+            </w:r>
+          </w:p>
+        </w:tc>
+        <w:tc>
+          <w:tcPr>
+            <w:tcW w:type="dxa" w:w="576"/>
+            <w:shd w:val="clear" w:color="auto" w:fill="DEEAF1"/>
+          </w:tcPr>
+          <w:p>
+            <w:r>
+              <w:rPr>
+                <w:sz w:val="19"/>
+              </w:rPr>
+              <w:t>S7</w:t>
+            </w:r>
+          </w:p>
+        </w:tc>
+      </w:tr>
+      <w:tr>
+        <w:tc>
+          <w:tcPr>
+            <w:tcW w:type="dxa" w:w="432"/>
+          </w:tcPr>
+          <w:p>
+            <w:r>
+              <w:rPr>
+                <w:sz w:val="19"/>
+              </w:rPr>
+              <w:t>38</w:t>
+            </w:r>
+          </w:p>
+        </w:tc>
+        <w:tc>
+          <w:tcPr>
+            <w:tcW w:type="dxa" w:w="1008"/>
+          </w:tcPr>
+          <w:p>
+            <w:r>
+              <w:rPr>
+                <w:sz w:val="19"/>
+              </w:rPr>
+              <w:t>GET</w:t>
+            </w:r>
+          </w:p>
+        </w:tc>
+        <w:tc>
+          <w:tcPr>
+            <w:tcW w:type="dxa" w:w="4032"/>
+          </w:tcPr>
+          <w:p>
+            <w:r>
+              <w:rPr>
+                <w:sz w:val="19"/>
+              </w:rPr>
+              <w:t>/billing/wallet/</w:t>
+            </w:r>
+          </w:p>
+        </w:tc>
+        <w:tc>
+          <w:tcPr>
+            <w:tcW w:type="dxa" w:w="2016"/>
+          </w:tcPr>
+          <w:p>
+            <w:r>
+              <w:rPr>
+                <w:sz w:val="19"/>
+              </w:rPr>
+              <w:t>Vendor JWT only</w:t>
+            </w:r>
+          </w:p>
+        </w:tc>
+        <w:tc>
+          <w:tcPr>
+            <w:tcW w:type="dxa" w:w="576"/>
+          </w:tcPr>
+          <w:p>
+            <w:r>
+              <w:rPr>
+                <w:sz w:val="19"/>
+              </w:rPr>
+              <w:t>S7</w:t>
+            </w:r>
+          </w:p>
+        </w:tc>
+      </w:tr>
+      <w:tr>
+        <w:tc>
+          <w:tcPr>
+            <w:tcW w:type="dxa" w:w="432"/>
+            <w:shd w:val="clear" w:color="auto" w:fill="DEEAF1"/>
+          </w:tcPr>
+          <w:p>
+            <w:r>
+              <w:rPr>
+                <w:sz w:val="19"/>
+              </w:rPr>
+              <w:t>39</w:t>
+            </w:r>
+          </w:p>
+        </w:tc>
+        <w:tc>
+          <w:tcPr>
+            <w:tcW w:type="dxa" w:w="1008"/>
+            <w:shd w:val="clear" w:color="auto" w:fill="DEEAF1"/>
+          </w:tcPr>
+          <w:p>
+            <w:r>
+              <w:rPr>
+                <w:sz w:val="19"/>
+              </w:rPr>
+              <w:t>POST</w:t>
+            </w:r>
+          </w:p>
+        </w:tc>
+        <w:tc>
+          <w:tcPr>
+            <w:tcW w:type="dxa" w:w="4032"/>
+            <w:shd w:val="clear" w:color="auto" w:fill="DEEAF1"/>
+          </w:tcPr>
+          <w:p>
+            <w:r>
+              <w:rPr>
+                <w:sz w:val="19"/>
+              </w:rPr>
+              <w:t>/billing/topup/</w:t>
+            </w:r>
+          </w:p>
+        </w:tc>
+        <w:tc>
+          <w:tcPr>
+            <w:tcW w:type="dxa" w:w="2016"/>
+            <w:shd w:val="clear" w:color="auto" w:fill="DEEAF1"/>
+          </w:tcPr>
+          <w:p>
+            <w:r>
+              <w:rPr>
+                <w:sz w:val="19"/>
+              </w:rPr>
+              <w:t>Vendor JWT only</w:t>
+            </w:r>
+          </w:p>
+        </w:tc>
+        <w:tc>
+          <w:tcPr>
+            <w:tcW w:type="dxa" w:w="576"/>
+            <w:shd w:val="clear" w:color="auto" w:fill="DEEAF1"/>
+          </w:tcPr>
+          <w:p>
+            <w:r>
+              <w:rPr>
+                <w:sz w:val="19"/>
+              </w:rPr>
+              <w:t>S7</w:t>
+            </w:r>
+          </w:p>
+        </w:tc>
+      </w:tr>
+      <w:tr>
+        <w:tc>
+          <w:tcPr>
+            <w:tcW w:type="dxa" w:w="432"/>
+          </w:tcPr>
+          <w:p>
+            <w:r>
+              <w:rPr>
+                <w:sz w:val="19"/>
+              </w:rPr>
+              <w:t>40</w:t>
+            </w:r>
+          </w:p>
+        </w:tc>
+        <w:tc>
+          <w:tcPr>
+            <w:tcW w:type="dxa" w:w="1008"/>
+          </w:tcPr>
+          <w:p>
+            <w:r>
+              <w:rPr>
+                <w:sz w:val="19"/>
+              </w:rPr>
+              <w:t>POST</w:t>
+            </w:r>
+          </w:p>
+        </w:tc>
+        <w:tc>
+          <w:tcPr>
+            <w:tcW w:type="dxa" w:w="4032"/>
+          </w:tcPr>
+          <w:p>
+            <w:r>
+              <w:rPr>
+                <w:sz w:val="19"/>
+              </w:rPr>
+              <w:t>/billing/subscribe/</w:t>
+            </w:r>
+          </w:p>
+        </w:tc>
+        <w:tc>
+          <w:tcPr>
+            <w:tcW w:type="dxa" w:w="2016"/>
+          </w:tcPr>
+          <w:p>
+            <w:r>
+              <w:rPr>
+                <w:sz w:val="19"/>
+              </w:rPr>
+              <w:t>Vendor JWT only</w:t>
+            </w:r>
+          </w:p>
+        </w:tc>
+        <w:tc>
+          <w:tcPr>
+            <w:tcW w:type="dxa" w:w="576"/>
+          </w:tcPr>
+          <w:p>
+            <w:r>
+              <w:rPr>
+                <w:sz w:val="19"/>
+              </w:rPr>
+              <w:t>S7</w:t>
+            </w:r>
+          </w:p>
+        </w:tc>
+      </w:tr>
+      <w:tr>
+        <w:tc>
+          <w:tcPr>
+            <w:tcW w:type="dxa" w:w="432"/>
+            <w:shd w:val="clear" w:color="auto" w:fill="DEEAF1"/>
+          </w:tcPr>
+          <w:p>
+            <w:r>
+              <w:rPr>
+                <w:sz w:val="19"/>
+              </w:rPr>
+              <w:t>41</w:t>
+            </w:r>
+          </w:p>
+        </w:tc>
+        <w:tc>
+          <w:tcPr>
+            <w:tcW w:type="dxa" w:w="1008"/>
+            <w:shd w:val="clear" w:color="auto" w:fill="DEEAF1"/>
+          </w:tcPr>
+          <w:p>
+            <w:r>
+              <w:rPr>
+                <w:sz w:val="19"/>
+              </w:rPr>
+              <w:t>GET</w:t>
+            </w:r>
+          </w:p>
+        </w:tc>
+        <w:tc>
+          <w:tcPr>
+            <w:tcW w:type="dxa" w:w="4032"/>
+            <w:shd w:val="clear" w:color="auto" w:fill="DEEAF1"/>
+          </w:tcPr>
+          <w:p>
+            <w:r>
+              <w:rPr>
+                <w:sz w:val="19"/>
+              </w:rPr>
+              <w:t>/billing/subscription/</w:t>
+            </w:r>
+          </w:p>
+        </w:tc>
+        <w:tc>
+          <w:tcPr>
+            <w:tcW w:type="dxa" w:w="2016"/>
+            <w:shd w:val="clear" w:color="auto" w:fill="DEEAF1"/>
+          </w:tcPr>
+          <w:p>
+            <w:r>
+              <w:rPr>
+                <w:sz w:val="19"/>
+              </w:rPr>
+              <w:t>Vendor JWT only</w:t>
+            </w:r>
+          </w:p>
+        </w:tc>
+        <w:tc>
+          <w:tcPr>
+            <w:tcW w:type="dxa" w:w="576"/>
+            <w:shd w:val="clear" w:color="auto" w:fill="DEEAF1"/>
+          </w:tcPr>
+          <w:p>
+            <w:r>
+              <w:rPr>
+                <w:sz w:val="19"/>
+              </w:rPr>
+              <w:t>S7</w:t>
+            </w:r>
+          </w:p>
+        </w:tc>
+      </w:tr>
+      <w:tr>
+        <w:tc>
+          <w:tcPr>
+            <w:tcW w:type="dxa" w:w="432"/>
+          </w:tcPr>
+          <w:p>
+            <w:r>
+              <w:rPr>
+                <w:sz w:val="19"/>
+              </w:rPr>
+              <w:t>42</w:t>
+            </w:r>
+          </w:p>
+        </w:tc>
+        <w:tc>
+          <w:tcPr>
+            <w:tcW w:type="dxa" w:w="1008"/>
+          </w:tcPr>
+          <w:p>
+            <w:r>
+              <w:rPr>
+                <w:sz w:val="19"/>
+              </w:rPr>
+              <w:t>GET</w:t>
+            </w:r>
+          </w:p>
+        </w:tc>
+        <w:tc>
+          <w:tcPr>
+            <w:tcW w:type="dxa" w:w="4032"/>
+          </w:tcPr>
+          <w:p>
+            <w:r>
+              <w:rPr>
+                <w:sz w:val="19"/>
+              </w:rPr>
+              <w:t>/billing/transactions/</w:t>
+            </w:r>
+          </w:p>
+        </w:tc>
+        <w:tc>
+          <w:tcPr>
+            <w:tcW w:type="dxa" w:w="2016"/>
+          </w:tcPr>
+          <w:p>
+            <w:r>
+              <w:rPr>
+                <w:sz w:val="19"/>
+              </w:rPr>
+              <w:t>Vendor JWT only</w:t>
+            </w:r>
+          </w:p>
+        </w:tc>
+        <w:tc>
+          <w:tcPr>
+            <w:tcW w:type="dxa" w:w="576"/>
+          </w:tcPr>
+          <w:p>
+            <w:r>
+              <w:rPr>
+                <w:sz w:val="19"/>
+              </w:rPr>
+              <w:t>S7</w:t>
+            </w:r>
+          </w:p>
+        </w:tc>
+      </w:tr>
     </w:tbl>
     <w:p/>
     <w:p>
@@ -13402,6 +13819,1126 @@
         <w:pStyle w:val="Heading1"/>
       </w:pPr>
       <w:r>
+        <w:t>Sprint 7 — Billing + Wallet</w:t>
+      </w:r>
+    </w:p>
+    <w:p>
+      <w:r>
+        <w:rPr>
+          <w:b w:val="0"/>
+          <w:sz w:val="22"/>
+        </w:rPr>
+        <w:t>Follow Steps 39–44 after completing Step 10 (Create Store). All billing endpoints are vendor-only except Plans.</w:t>
+      </w:r>
+    </w:p>
+    <w:tbl>
+      <w:tblPr>
+        <w:tblStyle w:val="TableGrid"/>
+        <w:tblW w:type="auto" w:w="0"/>
+        <w:jc w:val="left"/>
+        <w:tblLook w:firstColumn="1" w:firstRow="1" w:lastColumn="0" w:lastRow="0" w:noHBand="0" w:noVBand="1" w:val="04A0"/>
+      </w:tblPr>
+      <w:tblGrid>
+        <w:gridCol w:w="2412"/>
+        <w:gridCol w:w="2412"/>
+        <w:gridCol w:w="2412"/>
+        <w:gridCol w:w="2412"/>
+      </w:tblGrid>
+      <w:tr>
+        <w:tc>
+          <w:tcPr>
+            <w:tcW w:type="dxa" w:w="1728"/>
+            <w:shd w:val="clear" w:color="auto" w:fill="1F4E79"/>
+          </w:tcPr>
+          <w:p>
+            <w:r>
+              <w:rPr>
+                <w:b/>
+                <w:color w:val="FFFFFF"/>
+                <w:sz w:val="20"/>
+              </w:rPr>
+              <w:t>Plan</w:t>
+            </w:r>
+          </w:p>
+        </w:tc>
+        <w:tc>
+          <w:tcPr>
+            <w:tcW w:type="dxa" w:w="2016"/>
+            <w:shd w:val="clear" w:color="auto" w:fill="1F4E79"/>
+          </w:tcPr>
+          <w:p>
+            <w:r>
+              <w:rPr>
+                <w:b/>
+                <w:color w:val="FFFFFF"/>
+                <w:sz w:val="20"/>
+              </w:rPr>
+              <w:t>Price</w:t>
+            </w:r>
+          </w:p>
+        </w:tc>
+        <w:tc>
+          <w:tcPr>
+            <w:tcW w:type="dxa" w:w="2016"/>
+            <w:shd w:val="clear" w:color="auto" w:fill="1F4E79"/>
+          </w:tcPr>
+          <w:p>
+            <w:r>
+              <w:rPr>
+                <w:b/>
+                <w:color w:val="FFFFFF"/>
+                <w:sz w:val="20"/>
+              </w:rPr>
+              <w:t>Videos</w:t>
+            </w:r>
+          </w:p>
+        </w:tc>
+        <w:tc>
+          <w:tcPr>
+            <w:tcW w:type="dxa" w:w="2016"/>
+            <w:shd w:val="clear" w:color="auto" w:fill="1F4E79"/>
+          </w:tcPr>
+          <w:p>
+            <w:r>
+              <w:rPr>
+                <w:b/>
+                <w:color w:val="FFFFFF"/>
+                <w:sz w:val="20"/>
+              </w:rPr>
+              <w:t>Products</w:t>
+            </w:r>
+          </w:p>
+        </w:tc>
+      </w:tr>
+      <w:tr>
+        <w:tc>
+          <w:tcPr>
+            <w:tcW w:type="dxa" w:w="1728"/>
+            <w:shd w:val="clear" w:color="auto" w:fill="DEEAF1"/>
+          </w:tcPr>
+          <w:p>
+            <w:r>
+              <w:rPr>
+                <w:sz w:val="19"/>
+              </w:rPr>
+              <w:t>Free</w:t>
+            </w:r>
+          </w:p>
+        </w:tc>
+        <w:tc>
+          <w:tcPr>
+            <w:tcW w:type="dxa" w:w="2016"/>
+            <w:shd w:val="clear" w:color="auto" w:fill="DEEAF1"/>
+          </w:tcPr>
+          <w:p>
+            <w:r>
+              <w:rPr>
+                <w:sz w:val="19"/>
+              </w:rPr>
+              <w:t>₹0 / month</w:t>
+            </w:r>
+          </w:p>
+        </w:tc>
+        <w:tc>
+          <w:tcPr>
+            <w:tcW w:type="dxa" w:w="2016"/>
+            <w:shd w:val="clear" w:color="auto" w:fill="DEEAF1"/>
+          </w:tcPr>
+          <w:p>
+            <w:r>
+              <w:rPr>
+                <w:sz w:val="19"/>
+              </w:rPr>
+              <w:t>3</w:t>
+            </w:r>
+          </w:p>
+        </w:tc>
+        <w:tc>
+          <w:tcPr>
+            <w:tcW w:type="dxa" w:w="2016"/>
+            <w:shd w:val="clear" w:color="auto" w:fill="DEEAF1"/>
+          </w:tcPr>
+          <w:p>
+            <w:r>
+              <w:rPr>
+                <w:sz w:val="19"/>
+              </w:rPr>
+              <w:t>10</w:t>
+            </w:r>
+          </w:p>
+        </w:tc>
+      </w:tr>
+      <w:tr>
+        <w:tc>
+          <w:tcPr>
+            <w:tcW w:type="dxa" w:w="1728"/>
+          </w:tcPr>
+          <w:p>
+            <w:r>
+              <w:rPr>
+                <w:sz w:val="19"/>
+              </w:rPr>
+              <w:t>Basic</w:t>
+            </w:r>
+          </w:p>
+        </w:tc>
+        <w:tc>
+          <w:tcPr>
+            <w:tcW w:type="dxa" w:w="2016"/>
+          </w:tcPr>
+          <w:p>
+            <w:r>
+              <w:rPr>
+                <w:sz w:val="19"/>
+              </w:rPr>
+              <w:t>₹499 / month</w:t>
+            </w:r>
+          </w:p>
+        </w:tc>
+        <w:tc>
+          <w:tcPr>
+            <w:tcW w:type="dxa" w:w="2016"/>
+          </w:tcPr>
+          <w:p>
+            <w:r>
+              <w:rPr>
+                <w:sz w:val="19"/>
+              </w:rPr>
+              <w:t>20</w:t>
+            </w:r>
+          </w:p>
+        </w:tc>
+        <w:tc>
+          <w:tcPr>
+            <w:tcW w:type="dxa" w:w="2016"/>
+          </w:tcPr>
+          <w:p>
+            <w:r>
+              <w:rPr>
+                <w:sz w:val="19"/>
+              </w:rPr>
+              <w:t>50</w:t>
+            </w:r>
+          </w:p>
+        </w:tc>
+      </w:tr>
+      <w:tr>
+        <w:tc>
+          <w:tcPr>
+            <w:tcW w:type="dxa" w:w="1728"/>
+            <w:shd w:val="clear" w:color="auto" w:fill="DEEAF1"/>
+          </w:tcPr>
+          <w:p>
+            <w:r>
+              <w:rPr>
+                <w:sz w:val="19"/>
+              </w:rPr>
+              <w:t>Premium</w:t>
+            </w:r>
+          </w:p>
+        </w:tc>
+        <w:tc>
+          <w:tcPr>
+            <w:tcW w:type="dxa" w:w="2016"/>
+            <w:shd w:val="clear" w:color="auto" w:fill="DEEAF1"/>
+          </w:tcPr>
+          <w:p>
+            <w:r>
+              <w:rPr>
+                <w:sz w:val="19"/>
+              </w:rPr>
+              <w:t>₹999 / month</w:t>
+            </w:r>
+          </w:p>
+        </w:tc>
+        <w:tc>
+          <w:tcPr>
+            <w:tcW w:type="dxa" w:w="2016"/>
+            <w:shd w:val="clear" w:color="auto" w:fill="DEEAF1"/>
+          </w:tcPr>
+          <w:p>
+            <w:r>
+              <w:rPr>
+                <w:sz w:val="19"/>
+              </w:rPr>
+              <w:t>Unlimited</w:t>
+            </w:r>
+          </w:p>
+        </w:tc>
+        <w:tc>
+          <w:tcPr>
+            <w:tcW w:type="dxa" w:w="2016"/>
+            <w:shd w:val="clear" w:color="auto" w:fill="DEEAF1"/>
+          </w:tcPr>
+          <w:p>
+            <w:r>
+              <w:rPr>
+                <w:sz w:val="19"/>
+              </w:rPr>
+              <w:t>Unlimited</w:t>
+            </w:r>
+          </w:p>
+        </w:tc>
+      </w:tr>
+    </w:tbl>
+    <w:p/>
+    <w:p>
+      <w:pPr>
+        <w:ind w:left="288"/>
+        <w:shd w:val="clear" w:color="auto" w:fill="D1ECF1"/>
+      </w:pPr>
+      <w:r>
+        <w:rPr>
+          <w:i/>
+          <w:color w:val="0C5460"/>
+          <w:sz w:val="20"/>
+        </w:rPr>
+        <w:t xml:space="preserve">  💡  Top up your wallet first (Step 41), then subscribe to a plan (Step 42).</w:t>
+        <w:br/>
+        <w:t>The Free plan costs ₹0 — you can subscribe without any balance.</w:t>
+        <w:br/>
+        <w:t>Plan limits are enforced when uploading videos (Step 24) and creating products (Step 17).</w:t>
+      </w:r>
+    </w:p>
+    <w:p>
+      <w:pPr>
+        <w:spacing w:before="40" w:after="40"/>
+      </w:pPr>
+      <w:r>
+        <w:rPr>
+          <w:color w:val="CCCCCC"/>
+          <w:sz w:val="14"/>
+        </w:rPr>
+        <w:t>──────────────────────────────────────────────────────────────────────────────────────────</w:t>
+      </w:r>
+    </w:p>
+    <w:p>
+      <w:pPr>
+        <w:pStyle w:val="Heading2"/>
+      </w:pPr>
+      <w:r>
+        <w:t>STEP 39 — List Plans  (Public)</w:t>
+      </w:r>
+    </w:p>
+    <w:p>
+      <w:pPr>
+        <w:spacing w:before="120"/>
+        <w:shd w:val="clear" w:color="auto" w:fill="D4EDDA"/>
+      </w:pPr>
+      <w:r>
+        <w:rPr>
+          <w:b/>
+          <w:color w:val="155524"/>
+          <w:sz w:val="20"/>
+        </w:rPr>
+        <w:t xml:space="preserve">  GET  </w:t>
+      </w:r>
+      <w:r>
+        <w:rPr>
+          <w:b/>
+          <w:color w:val="1F4E79"/>
+          <w:sz w:val="20"/>
+        </w:rPr>
+        <w:t xml:space="preserve">  {{base_url}}/billing/plans/</w:t>
+      </w:r>
+      <w:r>
+        <w:rPr>
+          <w:i/>
+          <w:color w:val="777777"/>
+          <w:sz w:val="18"/>
+        </w:rPr>
+        <w:t xml:space="preserve">   [No Auth]   [Sprint 7]</w:t>
+      </w:r>
+    </w:p>
+    <w:p>
+      <w:r>
+        <w:rPr>
+          <w:b w:val="0"/>
+          <w:sz w:val="22"/>
+        </w:rPr>
+        <w:t>No body. No auth required.</w:t>
+      </w:r>
+    </w:p>
+    <w:p>
+      <w:r>
+        <w:rPr>
+          <w:b/>
+          <w:sz w:val="20"/>
+        </w:rPr>
+        <w:t>Expected Response  200 OK:</w:t>
+      </w:r>
+    </w:p>
+    <w:p>
+      <w:pPr>
+        <w:spacing w:before="40" w:after="40"/>
+        <w:ind w:left="288"/>
+        <w:shd w:val="clear" w:color="auto" w:fill="F0F0F0"/>
+      </w:pPr>
+      <w:r>
+        <w:rPr>
+          <w:rFonts w:ascii="Courier New" w:hAnsi="Courier New"/>
+          <w:color w:val="1A1A8C"/>
+          <w:sz w:val="18"/>
+        </w:rPr>
+        <w:t>[</w:t>
+        <w:br/>
+        <w:t xml:space="preserve">  {</w:t>
+        <w:br/>
+        <w:t xml:space="preserve">    "name": "free",</w:t>
+        <w:br/>
+        <w:t xml:space="preserve">    "display_name": "Free Plan",</w:t>
+        <w:br/>
+        <w:t xml:space="preserve">    "price": "0.00",</w:t>
+        <w:br/>
+        <w:t xml:space="preserve">    "duration_days": 30,</w:t>
+        <w:br/>
+        <w:t xml:space="preserve">    "video_limit": 3,</w:t>
+        <w:br/>
+        <w:t xml:space="preserve">    "product_limit": 10,</w:t>
+        <w:br/>
+        <w:t xml:space="preserve">    "video_limit_display": "3",</w:t>
+        <w:br/>
+        <w:t xml:space="preserve">    "product_limit_display": "10",</w:t>
+        <w:br/>
+        <w:t xml:space="preserve">    "description": "Up to 3 videos and 10 products. No payment required."</w:t>
+        <w:br/>
+        <w:t xml:space="preserve">  },</w:t>
+        <w:br/>
+        <w:t xml:space="preserve">  { "name": "basic", "price": "499.00", "video_limit_display": "20", ... },</w:t>
+        <w:br/>
+        <w:t xml:space="preserve">  { "name": "premium", "price": "999.00", "video_limit_display": "Unlimited", ... }</w:t>
+        <w:br/>
+        <w:t>]</w:t>
+      </w:r>
+    </w:p>
+    <w:p>
+      <w:pPr>
+        <w:spacing w:before="40" w:after="40"/>
+      </w:pPr>
+      <w:r>
+        <w:rPr>
+          <w:color w:val="CCCCCC"/>
+          <w:sz w:val="14"/>
+        </w:rPr>
+        <w:t>──────────────────────────────────────────────────────────────────────────────────────────</w:t>
+      </w:r>
+    </w:p>
+    <w:p>
+      <w:pPr>
+        <w:pStyle w:val="Heading2"/>
+      </w:pPr>
+      <w:r>
+        <w:t>STEP 40 — Check Wallet Balance  (Vendor Only)</w:t>
+      </w:r>
+    </w:p>
+    <w:p>
+      <w:pPr>
+        <w:spacing w:before="120"/>
+        <w:shd w:val="clear" w:color="auto" w:fill="D4EDDA"/>
+      </w:pPr>
+      <w:r>
+        <w:rPr>
+          <w:b/>
+          <w:color w:val="155524"/>
+          <w:sz w:val="20"/>
+        </w:rPr>
+        <w:t xml:space="preserve">  GET  </w:t>
+      </w:r>
+      <w:r>
+        <w:rPr>
+          <w:b/>
+          <w:color w:val="1F4E79"/>
+          <w:sz w:val="20"/>
+        </w:rPr>
+        <w:t xml:space="preserve">  {{base_url}}/billing/wallet/</w:t>
+      </w:r>
+      <w:r>
+        <w:rPr>
+          <w:i/>
+          <w:color w:val="777777"/>
+          <w:sz w:val="18"/>
+        </w:rPr>
+        <w:t xml:space="preserve">   [Vendor JWT]   [Sprint 7]</w:t>
+      </w:r>
+    </w:p>
+    <w:p>
+      <w:pPr>
+        <w:ind w:left="288"/>
+      </w:pPr>
+      <w:r>
+        <w:rPr>
+          <w:b w:val="0"/>
+          <w:sz w:val="20"/>
+        </w:rPr>
+        <w:t>Authorization: Bearer {{vendor_token}}</w:t>
+      </w:r>
+    </w:p>
+    <w:p>
+      <w:r>
+        <w:rPr>
+          <w:b w:val="0"/>
+          <w:sz w:val="22"/>
+        </w:rPr>
+        <w:t>No body.</w:t>
+      </w:r>
+    </w:p>
+    <w:p>
+      <w:r>
+        <w:rPr>
+          <w:b/>
+          <w:sz w:val="20"/>
+        </w:rPr>
+        <w:t>Expected Response  200 OK:</w:t>
+      </w:r>
+    </w:p>
+    <w:p>
+      <w:pPr>
+        <w:spacing w:before="40" w:after="40"/>
+        <w:ind w:left="288"/>
+        <w:shd w:val="clear" w:color="auto" w:fill="F0F0F0"/>
+      </w:pPr>
+      <w:r>
+        <w:rPr>
+          <w:rFonts w:ascii="Courier New" w:hAnsi="Courier New"/>
+          <w:color w:val="1A1A8C"/>
+          <w:sz w:val="18"/>
+        </w:rPr>
+        <w:t>{</w:t>
+        <w:br/>
+        <w:t xml:space="preserve">  "store_name": "Fashion Hub",</w:t>
+        <w:br/>
+        <w:t xml:space="preserve">  "wallet_balance": "0.00"</w:t>
+        <w:br/>
+        <w:t>}</w:t>
+      </w:r>
+    </w:p>
+    <w:p>
+      <w:pPr>
+        <w:spacing w:before="40" w:after="40"/>
+      </w:pPr>
+      <w:r>
+        <w:rPr>
+          <w:color w:val="CCCCCC"/>
+          <w:sz w:val="14"/>
+        </w:rPr>
+        <w:t>──────────────────────────────────────────────────────────────────────────────────────────</w:t>
+      </w:r>
+    </w:p>
+    <w:p>
+      <w:pPr>
+        <w:pStyle w:val="Heading2"/>
+      </w:pPr>
+      <w:r>
+        <w:t>STEP 41 — Top Up Wallet  (Vendor Only)</w:t>
+      </w:r>
+    </w:p>
+    <w:p>
+      <w:pPr>
+        <w:spacing w:before="120"/>
+        <w:shd w:val="clear" w:color="auto" w:fill="CCE5FF"/>
+      </w:pPr>
+      <w:r>
+        <w:rPr>
+          <w:b/>
+          <w:color w:val="004DAA"/>
+          <w:sz w:val="20"/>
+        </w:rPr>
+        <w:t xml:space="preserve">  POST  </w:t>
+      </w:r>
+      <w:r>
+        <w:rPr>
+          <w:b/>
+          <w:color w:val="1F4E79"/>
+          <w:sz w:val="20"/>
+        </w:rPr>
+        <w:t xml:space="preserve">  {{base_url}}/billing/topup/</w:t>
+      </w:r>
+      <w:r>
+        <w:rPr>
+          <w:i/>
+          <w:color w:val="777777"/>
+          <w:sz w:val="18"/>
+        </w:rPr>
+        <w:t xml:space="preserve">   [Vendor JWT]   [Sprint 7]</w:t>
+      </w:r>
+    </w:p>
+    <w:p>
+      <w:pPr>
+        <w:ind w:left="288"/>
+      </w:pPr>
+      <w:r>
+        <w:rPr>
+          <w:b w:val="0"/>
+          <w:sz w:val="20"/>
+        </w:rPr>
+        <w:t>Authorization: Bearer {{vendor_token}}</w:t>
+      </w:r>
+    </w:p>
+    <w:p>
+      <w:pPr>
+        <w:ind w:left="288"/>
+      </w:pPr>
+      <w:r>
+        <w:rPr>
+          <w:b w:val="0"/>
+          <w:sz w:val="20"/>
+        </w:rPr>
+        <w:t>Content-Type: application/json</w:t>
+      </w:r>
+    </w:p>
+    <w:p>
+      <w:r>
+        <w:rPr>
+          <w:b/>
+          <w:sz w:val="20"/>
+        </w:rPr>
+        <w:t>Request Body:</w:t>
+      </w:r>
+    </w:p>
+    <w:p>
+      <w:pPr>
+        <w:spacing w:before="40" w:after="40"/>
+        <w:ind w:left="288"/>
+        <w:shd w:val="clear" w:color="auto" w:fill="F0F0F0"/>
+      </w:pPr>
+      <w:r>
+        <w:rPr>
+          <w:rFonts w:ascii="Courier New" w:hAnsi="Courier New"/>
+          <w:color w:val="1A1A8C"/>
+          <w:sz w:val="18"/>
+        </w:rPr>
+        <w:t>{</w:t>
+        <w:br/>
+        <w:t xml:space="preserve">  "amount": "1000.00"</w:t>
+        <w:br/>
+        <w:t>}</w:t>
+      </w:r>
+    </w:p>
+    <w:p>
+      <w:pPr>
+        <w:ind w:left="288"/>
+        <w:shd w:val="clear" w:color="auto" w:fill="D1ECF1"/>
+      </w:pPr>
+      <w:r>
+        <w:rPr>
+          <w:i/>
+          <w:color w:val="0C5460"/>
+          <w:sz w:val="20"/>
+        </w:rPr>
+        <w:t xml:space="preserve">  💡  Swagger has two pre-filled examples: "Top up ₹500" and "Top up ₹1000".</w:t>
+        <w:br/>
+        <w:t>Dev mode: money is added instantly — no payment gateway.</w:t>
+      </w:r>
+    </w:p>
+    <w:p>
+      <w:r>
+        <w:rPr>
+          <w:b/>
+          <w:sz w:val="20"/>
+        </w:rPr>
+        <w:t>Expected Response  200 OK:</w:t>
+      </w:r>
+    </w:p>
+    <w:p>
+      <w:pPr>
+        <w:spacing w:before="40" w:after="40"/>
+        <w:ind w:left="288"/>
+        <w:shd w:val="clear" w:color="auto" w:fill="F0F0F0"/>
+      </w:pPr>
+      <w:r>
+        <w:rPr>
+          <w:rFonts w:ascii="Courier New" w:hAnsi="Courier New"/>
+          <w:color w:val="1A1A8C"/>
+          <w:sz w:val="18"/>
+        </w:rPr>
+        <w:t>{</w:t>
+        <w:br/>
+        <w:t xml:space="preserve">  "message": "₹1000.00 added to wallet.",</w:t>
+        <w:br/>
+        <w:t xml:space="preserve">  "amount_added": "1000.00",</w:t>
+        <w:br/>
+        <w:t xml:space="preserve">  "wallet_balance": "1000.00",</w:t>
+        <w:br/>
+        <w:t xml:space="preserve">  "transaction_id": "55a8c23d-..."</w:t>
+        <w:br/>
+        <w:t>}</w:t>
+      </w:r>
+    </w:p>
+    <w:p>
+      <w:pPr>
+        <w:ind w:left="288"/>
+        <w:shd w:val="clear" w:color="auto" w:fill="F8D7DA"/>
+      </w:pPr>
+      <w:r>
+        <w:rPr>
+          <w:i/>
+          <w:color w:val="7B1D1D"/>
+          <w:sz w:val="20"/>
+        </w:rPr>
+        <w:t xml:space="preserve">  🚫  400 — amount must be a positive number  (if amount is 0 or negative)</w:t>
+        <w:br/>
+        <w:t xml:space="preserve">     400 — validation_error  (if amount is not a number, e.g. "abc")</w:t>
+      </w:r>
+    </w:p>
+    <w:p>
+      <w:pPr>
+        <w:spacing w:before="40" w:after="40"/>
+      </w:pPr>
+      <w:r>
+        <w:rPr>
+          <w:color w:val="CCCCCC"/>
+          <w:sz w:val="14"/>
+        </w:rPr>
+        <w:t>──────────────────────────────────────────────────────────────────────────────────────────</w:t>
+      </w:r>
+    </w:p>
+    <w:p>
+      <w:pPr>
+        <w:pStyle w:val="Heading2"/>
+      </w:pPr>
+      <w:r>
+        <w:t>STEP 42 — Subscribe to a Plan  (Vendor Only)</w:t>
+      </w:r>
+    </w:p>
+    <w:p>
+      <w:pPr>
+        <w:spacing w:before="120"/>
+        <w:shd w:val="clear" w:color="auto" w:fill="CCE5FF"/>
+      </w:pPr>
+      <w:r>
+        <w:rPr>
+          <w:b/>
+          <w:color w:val="004DAA"/>
+          <w:sz w:val="20"/>
+        </w:rPr>
+        <w:t xml:space="preserve">  POST  </w:t>
+      </w:r>
+      <w:r>
+        <w:rPr>
+          <w:b/>
+          <w:color w:val="1F4E79"/>
+          <w:sz w:val="20"/>
+        </w:rPr>
+        <w:t xml:space="preserve">  {{base_url}}/billing/subscribe/</w:t>
+      </w:r>
+      <w:r>
+        <w:rPr>
+          <w:i/>
+          <w:color w:val="777777"/>
+          <w:sz w:val="18"/>
+        </w:rPr>
+        <w:t xml:space="preserve">   [Vendor JWT]   [Sprint 7]</w:t>
+      </w:r>
+    </w:p>
+    <w:p>
+      <w:pPr>
+        <w:ind w:left="288"/>
+      </w:pPr>
+      <w:r>
+        <w:rPr>
+          <w:b w:val="0"/>
+          <w:sz w:val="20"/>
+        </w:rPr>
+        <w:t>Authorization: Bearer {{vendor_token}}</w:t>
+      </w:r>
+    </w:p>
+    <w:p>
+      <w:pPr>
+        <w:ind w:left="288"/>
+      </w:pPr>
+      <w:r>
+        <w:rPr>
+          <w:b w:val="0"/>
+          <w:sz w:val="20"/>
+        </w:rPr>
+        <w:t>Content-Type: application/json</w:t>
+      </w:r>
+    </w:p>
+    <w:p>
+      <w:r>
+        <w:rPr>
+          <w:b/>
+          <w:sz w:val="20"/>
+        </w:rPr>
+        <w:t>Request Body:</w:t>
+      </w:r>
+    </w:p>
+    <w:p>
+      <w:pPr>
+        <w:spacing w:before="40" w:after="40"/>
+        <w:ind w:left="288"/>
+        <w:shd w:val="clear" w:color="auto" w:fill="F0F0F0"/>
+      </w:pPr>
+      <w:r>
+        <w:rPr>
+          <w:rFonts w:ascii="Courier New" w:hAnsi="Courier New"/>
+          <w:color w:val="1A1A8C"/>
+          <w:sz w:val="18"/>
+        </w:rPr>
+        <w:t>{</w:t>
+        <w:br/>
+        <w:t xml:space="preserve">  "plan_name": "basic"</w:t>
+        <w:br/>
+        <w:t>}</w:t>
+      </w:r>
+    </w:p>
+    <w:p>
+      <w:pPr>
+        <w:ind w:left="288"/>
+        <w:shd w:val="clear" w:color="auto" w:fill="D1ECF1"/>
+      </w:pPr>
+      <w:r>
+        <w:rPr>
+          <w:i/>
+          <w:color w:val="0C5460"/>
+          <w:sz w:val="20"/>
+        </w:rPr>
+        <w:t xml:space="preserve">  💡  Swagger has three pre-filled examples: "Subscribe Basic", "Subscribe Premium", "Subscribe Free".</w:t>
+        <w:br/>
+        <w:t>Valid plan_name values: free | basic | premium</w:t>
+        <w:br/>
+        <w:t>Subscribing again (same or different plan) replaces the current subscription.</w:t>
+      </w:r>
+    </w:p>
+    <w:p>
+      <w:r>
+        <w:rPr>
+          <w:b/>
+          <w:sz w:val="20"/>
+        </w:rPr>
+        <w:t>Expected Response  200 OK:</w:t>
+      </w:r>
+    </w:p>
+    <w:p>
+      <w:pPr>
+        <w:spacing w:before="40" w:after="40"/>
+        <w:ind w:left="288"/>
+        <w:shd w:val="clear" w:color="auto" w:fill="F0F0F0"/>
+      </w:pPr>
+      <w:r>
+        <w:rPr>
+          <w:rFonts w:ascii="Courier New" w:hAnsi="Courier New"/>
+          <w:color w:val="1A1A8C"/>
+          <w:sz w:val="18"/>
+        </w:rPr>
+        <w:t>{</w:t>
+        <w:br/>
+        <w:t xml:space="preserve">  "id": "e3f0d941-...",</w:t>
+        <w:br/>
+        <w:t xml:space="preserve">  "store_name": "Fashion Hub",</w:t>
+        <w:br/>
+        <w:t xml:space="preserve">  "plan": {</w:t>
+        <w:br/>
+        <w:t xml:space="preserve">    "name": "basic",</w:t>
+        <w:br/>
+        <w:t xml:space="preserve">    "display_name": "Basic Plan",</w:t>
+        <w:br/>
+        <w:t xml:space="preserve">    "price": "499.00",</w:t>
+        <w:br/>
+        <w:t xml:space="preserve">    "video_limit": 20,</w:t>
+        <w:br/>
+        <w:t xml:space="preserve">    "product_limit": 50</w:t>
+        <w:br/>
+        <w:t xml:space="preserve">  },</w:t>
+        <w:br/>
+        <w:t xml:space="preserve">  "started_at": "2026-05-15T19:24:45Z",</w:t>
+        <w:br/>
+        <w:t xml:space="preserve">  "expires_at": "2026-06-14T19:24:45Z",</w:t>
+        <w:br/>
+        <w:t xml:space="preserve">  "is_active": true,</w:t>
+        <w:br/>
+        <w:t xml:space="preserve">  "days_left": 29</w:t>
+        <w:br/>
+        <w:t>}</w:t>
+      </w:r>
+    </w:p>
+    <w:p>
+      <w:pPr>
+        <w:ind w:left="288"/>
+        <w:shd w:val="clear" w:color="auto" w:fill="D4EDDA"/>
+      </w:pPr>
+      <w:r>
+        <w:rPr>
+          <w:i/>
+          <w:color w:val="155724"/>
+          <w:sz w:val="20"/>
+        </w:rPr>
+        <w:t xml:space="preserve">  ✅  Wallet balance is deducted automatically. GET /billing/wallet/ will show updated balance.</w:t>
+      </w:r>
+    </w:p>
+    <w:p>
+      <w:pPr>
+        <w:ind w:left="288"/>
+        <w:shd w:val="clear" w:color="auto" w:fill="F8D7DA"/>
+      </w:pPr>
+      <w:r>
+        <w:rPr>
+          <w:i/>
+          <w:color w:val="7B1D1D"/>
+          <w:sz w:val="20"/>
+        </w:rPr>
+        <w:t xml:space="preserve">  🚫  400 — insufficient_balance  (not enough in wallet)</w:t>
+        <w:br/>
+        <w:t xml:space="preserve">     Fix: top up wallet first (Step 41), then retry subscribe.</w:t>
+        <w:br/>
+        <w:t xml:space="preserve">     404 — Plan not found  (wrong plan_name)</w:t>
+        <w:br/>
+        <w:t xml:space="preserve">     Fix: use exactly one of: free | basic | premium</w:t>
+      </w:r>
+    </w:p>
+    <w:p>
+      <w:pPr>
+        <w:spacing w:before="40" w:after="40"/>
+      </w:pPr>
+      <w:r>
+        <w:rPr>
+          <w:color w:val="CCCCCC"/>
+          <w:sz w:val="14"/>
+        </w:rPr>
+        <w:t>──────────────────────────────────────────────────────────────────────────────────────────</w:t>
+      </w:r>
+    </w:p>
+    <w:p>
+      <w:pPr>
+        <w:pStyle w:val="Heading2"/>
+      </w:pPr>
+      <w:r>
+        <w:t>STEP 43 — Subscription Status  (Vendor Only)</w:t>
+      </w:r>
+    </w:p>
+    <w:p>
+      <w:pPr>
+        <w:spacing w:before="120"/>
+        <w:shd w:val="clear" w:color="auto" w:fill="D4EDDA"/>
+      </w:pPr>
+      <w:r>
+        <w:rPr>
+          <w:b/>
+          <w:color w:val="155524"/>
+          <w:sz w:val="20"/>
+        </w:rPr>
+        <w:t xml:space="preserve">  GET  </w:t>
+      </w:r>
+      <w:r>
+        <w:rPr>
+          <w:b/>
+          <w:color w:val="1F4E79"/>
+          <w:sz w:val="20"/>
+        </w:rPr>
+        <w:t xml:space="preserve">  {{base_url}}/billing/subscription/</w:t>
+      </w:r>
+      <w:r>
+        <w:rPr>
+          <w:i/>
+          <w:color w:val="777777"/>
+          <w:sz w:val="18"/>
+        </w:rPr>
+        <w:t xml:space="preserve">   [Vendor JWT]   [Sprint 7]</w:t>
+      </w:r>
+    </w:p>
+    <w:p>
+      <w:pPr>
+        <w:ind w:left="288"/>
+      </w:pPr>
+      <w:r>
+        <w:rPr>
+          <w:b w:val="0"/>
+          <w:sz w:val="20"/>
+        </w:rPr>
+        <w:t>Authorization: Bearer {{vendor_token}}</w:t>
+      </w:r>
+    </w:p>
+    <w:p>
+      <w:r>
+        <w:rPr>
+          <w:b w:val="0"/>
+          <w:sz w:val="22"/>
+        </w:rPr>
+        <w:t>No body.</w:t>
+      </w:r>
+    </w:p>
+    <w:p>
+      <w:r>
+        <w:rPr>
+          <w:b w:val="0"/>
+          <w:sz w:val="20"/>
+        </w:rPr>
+        <w:t>Expected Response  200 OK — same shape as subscribe response.</w:t>
+      </w:r>
+    </w:p>
+    <w:p>
+      <w:pPr>
+        <w:ind w:left="288"/>
+        <w:shd w:val="clear" w:color="auto" w:fill="D1ECF1"/>
+      </w:pPr>
+      <w:r>
+        <w:rPr>
+          <w:i/>
+          <w:color w:val="0C5460"/>
+          <w:sz w:val="20"/>
+        </w:rPr>
+        <w:t xml:space="preserve">  💡  days_left shows how many days remain.</w:t>
+        <w:br/>
+        <w:t>If is_active=false, the plan has expired — subscribe again to reactivate.</w:t>
+        <w:br/>
+        <w:t>A vendor with no subscription gets 404 from this endpoint.</w:t>
+      </w:r>
+    </w:p>
+    <w:p>
+      <w:pPr>
+        <w:spacing w:before="40" w:after="40"/>
+      </w:pPr>
+      <w:r>
+        <w:rPr>
+          <w:color w:val="CCCCCC"/>
+          <w:sz w:val="14"/>
+        </w:rPr>
+        <w:t>──────────────────────────────────────────────────────────────────────────────────────────</w:t>
+      </w:r>
+    </w:p>
+    <w:p>
+      <w:pPr>
+        <w:pStyle w:val="Heading2"/>
+      </w:pPr>
+      <w:r>
+        <w:t>STEP 44 — Transaction History  (Vendor Only)</w:t>
+      </w:r>
+    </w:p>
+    <w:p>
+      <w:pPr>
+        <w:spacing w:before="120"/>
+        <w:shd w:val="clear" w:color="auto" w:fill="D4EDDA"/>
+      </w:pPr>
+      <w:r>
+        <w:rPr>
+          <w:b/>
+          <w:color w:val="155524"/>
+          <w:sz w:val="20"/>
+        </w:rPr>
+        <w:t xml:space="preserve">  GET  </w:t>
+      </w:r>
+      <w:r>
+        <w:rPr>
+          <w:b/>
+          <w:color w:val="1F4E79"/>
+          <w:sz w:val="20"/>
+        </w:rPr>
+        <w:t xml:space="preserve">  {{base_url}}/billing/transactions/</w:t>
+      </w:r>
+      <w:r>
+        <w:rPr>
+          <w:i/>
+          <w:color w:val="777777"/>
+          <w:sz w:val="18"/>
+        </w:rPr>
+        <w:t xml:space="preserve">   [Vendor JWT]   [Sprint 7]</w:t>
+      </w:r>
+    </w:p>
+    <w:p>
+      <w:pPr>
+        <w:ind w:left="288"/>
+      </w:pPr>
+      <w:r>
+        <w:rPr>
+          <w:b w:val="0"/>
+          <w:sz w:val="20"/>
+        </w:rPr>
+        <w:t>Authorization: Bearer {{vendor_token}}</w:t>
+      </w:r>
+    </w:p>
+    <w:p>
+      <w:r>
+        <w:rPr>
+          <w:b w:val="0"/>
+          <w:sz w:val="22"/>
+        </w:rPr>
+        <w:t>No body.</w:t>
+      </w:r>
+    </w:p>
+    <w:p>
+      <w:r>
+        <w:rPr>
+          <w:b/>
+          <w:sz w:val="20"/>
+        </w:rPr>
+        <w:t>Expected Response  200 OK:</w:t>
+      </w:r>
+    </w:p>
+    <w:p>
+      <w:pPr>
+        <w:spacing w:before="40" w:after="40"/>
+        <w:ind w:left="288"/>
+        <w:shd w:val="clear" w:color="auto" w:fill="F0F0F0"/>
+      </w:pPr>
+      <w:r>
+        <w:rPr>
+          <w:rFonts w:ascii="Courier New" w:hAnsi="Courier New"/>
+          <w:color w:val="1A1A8C"/>
+          <w:sz w:val="18"/>
+        </w:rPr>
+        <w:t>[</w:t>
+        <w:br/>
+        <w:t xml:space="preserve">  {</w:t>
+        <w:br/>
+        <w:t xml:space="preserve">    "id": "...",</w:t>
+        <w:br/>
+        <w:t xml:space="preserve">    "type": "subscription",</w:t>
+        <w:br/>
+        <w:t xml:space="preserve">    "amount": "-499.00",</w:t>
+        <w:br/>
+        <w:t xml:space="preserve">    "description": "Subscribed to Basic Plan",</w:t>
+        <w:br/>
+        <w:t xml:space="preserve">    "reference_id": "SUB-BASIC-1747315485",</w:t>
+        <w:br/>
+        <w:t xml:space="preserve">    "balance_after": "501.00",</w:t>
+        <w:br/>
+        <w:t xml:space="preserve">    "created_at": "2026-05-15T19:24:45Z"</w:t>
+        <w:br/>
+        <w:t xml:space="preserve">  },</w:t>
+        <w:br/>
+        <w:t xml:space="preserve">  {</w:t>
+        <w:br/>
+        <w:t xml:space="preserve">    "type": "topup",</w:t>
+        <w:br/>
+        <w:t xml:space="preserve">    "amount": "1000.00",</w:t>
+        <w:br/>
+        <w:t xml:space="preserve">    "description": "Wallet top-up of ₹1000.00",</w:t>
+        <w:br/>
+        <w:t xml:space="preserve">    "reference_id": "DEV-TOPUP-1747315200",</w:t>
+        <w:br/>
+        <w:t xml:space="preserve">    "balance_after": "1000.00"</w:t>
+        <w:br/>
+        <w:t xml:space="preserve">  }</w:t>
+        <w:br/>
+        <w:t>]</w:t>
+      </w:r>
+    </w:p>
+    <w:p>
+      <w:pPr>
+        <w:ind w:left="288"/>
+        <w:shd w:val="clear" w:color="auto" w:fill="D1ECF1"/>
+      </w:pPr>
+      <w:r>
+        <w:rPr>
+          <w:i/>
+          <w:color w:val="0C5460"/>
+          <w:sz w:val="20"/>
+        </w:rPr>
+        <w:t xml:space="preserve">  💡  Top-up entries have positive amount. Subscription entries have negative amount.</w:t>
+        <w:br/>
+        <w:t>Sorted newest first. Free plan subscriptions create NO transaction (no money moved).</w:t>
+      </w:r>
+    </w:p>
+    <w:p>
+      <w:r>
+        <w:br w:type="page"/>
+      </w:r>
+    </w:p>
+    <w:p>
+      <w:pPr>
+        <w:pStyle w:val="Heading1"/>
+      </w:pPr>
+      <w:r>
         <w:t>4. Error Cases to Test</w:t>
       </w:r>
     </w:p>
@@ -16001,7 +17538,7 @@
         <w:pStyle w:val="Heading2"/>
       </w:pPr>
       <w:r>
-        <w:t>Video Error Cases  (Sprint 4)</w:t>
+        <w:t>Billing Error Cases  (Sprint 7)</w:t>
       </w:r>
     </w:p>
     <w:tbl>
@@ -16019,7 +17556,7 @@
       <w:tr>
         <w:tc>
           <w:tcPr>
-            <w:tcW w:type="dxa" w:w="2880"/>
+            <w:tcW w:type="dxa" w:w="2736"/>
             <w:shd w:val="clear" w:color="auto" w:fill="1F4E79"/>
           </w:tcPr>
           <w:p>
@@ -16035,7 +17572,7 @@
         </w:tc>
         <w:tc>
           <w:tcPr>
-            <w:tcW w:type="dxa" w:w="3456"/>
+            <w:tcW w:type="dxa" w:w="3744"/>
             <w:shd w:val="clear" w:color="auto" w:fill="1F4E79"/>
           </w:tcPr>
           <w:p>
@@ -16045,13 +17582,13 @@
                 <w:color w:val="FFFFFF"/>
                 <w:sz w:val="20"/>
               </w:rPr>
-              <w:t>Request</w:t>
-            </w:r>
-          </w:p>
-        </w:tc>
-        <w:tc>
-          <w:tcPr>
-            <w:tcW w:type="dxa" w:w="3168"/>
+              <w:t>Request / Situation</w:t>
+            </w:r>
+          </w:p>
+        </w:tc>
+        <w:tc>
+          <w:tcPr>
+            <w:tcW w:type="dxa" w:w="3024"/>
             <w:shd w:val="clear" w:color="auto" w:fill="1F4E79"/>
           </w:tcPr>
           <w:p>
@@ -16069,7 +17606,7 @@
       <w:tr>
         <w:tc>
           <w:tcPr>
-            <w:tcW w:type="dxa" w:w="2880"/>
+            <w:tcW w:type="dxa" w:w="2736"/>
             <w:shd w:val="clear" w:color="auto" w:fill="DEEAF1"/>
           </w:tcPr>
           <w:p>
@@ -16077,13 +17614,13 @@
               <w:rPr>
                 <w:sz w:val="19"/>
               </w:rPr>
-              <w:t>No store — request upload</w:t>
-            </w:r>
-          </w:p>
-        </w:tc>
-        <w:tc>
-          <w:tcPr>
-            <w:tcW w:type="dxa" w:w="3456"/>
+              <w:t>Top-up — zero amount</w:t>
+            </w:r>
+          </w:p>
+        </w:tc>
+        <w:tc>
+          <w:tcPr>
+            <w:tcW w:type="dxa" w:w="3744"/>
             <w:shd w:val="clear" w:color="auto" w:fill="DEEAF1"/>
           </w:tcPr>
           <w:p>
@@ -16091,13 +17628,13 @@
               <w:rPr>
                 <w:sz w:val="19"/>
               </w:rPr>
-              <w:t>POST /videos/request-upload/ before store created</w:t>
-            </w:r>
-          </w:p>
-        </w:tc>
-        <w:tc>
-          <w:tcPr>
-            <w:tcW w:type="dxa" w:w="3168"/>
+              <w:t>POST /billing/topup/ {"amount": "0"}</w:t>
+            </w:r>
+          </w:p>
+        </w:tc>
+        <w:tc>
+          <w:tcPr>
+            <w:tcW w:type="dxa" w:w="3024"/>
             <w:shd w:val="clear" w:color="auto" w:fill="DEEAF1"/>
           </w:tcPr>
           <w:p>
@@ -16105,7 +17642,7 @@
               <w:rPr>
                 <w:sz w:val="19"/>
               </w:rPr>
-              <w:t>400 — Create a store first</w:t>
+              <w:t>400 — amount must be a positive number</w:t>
             </w:r>
           </w:p>
         </w:tc>
@@ -16113,40 +17650,40 @@
       <w:tr>
         <w:tc>
           <w:tcPr>
-            <w:tcW w:type="dxa" w:w="2880"/>
-          </w:tcPr>
-          <w:p>
-            <w:r>
-              <w:rPr>
-                <w:sz w:val="19"/>
-              </w:rPr>
-              <w:t>Missing title</w:t>
-            </w:r>
-          </w:p>
-        </w:tc>
-        <w:tc>
-          <w:tcPr>
-            <w:tcW w:type="dxa" w:w="3456"/>
-          </w:tcPr>
-          <w:p>
-            <w:r>
-              <w:rPr>
-                <w:sz w:val="19"/>
-              </w:rPr>
-              <w:t>POST /videos/request-upload/ with no title field</w:t>
-            </w:r>
-          </w:p>
-        </w:tc>
-        <w:tc>
-          <w:tcPr>
-            <w:tcW w:type="dxa" w:w="3168"/>
-          </w:tcPr>
-          <w:p>
-            <w:r>
-              <w:rPr>
-                <w:sz w:val="19"/>
-              </w:rPr>
-              <w:t>400 — This field is required</w:t>
+            <w:tcW w:type="dxa" w:w="2736"/>
+          </w:tcPr>
+          <w:p>
+            <w:r>
+              <w:rPr>
+                <w:sz w:val="19"/>
+              </w:rPr>
+              <w:t>Top-up — negative amount</w:t>
+            </w:r>
+          </w:p>
+        </w:tc>
+        <w:tc>
+          <w:tcPr>
+            <w:tcW w:type="dxa" w:w="3744"/>
+          </w:tcPr>
+          <w:p>
+            <w:r>
+              <w:rPr>
+                <w:sz w:val="19"/>
+              </w:rPr>
+              <w:t>POST /billing/topup/ {"amount": "-100"}</w:t>
+            </w:r>
+          </w:p>
+        </w:tc>
+        <w:tc>
+          <w:tcPr>
+            <w:tcW w:type="dxa" w:w="3024"/>
+          </w:tcPr>
+          <w:p>
+            <w:r>
+              <w:rPr>
+                <w:sz w:val="19"/>
+              </w:rPr>
+              <w:t>400 — validation_error</w:t>
             </w:r>
           </w:p>
         </w:tc>
@@ -16154,7 +17691,7 @@
       <w:tr>
         <w:tc>
           <w:tcPr>
-            <w:tcW w:type="dxa" w:w="2880"/>
+            <w:tcW w:type="dxa" w:w="2736"/>
             <w:shd w:val="clear" w:color="auto" w:fill="DEEAF1"/>
           </w:tcPr>
           <w:p>
@@ -16162,13 +17699,13 @@
               <w:rPr>
                 <w:sz w:val="19"/>
               </w:rPr>
-              <w:t>Customer calls request-upload</w:t>
-            </w:r>
-          </w:p>
-        </w:tc>
-        <w:tc>
-          <w:tcPr>
-            <w:tcW w:type="dxa" w:w="3456"/>
+              <w:t>Top-up — non-numeric</w:t>
+            </w:r>
+          </w:p>
+        </w:tc>
+        <w:tc>
+          <w:tcPr>
+            <w:tcW w:type="dxa" w:w="3744"/>
             <w:shd w:val="clear" w:color="auto" w:fill="DEEAF1"/>
           </w:tcPr>
           <w:p>
@@ -16176,13 +17713,13 @@
               <w:rPr>
                 <w:sz w:val="19"/>
               </w:rPr>
-              <w:t>POST /videos/request-upload/ with customer token</w:t>
-            </w:r>
-          </w:p>
-        </w:tc>
-        <w:tc>
-          <w:tcPr>
-            <w:tcW w:type="dxa" w:w="3168"/>
+              <w:t>POST /billing/topup/ {"amount": "abc"}</w:t>
+            </w:r>
+          </w:p>
+        </w:tc>
+        <w:tc>
+          <w:tcPr>
+            <w:tcW w:type="dxa" w:w="3024"/>
             <w:shd w:val="clear" w:color="auto" w:fill="DEEAF1"/>
           </w:tcPr>
           <w:p>
@@ -16190,7 +17727,7 @@
               <w:rPr>
                 <w:sz w:val="19"/>
               </w:rPr>
-              <w:t>403 — Vendor access only</w:t>
+              <w:t>400 — validation_error</w:t>
             </w:r>
           </w:p>
         </w:tc>
@@ -16198,40 +17735,40 @@
       <w:tr>
         <w:tc>
           <w:tcPr>
-            <w:tcW w:type="dxa" w:w="2880"/>
-          </w:tcPr>
-          <w:p>
-            <w:r>
-              <w:rPr>
-                <w:sz w:val="19"/>
-              </w:rPr>
-              <w:t>Confirm already-ready video</w:t>
-            </w:r>
-          </w:p>
-        </w:tc>
-        <w:tc>
-          <w:tcPr>
-            <w:tcW w:type="dxa" w:w="3456"/>
-          </w:tcPr>
-          <w:p>
-            <w:r>
-              <w:rPr>
-                <w:sz w:val="19"/>
-              </w:rPr>
-              <w:t>POST /videos/&lt;id&gt;/confirm-upload/ on ready video</w:t>
-            </w:r>
-          </w:p>
-        </w:tc>
-        <w:tc>
-          <w:tcPr>
-            <w:tcW w:type="dxa" w:w="3168"/>
-          </w:tcPr>
-          <w:p>
-            <w:r>
-              <w:rPr>
-                <w:sz w:val="19"/>
-              </w:rPr>
-              <w:t>400 — Video already in "ready" state</w:t>
+            <w:tcW w:type="dxa" w:w="2736"/>
+          </w:tcPr>
+          <w:p>
+            <w:r>
+              <w:rPr>
+                <w:sz w:val="19"/>
+              </w:rPr>
+              <w:t>Top-up — no auth</w:t>
+            </w:r>
+          </w:p>
+        </w:tc>
+        <w:tc>
+          <w:tcPr>
+            <w:tcW w:type="dxa" w:w="3744"/>
+          </w:tcPr>
+          <w:p>
+            <w:r>
+              <w:rPr>
+                <w:sz w:val="19"/>
+              </w:rPr>
+              <w:t>POST /billing/topup/ — no Authorization header</w:t>
+            </w:r>
+          </w:p>
+        </w:tc>
+        <w:tc>
+          <w:tcPr>
+            <w:tcW w:type="dxa" w:w="3024"/>
+          </w:tcPr>
+          <w:p>
+            <w:r>
+              <w:rPr>
+                <w:sz w:val="19"/>
+              </w:rPr>
+              <w:t>401 — authentication_failed</w:t>
             </w:r>
           </w:p>
         </w:tc>
@@ -16239,7 +17776,7 @@
       <w:tr>
         <w:tc>
           <w:tcPr>
-            <w:tcW w:type="dxa" w:w="2880"/>
+            <w:tcW w:type="dxa" w:w="2736"/>
             <w:shd w:val="clear" w:color="auto" w:fill="DEEAF1"/>
           </w:tcPr>
           <w:p>
@@ -16247,13 +17784,13 @@
               <w:rPr>
                 <w:sz w:val="19"/>
               </w:rPr>
-              <w:t>Duration too long</w:t>
-            </w:r>
-          </w:p>
-        </w:tc>
-        <w:tc>
-          <w:tcPr>
-            <w:tcW w:type="dxa" w:w="3456"/>
+              <w:t>Top-up — customer token</w:t>
+            </w:r>
+          </w:p>
+        </w:tc>
+        <w:tc>
+          <w:tcPr>
+            <w:tcW w:type="dxa" w:w="3744"/>
             <w:shd w:val="clear" w:color="auto" w:fill="DEEAF1"/>
           </w:tcPr>
           <w:p>
@@ -16261,13 +17798,13 @@
               <w:rPr>
                 <w:sz w:val="19"/>
               </w:rPr>
-              <w:t>POST /videos/&lt;id&gt;/confirm-upload/ — duration_seconds=120</w:t>
-            </w:r>
-          </w:p>
-        </w:tc>
-        <w:tc>
-          <w:tcPr>
-            <w:tcW w:type="dxa" w:w="3168"/>
+              <w:t>POST /billing/topup/ — customer token</w:t>
+            </w:r>
+          </w:p>
+        </w:tc>
+        <w:tc>
+          <w:tcPr>
+            <w:tcW w:type="dxa" w:w="3024"/>
             <w:shd w:val="clear" w:color="auto" w:fill="DEEAF1"/>
           </w:tcPr>
           <w:p>
@@ -16275,7 +17812,7 @@
               <w:rPr>
                 <w:sz w:val="19"/>
               </w:rPr>
-              <w:t>400 — cannot exceed 60 seconds</w:t>
+              <w:t>403 — Vendor access only</w:t>
             </w:r>
           </w:p>
         </w:tc>
@@ -16283,40 +17820,40 @@
       <w:tr>
         <w:tc>
           <w:tcPr>
-            <w:tcW w:type="dxa" w:w="2880"/>
-          </w:tcPr>
-          <w:p>
-            <w:r>
-              <w:rPr>
-                <w:sz w:val="19"/>
-              </w:rPr>
-              <w:t>Confirm another vendor video</w:t>
-            </w:r>
-          </w:p>
-        </w:tc>
-        <w:tc>
-          <w:tcPr>
-            <w:tcW w:type="dxa" w:w="3456"/>
-          </w:tcPr>
-          <w:p>
-            <w:r>
-              <w:rPr>
-                <w:sz w:val="19"/>
-              </w:rPr>
-              <w:t>POST /videos/&lt;id&gt;/confirm-upload/ — wrong vendor</w:t>
-            </w:r>
-          </w:p>
-        </w:tc>
-        <w:tc>
-          <w:tcPr>
-            <w:tcW w:type="dxa" w:w="3168"/>
-          </w:tcPr>
-          <w:p>
-            <w:r>
-              <w:rPr>
-                <w:sz w:val="19"/>
-              </w:rPr>
-              <w:t>404 — not_found</w:t>
+            <w:tcW w:type="dxa" w:w="2736"/>
+          </w:tcPr>
+          <w:p>
+            <w:r>
+              <w:rPr>
+                <w:sz w:val="19"/>
+              </w:rPr>
+              <w:t>Subscribe — bad plan name</w:t>
+            </w:r>
+          </w:p>
+        </w:tc>
+        <w:tc>
+          <w:tcPr>
+            <w:tcW w:type="dxa" w:w="3744"/>
+          </w:tcPr>
+          <w:p>
+            <w:r>
+              <w:rPr>
+                <w:sz w:val="19"/>
+              </w:rPr>
+              <w:t>POST /billing/subscribe/ {"plan_name": "gold"}</w:t>
+            </w:r>
+          </w:p>
+        </w:tc>
+        <w:tc>
+          <w:tcPr>
+            <w:tcW w:type="dxa" w:w="3024"/>
+          </w:tcPr>
+          <w:p>
+            <w:r>
+              <w:rPr>
+                <w:sz w:val="19"/>
+              </w:rPr>
+              <w:t>404 — Plan not found</w:t>
             </w:r>
           </w:p>
         </w:tc>
@@ -16324,7 +17861,7 @@
       <w:tr>
         <w:tc>
           <w:tcPr>
-            <w:tcW w:type="dxa" w:w="2880"/>
+            <w:tcW w:type="dxa" w:w="2736"/>
             <w:shd w:val="clear" w:color="auto" w:fill="DEEAF1"/>
           </w:tcPr>
           <w:p>
@@ -16332,13 +17869,13 @@
               <w:rPr>
                 <w:sz w:val="19"/>
               </w:rPr>
-              <w:t>Feed without lat/lng</w:t>
-            </w:r>
-          </w:p>
-        </w:tc>
-        <w:tc>
-          <w:tcPr>
-            <w:tcW w:type="dxa" w:w="3456"/>
+              <w:t>Subscribe — insufficient bal</w:t>
+            </w:r>
+          </w:p>
+        </w:tc>
+        <w:tc>
+          <w:tcPr>
+            <w:tcW w:type="dxa" w:w="3744"/>
             <w:shd w:val="clear" w:color="auto" w:fill="DEEAF1"/>
           </w:tcPr>
           <w:p>
@@ -16346,13 +17883,13 @@
               <w:rPr>
                 <w:sz w:val="19"/>
               </w:rPr>
-              <w:t>GET /videos/feed/ — no ?lat=&amp;lng= params</w:t>
-            </w:r>
-          </w:p>
-        </w:tc>
-        <w:tc>
-          <w:tcPr>
-            <w:tcW w:type="dxa" w:w="3168"/>
+              <w:t>POST /billing/subscribe/ {"plan_name": "premium"} — balance too low</w:t>
+            </w:r>
+          </w:p>
+        </w:tc>
+        <w:tc>
+          <w:tcPr>
+            <w:tcW w:type="dxa" w:w="3024"/>
             <w:shd w:val="clear" w:color="auto" w:fill="DEEAF1"/>
           </w:tcPr>
           <w:p>
@@ -16360,7 +17897,7 @@
               <w:rPr>
                 <w:sz w:val="19"/>
               </w:rPr>
-              <w:t>400 — lat and lng are required numbers</w:t>
+              <w:t>400 — insufficient_balance</w:t>
             </w:r>
           </w:p>
         </w:tc>
@@ -16368,40 +17905,40 @@
       <w:tr>
         <w:tc>
           <w:tcPr>
-            <w:tcW w:type="dxa" w:w="2880"/>
-          </w:tcPr>
-          <w:p>
-            <w:r>
-              <w:rPr>
-                <w:sz w:val="19"/>
-              </w:rPr>
-              <w:t>Detail on processing video</w:t>
-            </w:r>
-          </w:p>
-        </w:tc>
-        <w:tc>
-          <w:tcPr>
-            <w:tcW w:type="dxa" w:w="3456"/>
-          </w:tcPr>
-          <w:p>
-            <w:r>
-              <w:rPr>
-                <w:sz w:val="19"/>
-              </w:rPr>
-              <w:t>GET /videos/&lt;id&gt;/ while status=processing</w:t>
-            </w:r>
-          </w:p>
-        </w:tc>
-        <w:tc>
-          <w:tcPr>
-            <w:tcW w:type="dxa" w:w="3168"/>
-          </w:tcPr>
-          <w:p>
-            <w:r>
-              <w:rPr>
-                <w:sz w:val="19"/>
-              </w:rPr>
-              <w:t>404 — not_found (only ready shown)</w:t>
+            <w:tcW w:type="dxa" w:w="2736"/>
+          </w:tcPr>
+          <w:p>
+            <w:r>
+              <w:rPr>
+                <w:sz w:val="19"/>
+              </w:rPr>
+              <w:t>Subscription status — no sub</w:t>
+            </w:r>
+          </w:p>
+        </w:tc>
+        <w:tc>
+          <w:tcPr>
+            <w:tcW w:type="dxa" w:w="3744"/>
+          </w:tcPr>
+          <w:p>
+            <w:r>
+              <w:rPr>
+                <w:sz w:val="19"/>
+              </w:rPr>
+              <w:t>GET /billing/subscription/ — never subscribed</w:t>
+            </w:r>
+          </w:p>
+        </w:tc>
+        <w:tc>
+          <w:tcPr>
+            <w:tcW w:type="dxa" w:w="3024"/>
+          </w:tcPr>
+          <w:p>
+            <w:r>
+              <w:rPr>
+                <w:sz w:val="19"/>
+              </w:rPr>
+              <w:t>404 — No subscription found</w:t>
             </w:r>
           </w:p>
         </w:tc>
@@ -16409,7 +17946,7 @@
       <w:tr>
         <w:tc>
           <w:tcPr>
-            <w:tcW w:type="dxa" w:w="2880"/>
+            <w:tcW w:type="dxa" w:w="2736"/>
             <w:shd w:val="clear" w:color="auto" w:fill="DEEAF1"/>
           </w:tcPr>
           <w:p>
@@ -16417,13 +17954,13 @@
               <w:rPr>
                 <w:sz w:val="19"/>
               </w:rPr>
-              <w:t>Like without auth</w:t>
-            </w:r>
-          </w:p>
-        </w:tc>
-        <w:tc>
-          <w:tcPr>
-            <w:tcW w:type="dxa" w:w="3456"/>
+              <w:t>Wallet — no store</w:t>
+            </w:r>
+          </w:p>
+        </w:tc>
+        <w:tc>
+          <w:tcPr>
+            <w:tcW w:type="dxa" w:w="3744"/>
             <w:shd w:val="clear" w:color="auto" w:fill="DEEAF1"/>
           </w:tcPr>
           <w:p>
@@ -16431,13 +17968,13 @@
               <w:rPr>
                 <w:sz w:val="19"/>
               </w:rPr>
-              <w:t>POST /videos/&lt;id&gt;/like/ — no auth header</w:t>
-            </w:r>
-          </w:p>
-        </w:tc>
-        <w:tc>
-          <w:tcPr>
-            <w:tcW w:type="dxa" w:w="3168"/>
+              <w:t>GET /billing/wallet/ — vendor with no store</w:t>
+            </w:r>
+          </w:p>
+        </w:tc>
+        <w:tc>
+          <w:tcPr>
+            <w:tcW w:type="dxa" w:w="3024"/>
             <w:shd w:val="clear" w:color="auto" w:fill="DEEAF1"/>
           </w:tcPr>
           <w:p>
@@ -16445,7 +17982,7 @@
               <w:rPr>
                 <w:sz w:val="19"/>
               </w:rPr>
-              <w:t>401 — authentication_failed</w:t>
+              <w:t>404 — not_found</w:t>
             </w:r>
           </w:p>
         </w:tc>
@@ -16453,40 +17990,40 @@
       <w:tr>
         <w:tc>
           <w:tcPr>
-            <w:tcW w:type="dxa" w:w="2880"/>
-          </w:tcPr>
-          <w:p>
-            <w:r>
-              <w:rPr>
-                <w:sz w:val="19"/>
-              </w:rPr>
-              <w:t>Update another vendor video</w:t>
-            </w:r>
-          </w:p>
-        </w:tc>
-        <w:tc>
-          <w:tcPr>
-            <w:tcW w:type="dxa" w:w="3456"/>
-          </w:tcPr>
-          <w:p>
-            <w:r>
-              <w:rPr>
-                <w:sz w:val="19"/>
-              </w:rPr>
-              <w:t>PATCH /videos/&lt;id&gt;/update/ — different vendor token</w:t>
-            </w:r>
-          </w:p>
-        </w:tc>
-        <w:tc>
-          <w:tcPr>
-            <w:tcW w:type="dxa" w:w="3168"/>
-          </w:tcPr>
-          <w:p>
-            <w:r>
-              <w:rPr>
-                <w:sz w:val="19"/>
-              </w:rPr>
-              <w:t>404 — not_found</w:t>
+            <w:tcW w:type="dxa" w:w="2736"/>
+          </w:tcPr>
+          <w:p>
+            <w:r>
+              <w:rPr>
+                <w:sz w:val="19"/>
+              </w:rPr>
+              <w:t>Video limit reached</w:t>
+            </w:r>
+          </w:p>
+        </w:tc>
+        <w:tc>
+          <w:tcPr>
+            <w:tcW w:type="dxa" w:w="3744"/>
+          </w:tcPr>
+          <w:p>
+            <w:r>
+              <w:rPr>
+                <w:sz w:val="19"/>
+              </w:rPr>
+              <w:t>POST /videos/request-upload/ on Free plan (&gt;3 videos)</w:t>
+            </w:r>
+          </w:p>
+        </w:tc>
+        <w:tc>
+          <w:tcPr>
+            <w:tcW w:type="dxa" w:w="3024"/>
+          </w:tcPr>
+          <w:p>
+            <w:r>
+              <w:rPr>
+                <w:sz w:val="19"/>
+              </w:rPr>
+              <w:t>403 — plan_limit_reached</w:t>
             </w:r>
           </w:p>
         </w:tc>
@@ -16494,7 +18031,7 @@
       <w:tr>
         <w:tc>
           <w:tcPr>
-            <w:tcW w:type="dxa" w:w="2880"/>
+            <w:tcW w:type="dxa" w:w="2736"/>
             <w:shd w:val="clear" w:color="auto" w:fill="DEEAF1"/>
           </w:tcPr>
           <w:p>
@@ -16502,13 +18039,13 @@
               <w:rPr>
                 <w:sz w:val="19"/>
               </w:rPr>
-              <w:t>Delete another vendor video</w:t>
-            </w:r>
-          </w:p>
-        </w:tc>
-        <w:tc>
-          <w:tcPr>
-            <w:tcW w:type="dxa" w:w="3456"/>
+              <w:t>Product limit reached</w:t>
+            </w:r>
+          </w:p>
+        </w:tc>
+        <w:tc>
+          <w:tcPr>
+            <w:tcW w:type="dxa" w:w="3744"/>
             <w:shd w:val="clear" w:color="auto" w:fill="DEEAF1"/>
           </w:tcPr>
           <w:p>
@@ -16516,13 +18053,13 @@
               <w:rPr>
                 <w:sz w:val="19"/>
               </w:rPr>
-              <w:t>DELETE /videos/&lt;id&gt;/delete/ — different vendor</w:t>
-            </w:r>
-          </w:p>
-        </w:tc>
-        <w:tc>
-          <w:tcPr>
-            <w:tcW w:type="dxa" w:w="3168"/>
+              <w:t>POST /products/ on Free plan (&gt;10 products)</w:t>
+            </w:r>
+          </w:p>
+        </w:tc>
+        <w:tc>
+          <w:tcPr>
+            <w:tcW w:type="dxa" w:w="3024"/>
             <w:shd w:val="clear" w:color="auto" w:fill="DEEAF1"/>
           </w:tcPr>
           <w:p>
@@ -16530,48 +18067,7 @@
               <w:rPr>
                 <w:sz w:val="19"/>
               </w:rPr>
-              <w:t>404 — not_found</w:t>
-            </w:r>
-          </w:p>
-        </w:tc>
-      </w:tr>
-      <w:tr>
-        <w:tc>
-          <w:tcPr>
-            <w:tcW w:type="dxa" w:w="2880"/>
-          </w:tcPr>
-          <w:p>
-            <w:r>
-              <w:rPr>
-                <w:sz w:val="19"/>
-              </w:rPr>
-              <w:t>Delete with customer token</w:t>
-            </w:r>
-          </w:p>
-        </w:tc>
-        <w:tc>
-          <w:tcPr>
-            <w:tcW w:type="dxa" w:w="3456"/>
-          </w:tcPr>
-          <w:p>
-            <w:r>
-              <w:rPr>
-                <w:sz w:val="19"/>
-              </w:rPr>
-              <w:t>DELETE /videos/&lt;id&gt;/delete/ — customer token</w:t>
-            </w:r>
-          </w:p>
-        </w:tc>
-        <w:tc>
-          <w:tcPr>
-            <w:tcW w:type="dxa" w:w="3168"/>
-          </w:tcPr>
-          <w:p>
-            <w:r>
-              <w:rPr>
-                <w:sz w:val="19"/>
-              </w:rPr>
-              <w:t>403 — Vendor access only</w:t>
+              <w:t>403 — plan_limit_reached</w:t>
             </w:r>
           </w:p>
         </w:tc>
@@ -16579,527 +18075,11 @@
     </w:tbl>
     <w:p/>
     <w:p>
-      <w:r>
-        <w:br w:type="page"/>
-      </w:r>
-    </w:p>
-    <w:p>
-      <w:pPr>
-        <w:pStyle w:val="Heading1"/>
-      </w:pPr>
-      <w:r>
-        <w:t>5. Postman Quick Setup</w:t>
-      </w:r>
-    </w:p>
-    <w:p>
       <w:pPr>
         <w:pStyle w:val="Heading2"/>
       </w:pPr>
       <w:r>
-        <w:t>Collection Folder Structure (recommended)</w:t>
-      </w:r>
-    </w:p>
-    <w:p>
-      <w:pPr>
-        <w:spacing w:before="40" w:after="40"/>
-        <w:ind w:left="288"/>
-        <w:shd w:val="clear" w:color="auto" w:fill="F0F0F0"/>
-      </w:pPr>
-      <w:r>
-        <w:rPr>
-          <w:rFonts w:ascii="Courier New" w:hAnsi="Courier New"/>
-          <w:color w:val="1A1A8C"/>
-          <w:sz w:val="18"/>
-        </w:rPr>
-        <w:t>NearKart Local</w:t>
-        <w:br/>
-        <w:t>├── 0. Setup</w:t>
-        <w:br/>
-        <w:t>│   └── Health Check</w:t>
-        <w:br/>
-        <w:t>├── 1. Auth</w:t>
-        <w:br/>
-        <w:t>│   ├── Send OTP (Vendor)</w:t>
-        <w:br/>
-        <w:t>│   ├── Verify OTP (Vendor) ← Tests script saves vendor_token</w:t>
-        <w:br/>
-        <w:t>│   ├── Send OTP (Customer)</w:t>
-        <w:br/>
-        <w:t>│   ├── Verify OTP (Customer) ← Tests script saves customer_token + customer_id</w:t>
-        <w:br/>
-        <w:t>│   ├── Get Profile</w:t>
-        <w:br/>
-        <w:t>│   ├── Update Profile</w:t>
-        <w:br/>
-        <w:t>│   ├── Update Location</w:t>
-        <w:br/>
-        <w:t>│   ├── Refresh Token</w:t>
-        <w:br/>
-        <w:t>│   └── Logout</w:t>
-        <w:br/>
-        <w:t>├── 2. Stores</w:t>
-        <w:br/>
-        <w:t>│   ├── Create Store ← Tests script saves store_id</w:t>
-        <w:br/>
-        <w:t>│   ├── Nearby Stores</w:t>
-        <w:br/>
-        <w:t>│   ├── Store Detail</w:t>
-        <w:br/>
-        <w:t>│   ├── Update Store</w:t>
-        <w:br/>
-        <w:t>│   ├── Follow Store</w:t>
-        <w:br/>
-        <w:t>│   ├── Review Store</w:t>
-        <w:br/>
-        <w:t>│   └── QR Code</w:t>
-        <w:br/>
-        <w:t>├── 3. Products</w:t>
-        <w:br/>
-        <w:t>│   ├── Create Product ← Tests script saves product_id</w:t>
-        <w:br/>
-        <w:t>│   ├── Nearby Products</w:t>
-        <w:br/>
-        <w:t>│   ├── Search Products</w:t>
-        <w:br/>
-        <w:t>│   ├── Product Detail</w:t>
-        <w:br/>
-        <w:t>│   ├── Update Product</w:t>
-        <w:br/>
-        <w:t>│   ├── Delete Product</w:t>
-        <w:br/>
-        <w:t>│   └── Wishlist Toggle</w:t>
-        <w:br/>
-        <w:t>├── 4. Videos</w:t>
-        <w:br/>
-        <w:t>│   ├── Request Upload URL ← Tests script saves video_id</w:t>
-        <w:br/>
-        <w:t>│   ├── Confirm Upload</w:t>
-        <w:br/>
-        <w:t>│   ├── My Videos (Vendor Library)</w:t>
-        <w:br/>
-        <w:t>│   ├── Update Video</w:t>
-        <w:br/>
-        <w:t>│   ├── Video Feed</w:t>
-        <w:br/>
-        <w:t>│   ├── Video Detail</w:t>
-        <w:br/>
-        <w:t>│   ├── Like / Unlike Video</w:t>
-        <w:br/>
-        <w:t>│   └── Delete Video</w:t>
-        <w:br/>
-        <w:t>├── 5. Chat</w:t>
-        <w:br/>
-        <w:t>│   ├── Start Conversation ← Tests script saves conversation_id</w:t>
-        <w:br/>
-        <w:t>│   ├── List Conversations (Inbox)</w:t>
-        <w:br/>
-        <w:t>│   ├── Message History</w:t>
-        <w:br/>
-        <w:t>│   ├── Mark as Read</w:t>
-        <w:br/>
-        <w:t>│   └── [WebSocket] Connect + Send  (use Postman WS tab or wscat)</w:t>
-        <w:br/>
-        <w:t>└── 6. Blacklist</w:t>
-        <w:br/>
-        <w:t xml:space="preserve">    ├── Block Customer  (vendor token + store_id + customer_id)</w:t>
-        <w:br/>
-        <w:t xml:space="preserve">    ├── List Blocked Customers  (vendor token + store_id)</w:t>
-        <w:br/>
-        <w:t xml:space="preserve">    └── Unblock Customer  (same endpoint as Block — toggle)</w:t>
-      </w:r>
-    </w:p>
-    <w:p>
-      <w:pPr>
-        <w:pStyle w:val="Heading2"/>
-      </w:pPr>
-      <w:r>
-        <w:t>Auto-Save Token Script  (paste in Tests tab of Verify OTP request)</w:t>
-      </w:r>
-    </w:p>
-    <w:p>
-      <w:pPr>
-        <w:spacing w:before="40" w:after="40"/>
-        <w:ind w:left="288"/>
-        <w:shd w:val="clear" w:color="auto" w:fill="F0F0F0"/>
-      </w:pPr>
-      <w:r>
-        <w:rPr>
-          <w:rFonts w:ascii="Courier New" w:hAnsi="Courier New"/>
-          <w:color w:val="1A1A8C"/>
-          <w:sz w:val="18"/>
-        </w:rPr>
-        <w:t>// For VENDOR verify OTP request:</w:t>
-        <w:br/>
-        <w:t>const r = pm.response.json();</w:t>
-        <w:br/>
-        <w:t>if (r.access) {</w:t>
-        <w:br/>
-        <w:t xml:space="preserve">    pm.environment.set("vendor_token", r.access);</w:t>
-        <w:br/>
-        <w:t xml:space="preserve">    pm.environment.set("vendor_refresh", r.refresh);</w:t>
-        <w:br/>
-        <w:t xml:space="preserve">    console.log("Vendor token saved:", r.access.substring(0, 30) + "...");</w:t>
-        <w:br/>
-        <w:t>}</w:t>
-        <w:br/>
-        <w:br/>
-        <w:t>// For CUSTOMER verify OTP request — use this instead:</w:t>
-        <w:br/>
-        <w:t>// pm.environment.set("customer_token", r.access);</w:t>
-        <w:br/>
-        <w:t>// pm.environment.set("customer_refresh", r.refresh);</w:t>
-      </w:r>
-    </w:p>
-    <w:p>
-      <w:pPr>
-        <w:pStyle w:val="Heading2"/>
-      </w:pPr>
-      <w:r>
-        <w:t>Auto-Save Store ID  (paste in Tests tab of Create Store request)</w:t>
-      </w:r>
-    </w:p>
-    <w:p>
-      <w:pPr>
-        <w:spacing w:before="40" w:after="40"/>
-        <w:ind w:left="288"/>
-        <w:shd w:val="clear" w:color="auto" w:fill="F0F0F0"/>
-      </w:pPr>
-      <w:r>
-        <w:rPr>
-          <w:rFonts w:ascii="Courier New" w:hAnsi="Courier New"/>
-          <w:color w:val="1A1A8C"/>
-          <w:sz w:val="18"/>
-        </w:rPr>
-        <w:t>const r = pm.response.json();</w:t>
-        <w:br/>
-        <w:t>if (r.id) {</w:t>
-        <w:br/>
-        <w:t xml:space="preserve">    pm.environment.set("store_id", r.id);</w:t>
-        <w:br/>
-        <w:t xml:space="preserve">    console.log("store_id saved:", r.id);</w:t>
-        <w:br/>
-        <w:t>}</w:t>
-      </w:r>
-    </w:p>
-    <w:p>
-      <w:pPr>
-        <w:pStyle w:val="Heading2"/>
-      </w:pPr>
-      <w:r>
-        <w:t>Auto-Save Product ID  (paste in Tests tab of Create Product request)</w:t>
-      </w:r>
-    </w:p>
-    <w:p>
-      <w:pPr>
-        <w:spacing w:before="40" w:after="40"/>
-        <w:ind w:left="288"/>
-        <w:shd w:val="clear" w:color="auto" w:fill="F0F0F0"/>
-      </w:pPr>
-      <w:r>
-        <w:rPr>
-          <w:rFonts w:ascii="Courier New" w:hAnsi="Courier New"/>
-          <w:color w:val="1A1A8C"/>
-          <w:sz w:val="18"/>
-        </w:rPr>
-        <w:t>const r = pm.response.json();</w:t>
-        <w:br/>
-        <w:t>if (r.id) {</w:t>
-        <w:br/>
-        <w:t xml:space="preserve">    pm.environment.set("product_id", r.id);</w:t>
-        <w:br/>
-        <w:t xml:space="preserve">    console.log("product_id saved:", r.id);</w:t>
-        <w:br/>
-        <w:t>}</w:t>
-      </w:r>
-    </w:p>
-    <w:p>
-      <w:pPr>
-        <w:pStyle w:val="Heading2"/>
-      </w:pPr>
-      <w:r>
-        <w:t>Auto-Save Video ID  (paste in Tests tab of Request Upload URL request)</w:t>
-      </w:r>
-    </w:p>
-    <w:p>
-      <w:pPr>
-        <w:spacing w:before="40" w:after="40"/>
-        <w:ind w:left="288"/>
-        <w:shd w:val="clear" w:color="auto" w:fill="F0F0F0"/>
-      </w:pPr>
-      <w:r>
-        <w:rPr>
-          <w:rFonts w:ascii="Courier New" w:hAnsi="Courier New"/>
-          <w:color w:val="1A1A8C"/>
-          <w:sz w:val="18"/>
-        </w:rPr>
-        <w:t>const r = pm.response.json();</w:t>
-        <w:br/>
-        <w:t>if (r.video_id) {</w:t>
-        <w:br/>
-        <w:t xml:space="preserve">    pm.environment.set("video_id", r.video_id);</w:t>
-        <w:br/>
-        <w:t xml:space="preserve">    pm.environment.set("upload_url", r.upload_url);</w:t>
-        <w:br/>
-        <w:t xml:space="preserve">    console.log("video_id saved:", r.video_id);</w:t>
-        <w:br/>
-        <w:t>}</w:t>
-      </w:r>
-    </w:p>
-    <w:p>
-      <w:pPr>
-        <w:pStyle w:val="Heading2"/>
-      </w:pPr>
-      <w:r>
-        <w:t>Auto-Save Conversation ID  (paste in Tests tab of Start Conversation request)</w:t>
-      </w:r>
-    </w:p>
-    <w:p>
-      <w:pPr>
-        <w:spacing w:before="40" w:after="40"/>
-        <w:ind w:left="288"/>
-        <w:shd w:val="clear" w:color="auto" w:fill="F0F0F0"/>
-      </w:pPr>
-      <w:r>
-        <w:rPr>
-          <w:rFonts w:ascii="Courier New" w:hAnsi="Courier New"/>
-          <w:color w:val="1A1A8C"/>
-          <w:sz w:val="18"/>
-        </w:rPr>
-        <w:t>const r = pm.response.json();</w:t>
-        <w:br/>
-        <w:t>if (r.id) {</w:t>
-        <w:br/>
-        <w:t xml:space="preserve">    pm.environment.set("conversation_id", r.id);</w:t>
-        <w:br/>
-        <w:t xml:space="preserve">    console.log("conversation_id saved:", r.id);</w:t>
-        <w:br/>
-        <w:t>}</w:t>
-      </w:r>
-    </w:p>
-    <w:p>
-      <w:pPr>
-        <w:pStyle w:val="Heading2"/>
-      </w:pPr>
-      <w:r>
-        <w:t>Auto-Save Customer ID  (paste in Tests tab of Verify OTP Customer request)</w:t>
-      </w:r>
-    </w:p>
-    <w:p>
-      <w:pPr>
-        <w:spacing w:before="40" w:after="40"/>
-        <w:ind w:left="288"/>
-        <w:shd w:val="clear" w:color="auto" w:fill="F0F0F0"/>
-      </w:pPr>
-      <w:r>
-        <w:rPr>
-          <w:rFonts w:ascii="Courier New" w:hAnsi="Courier New"/>
-          <w:color w:val="1A1A8C"/>
-          <w:sz w:val="18"/>
-        </w:rPr>
-        <w:t>// Add this to the existing customer verify OTP Tests script:</w:t>
-        <w:br/>
-        <w:t>const r = pm.response.json();</w:t>
-        <w:br/>
-        <w:t>if (r.user &amp;&amp; r.user.id) {</w:t>
-        <w:br/>
-        <w:t xml:space="preserve">    pm.environment.set("customer_id", r.user.id);</w:t>
-        <w:br/>
-        <w:t xml:space="preserve">    console.log("customer_id saved:", r.user.id);</w:t>
-        <w:br/>
-        <w:t>}</w:t>
-      </w:r>
-    </w:p>
-    <w:p>
-      <w:pPr>
-        <w:ind w:left="288"/>
-        <w:shd w:val="clear" w:color="auto" w:fill="D1ECF1"/>
-      </w:pPr>
-      <w:r>
-        <w:rPr>
-          <w:i/>
-          <w:color w:val="0C5460"/>
-          <w:sz w:val="20"/>
-        </w:rPr>
-        <w:t xml:space="preserve">  💡  customer_id is needed for Sprint 6 blacklist endpoint:</w:t>
-        <w:br/>
-        <w:t xml:space="preserve">  POST /stores/{{store_id}}/blacklist/{{customer_id}}/</w:t>
-      </w:r>
-    </w:p>
-    <w:p>
-      <w:pPr>
-        <w:pStyle w:val="Heading2"/>
-      </w:pPr>
-      <w:r>
-        <w:t>Quick Test — All Public Endpoints via curl</w:t>
-      </w:r>
-    </w:p>
-    <w:p>
-      <w:r>
-        <w:rPr>
-          <w:b w:val="0"/>
-          <w:sz w:val="22"/>
-        </w:rPr>
-        <w:t>Copy-paste these into terminal to test without Postman:</w:t>
-      </w:r>
-    </w:p>
-    <w:p>
-      <w:pPr>
-        <w:spacing w:before="40" w:after="40"/>
-        <w:ind w:left="288"/>
-        <w:shd w:val="clear" w:color="auto" w:fill="F0F0F0"/>
-      </w:pPr>
-      <w:r>
-        <w:rPr>
-          <w:rFonts w:ascii="Courier New" w:hAnsi="Courier New"/>
-          <w:color w:val="1A1A8C"/>
-          <w:sz w:val="18"/>
-        </w:rPr>
-        <w:t># Health check</w:t>
-        <w:br/>
-        <w:t>curl -s http://localhost:8000/api/v1/health/ | python3 -m json.tool</w:t>
-        <w:br/>
-        <w:br/>
-        <w:t># Send OTP</w:t>
-        <w:br/>
-        <w:t>curl -s -X POST http://localhost:8000/api/v1/auth/otp/send/ \</w:t>
-        <w:br/>
-        <w:t xml:space="preserve">  -H "Content-Type: application/json" \</w:t>
-        <w:br/>
-        <w:t xml:space="preserve">  -d '{"phone_number": "+919999999999"}'</w:t>
-        <w:br/>
-        <w:br/>
-        <w:t># Verify OTP (copy access token from response)</w:t>
-        <w:br/>
-        <w:t>curl -s -X POST http://localhost:8000/api/v1/auth/otp/verify/ \</w:t>
-        <w:br/>
-        <w:t xml:space="preserve">  -H "Content-Type: application/json" \</w:t>
-        <w:br/>
-        <w:t xml:space="preserve">  -d '{"phone_number": "+919999999999", "otp": "123456"}'</w:t>
-        <w:br/>
-        <w:br/>
-        <w:t># Get profile (replace TOKEN with your access token)</w:t>
-        <w:br/>
-        <w:t>curl -s http://localhost:8000/api/v1/auth/me/ \</w:t>
-        <w:br/>
-        <w:t xml:space="preserve">  -H "Authorization: Bearer TOKEN"</w:t>
-      </w:r>
-    </w:p>
-    <w:p>
-      <w:r>
-        <w:br w:type="page"/>
-      </w:r>
-    </w:p>
-    <w:p>
-      <w:pPr>
-        <w:pStyle w:val="Heading1"/>
-      </w:pPr>
-      <w:r>
-        <w:t>6. How to Update This Document (Future Sprints)</w:t>
-      </w:r>
-    </w:p>
-    <w:p>
-      <w:pPr>
-        <w:ind w:left="288"/>
-        <w:shd w:val="clear" w:color="auto" w:fill="D1ECF1"/>
-      </w:pPr>
-      <w:r>
-        <w:rPr>
-          <w:i/>
-          <w:color w:val="0C5460"/>
-          <w:sz w:val="20"/>
-        </w:rPr>
-        <w:t xml:space="preserve">  📌  IMPORTANT: When a new sprint adds new API endpoints, update this document.</w:t>
-        <w:br/>
-        <w:t xml:space="preserve">     Do NOT create a separate doc — keep everything in this single file.</w:t>
-      </w:r>
-    </w:p>
-    <w:p/>
-    <w:p>
-      <w:pPr>
-        <w:pStyle w:val="Heading2"/>
-      </w:pPr>
-      <w:r>
-        <w:t>Checklist for each new sprint:</w:t>
-      </w:r>
-    </w:p>
-    <w:p>
-      <w:pPr>
-        <w:pStyle w:val="ListBullet"/>
-        <w:ind w:left="432"/>
-      </w:pPr>
-      <w:r>
-        <w:rPr>
-          <w:sz w:val="21"/>
-        </w:rPr>
-        <w:t>Add new endpoint rows to Section 2 — Complete API Reference table</w:t>
-      </w:r>
-    </w:p>
-    <w:p>
-      <w:pPr>
-        <w:pStyle w:val="ListBullet"/>
-        <w:ind w:left="432"/>
-      </w:pPr>
-      <w:r>
-        <w:rPr>
-          <w:sz w:val="21"/>
-        </w:rPr>
-        <w:t>Add new STEP sections in Section 3 — Step-by-Step Test Flow</w:t>
-      </w:r>
-    </w:p>
-    <w:p>
-      <w:pPr>
-        <w:pStyle w:val="ListBullet"/>
-        <w:ind w:left="432"/>
-      </w:pPr>
-      <w:r>
-        <w:rPr>
-          <w:sz w:val="21"/>
-        </w:rPr>
-        <w:t>Add new error cases in Section 4 — Error Cases to Test</w:t>
-      </w:r>
-    </w:p>
-    <w:p>
-      <w:pPr>
-        <w:pStyle w:val="ListBullet"/>
-        <w:ind w:left="432"/>
-      </w:pPr>
-      <w:r>
-        <w:rPr>
-          <w:sz w:val="21"/>
-        </w:rPr>
-        <w:t>Add new Postman folder in Section 5 — Postman Quick Setup</w:t>
-      </w:r>
-    </w:p>
-    <w:p>
-      <w:pPr>
-        <w:pStyle w:val="ListBullet"/>
-        <w:ind w:left="432"/>
-      </w:pPr>
-      <w:r>
-        <w:rPr>
-          <w:sz w:val="21"/>
-        </w:rPr>
-        <w:t>Update the cover page "Last updated" date and sprint range</w:t>
-      </w:r>
-    </w:p>
-    <w:p>
-      <w:pPr>
-        <w:pStyle w:val="ListBullet"/>
-        <w:ind w:left="432"/>
-      </w:pPr>
-      <w:r>
-        <w:rPr>
-          <w:sz w:val="21"/>
-        </w:rPr>
-        <w:t>If new field types are introduced (e.g. file uploads), add a format rules subsection in Section 1</w:t>
-      </w:r>
-    </w:p>
-    <w:p>
-      <w:pPr>
-        <w:pStyle w:val="Heading2"/>
-      </w:pPr>
-      <w:r>
-        <w:t>Upcoming Sprints to Add Here</w:t>
+        <w:t>Video Error Cases  (Sprint 4)</w:t>
       </w:r>
     </w:p>
     <w:tbl>
@@ -17117,7 +18097,7 @@
       <w:tr>
         <w:tc>
           <w:tcPr>
-            <w:tcW w:type="dxa" w:w="1152"/>
+            <w:tcW w:type="dxa" w:w="2880"/>
             <w:shd w:val="clear" w:color="auto" w:fill="1F4E79"/>
           </w:tcPr>
           <w:p>
@@ -17127,13 +18107,13 @@
                 <w:color w:val="FFFFFF"/>
                 <w:sz w:val="20"/>
               </w:rPr>
-              <w:t>Sprint</w:t>
-            </w:r>
-          </w:p>
-        </w:tc>
-        <w:tc>
-          <w:tcPr>
-            <w:tcW w:type="dxa" w:w="2160"/>
+              <w:t>Test</w:t>
+            </w:r>
+          </w:p>
+        </w:tc>
+        <w:tc>
+          <w:tcPr>
+            <w:tcW w:type="dxa" w:w="3456"/>
             <w:shd w:val="clear" w:color="auto" w:fill="1F4E79"/>
           </w:tcPr>
           <w:p>
@@ -17143,13 +18123,13 @@
                 <w:color w:val="FFFFFF"/>
                 <w:sz w:val="20"/>
               </w:rPr>
-              <w:t>Module</w:t>
-            </w:r>
-          </w:p>
-        </w:tc>
-        <w:tc>
-          <w:tcPr>
-            <w:tcW w:type="dxa" w:w="6048"/>
+              <w:t>Request</w:t>
+            </w:r>
+          </w:p>
+        </w:tc>
+        <w:tc>
+          <w:tcPr>
+            <w:tcW w:type="dxa" w:w="3168"/>
             <w:shd w:val="clear" w:color="auto" w:fill="1F4E79"/>
           </w:tcPr>
           <w:p>
@@ -17159,7 +18139,7 @@
                 <w:color w:val="FFFFFF"/>
                 <w:sz w:val="20"/>
               </w:rPr>
-              <w:t>APIs to Add</w:t>
+              <w:t>Expected Response</w:t>
             </w:r>
           </w:p>
         </w:tc>
@@ -17167,6 +18147,1118 @@
       <w:tr>
         <w:tc>
           <w:tcPr>
+            <w:tcW w:type="dxa" w:w="2880"/>
+            <w:shd w:val="clear" w:color="auto" w:fill="DEEAF1"/>
+          </w:tcPr>
+          <w:p>
+            <w:r>
+              <w:rPr>
+                <w:sz w:val="19"/>
+              </w:rPr>
+              <w:t>No store — request upload</w:t>
+            </w:r>
+          </w:p>
+        </w:tc>
+        <w:tc>
+          <w:tcPr>
+            <w:tcW w:type="dxa" w:w="3456"/>
+            <w:shd w:val="clear" w:color="auto" w:fill="DEEAF1"/>
+          </w:tcPr>
+          <w:p>
+            <w:r>
+              <w:rPr>
+                <w:sz w:val="19"/>
+              </w:rPr>
+              <w:t>POST /videos/request-upload/ before store created</w:t>
+            </w:r>
+          </w:p>
+        </w:tc>
+        <w:tc>
+          <w:tcPr>
+            <w:tcW w:type="dxa" w:w="3168"/>
+            <w:shd w:val="clear" w:color="auto" w:fill="DEEAF1"/>
+          </w:tcPr>
+          <w:p>
+            <w:r>
+              <w:rPr>
+                <w:sz w:val="19"/>
+              </w:rPr>
+              <w:t>400 — Create a store first</w:t>
+            </w:r>
+          </w:p>
+        </w:tc>
+      </w:tr>
+      <w:tr>
+        <w:tc>
+          <w:tcPr>
+            <w:tcW w:type="dxa" w:w="2880"/>
+          </w:tcPr>
+          <w:p>
+            <w:r>
+              <w:rPr>
+                <w:sz w:val="19"/>
+              </w:rPr>
+              <w:t>Missing title</w:t>
+            </w:r>
+          </w:p>
+        </w:tc>
+        <w:tc>
+          <w:tcPr>
+            <w:tcW w:type="dxa" w:w="3456"/>
+          </w:tcPr>
+          <w:p>
+            <w:r>
+              <w:rPr>
+                <w:sz w:val="19"/>
+              </w:rPr>
+              <w:t>POST /videos/request-upload/ with no title field</w:t>
+            </w:r>
+          </w:p>
+        </w:tc>
+        <w:tc>
+          <w:tcPr>
+            <w:tcW w:type="dxa" w:w="3168"/>
+          </w:tcPr>
+          <w:p>
+            <w:r>
+              <w:rPr>
+                <w:sz w:val="19"/>
+              </w:rPr>
+              <w:t>400 — This field is required</w:t>
+            </w:r>
+          </w:p>
+        </w:tc>
+      </w:tr>
+      <w:tr>
+        <w:tc>
+          <w:tcPr>
+            <w:tcW w:type="dxa" w:w="2880"/>
+            <w:shd w:val="clear" w:color="auto" w:fill="DEEAF1"/>
+          </w:tcPr>
+          <w:p>
+            <w:r>
+              <w:rPr>
+                <w:sz w:val="19"/>
+              </w:rPr>
+              <w:t>Customer calls request-upload</w:t>
+            </w:r>
+          </w:p>
+        </w:tc>
+        <w:tc>
+          <w:tcPr>
+            <w:tcW w:type="dxa" w:w="3456"/>
+            <w:shd w:val="clear" w:color="auto" w:fill="DEEAF1"/>
+          </w:tcPr>
+          <w:p>
+            <w:r>
+              <w:rPr>
+                <w:sz w:val="19"/>
+              </w:rPr>
+              <w:t>POST /videos/request-upload/ with customer token</w:t>
+            </w:r>
+          </w:p>
+        </w:tc>
+        <w:tc>
+          <w:tcPr>
+            <w:tcW w:type="dxa" w:w="3168"/>
+            <w:shd w:val="clear" w:color="auto" w:fill="DEEAF1"/>
+          </w:tcPr>
+          <w:p>
+            <w:r>
+              <w:rPr>
+                <w:sz w:val="19"/>
+              </w:rPr>
+              <w:t>403 — Vendor access only</w:t>
+            </w:r>
+          </w:p>
+        </w:tc>
+      </w:tr>
+      <w:tr>
+        <w:tc>
+          <w:tcPr>
+            <w:tcW w:type="dxa" w:w="2880"/>
+          </w:tcPr>
+          <w:p>
+            <w:r>
+              <w:rPr>
+                <w:sz w:val="19"/>
+              </w:rPr>
+              <w:t>Confirm already-ready video</w:t>
+            </w:r>
+          </w:p>
+        </w:tc>
+        <w:tc>
+          <w:tcPr>
+            <w:tcW w:type="dxa" w:w="3456"/>
+          </w:tcPr>
+          <w:p>
+            <w:r>
+              <w:rPr>
+                <w:sz w:val="19"/>
+              </w:rPr>
+              <w:t>POST /videos/&lt;id&gt;/confirm-upload/ on ready video</w:t>
+            </w:r>
+          </w:p>
+        </w:tc>
+        <w:tc>
+          <w:tcPr>
+            <w:tcW w:type="dxa" w:w="3168"/>
+          </w:tcPr>
+          <w:p>
+            <w:r>
+              <w:rPr>
+                <w:sz w:val="19"/>
+              </w:rPr>
+              <w:t>400 — Video already in "ready" state</w:t>
+            </w:r>
+          </w:p>
+        </w:tc>
+      </w:tr>
+      <w:tr>
+        <w:tc>
+          <w:tcPr>
+            <w:tcW w:type="dxa" w:w="2880"/>
+            <w:shd w:val="clear" w:color="auto" w:fill="DEEAF1"/>
+          </w:tcPr>
+          <w:p>
+            <w:r>
+              <w:rPr>
+                <w:sz w:val="19"/>
+              </w:rPr>
+              <w:t>Duration too long</w:t>
+            </w:r>
+          </w:p>
+        </w:tc>
+        <w:tc>
+          <w:tcPr>
+            <w:tcW w:type="dxa" w:w="3456"/>
+            <w:shd w:val="clear" w:color="auto" w:fill="DEEAF1"/>
+          </w:tcPr>
+          <w:p>
+            <w:r>
+              <w:rPr>
+                <w:sz w:val="19"/>
+              </w:rPr>
+              <w:t>POST /videos/&lt;id&gt;/confirm-upload/ — duration_seconds=120</w:t>
+            </w:r>
+          </w:p>
+        </w:tc>
+        <w:tc>
+          <w:tcPr>
+            <w:tcW w:type="dxa" w:w="3168"/>
+            <w:shd w:val="clear" w:color="auto" w:fill="DEEAF1"/>
+          </w:tcPr>
+          <w:p>
+            <w:r>
+              <w:rPr>
+                <w:sz w:val="19"/>
+              </w:rPr>
+              <w:t>400 — cannot exceed 60 seconds</w:t>
+            </w:r>
+          </w:p>
+        </w:tc>
+      </w:tr>
+      <w:tr>
+        <w:tc>
+          <w:tcPr>
+            <w:tcW w:type="dxa" w:w="2880"/>
+          </w:tcPr>
+          <w:p>
+            <w:r>
+              <w:rPr>
+                <w:sz w:val="19"/>
+              </w:rPr>
+              <w:t>Confirm another vendor video</w:t>
+            </w:r>
+          </w:p>
+        </w:tc>
+        <w:tc>
+          <w:tcPr>
+            <w:tcW w:type="dxa" w:w="3456"/>
+          </w:tcPr>
+          <w:p>
+            <w:r>
+              <w:rPr>
+                <w:sz w:val="19"/>
+              </w:rPr>
+              <w:t>POST /videos/&lt;id&gt;/confirm-upload/ — wrong vendor</w:t>
+            </w:r>
+          </w:p>
+        </w:tc>
+        <w:tc>
+          <w:tcPr>
+            <w:tcW w:type="dxa" w:w="3168"/>
+          </w:tcPr>
+          <w:p>
+            <w:r>
+              <w:rPr>
+                <w:sz w:val="19"/>
+              </w:rPr>
+              <w:t>404 — not_found</w:t>
+            </w:r>
+          </w:p>
+        </w:tc>
+      </w:tr>
+      <w:tr>
+        <w:tc>
+          <w:tcPr>
+            <w:tcW w:type="dxa" w:w="2880"/>
+            <w:shd w:val="clear" w:color="auto" w:fill="DEEAF1"/>
+          </w:tcPr>
+          <w:p>
+            <w:r>
+              <w:rPr>
+                <w:sz w:val="19"/>
+              </w:rPr>
+              <w:t>Feed without lat/lng</w:t>
+            </w:r>
+          </w:p>
+        </w:tc>
+        <w:tc>
+          <w:tcPr>
+            <w:tcW w:type="dxa" w:w="3456"/>
+            <w:shd w:val="clear" w:color="auto" w:fill="DEEAF1"/>
+          </w:tcPr>
+          <w:p>
+            <w:r>
+              <w:rPr>
+                <w:sz w:val="19"/>
+              </w:rPr>
+              <w:t>GET /videos/feed/ — no ?lat=&amp;lng= params</w:t>
+            </w:r>
+          </w:p>
+        </w:tc>
+        <w:tc>
+          <w:tcPr>
+            <w:tcW w:type="dxa" w:w="3168"/>
+            <w:shd w:val="clear" w:color="auto" w:fill="DEEAF1"/>
+          </w:tcPr>
+          <w:p>
+            <w:r>
+              <w:rPr>
+                <w:sz w:val="19"/>
+              </w:rPr>
+              <w:t>400 — lat and lng are required numbers</w:t>
+            </w:r>
+          </w:p>
+        </w:tc>
+      </w:tr>
+      <w:tr>
+        <w:tc>
+          <w:tcPr>
+            <w:tcW w:type="dxa" w:w="2880"/>
+          </w:tcPr>
+          <w:p>
+            <w:r>
+              <w:rPr>
+                <w:sz w:val="19"/>
+              </w:rPr>
+              <w:t>Detail on processing video</w:t>
+            </w:r>
+          </w:p>
+        </w:tc>
+        <w:tc>
+          <w:tcPr>
+            <w:tcW w:type="dxa" w:w="3456"/>
+          </w:tcPr>
+          <w:p>
+            <w:r>
+              <w:rPr>
+                <w:sz w:val="19"/>
+              </w:rPr>
+              <w:t>GET /videos/&lt;id&gt;/ while status=processing</w:t>
+            </w:r>
+          </w:p>
+        </w:tc>
+        <w:tc>
+          <w:tcPr>
+            <w:tcW w:type="dxa" w:w="3168"/>
+          </w:tcPr>
+          <w:p>
+            <w:r>
+              <w:rPr>
+                <w:sz w:val="19"/>
+              </w:rPr>
+              <w:t>404 — not_found (only ready shown)</w:t>
+            </w:r>
+          </w:p>
+        </w:tc>
+      </w:tr>
+      <w:tr>
+        <w:tc>
+          <w:tcPr>
+            <w:tcW w:type="dxa" w:w="2880"/>
+            <w:shd w:val="clear" w:color="auto" w:fill="DEEAF1"/>
+          </w:tcPr>
+          <w:p>
+            <w:r>
+              <w:rPr>
+                <w:sz w:val="19"/>
+              </w:rPr>
+              <w:t>Like without auth</w:t>
+            </w:r>
+          </w:p>
+        </w:tc>
+        <w:tc>
+          <w:tcPr>
+            <w:tcW w:type="dxa" w:w="3456"/>
+            <w:shd w:val="clear" w:color="auto" w:fill="DEEAF1"/>
+          </w:tcPr>
+          <w:p>
+            <w:r>
+              <w:rPr>
+                <w:sz w:val="19"/>
+              </w:rPr>
+              <w:t>POST /videos/&lt;id&gt;/like/ — no auth header</w:t>
+            </w:r>
+          </w:p>
+        </w:tc>
+        <w:tc>
+          <w:tcPr>
+            <w:tcW w:type="dxa" w:w="3168"/>
+            <w:shd w:val="clear" w:color="auto" w:fill="DEEAF1"/>
+          </w:tcPr>
+          <w:p>
+            <w:r>
+              <w:rPr>
+                <w:sz w:val="19"/>
+              </w:rPr>
+              <w:t>401 — authentication_failed</w:t>
+            </w:r>
+          </w:p>
+        </w:tc>
+      </w:tr>
+      <w:tr>
+        <w:tc>
+          <w:tcPr>
+            <w:tcW w:type="dxa" w:w="2880"/>
+          </w:tcPr>
+          <w:p>
+            <w:r>
+              <w:rPr>
+                <w:sz w:val="19"/>
+              </w:rPr>
+              <w:t>Update another vendor video</w:t>
+            </w:r>
+          </w:p>
+        </w:tc>
+        <w:tc>
+          <w:tcPr>
+            <w:tcW w:type="dxa" w:w="3456"/>
+          </w:tcPr>
+          <w:p>
+            <w:r>
+              <w:rPr>
+                <w:sz w:val="19"/>
+              </w:rPr>
+              <w:t>PATCH /videos/&lt;id&gt;/update/ — different vendor token</w:t>
+            </w:r>
+          </w:p>
+        </w:tc>
+        <w:tc>
+          <w:tcPr>
+            <w:tcW w:type="dxa" w:w="3168"/>
+          </w:tcPr>
+          <w:p>
+            <w:r>
+              <w:rPr>
+                <w:sz w:val="19"/>
+              </w:rPr>
+              <w:t>404 — not_found</w:t>
+            </w:r>
+          </w:p>
+        </w:tc>
+      </w:tr>
+      <w:tr>
+        <w:tc>
+          <w:tcPr>
+            <w:tcW w:type="dxa" w:w="2880"/>
+            <w:shd w:val="clear" w:color="auto" w:fill="DEEAF1"/>
+          </w:tcPr>
+          <w:p>
+            <w:r>
+              <w:rPr>
+                <w:sz w:val="19"/>
+              </w:rPr>
+              <w:t>Delete another vendor video</w:t>
+            </w:r>
+          </w:p>
+        </w:tc>
+        <w:tc>
+          <w:tcPr>
+            <w:tcW w:type="dxa" w:w="3456"/>
+            <w:shd w:val="clear" w:color="auto" w:fill="DEEAF1"/>
+          </w:tcPr>
+          <w:p>
+            <w:r>
+              <w:rPr>
+                <w:sz w:val="19"/>
+              </w:rPr>
+              <w:t>DELETE /videos/&lt;id&gt;/delete/ — different vendor</w:t>
+            </w:r>
+          </w:p>
+        </w:tc>
+        <w:tc>
+          <w:tcPr>
+            <w:tcW w:type="dxa" w:w="3168"/>
+            <w:shd w:val="clear" w:color="auto" w:fill="DEEAF1"/>
+          </w:tcPr>
+          <w:p>
+            <w:r>
+              <w:rPr>
+                <w:sz w:val="19"/>
+              </w:rPr>
+              <w:t>404 — not_found</w:t>
+            </w:r>
+          </w:p>
+        </w:tc>
+      </w:tr>
+      <w:tr>
+        <w:tc>
+          <w:tcPr>
+            <w:tcW w:type="dxa" w:w="2880"/>
+          </w:tcPr>
+          <w:p>
+            <w:r>
+              <w:rPr>
+                <w:sz w:val="19"/>
+              </w:rPr>
+              <w:t>Delete with customer token</w:t>
+            </w:r>
+          </w:p>
+        </w:tc>
+        <w:tc>
+          <w:tcPr>
+            <w:tcW w:type="dxa" w:w="3456"/>
+          </w:tcPr>
+          <w:p>
+            <w:r>
+              <w:rPr>
+                <w:sz w:val="19"/>
+              </w:rPr>
+              <w:t>DELETE /videos/&lt;id&gt;/delete/ — customer token</w:t>
+            </w:r>
+          </w:p>
+        </w:tc>
+        <w:tc>
+          <w:tcPr>
+            <w:tcW w:type="dxa" w:w="3168"/>
+          </w:tcPr>
+          <w:p>
+            <w:r>
+              <w:rPr>
+                <w:sz w:val="19"/>
+              </w:rPr>
+              <w:t>403 — Vendor access only</w:t>
+            </w:r>
+          </w:p>
+        </w:tc>
+      </w:tr>
+    </w:tbl>
+    <w:p/>
+    <w:p>
+      <w:r>
+        <w:br w:type="page"/>
+      </w:r>
+    </w:p>
+    <w:p>
+      <w:pPr>
+        <w:pStyle w:val="Heading1"/>
+      </w:pPr>
+      <w:r>
+        <w:t>5. Postman Quick Setup</w:t>
+      </w:r>
+    </w:p>
+    <w:p>
+      <w:pPr>
+        <w:pStyle w:val="Heading2"/>
+      </w:pPr>
+      <w:r>
+        <w:t>Collection Folder Structure (recommended)</w:t>
+      </w:r>
+    </w:p>
+    <w:p>
+      <w:pPr>
+        <w:spacing w:before="40" w:after="40"/>
+        <w:ind w:left="288"/>
+        <w:shd w:val="clear" w:color="auto" w:fill="F0F0F0"/>
+      </w:pPr>
+      <w:r>
+        <w:rPr>
+          <w:rFonts w:ascii="Courier New" w:hAnsi="Courier New"/>
+          <w:color w:val="1A1A8C"/>
+          <w:sz w:val="18"/>
+        </w:rPr>
+        <w:t>NearKart Local</w:t>
+        <w:br/>
+        <w:t>├── 0. Setup</w:t>
+        <w:br/>
+        <w:t>│   └── Health Check</w:t>
+        <w:br/>
+        <w:t>├── 1. Auth</w:t>
+        <w:br/>
+        <w:t>│   ├── Send OTP (Vendor)</w:t>
+        <w:br/>
+        <w:t>│   ├── Verify OTP (Vendor) ← Tests script saves vendor_token</w:t>
+        <w:br/>
+        <w:t>│   ├── Send OTP (Customer)</w:t>
+        <w:br/>
+        <w:t>│   ├── Verify OTP (Customer) ← Tests script saves customer_token + customer_id</w:t>
+        <w:br/>
+        <w:t>│   ├── Get Profile</w:t>
+        <w:br/>
+        <w:t>│   ├── Update Profile</w:t>
+        <w:br/>
+        <w:t>│   ├── Update Location</w:t>
+        <w:br/>
+        <w:t>│   ├── Refresh Token</w:t>
+        <w:br/>
+        <w:t>│   └── Logout</w:t>
+        <w:br/>
+        <w:t>├── 2. Stores</w:t>
+        <w:br/>
+        <w:t>│   ├── Create Store ← Tests script saves store_id</w:t>
+        <w:br/>
+        <w:t>│   ├── Nearby Stores</w:t>
+        <w:br/>
+        <w:t>│   ├── Store Detail</w:t>
+        <w:br/>
+        <w:t>│   ├── Update Store</w:t>
+        <w:br/>
+        <w:t>│   ├── Follow Store</w:t>
+        <w:br/>
+        <w:t>│   ├── Review Store</w:t>
+        <w:br/>
+        <w:t>│   └── QR Code</w:t>
+        <w:br/>
+        <w:t>├── 3. Products</w:t>
+        <w:br/>
+        <w:t>│   ├── Create Product ← Tests script saves product_id</w:t>
+        <w:br/>
+        <w:t>│   ├── Nearby Products</w:t>
+        <w:br/>
+        <w:t>│   ├── Search Products</w:t>
+        <w:br/>
+        <w:t>│   ├── Product Detail</w:t>
+        <w:br/>
+        <w:t>│   ├── Update Product</w:t>
+        <w:br/>
+        <w:t>│   ├── Delete Product</w:t>
+        <w:br/>
+        <w:t>│   └── Wishlist Toggle</w:t>
+        <w:br/>
+        <w:t>├── 4. Videos</w:t>
+        <w:br/>
+        <w:t>│   ├── Request Upload URL ← Tests script saves video_id</w:t>
+        <w:br/>
+        <w:t>│   ├── Confirm Upload</w:t>
+        <w:br/>
+        <w:t>│   ├── My Videos (Vendor Library)</w:t>
+        <w:br/>
+        <w:t>│   ├── Update Video</w:t>
+        <w:br/>
+        <w:t>│   ├── Video Feed</w:t>
+        <w:br/>
+        <w:t>│   ├── Video Detail</w:t>
+        <w:br/>
+        <w:t>│   ├── Like / Unlike Video</w:t>
+        <w:br/>
+        <w:t>│   └── Delete Video</w:t>
+        <w:br/>
+        <w:t>├── 5. Chat</w:t>
+        <w:br/>
+        <w:t>│   ├── Start Conversation ← Tests script saves conversation_id</w:t>
+        <w:br/>
+        <w:t>│   ├── List Conversations (Inbox)</w:t>
+        <w:br/>
+        <w:t>│   ├── Message History</w:t>
+        <w:br/>
+        <w:t>│   ├── Mark as Read</w:t>
+        <w:br/>
+        <w:t>│   └── [WebSocket] Connect + Send  (use Postman WS tab or wscat)</w:t>
+        <w:br/>
+        <w:t>├── 6. Blacklist</w:t>
+        <w:br/>
+        <w:t>│   ├── Block Customer  (vendor token + store_id + customer_id)</w:t>
+        <w:br/>
+        <w:t>│   ├── List Blocked Customers  (vendor token + store_id)</w:t>
+        <w:br/>
+        <w:t>│   └── Unblock Customer  (same endpoint as Block — toggle)</w:t>
+        <w:br/>
+        <w:t>└── 7. Billing</w:t>
+        <w:br/>
+        <w:t xml:space="preserve">    ├── List Plans  (no auth required)</w:t>
+        <w:br/>
+        <w:t xml:space="preserve">    ├── Wallet Balance  (vendor token)</w:t>
+        <w:br/>
+        <w:t xml:space="preserve">    ├── Top Up Wallet  (vendor token + {"amount": "1000.00"})</w:t>
+        <w:br/>
+        <w:t xml:space="preserve">    ├── Subscribe to Plan  (vendor token + {"plan_name": "basic"})</w:t>
+        <w:br/>
+        <w:t xml:space="preserve">    ├── Subscription Status  (vendor token)</w:t>
+        <w:br/>
+        <w:t xml:space="preserve">    └── Transaction History  (vendor token)</w:t>
+      </w:r>
+    </w:p>
+    <w:p>
+      <w:pPr>
+        <w:pStyle w:val="Heading2"/>
+      </w:pPr>
+      <w:r>
+        <w:t>Auto-Save Token Script  (paste in Tests tab of Verify OTP request)</w:t>
+      </w:r>
+    </w:p>
+    <w:p>
+      <w:pPr>
+        <w:spacing w:before="40" w:after="40"/>
+        <w:ind w:left="288"/>
+        <w:shd w:val="clear" w:color="auto" w:fill="F0F0F0"/>
+      </w:pPr>
+      <w:r>
+        <w:rPr>
+          <w:rFonts w:ascii="Courier New" w:hAnsi="Courier New"/>
+          <w:color w:val="1A1A8C"/>
+          <w:sz w:val="18"/>
+        </w:rPr>
+        <w:t>// For VENDOR verify OTP request:</w:t>
+        <w:br/>
+        <w:t>const r = pm.response.json();</w:t>
+        <w:br/>
+        <w:t>if (r.access) {</w:t>
+        <w:br/>
+        <w:t xml:space="preserve">    pm.environment.set("vendor_token", r.access);</w:t>
+        <w:br/>
+        <w:t xml:space="preserve">    pm.environment.set("vendor_refresh", r.refresh);</w:t>
+        <w:br/>
+        <w:t xml:space="preserve">    console.log("Vendor token saved:", r.access.substring(0, 30) + "...");</w:t>
+        <w:br/>
+        <w:t>}</w:t>
+        <w:br/>
+        <w:br/>
+        <w:t>// For CUSTOMER verify OTP request — use this instead:</w:t>
+        <w:br/>
+        <w:t>// pm.environment.set("customer_token", r.access);</w:t>
+        <w:br/>
+        <w:t>// pm.environment.set("customer_refresh", r.refresh);</w:t>
+      </w:r>
+    </w:p>
+    <w:p>
+      <w:pPr>
+        <w:pStyle w:val="Heading2"/>
+      </w:pPr>
+      <w:r>
+        <w:t>Auto-Save Store ID  (paste in Tests tab of Create Store request)</w:t>
+      </w:r>
+    </w:p>
+    <w:p>
+      <w:pPr>
+        <w:spacing w:before="40" w:after="40"/>
+        <w:ind w:left="288"/>
+        <w:shd w:val="clear" w:color="auto" w:fill="F0F0F0"/>
+      </w:pPr>
+      <w:r>
+        <w:rPr>
+          <w:rFonts w:ascii="Courier New" w:hAnsi="Courier New"/>
+          <w:color w:val="1A1A8C"/>
+          <w:sz w:val="18"/>
+        </w:rPr>
+        <w:t>const r = pm.response.json();</w:t>
+        <w:br/>
+        <w:t>if (r.id) {</w:t>
+        <w:br/>
+        <w:t xml:space="preserve">    pm.environment.set("store_id", r.id);</w:t>
+        <w:br/>
+        <w:t xml:space="preserve">    console.log("store_id saved:", r.id);</w:t>
+        <w:br/>
+        <w:t>}</w:t>
+      </w:r>
+    </w:p>
+    <w:p>
+      <w:pPr>
+        <w:pStyle w:val="Heading2"/>
+      </w:pPr>
+      <w:r>
+        <w:t>Auto-Save Product ID  (paste in Tests tab of Create Product request)</w:t>
+      </w:r>
+    </w:p>
+    <w:p>
+      <w:pPr>
+        <w:spacing w:before="40" w:after="40"/>
+        <w:ind w:left="288"/>
+        <w:shd w:val="clear" w:color="auto" w:fill="F0F0F0"/>
+      </w:pPr>
+      <w:r>
+        <w:rPr>
+          <w:rFonts w:ascii="Courier New" w:hAnsi="Courier New"/>
+          <w:color w:val="1A1A8C"/>
+          <w:sz w:val="18"/>
+        </w:rPr>
+        <w:t>const r = pm.response.json();</w:t>
+        <w:br/>
+        <w:t>if (r.id) {</w:t>
+        <w:br/>
+        <w:t xml:space="preserve">    pm.environment.set("product_id", r.id);</w:t>
+        <w:br/>
+        <w:t xml:space="preserve">    console.log("product_id saved:", r.id);</w:t>
+        <w:br/>
+        <w:t>}</w:t>
+      </w:r>
+    </w:p>
+    <w:p>
+      <w:pPr>
+        <w:pStyle w:val="Heading2"/>
+      </w:pPr>
+      <w:r>
+        <w:t>Auto-Save Video ID  (paste in Tests tab of Request Upload URL request)</w:t>
+      </w:r>
+    </w:p>
+    <w:p>
+      <w:pPr>
+        <w:spacing w:before="40" w:after="40"/>
+        <w:ind w:left="288"/>
+        <w:shd w:val="clear" w:color="auto" w:fill="F0F0F0"/>
+      </w:pPr>
+      <w:r>
+        <w:rPr>
+          <w:rFonts w:ascii="Courier New" w:hAnsi="Courier New"/>
+          <w:color w:val="1A1A8C"/>
+          <w:sz w:val="18"/>
+        </w:rPr>
+        <w:t>const r = pm.response.json();</w:t>
+        <w:br/>
+        <w:t>if (r.video_id) {</w:t>
+        <w:br/>
+        <w:t xml:space="preserve">    pm.environment.set("video_id", r.video_id);</w:t>
+        <w:br/>
+        <w:t xml:space="preserve">    pm.environment.set("upload_url", r.upload_url);</w:t>
+        <w:br/>
+        <w:t xml:space="preserve">    console.log("video_id saved:", r.video_id);</w:t>
+        <w:br/>
+        <w:t>}</w:t>
+      </w:r>
+    </w:p>
+    <w:p>
+      <w:pPr>
+        <w:pStyle w:val="Heading2"/>
+      </w:pPr>
+      <w:r>
+        <w:t>Auto-Save Conversation ID  (paste in Tests tab of Start Conversation request)</w:t>
+      </w:r>
+    </w:p>
+    <w:p>
+      <w:pPr>
+        <w:spacing w:before="40" w:after="40"/>
+        <w:ind w:left="288"/>
+        <w:shd w:val="clear" w:color="auto" w:fill="F0F0F0"/>
+      </w:pPr>
+      <w:r>
+        <w:rPr>
+          <w:rFonts w:ascii="Courier New" w:hAnsi="Courier New"/>
+          <w:color w:val="1A1A8C"/>
+          <w:sz w:val="18"/>
+        </w:rPr>
+        <w:t>const r = pm.response.json();</w:t>
+        <w:br/>
+        <w:t>if (r.id) {</w:t>
+        <w:br/>
+        <w:t xml:space="preserve">    pm.environment.set("conversation_id", r.id);</w:t>
+        <w:br/>
+        <w:t xml:space="preserve">    console.log("conversation_id saved:", r.id);</w:t>
+        <w:br/>
+        <w:t>}</w:t>
+      </w:r>
+    </w:p>
+    <w:p>
+      <w:pPr>
+        <w:pStyle w:val="Heading2"/>
+      </w:pPr>
+      <w:r>
+        <w:t>Auto-Save Customer ID  (paste in Tests tab of Verify OTP Customer request)</w:t>
+      </w:r>
+    </w:p>
+    <w:p>
+      <w:pPr>
+        <w:spacing w:before="40" w:after="40"/>
+        <w:ind w:left="288"/>
+        <w:shd w:val="clear" w:color="auto" w:fill="F0F0F0"/>
+      </w:pPr>
+      <w:r>
+        <w:rPr>
+          <w:rFonts w:ascii="Courier New" w:hAnsi="Courier New"/>
+          <w:color w:val="1A1A8C"/>
+          <w:sz w:val="18"/>
+        </w:rPr>
+        <w:t>// Add this to the existing customer verify OTP Tests script:</w:t>
+        <w:br/>
+        <w:t>const r = pm.response.json();</w:t>
+        <w:br/>
+        <w:t>if (r.user &amp;&amp; r.user.id) {</w:t>
+        <w:br/>
+        <w:t xml:space="preserve">    pm.environment.set("customer_id", r.user.id);</w:t>
+        <w:br/>
+        <w:t xml:space="preserve">    console.log("customer_id saved:", r.user.id);</w:t>
+        <w:br/>
+        <w:t>}</w:t>
+      </w:r>
+    </w:p>
+    <w:p>
+      <w:pPr>
+        <w:ind w:left="288"/>
+        <w:shd w:val="clear" w:color="auto" w:fill="D1ECF1"/>
+      </w:pPr>
+      <w:r>
+        <w:rPr>
+          <w:i/>
+          <w:color w:val="0C5460"/>
+          <w:sz w:val="20"/>
+        </w:rPr>
+        <w:t xml:space="preserve">  💡  customer_id is needed for Sprint 6 blacklist endpoint:</w:t>
+        <w:br/>
+        <w:t xml:space="preserve">  POST /stores/{{store_id}}/blacklist/{{customer_id}}/</w:t>
+      </w:r>
+    </w:p>
+    <w:p>
+      <w:pPr>
+        <w:pStyle w:val="Heading2"/>
+      </w:pPr>
+      <w:r>
+        <w:t>Quick Test — All Public Endpoints via curl</w:t>
+      </w:r>
+    </w:p>
+    <w:p>
+      <w:r>
+        <w:rPr>
+          <w:b w:val="0"/>
+          <w:sz w:val="22"/>
+        </w:rPr>
+        <w:t>Copy-paste these into terminal to test without Postman:</w:t>
+      </w:r>
+    </w:p>
+    <w:p>
+      <w:pPr>
+        <w:spacing w:before="40" w:after="40"/>
+        <w:ind w:left="288"/>
+        <w:shd w:val="clear" w:color="auto" w:fill="F0F0F0"/>
+      </w:pPr>
+      <w:r>
+        <w:rPr>
+          <w:rFonts w:ascii="Courier New" w:hAnsi="Courier New"/>
+          <w:color w:val="1A1A8C"/>
+          <w:sz w:val="18"/>
+        </w:rPr>
+        <w:t># Health check</w:t>
+        <w:br/>
+        <w:t>curl -s http://localhost:8000/api/v1/health/ | python3 -m json.tool</w:t>
+        <w:br/>
+        <w:br/>
+        <w:t># Send OTP</w:t>
+        <w:br/>
+        <w:t>curl -s -X POST http://localhost:8000/api/v1/auth/otp/send/ \</w:t>
+        <w:br/>
+        <w:t xml:space="preserve">  -H "Content-Type: application/json" \</w:t>
+        <w:br/>
+        <w:t xml:space="preserve">  -d '{"phone_number": "+919999999999"}'</w:t>
+        <w:br/>
+        <w:br/>
+        <w:t># Verify OTP (copy access token from response)</w:t>
+        <w:br/>
+        <w:t>curl -s -X POST http://localhost:8000/api/v1/auth/otp/verify/ \</w:t>
+        <w:br/>
+        <w:t xml:space="preserve">  -H "Content-Type: application/json" \</w:t>
+        <w:br/>
+        <w:t xml:space="preserve">  -d '{"phone_number": "+919999999999", "otp": "123456"}'</w:t>
+        <w:br/>
+        <w:br/>
+        <w:t># Get profile (replace TOKEN with your access token)</w:t>
+        <w:br/>
+        <w:t>curl -s http://localhost:8000/api/v1/auth/me/ \</w:t>
+        <w:br/>
+        <w:t xml:space="preserve">  -H "Authorization: Bearer TOKEN"</w:t>
+      </w:r>
+    </w:p>
+    <w:p>
+      <w:r>
+        <w:br w:type="page"/>
+      </w:r>
+    </w:p>
+    <w:p>
+      <w:pPr>
+        <w:pStyle w:val="Heading1"/>
+      </w:pPr>
+      <w:r>
+        <w:t>6. How to Update This Document (Future Sprints)</w:t>
+      </w:r>
+    </w:p>
+    <w:p>
+      <w:pPr>
+        <w:ind w:left="288"/>
+        <w:shd w:val="clear" w:color="auto" w:fill="D1ECF1"/>
+      </w:pPr>
+      <w:r>
+        <w:rPr>
+          <w:i/>
+          <w:color w:val="0C5460"/>
+          <w:sz w:val="20"/>
+        </w:rPr>
+        <w:t xml:space="preserve">  📌  IMPORTANT: When a new sprint adds new API endpoints, update this document.</w:t>
+        <w:br/>
+        <w:t xml:space="preserve">     Do NOT create a separate doc — keep everything in this single file.</w:t>
+      </w:r>
+    </w:p>
+    <w:p/>
+    <w:p>
+      <w:pPr>
+        <w:pStyle w:val="Heading2"/>
+      </w:pPr>
+      <w:r>
+        <w:t>Checklist for each new sprint:</w:t>
+      </w:r>
+    </w:p>
+    <w:p>
+      <w:pPr>
+        <w:pStyle w:val="ListBullet"/>
+        <w:ind w:left="432"/>
+      </w:pPr>
+      <w:r>
+        <w:rPr>
+          <w:sz w:val="21"/>
+        </w:rPr>
+        <w:t>Add new endpoint rows to Section 2 — Complete API Reference table</w:t>
+      </w:r>
+    </w:p>
+    <w:p>
+      <w:pPr>
+        <w:pStyle w:val="ListBullet"/>
+        <w:ind w:left="432"/>
+      </w:pPr>
+      <w:r>
+        <w:rPr>
+          <w:sz w:val="21"/>
+        </w:rPr>
+        <w:t>Add new STEP sections in Section 3 — Step-by-Step Test Flow</w:t>
+      </w:r>
+    </w:p>
+    <w:p>
+      <w:pPr>
+        <w:pStyle w:val="ListBullet"/>
+        <w:ind w:left="432"/>
+      </w:pPr>
+      <w:r>
+        <w:rPr>
+          <w:sz w:val="21"/>
+        </w:rPr>
+        <w:t>Add new error cases in Section 4 — Error Cases to Test</w:t>
+      </w:r>
+    </w:p>
+    <w:p>
+      <w:pPr>
+        <w:pStyle w:val="ListBullet"/>
+        <w:ind w:left="432"/>
+      </w:pPr>
+      <w:r>
+        <w:rPr>
+          <w:sz w:val="21"/>
+        </w:rPr>
+        <w:t>Add new Postman folder in Section 5 — Postman Quick Setup</w:t>
+      </w:r>
+    </w:p>
+    <w:p>
+      <w:pPr>
+        <w:pStyle w:val="ListBullet"/>
+        <w:ind w:left="432"/>
+      </w:pPr>
+      <w:r>
+        <w:rPr>
+          <w:sz w:val="21"/>
+        </w:rPr>
+        <w:t>Update the cover page "Last updated" date and sprint range</w:t>
+      </w:r>
+    </w:p>
+    <w:p>
+      <w:pPr>
+        <w:pStyle w:val="ListBullet"/>
+        <w:ind w:left="432"/>
+      </w:pPr>
+      <w:r>
+        <w:rPr>
+          <w:sz w:val="21"/>
+        </w:rPr>
+        <w:t>If new field types are introduced (e.g. file uploads), add a format rules subsection in Section 1</w:t>
+      </w:r>
+    </w:p>
+    <w:p>
+      <w:pPr>
+        <w:pStyle w:val="Heading2"/>
+      </w:pPr>
+      <w:r>
+        <w:t>Upcoming Sprints to Add Here</w:t>
+      </w:r>
+    </w:p>
+    <w:tbl>
+      <w:tblPr>
+        <w:tblStyle w:val="TableGrid"/>
+        <w:tblW w:type="auto" w:w="0"/>
+        <w:jc w:val="left"/>
+        <w:tblLook w:firstColumn="1" w:firstRow="1" w:lastColumn="0" w:lastRow="0" w:noHBand="0" w:noVBand="1" w:val="04A0"/>
+      </w:tblPr>
+      <w:tblGrid>
+        <w:gridCol w:w="3216"/>
+        <w:gridCol w:w="3216"/>
+        <w:gridCol w:w="3216"/>
+      </w:tblGrid>
+      <w:tr>
+        <w:tc>
+          <w:tcPr>
+            <w:tcW w:type="dxa" w:w="1152"/>
+            <w:shd w:val="clear" w:color="auto" w:fill="1F4E79"/>
+          </w:tcPr>
+          <w:p>
+            <w:r>
+              <w:rPr>
+                <w:b/>
+                <w:color w:val="FFFFFF"/>
+                <w:sz w:val="20"/>
+              </w:rPr>
+              <w:t>Sprint</w:t>
+            </w:r>
+          </w:p>
+        </w:tc>
+        <w:tc>
+          <w:tcPr>
+            <w:tcW w:type="dxa" w:w="2160"/>
+            <w:shd w:val="clear" w:color="auto" w:fill="1F4E79"/>
+          </w:tcPr>
+          <w:p>
+            <w:r>
+              <w:rPr>
+                <w:b/>
+                <w:color w:val="FFFFFF"/>
+                <w:sz w:val="20"/>
+              </w:rPr>
+              <w:t>Module</w:t>
+            </w:r>
+          </w:p>
+        </w:tc>
+        <w:tc>
+          <w:tcPr>
+            <w:tcW w:type="dxa" w:w="6048"/>
+            <w:shd w:val="clear" w:color="auto" w:fill="1F4E79"/>
+          </w:tcPr>
+          <w:p>
+            <w:r>
+              <w:rPr>
+                <w:b/>
+                <w:color w:val="FFFFFF"/>
+                <w:sz w:val="20"/>
+              </w:rPr>
+              <w:t>APIs to Add</w:t>
+            </w:r>
+          </w:p>
+        </w:tc>
+      </w:tr>
+      <w:tr>
+        <w:tc>
+          <w:tcPr>
             <w:tcW w:type="dxa" w:w="1152"/>
             <w:shd w:val="clear" w:color="auto" w:fill="DEEAF1"/>
           </w:tcPr>
@@ -17329,7 +19421,7 @@
               <w:rPr>
                 <w:sz w:val="19"/>
               </w:rPr>
-              <w:t>POST /billing/recharge/, GET /billing/history/, POST /billing/withdraw/</w:t>
+              <w:t>✅ DONE — Steps 39–44 in this document</w:t>
             </w:r>
           </w:p>
         </w:tc>
@@ -17345,7 +19437,7 @@
               <w:rPr>
                 <w:sz w:val="19"/>
               </w:rPr>
-              <w:t>Sprint 7</w:t>
+              <w:t>Sprint 8</w:t>
             </w:r>
           </w:p>
         </w:tc>
@@ -17388,7 +19480,7 @@
               <w:rPr>
                 <w:sz w:val="19"/>
               </w:rPr>
-              <w:t>Sprint 8</w:t>
+              <w:t>Sprint 9</w:t>
             </w:r>
           </w:p>
         </w:tc>
@@ -17430,7 +19522,7 @@
               <w:rPr>
                 <w:sz w:val="19"/>
               </w:rPr>
-              <w:t>Sprint 9</w:t>
+              <w:t>Sprint 10</w:t>
             </w:r>
           </w:p>
         </w:tc>
@@ -17473,7 +19565,7 @@
               <w:rPr>
                 <w:sz w:val="19"/>
               </w:rPr>
-              <w:t>Sprint 10</w:t>
+              <w:t>Sprint 11</w:t>
             </w:r>
           </w:p>
         </w:tc>
@@ -17515,7 +19607,7 @@
               <w:rPr>
                 <w:sz w:val="19"/>
               </w:rPr>
-              <w:t>Sprint 11</w:t>
+              <w:t>Sprint 12</w:t>
             </w:r>
           </w:p>
         </w:tc>
@@ -17558,7 +19650,7 @@
               <w:rPr>
                 <w:sz w:val="19"/>
               </w:rPr>
-              <w:t>Sprint 12</w:t>
+              <w:t>Sprint 13</w:t>
             </w:r>
           </w:p>
         </w:tc>
@@ -17602,7 +19694,7 @@
           <w:color w:val="999999"/>
           <w:sz w:val="18"/>
         </w:rPr>
-        <w:t>NearKart Backend — Master API Testing Guide   |   Sprint 1–6   |   Use Postman or curl for testing</w:t>
+        <w:t>NearKart Backend — Master API Testing Guide   |   Sprint 1–7   |   Use Postman or curl for testing</w:t>
       </w:r>
     </w:p>
     <w:sectPr>

</xml_diff>

<commit_message>
feat(sprint8): implement Analytics + Admin Panel
Vendors get a real-time performance dashboard (store stats, subscription,
product/video breakdowns). Staff users get platform management endpoints:
aggregate stats, store verification, user management with toggle-active.

- apps/analytics: VendorDashboardView, VendorVideoStatsView, VendorProductStatsView
- apps/admin_panel: PlatformStatsView, AdminStoreListView, AdminStoreUpdateView, AdminUserListView, AdminUserToggleActiveView
- All admin endpoints gated by IsAdminUser (is_staff=True)
- No new models or migrations — aggregates from existing tables
- docs/sprint_8_analytics/: README, TESTING_CHECKLIST, POSTMAN_GUIDE
- docs/NearKart_Master_API_Testing_Guide.docx: updated to Sprint 1-8 (50 endpoints)

Co-Authored-By: Claude Sonnet 4.6 <noreply@anthropic.com>
</commit_message>
<xml_diff>
--- a/nearkart_backend/docs/NearKart_Master_API_Testing_Guide.docx
+++ b/nearkart_backend/docs/NearKart_Master_API_Testing_Guide.docx
@@ -50,7 +50,7 @@
           <w:color w:val="888888"/>
           <w:sz w:val="20"/>
         </w:rPr>
-        <w:t>Sprint 1 → Sprint 7   |   Last updated: May 2026</w:t>
+        <w:t>Sprint 1 → Sprint 8   |   Last updated: May 2026</w:t>
       </w:r>
     </w:p>
     <w:p/>
@@ -5933,6 +5933,562 @@
           </w:p>
         </w:tc>
       </w:tr>
+      <w:tr>
+        <w:tc>
+          <w:tcPr>
+            <w:tcW w:type="dxa" w:w="432"/>
+            <w:shd w:val="clear" w:color="auto" w:fill="DEEAF1"/>
+          </w:tcPr>
+          <w:p>
+            <w:r>
+              <w:rPr>
+                <w:sz w:val="19"/>
+              </w:rPr>
+              <w:t>43</w:t>
+            </w:r>
+          </w:p>
+        </w:tc>
+        <w:tc>
+          <w:tcPr>
+            <w:tcW w:type="dxa" w:w="1008"/>
+            <w:shd w:val="clear" w:color="auto" w:fill="DEEAF1"/>
+          </w:tcPr>
+          <w:p>
+            <w:r>
+              <w:rPr>
+                <w:sz w:val="19"/>
+              </w:rPr>
+              <w:t>GET</w:t>
+            </w:r>
+          </w:p>
+        </w:tc>
+        <w:tc>
+          <w:tcPr>
+            <w:tcW w:type="dxa" w:w="4032"/>
+            <w:shd w:val="clear" w:color="auto" w:fill="DEEAF1"/>
+          </w:tcPr>
+          <w:p>
+            <w:r>
+              <w:rPr>
+                <w:sz w:val="19"/>
+              </w:rPr>
+              <w:t>/analytics/vendor/</w:t>
+            </w:r>
+          </w:p>
+        </w:tc>
+        <w:tc>
+          <w:tcPr>
+            <w:tcW w:type="dxa" w:w="2016"/>
+            <w:shd w:val="clear" w:color="auto" w:fill="DEEAF1"/>
+          </w:tcPr>
+          <w:p>
+            <w:r>
+              <w:rPr>
+                <w:sz w:val="19"/>
+              </w:rPr>
+              <w:t>Vendor JWT only</w:t>
+            </w:r>
+          </w:p>
+        </w:tc>
+        <w:tc>
+          <w:tcPr>
+            <w:tcW w:type="dxa" w:w="576"/>
+            <w:shd w:val="clear" w:color="auto" w:fill="DEEAF1"/>
+          </w:tcPr>
+          <w:p>
+            <w:r>
+              <w:rPr>
+                <w:sz w:val="19"/>
+              </w:rPr>
+              <w:t>S8</w:t>
+            </w:r>
+          </w:p>
+        </w:tc>
+      </w:tr>
+      <w:tr>
+        <w:tc>
+          <w:tcPr>
+            <w:tcW w:type="dxa" w:w="432"/>
+          </w:tcPr>
+          <w:p>
+            <w:r>
+              <w:rPr>
+                <w:sz w:val="19"/>
+              </w:rPr>
+              <w:t>44</w:t>
+            </w:r>
+          </w:p>
+        </w:tc>
+        <w:tc>
+          <w:tcPr>
+            <w:tcW w:type="dxa" w:w="1008"/>
+          </w:tcPr>
+          <w:p>
+            <w:r>
+              <w:rPr>
+                <w:sz w:val="19"/>
+              </w:rPr>
+              <w:t>GET</w:t>
+            </w:r>
+          </w:p>
+        </w:tc>
+        <w:tc>
+          <w:tcPr>
+            <w:tcW w:type="dxa" w:w="4032"/>
+          </w:tcPr>
+          <w:p>
+            <w:r>
+              <w:rPr>
+                <w:sz w:val="19"/>
+              </w:rPr>
+              <w:t>/analytics/vendor/videos/</w:t>
+            </w:r>
+          </w:p>
+        </w:tc>
+        <w:tc>
+          <w:tcPr>
+            <w:tcW w:type="dxa" w:w="2016"/>
+          </w:tcPr>
+          <w:p>
+            <w:r>
+              <w:rPr>
+                <w:sz w:val="19"/>
+              </w:rPr>
+              <w:t>Vendor JWT only</w:t>
+            </w:r>
+          </w:p>
+        </w:tc>
+        <w:tc>
+          <w:tcPr>
+            <w:tcW w:type="dxa" w:w="576"/>
+          </w:tcPr>
+          <w:p>
+            <w:r>
+              <w:rPr>
+                <w:sz w:val="19"/>
+              </w:rPr>
+              <w:t>S8</w:t>
+            </w:r>
+          </w:p>
+        </w:tc>
+      </w:tr>
+      <w:tr>
+        <w:tc>
+          <w:tcPr>
+            <w:tcW w:type="dxa" w:w="432"/>
+            <w:shd w:val="clear" w:color="auto" w:fill="DEEAF1"/>
+          </w:tcPr>
+          <w:p>
+            <w:r>
+              <w:rPr>
+                <w:sz w:val="19"/>
+              </w:rPr>
+              <w:t>45</w:t>
+            </w:r>
+          </w:p>
+        </w:tc>
+        <w:tc>
+          <w:tcPr>
+            <w:tcW w:type="dxa" w:w="1008"/>
+            <w:shd w:val="clear" w:color="auto" w:fill="DEEAF1"/>
+          </w:tcPr>
+          <w:p>
+            <w:r>
+              <w:rPr>
+                <w:sz w:val="19"/>
+              </w:rPr>
+              <w:t>GET</w:t>
+            </w:r>
+          </w:p>
+        </w:tc>
+        <w:tc>
+          <w:tcPr>
+            <w:tcW w:type="dxa" w:w="4032"/>
+            <w:shd w:val="clear" w:color="auto" w:fill="DEEAF1"/>
+          </w:tcPr>
+          <w:p>
+            <w:r>
+              <w:rPr>
+                <w:sz w:val="19"/>
+              </w:rPr>
+              <w:t>/analytics/vendor/products/</w:t>
+            </w:r>
+          </w:p>
+        </w:tc>
+        <w:tc>
+          <w:tcPr>
+            <w:tcW w:type="dxa" w:w="2016"/>
+            <w:shd w:val="clear" w:color="auto" w:fill="DEEAF1"/>
+          </w:tcPr>
+          <w:p>
+            <w:r>
+              <w:rPr>
+                <w:sz w:val="19"/>
+              </w:rPr>
+              <w:t>Vendor JWT only</w:t>
+            </w:r>
+          </w:p>
+        </w:tc>
+        <w:tc>
+          <w:tcPr>
+            <w:tcW w:type="dxa" w:w="576"/>
+            <w:shd w:val="clear" w:color="auto" w:fill="DEEAF1"/>
+          </w:tcPr>
+          <w:p>
+            <w:r>
+              <w:rPr>
+                <w:sz w:val="19"/>
+              </w:rPr>
+              <w:t>S8</w:t>
+            </w:r>
+          </w:p>
+        </w:tc>
+      </w:tr>
+      <w:tr>
+        <w:tc>
+          <w:tcPr>
+            <w:tcW w:type="dxa" w:w="432"/>
+          </w:tcPr>
+          <w:p>
+            <w:r>
+              <w:rPr>
+                <w:sz w:val="19"/>
+              </w:rPr>
+              <w:t>46</w:t>
+            </w:r>
+          </w:p>
+        </w:tc>
+        <w:tc>
+          <w:tcPr>
+            <w:tcW w:type="dxa" w:w="1008"/>
+          </w:tcPr>
+          <w:p>
+            <w:r>
+              <w:rPr>
+                <w:sz w:val="19"/>
+              </w:rPr>
+              <w:t>GET</w:t>
+            </w:r>
+          </w:p>
+        </w:tc>
+        <w:tc>
+          <w:tcPr>
+            <w:tcW w:type="dxa" w:w="4032"/>
+          </w:tcPr>
+          <w:p>
+            <w:r>
+              <w:rPr>
+                <w:sz w:val="19"/>
+              </w:rPr>
+              <w:t>/admin-panel/stats/</w:t>
+            </w:r>
+          </w:p>
+        </w:tc>
+        <w:tc>
+          <w:tcPr>
+            <w:tcW w:type="dxa" w:w="2016"/>
+          </w:tcPr>
+          <w:p>
+            <w:r>
+              <w:rPr>
+                <w:sz w:val="19"/>
+              </w:rPr>
+              <w:t>Staff JWT only</w:t>
+            </w:r>
+          </w:p>
+        </w:tc>
+        <w:tc>
+          <w:tcPr>
+            <w:tcW w:type="dxa" w:w="576"/>
+          </w:tcPr>
+          <w:p>
+            <w:r>
+              <w:rPr>
+                <w:sz w:val="19"/>
+              </w:rPr>
+              <w:t>S8</w:t>
+            </w:r>
+          </w:p>
+        </w:tc>
+      </w:tr>
+      <w:tr>
+        <w:tc>
+          <w:tcPr>
+            <w:tcW w:type="dxa" w:w="432"/>
+            <w:shd w:val="clear" w:color="auto" w:fill="DEEAF1"/>
+          </w:tcPr>
+          <w:p>
+            <w:r>
+              <w:rPr>
+                <w:sz w:val="19"/>
+              </w:rPr>
+              <w:t>47</w:t>
+            </w:r>
+          </w:p>
+        </w:tc>
+        <w:tc>
+          <w:tcPr>
+            <w:tcW w:type="dxa" w:w="1008"/>
+            <w:shd w:val="clear" w:color="auto" w:fill="DEEAF1"/>
+          </w:tcPr>
+          <w:p>
+            <w:r>
+              <w:rPr>
+                <w:sz w:val="19"/>
+              </w:rPr>
+              <w:t>GET</w:t>
+            </w:r>
+          </w:p>
+        </w:tc>
+        <w:tc>
+          <w:tcPr>
+            <w:tcW w:type="dxa" w:w="4032"/>
+            <w:shd w:val="clear" w:color="auto" w:fill="DEEAF1"/>
+          </w:tcPr>
+          <w:p>
+            <w:r>
+              <w:rPr>
+                <w:sz w:val="19"/>
+              </w:rPr>
+              <w:t>/admin-panel/stores/</w:t>
+            </w:r>
+          </w:p>
+        </w:tc>
+        <w:tc>
+          <w:tcPr>
+            <w:tcW w:type="dxa" w:w="2016"/>
+            <w:shd w:val="clear" w:color="auto" w:fill="DEEAF1"/>
+          </w:tcPr>
+          <w:p>
+            <w:r>
+              <w:rPr>
+                <w:sz w:val="19"/>
+              </w:rPr>
+              <w:t>Staff JWT only</w:t>
+            </w:r>
+          </w:p>
+        </w:tc>
+        <w:tc>
+          <w:tcPr>
+            <w:tcW w:type="dxa" w:w="576"/>
+            <w:shd w:val="clear" w:color="auto" w:fill="DEEAF1"/>
+          </w:tcPr>
+          <w:p>
+            <w:r>
+              <w:rPr>
+                <w:sz w:val="19"/>
+              </w:rPr>
+              <w:t>S8</w:t>
+            </w:r>
+          </w:p>
+        </w:tc>
+      </w:tr>
+      <w:tr>
+        <w:tc>
+          <w:tcPr>
+            <w:tcW w:type="dxa" w:w="432"/>
+          </w:tcPr>
+          <w:p>
+            <w:r>
+              <w:rPr>
+                <w:sz w:val="19"/>
+              </w:rPr>
+              <w:t>48</w:t>
+            </w:r>
+          </w:p>
+        </w:tc>
+        <w:tc>
+          <w:tcPr>
+            <w:tcW w:type="dxa" w:w="1008"/>
+          </w:tcPr>
+          <w:p>
+            <w:r>
+              <w:rPr>
+                <w:sz w:val="19"/>
+              </w:rPr>
+              <w:t>PATCH</w:t>
+            </w:r>
+          </w:p>
+        </w:tc>
+        <w:tc>
+          <w:tcPr>
+            <w:tcW w:type="dxa" w:w="4032"/>
+          </w:tcPr>
+          <w:p>
+            <w:r>
+              <w:rPr>
+                <w:sz w:val="19"/>
+              </w:rPr>
+              <w:t>/admin-panel/stores/&lt;uuid&gt;/</w:t>
+            </w:r>
+          </w:p>
+        </w:tc>
+        <w:tc>
+          <w:tcPr>
+            <w:tcW w:type="dxa" w:w="2016"/>
+          </w:tcPr>
+          <w:p>
+            <w:r>
+              <w:rPr>
+                <w:sz w:val="19"/>
+              </w:rPr>
+              <w:t>Staff JWT only</w:t>
+            </w:r>
+          </w:p>
+        </w:tc>
+        <w:tc>
+          <w:tcPr>
+            <w:tcW w:type="dxa" w:w="576"/>
+          </w:tcPr>
+          <w:p>
+            <w:r>
+              <w:rPr>
+                <w:sz w:val="19"/>
+              </w:rPr>
+              <w:t>S8</w:t>
+            </w:r>
+          </w:p>
+        </w:tc>
+      </w:tr>
+      <w:tr>
+        <w:tc>
+          <w:tcPr>
+            <w:tcW w:type="dxa" w:w="432"/>
+            <w:shd w:val="clear" w:color="auto" w:fill="DEEAF1"/>
+          </w:tcPr>
+          <w:p>
+            <w:r>
+              <w:rPr>
+                <w:sz w:val="19"/>
+              </w:rPr>
+              <w:t>49</w:t>
+            </w:r>
+          </w:p>
+        </w:tc>
+        <w:tc>
+          <w:tcPr>
+            <w:tcW w:type="dxa" w:w="1008"/>
+            <w:shd w:val="clear" w:color="auto" w:fill="DEEAF1"/>
+          </w:tcPr>
+          <w:p>
+            <w:r>
+              <w:rPr>
+                <w:sz w:val="19"/>
+              </w:rPr>
+              <w:t>GET</w:t>
+            </w:r>
+          </w:p>
+        </w:tc>
+        <w:tc>
+          <w:tcPr>
+            <w:tcW w:type="dxa" w:w="4032"/>
+            <w:shd w:val="clear" w:color="auto" w:fill="DEEAF1"/>
+          </w:tcPr>
+          <w:p>
+            <w:r>
+              <w:rPr>
+                <w:sz w:val="19"/>
+              </w:rPr>
+              <w:t>/admin-panel/users/</w:t>
+            </w:r>
+          </w:p>
+        </w:tc>
+        <w:tc>
+          <w:tcPr>
+            <w:tcW w:type="dxa" w:w="2016"/>
+            <w:shd w:val="clear" w:color="auto" w:fill="DEEAF1"/>
+          </w:tcPr>
+          <w:p>
+            <w:r>
+              <w:rPr>
+                <w:sz w:val="19"/>
+              </w:rPr>
+              <w:t>Staff JWT only</w:t>
+            </w:r>
+          </w:p>
+        </w:tc>
+        <w:tc>
+          <w:tcPr>
+            <w:tcW w:type="dxa" w:w="576"/>
+            <w:shd w:val="clear" w:color="auto" w:fill="DEEAF1"/>
+          </w:tcPr>
+          <w:p>
+            <w:r>
+              <w:rPr>
+                <w:sz w:val="19"/>
+              </w:rPr>
+              <w:t>S8</w:t>
+            </w:r>
+          </w:p>
+        </w:tc>
+      </w:tr>
+      <w:tr>
+        <w:tc>
+          <w:tcPr>
+            <w:tcW w:type="dxa" w:w="432"/>
+          </w:tcPr>
+          <w:p>
+            <w:r>
+              <w:rPr>
+                <w:sz w:val="19"/>
+              </w:rPr>
+              <w:t>50</w:t>
+            </w:r>
+          </w:p>
+        </w:tc>
+        <w:tc>
+          <w:tcPr>
+            <w:tcW w:type="dxa" w:w="1008"/>
+          </w:tcPr>
+          <w:p>
+            <w:r>
+              <w:rPr>
+                <w:sz w:val="19"/>
+              </w:rPr>
+              <w:t>POST</w:t>
+            </w:r>
+          </w:p>
+        </w:tc>
+        <w:tc>
+          <w:tcPr>
+            <w:tcW w:type="dxa" w:w="4032"/>
+          </w:tcPr>
+          <w:p>
+            <w:r>
+              <w:rPr>
+                <w:sz w:val="19"/>
+              </w:rPr>
+              <w:t>/admin-panel/users/&lt;uuid&gt;/toggle-active/</w:t>
+            </w:r>
+          </w:p>
+        </w:tc>
+        <w:tc>
+          <w:tcPr>
+            <w:tcW w:type="dxa" w:w="2016"/>
+          </w:tcPr>
+          <w:p>
+            <w:r>
+              <w:rPr>
+                <w:sz w:val="19"/>
+              </w:rPr>
+              <w:t>Staff JWT only</w:t>
+            </w:r>
+          </w:p>
+        </w:tc>
+        <w:tc>
+          <w:tcPr>
+            <w:tcW w:type="dxa" w:w="576"/>
+          </w:tcPr>
+          <w:p>
+            <w:r>
+              <w:rPr>
+                <w:sz w:val="19"/>
+              </w:rPr>
+              <w:t>S8</w:t>
+            </w:r>
+          </w:p>
+        </w:tc>
+      </w:tr>
     </w:tbl>
     <w:p/>
     <w:p>
@@ -14939,6 +15495,930 @@
         <w:pStyle w:val="Heading1"/>
       </w:pPr>
       <w:r>
+        <w:t>Sprint 8 — Analytics + Admin Panel  (Steps 45–53)</w:t>
+      </w:r>
+    </w:p>
+    <w:p>
+      <w:r>
+        <w:rPr>
+          <w:b w:val="0"/>
+          <w:sz w:val="22"/>
+        </w:rPr>
+        <w:t>Follow Steps 45–53 after completing Step 10 (Create Store). Admin endpoints require a staff/superuser account — see Step 45b.</w:t>
+      </w:r>
+    </w:p>
+    <w:p>
+      <w:pPr>
+        <w:ind w:left="288"/>
+        <w:shd w:val="clear" w:color="auto" w:fill="D1ECF1"/>
+      </w:pPr>
+      <w:r>
+        <w:rPr>
+          <w:i/>
+          <w:color w:val="0C5460"/>
+          <w:sz w:val="20"/>
+        </w:rPr>
+        <w:t xml:space="preserve">  💡  No new migrations for this sprint. All analytics data is aggregated from existing tables.</w:t>
+      </w:r>
+    </w:p>
+    <w:p>
+      <w:r>
+        <w:rPr>
+          <w:b/>
+          <w:sz w:val="22"/>
+        </w:rPr>
+        <w:t>Step 45b: Create a Staff User (one-time dev setup)</w:t>
+      </w:r>
+    </w:p>
+    <w:p>
+      <w:pPr>
+        <w:spacing w:before="40" w:after="40"/>
+        <w:ind w:left="288"/>
+        <w:shd w:val="clear" w:color="auto" w:fill="F0F0F0"/>
+      </w:pPr>
+      <w:r>
+        <w:rPr>
+          <w:rFonts w:ascii="Courier New" w:hAnsi="Courier New"/>
+          <w:color w:val="1A1A8C"/>
+          <w:sz w:val="18"/>
+        </w:rPr>
+        <w:t>docker compose exec django python manage.py shell -c "</w:t>
+        <w:br/>
+        <w:t>from apps.auth_app.models import User</w:t>
+        <w:br/>
+        <w:t>u, _ = User.objects.get_or_create(phone_number='+919000000001', defaults={'role':'admin','full_name':'Admin'})</w:t>
+        <w:br/>
+        <w:t>u.is_staff = True; u.is_superuser = True; u.save()</w:t>
+        <w:br/>
+        <w:t>print('Done')</w:t>
+        <w:br/>
+        <w:t>"</w:t>
+      </w:r>
+    </w:p>
+    <w:p>
+      <w:r>
+        <w:rPr>
+          <w:b w:val="0"/>
+          <w:sz w:val="20"/>
+        </w:rPr>
+        <w:t>Then run /auth/otp/send/ + /auth/otp/verify/ with +919000000001 to get admin_token.</w:t>
+      </w:r>
+    </w:p>
+    <w:p>
+      <w:pPr>
+        <w:pStyle w:val="Heading2"/>
+      </w:pPr>
+      <w:r>
+        <w:t>STEP 45 — Vendor Dashboard  (Analytics)</w:t>
+      </w:r>
+    </w:p>
+    <w:p>
+      <w:pPr>
+        <w:spacing w:before="120"/>
+        <w:shd w:val="clear" w:color="auto" w:fill="D4EDDA"/>
+      </w:pPr>
+      <w:r>
+        <w:rPr>
+          <w:b/>
+          <w:color w:val="155524"/>
+          <w:sz w:val="20"/>
+        </w:rPr>
+        <w:t xml:space="preserve">  GET  </w:t>
+      </w:r>
+      <w:r>
+        <w:rPr>
+          <w:b/>
+          <w:color w:val="1F4E79"/>
+          <w:sz w:val="20"/>
+        </w:rPr>
+        <w:t xml:space="preserve">  {{base_url}}/analytics/vendor/</w:t>
+      </w:r>
+      <w:r>
+        <w:rPr>
+          <w:i/>
+          <w:color w:val="777777"/>
+          <w:sz w:val="18"/>
+        </w:rPr>
+        <w:t xml:space="preserve">   [Vendor JWT]   [Sprint 8]</w:t>
+      </w:r>
+    </w:p>
+    <w:p>
+      <w:r>
+        <w:rPr>
+          <w:b w:val="0"/>
+          <w:sz w:val="22"/>
+        </w:rPr>
+        <w:t>No body.</w:t>
+      </w:r>
+    </w:p>
+    <w:p>
+      <w:r>
+        <w:rPr>
+          <w:b/>
+          <w:sz w:val="20"/>
+        </w:rPr>
+        <w:t>Expected Response  200 OK:</w:t>
+      </w:r>
+    </w:p>
+    <w:p>
+      <w:pPr>
+        <w:spacing w:before="40" w:after="40"/>
+        <w:ind w:left="288"/>
+        <w:shd w:val="clear" w:color="auto" w:fill="F0F0F0"/>
+      </w:pPr>
+      <w:r>
+        <w:rPr>
+          <w:rFonts w:ascii="Courier New" w:hAnsi="Courier New"/>
+          <w:color w:val="1A1A8C"/>
+          <w:sz w:val="18"/>
+        </w:rPr>
+        <w:t>{</w:t>
+        <w:br/>
+        <w:t xml:space="preserve">  "store": {</w:t>
+        <w:br/>
+        <w:t xml:space="preserve">    "id": "...", "name": "Chennai Silk House", "category": "fashion",</w:t>
+        <w:br/>
+        <w:t xml:space="preserve">    "is_active": true, "is_verified": true, "is_open": true,</w:t>
+        <w:br/>
+        <w:t xml:space="preserve">    "follower_count": 2, "review_count": 2, "avg_rating": 4.5</w:t>
+        <w:br/>
+        <w:t xml:space="preserve">  },</w:t>
+        <w:br/>
+        <w:t xml:space="preserve">  "wallet": { "balance": "501.00" },</w:t>
+        <w:br/>
+        <w:t xml:space="preserve">  "subscription": { "plan": "Basic Plan", "expires_at": "2026-06-14T...", "is_active": true, "days_left": 29 },</w:t>
+        <w:br/>
+        <w:t xml:space="preserve">  "current_plan": { "name": "basic", "display_name": "Basic Plan", "video_limit": 20, "product_limit": 50 },</w:t>
+        <w:br/>
+        <w:t xml:space="preserve">  "products": { "total": 5, "active": 3, "draft": 1, "inactive": 1 },</w:t>
+        <w:br/>
+        <w:t xml:space="preserve">  "videos": { "total": 8, "ready": 3, "processing": 2, "pending": 3, "total_likes": 0, "total_views": 6 }</w:t>
+        <w:br/>
+        <w:t>}</w:t>
+      </w:r>
+    </w:p>
+    <w:p>
+      <w:pPr>
+        <w:ind w:left="288"/>
+        <w:shd w:val="clear" w:color="auto" w:fill="D4EDDA"/>
+      </w:pPr>
+      <w:r>
+        <w:rPr>
+          <w:i/>
+          <w:color w:val="155724"/>
+          <w:sz w:val="20"/>
+        </w:rPr>
+        <w:t xml:space="preserve">  ✅  subscription is null if the vendor has never subscribed. current_plan defaults to Free.</w:t>
+      </w:r>
+    </w:p>
+    <w:p>
+      <w:pPr>
+        <w:pStyle w:val="Heading2"/>
+      </w:pPr>
+      <w:r>
+        <w:t>STEP 46 — Video Stats  (Analytics)</w:t>
+      </w:r>
+    </w:p>
+    <w:p>
+      <w:pPr>
+        <w:spacing w:before="120"/>
+        <w:shd w:val="clear" w:color="auto" w:fill="D4EDDA"/>
+      </w:pPr>
+      <w:r>
+        <w:rPr>
+          <w:b/>
+          <w:color w:val="155524"/>
+          <w:sz w:val="20"/>
+        </w:rPr>
+        <w:t xml:space="preserve">  GET  </w:t>
+      </w:r>
+      <w:r>
+        <w:rPr>
+          <w:b/>
+          <w:color w:val="1F4E79"/>
+          <w:sz w:val="20"/>
+        </w:rPr>
+        <w:t xml:space="preserve">  {{base_url}}/analytics/vendor/videos/</w:t>
+      </w:r>
+      <w:r>
+        <w:rPr>
+          <w:i/>
+          <w:color w:val="777777"/>
+          <w:sz w:val="18"/>
+        </w:rPr>
+        <w:t xml:space="preserve">   [Vendor JWT]   [Sprint 8]</w:t>
+      </w:r>
+    </w:p>
+    <w:p>
+      <w:r>
+        <w:rPr>
+          <w:b w:val="0"/>
+          <w:sz w:val="22"/>
+        </w:rPr>
+        <w:t>No body.</w:t>
+      </w:r>
+    </w:p>
+    <w:p>
+      <w:r>
+        <w:rPr>
+          <w:b/>
+          <w:sz w:val="20"/>
+        </w:rPr>
+        <w:t>Expected Response  200 OK:</w:t>
+      </w:r>
+    </w:p>
+    <w:p>
+      <w:pPr>
+        <w:spacing w:before="40" w:after="40"/>
+        <w:ind w:left="288"/>
+        <w:shd w:val="clear" w:color="auto" w:fill="F0F0F0"/>
+      </w:pPr>
+      <w:r>
+        <w:rPr>
+          <w:rFonts w:ascii="Courier New" w:hAnsi="Courier New"/>
+          <w:color w:val="1A1A8C"/>
+          <w:sz w:val="18"/>
+        </w:rPr>
+        <w:t>[</w:t>
+        <w:br/>
+        <w:t xml:space="preserve">  {</w:t>
+        <w:br/>
+        <w:t xml:space="preserve">    "id": "...", "title": "Summer Kurta Collection",</w:t>
+        <w:br/>
+        <w:t xml:space="preserve">    "status": "ready", "view_count": 4, "like_count": 0,</w:t>
+        <w:br/>
+        <w:t xml:space="preserve">    "duration_seconds": 45, "created_at": "2026-05-15T..."</w:t>
+        <w:br/>
+        <w:t xml:space="preserve">  }</w:t>
+        <w:br/>
+        <w:t>]</w:t>
+      </w:r>
+    </w:p>
+    <w:p>
+      <w:pPr>
+        <w:ind w:left="288"/>
+        <w:shd w:val="clear" w:color="auto" w:fill="D1ECF1"/>
+      </w:pPr>
+      <w:r>
+        <w:rPr>
+          <w:i/>
+          <w:color w:val="0C5460"/>
+          <w:sz w:val="20"/>
+        </w:rPr>
+        <w:t xml:space="preserve">  💡  Ordered by most views first. All videos returned — not just ready ones.</w:t>
+      </w:r>
+    </w:p>
+    <w:p>
+      <w:pPr>
+        <w:pStyle w:val="Heading2"/>
+      </w:pPr>
+      <w:r>
+        <w:t>STEP 47 — Product Stats  (Analytics)</w:t>
+      </w:r>
+    </w:p>
+    <w:p>
+      <w:pPr>
+        <w:spacing w:before="120"/>
+        <w:shd w:val="clear" w:color="auto" w:fill="D4EDDA"/>
+      </w:pPr>
+      <w:r>
+        <w:rPr>
+          <w:b/>
+          <w:color w:val="155524"/>
+          <w:sz w:val="20"/>
+        </w:rPr>
+        <w:t xml:space="preserve">  GET  </w:t>
+      </w:r>
+      <w:r>
+        <w:rPr>
+          <w:b/>
+          <w:color w:val="1F4E79"/>
+          <w:sz w:val="20"/>
+        </w:rPr>
+        <w:t xml:space="preserve">  {{base_url}}/analytics/vendor/products/</w:t>
+      </w:r>
+      <w:r>
+        <w:rPr>
+          <w:i/>
+          <w:color w:val="777777"/>
+          <w:sz w:val="18"/>
+        </w:rPr>
+        <w:t xml:space="preserve">   [Vendor JWT]   [Sprint 8]</w:t>
+      </w:r>
+    </w:p>
+    <w:p>
+      <w:r>
+        <w:rPr>
+          <w:b w:val="0"/>
+          <w:sz w:val="22"/>
+        </w:rPr>
+        <w:t>No body.</w:t>
+      </w:r>
+    </w:p>
+    <w:p>
+      <w:r>
+        <w:rPr>
+          <w:b/>
+          <w:sz w:val="20"/>
+        </w:rPr>
+        <w:t>Expected Response  200 OK:</w:t>
+      </w:r>
+    </w:p>
+    <w:p>
+      <w:pPr>
+        <w:spacing w:before="40" w:after="40"/>
+        <w:ind w:left="288"/>
+        <w:shd w:val="clear" w:color="auto" w:fill="F0F0F0"/>
+      </w:pPr>
+      <w:r>
+        <w:rPr>
+          <w:rFonts w:ascii="Courier New" w:hAnsi="Courier New"/>
+          <w:color w:val="1A1A8C"/>
+          <w:sz w:val="18"/>
+        </w:rPr>
+        <w:t>[</w:t>
+        <w:br/>
+        <w:t xml:space="preserve">  {</w:t>
+        <w:br/>
+        <w:t xml:space="preserve">    "id": "...", "name": "Kanchipuram Silk Saree",</w:t>
+        <w:br/>
+        <w:t xml:space="preserve">    "status": "active", "base_price": "4500.00",</w:t>
+        <w:br/>
+        <w:t xml:space="preserve">    "wishlist_count": 1, "created_at": "2026-05-15T..."</w:t>
+        <w:br/>
+        <w:t xml:space="preserve">  }</w:t>
+        <w:br/>
+        <w:t>]</w:t>
+      </w:r>
+    </w:p>
+    <w:p>
+      <w:pPr>
+        <w:pStyle w:val="Heading2"/>
+      </w:pPr>
+      <w:r>
+        <w:t>STEP 48 — Platform Stats  (Admin)</w:t>
+      </w:r>
+    </w:p>
+    <w:p>
+      <w:pPr>
+        <w:spacing w:before="120"/>
+        <w:shd w:val="clear" w:color="auto" w:fill="D4EDDA"/>
+      </w:pPr>
+      <w:r>
+        <w:rPr>
+          <w:b/>
+          <w:color w:val="155524"/>
+          <w:sz w:val="20"/>
+        </w:rPr>
+        <w:t xml:space="preserve">  GET  </w:t>
+      </w:r>
+      <w:r>
+        <w:rPr>
+          <w:b/>
+          <w:color w:val="1F4E79"/>
+          <w:sz w:val="20"/>
+        </w:rPr>
+        <w:t xml:space="preserve">  {{base_url}}/admin-panel/stats/</w:t>
+      </w:r>
+      <w:r>
+        <w:rPr>
+          <w:i/>
+          <w:color w:val="777777"/>
+          <w:sz w:val="18"/>
+        </w:rPr>
+        <w:t xml:space="preserve">   [Staff JWT]   [Sprint 8]</w:t>
+      </w:r>
+    </w:p>
+    <w:p>
+      <w:r>
+        <w:rPr>
+          <w:b w:val="0"/>
+          <w:sz w:val="22"/>
+        </w:rPr>
+        <w:t>No body. Use admin_token saved in Step 45b.</w:t>
+      </w:r>
+    </w:p>
+    <w:p>
+      <w:r>
+        <w:rPr>
+          <w:b/>
+          <w:sz w:val="20"/>
+        </w:rPr>
+        <w:t>Expected Response  200 OK:</w:t>
+      </w:r>
+    </w:p>
+    <w:p>
+      <w:pPr>
+        <w:spacing w:before="40" w:after="40"/>
+        <w:ind w:left="288"/>
+        <w:shd w:val="clear" w:color="auto" w:fill="F0F0F0"/>
+      </w:pPr>
+      <w:r>
+        <w:rPr>
+          <w:rFonts w:ascii="Courier New" w:hAnsi="Courier New"/>
+          <w:color w:val="1A1A8C"/>
+          <w:sz w:val="18"/>
+        </w:rPr>
+        <w:t>{</w:t>
+        <w:br/>
+        <w:t xml:space="preserve">  "users":    { "total": 7, "vendors": 2, "customers": 4, "active": 7 },</w:t>
+        <w:br/>
+        <w:t xml:space="preserve">  "stores":   { "total": 1, "active": 1, "verified": 1, "open": 1 },</w:t>
+        <w:br/>
+        <w:t xml:space="preserve">  "videos":   { "total": 8, "ready": 3, "total_views": 6, "total_likes": 0 },</w:t>
+        <w:br/>
+        <w:t xml:space="preserve">  "products": { "active": 1 },</w:t>
+        <w:br/>
+        <w:t xml:space="preserve">  "revenue":  { "subscription_revenue": "499.00", "total_topups": "1000.00" }</w:t>
+        <w:br/>
+        <w:t>}</w:t>
+      </w:r>
+    </w:p>
+    <w:p>
+      <w:pPr>
+        <w:pStyle w:val="Heading2"/>
+      </w:pPr>
+      <w:r>
+        <w:t>STEP 49 — List All Stores  (Admin)</w:t>
+      </w:r>
+    </w:p>
+    <w:p>
+      <w:pPr>
+        <w:spacing w:before="120"/>
+        <w:shd w:val="clear" w:color="auto" w:fill="D4EDDA"/>
+      </w:pPr>
+      <w:r>
+        <w:rPr>
+          <w:b/>
+          <w:color w:val="155524"/>
+          <w:sz w:val="20"/>
+        </w:rPr>
+        <w:t xml:space="preserve">  GET  </w:t>
+      </w:r>
+      <w:r>
+        <w:rPr>
+          <w:b/>
+          <w:color w:val="1F4E79"/>
+          <w:sz w:val="20"/>
+        </w:rPr>
+        <w:t xml:space="preserve">  {{base_url}}/admin-panel/stores/</w:t>
+      </w:r>
+      <w:r>
+        <w:rPr>
+          <w:i/>
+          <w:color w:val="777777"/>
+          <w:sz w:val="18"/>
+        </w:rPr>
+        <w:t xml:space="preserve">   [Staff JWT]   [Sprint 8]</w:t>
+      </w:r>
+    </w:p>
+    <w:p>
+      <w:r>
+        <w:rPr>
+          <w:b w:val="0"/>
+          <w:sz w:val="22"/>
+        </w:rPr>
+        <w:t>No body. Optional query params: ?search=, ?is_active=, ?is_verified=, ?category=</w:t>
+      </w:r>
+    </w:p>
+    <w:p>
+      <w:r>
+        <w:rPr>
+          <w:b/>
+          <w:sz w:val="20"/>
+        </w:rPr>
+        <w:t>Expected Response  200 OK:</w:t>
+      </w:r>
+    </w:p>
+    <w:p>
+      <w:pPr>
+        <w:spacing w:before="40" w:after="40"/>
+        <w:ind w:left="288"/>
+        <w:shd w:val="clear" w:color="auto" w:fill="F0F0F0"/>
+      </w:pPr>
+      <w:r>
+        <w:rPr>
+          <w:rFonts w:ascii="Courier New" w:hAnsi="Courier New"/>
+          <w:color w:val="1A1A8C"/>
+          <w:sz w:val="18"/>
+        </w:rPr>
+        <w:t>{</w:t>
+        <w:br/>
+        <w:t xml:space="preserve">  "count": 1,</w:t>
+        <w:br/>
+        <w:t xml:space="preserve">  "results": [</w:t>
+        <w:br/>
+        <w:t xml:space="preserve">    {</w:t>
+        <w:br/>
+        <w:t xml:space="preserve">      "id": "...", "name": "Chennai Silk House", "category": "fashion",</w:t>
+        <w:br/>
+        <w:t xml:space="preserve">      "address": "123 T Nagar", "locality": "T Nagar",</w:t>
+        <w:br/>
+        <w:t xml:space="preserve">      "is_active": true, "is_verified": true, "is_open": true,</w:t>
+        <w:br/>
+        <w:t xml:space="preserve">      "wallet_balance": "501.00",</w:t>
+        <w:br/>
+        <w:t xml:space="preserve">      "owner_phone": "+919999999999", "owner_name": "",</w:t>
+        <w:br/>
+        <w:t xml:space="preserve">      "product_count": 1, "video_count": 8, "created_at": "..."</w:t>
+        <w:br/>
+        <w:t xml:space="preserve">    }</w:t>
+        <w:br/>
+        <w:t xml:space="preserve">  ]</w:t>
+        <w:br/>
+        <w:t>}</w:t>
+      </w:r>
+    </w:p>
+    <w:p>
+      <w:pPr>
+        <w:ind w:left="288"/>
+        <w:shd w:val="clear" w:color="auto" w:fill="D1ECF1"/>
+      </w:pPr>
+      <w:r>
+        <w:rPr>
+          <w:i/>
+          <w:color w:val="0C5460"/>
+          <w:sz w:val="20"/>
+        </w:rPr>
+        <w:t xml:space="preserve">  💡  Try: /admin-panel/stores/?is_verified=false to find stores pending verification.</w:t>
+      </w:r>
+    </w:p>
+    <w:p>
+      <w:pPr>
+        <w:pStyle w:val="Heading2"/>
+      </w:pPr>
+      <w:r>
+        <w:t>STEP 50 — Verify a Store  (Admin)</w:t>
+      </w:r>
+    </w:p>
+    <w:p>
+      <w:pPr>
+        <w:spacing w:before="120"/>
+        <w:shd w:val="clear" w:color="auto" w:fill="FFF3CD"/>
+      </w:pPr>
+      <w:r>
+        <w:rPr>
+          <w:b/>
+          <w:color w:val="7D4E00"/>
+          <w:sz w:val="20"/>
+        </w:rPr>
+        <w:t xml:space="preserve">  PATCH  </w:t>
+      </w:r>
+      <w:r>
+        <w:rPr>
+          <w:b/>
+          <w:color w:val="1F4E79"/>
+          <w:sz w:val="20"/>
+        </w:rPr>
+        <w:t xml:space="preserve">  {{base_url}}/admin-panel/stores/{{store_id}}/</w:t>
+      </w:r>
+      <w:r>
+        <w:rPr>
+          <w:i/>
+          <w:color w:val="777777"/>
+          <w:sz w:val="18"/>
+        </w:rPr>
+        <w:t xml:space="preserve">   [Staff JWT]   [Sprint 8]</w:t>
+      </w:r>
+    </w:p>
+    <w:p>
+      <w:r>
+        <w:rPr>
+          <w:b/>
+          <w:sz w:val="20"/>
+        </w:rPr>
+        <w:t>Body:</w:t>
+      </w:r>
+    </w:p>
+    <w:p>
+      <w:pPr>
+        <w:spacing w:before="40" w:after="40"/>
+        <w:ind w:left="288"/>
+        <w:shd w:val="clear" w:color="auto" w:fill="F0F0F0"/>
+      </w:pPr>
+      <w:r>
+        <w:rPr>
+          <w:rFonts w:ascii="Courier New" w:hAnsi="Courier New"/>
+          <w:color w:val="1A1A8C"/>
+          <w:sz w:val="18"/>
+        </w:rPr>
+        <w:t>{ "is_verified": true }</w:t>
+      </w:r>
+    </w:p>
+    <w:p>
+      <w:r>
+        <w:rPr>
+          <w:b/>
+          <w:sz w:val="20"/>
+        </w:rPr>
+        <w:t>Expected Response  200 OK:</w:t>
+      </w:r>
+    </w:p>
+    <w:p>
+      <w:pPr>
+        <w:spacing w:before="40" w:after="40"/>
+        <w:ind w:left="288"/>
+        <w:shd w:val="clear" w:color="auto" w:fill="F0F0F0"/>
+      </w:pPr>
+      <w:r>
+        <w:rPr>
+          <w:rFonts w:ascii="Courier New" w:hAnsi="Courier New"/>
+          <w:color w:val="1A1A8C"/>
+          <w:sz w:val="18"/>
+        </w:rPr>
+        <w:t>{ "id": "...", "is_verified": true, ... }</w:t>
+      </w:r>
+    </w:p>
+    <w:p>
+      <w:pPr>
+        <w:ind w:left="288"/>
+        <w:shd w:val="clear" w:color="auto" w:fill="D4EDDA"/>
+      </w:pPr>
+      <w:r>
+        <w:rPr>
+          <w:i/>
+          <w:color w:val="155724"/>
+          <w:sz w:val="20"/>
+        </w:rPr>
+        <w:t xml:space="preserve">  ✅  You can also set: {"is_active": false} to deactivate, or {"is_open": true} to mark store as open.</w:t>
+      </w:r>
+    </w:p>
+    <w:p>
+      <w:pPr>
+        <w:pStyle w:val="Heading2"/>
+      </w:pPr>
+      <w:r>
+        <w:t>STEP 51 — List All Users  (Admin)</w:t>
+      </w:r>
+    </w:p>
+    <w:p>
+      <w:pPr>
+        <w:spacing w:before="120"/>
+        <w:shd w:val="clear" w:color="auto" w:fill="D4EDDA"/>
+      </w:pPr>
+      <w:r>
+        <w:rPr>
+          <w:b/>
+          <w:color w:val="155524"/>
+          <w:sz w:val="20"/>
+        </w:rPr>
+        <w:t xml:space="preserve">  GET  </w:t>
+      </w:r>
+      <w:r>
+        <w:rPr>
+          <w:b/>
+          <w:color w:val="1F4E79"/>
+          <w:sz w:val="20"/>
+        </w:rPr>
+        <w:t xml:space="preserve">  {{base_url}}/admin-panel/users/</w:t>
+      </w:r>
+      <w:r>
+        <w:rPr>
+          <w:i/>
+          <w:color w:val="777777"/>
+          <w:sz w:val="18"/>
+        </w:rPr>
+        <w:t xml:space="preserve">   [Staff JWT]   [Sprint 8]</w:t>
+      </w:r>
+    </w:p>
+    <w:p>
+      <w:r>
+        <w:rPr>
+          <w:b w:val="0"/>
+          <w:sz w:val="22"/>
+        </w:rPr>
+        <w:t>No body. Optional query params: ?search=, ?role=vendor/customer, ?is_active=</w:t>
+      </w:r>
+    </w:p>
+    <w:p>
+      <w:r>
+        <w:rPr>
+          <w:b/>
+          <w:sz w:val="20"/>
+        </w:rPr>
+        <w:t>Expected Response  200 OK:</w:t>
+      </w:r>
+    </w:p>
+    <w:p>
+      <w:pPr>
+        <w:spacing w:before="40" w:after="40"/>
+        <w:ind w:left="288"/>
+        <w:shd w:val="clear" w:color="auto" w:fill="F0F0F0"/>
+      </w:pPr>
+      <w:r>
+        <w:rPr>
+          <w:rFonts w:ascii="Courier New" w:hAnsi="Courier New"/>
+          <w:color w:val="1A1A8C"/>
+          <w:sz w:val="18"/>
+        </w:rPr>
+        <w:t>{</w:t>
+        <w:br/>
+        <w:t xml:space="preserve">  "count": 7,</w:t>
+        <w:br/>
+        <w:t xml:space="preserve">  "results": [</w:t>
+        <w:br/>
+        <w:t xml:space="preserve">    {</w:t>
+        <w:br/>
+        <w:t xml:space="preserve">      "id": "...", "phone_number": "+919999999999",</w:t>
+        <w:br/>
+        <w:t xml:space="preserve">      "role": "vendor", "is_active": true, "is_staff": false,</w:t>
+        <w:br/>
+        <w:t xml:space="preserve">      "store_name": "Chennai Silk House", "created_at": "..."</w:t>
+        <w:br/>
+        <w:t xml:space="preserve">    }</w:t>
+        <w:br/>
+        <w:t xml:space="preserve">  ]</w:t>
+        <w:br/>
+        <w:t>}</w:t>
+      </w:r>
+    </w:p>
+    <w:p>
+      <w:pPr>
+        <w:ind w:left="288"/>
+        <w:shd w:val="clear" w:color="auto" w:fill="D1ECF1"/>
+      </w:pPr>
+      <w:r>
+        <w:rPr>
+          <w:i/>
+          <w:color w:val="0C5460"/>
+          <w:sz w:val="20"/>
+        </w:rPr>
+        <w:t xml:space="preserve">  💡  Vendors show store_name. Customers show null for store_name.</w:t>
+      </w:r>
+    </w:p>
+    <w:p>
+      <w:pPr>
+        <w:pStyle w:val="Heading2"/>
+      </w:pPr>
+      <w:r>
+        <w:t>STEP 52 — Toggle User Active  (Admin)</w:t>
+      </w:r>
+    </w:p>
+    <w:p>
+      <w:pPr>
+        <w:spacing w:before="120"/>
+        <w:shd w:val="clear" w:color="auto" w:fill="CCE5FF"/>
+      </w:pPr>
+      <w:r>
+        <w:rPr>
+          <w:b/>
+          <w:color w:val="004DAA"/>
+          <w:sz w:val="20"/>
+        </w:rPr>
+        <w:t xml:space="preserve">  POST  </w:t>
+      </w:r>
+      <w:r>
+        <w:rPr>
+          <w:b/>
+          <w:color w:val="1F4E79"/>
+          <w:sz w:val="20"/>
+        </w:rPr>
+        <w:t xml:space="preserve">  {{base_url}}/admin-panel/users/{{customer_id}}/toggle-active/</w:t>
+      </w:r>
+      <w:r>
+        <w:rPr>
+          <w:i/>
+          <w:color w:val="777777"/>
+          <w:sz w:val="18"/>
+        </w:rPr>
+        <w:t xml:space="preserve">   [Staff JWT]   [Sprint 8]</w:t>
+      </w:r>
+    </w:p>
+    <w:p>
+      <w:r>
+        <w:rPr>
+          <w:b w:val="0"/>
+          <w:sz w:val="22"/>
+        </w:rPr>
+        <w:t>No body.</w:t>
+      </w:r>
+    </w:p>
+    <w:p>
+      <w:r>
+        <w:rPr>
+          <w:b/>
+          <w:sz w:val="20"/>
+        </w:rPr>
+        <w:t>Expected Response  200 OK:</w:t>
+      </w:r>
+    </w:p>
+    <w:p>
+      <w:pPr>
+        <w:spacing w:before="40" w:after="40"/>
+        <w:ind w:left="288"/>
+        <w:shd w:val="clear" w:color="auto" w:fill="F0F0F0"/>
+      </w:pPr>
+      <w:r>
+        <w:rPr>
+          <w:rFonts w:ascii="Courier New" w:hAnsi="Courier New"/>
+          <w:color w:val="1A1A8C"/>
+          <w:sz w:val="18"/>
+        </w:rPr>
+        <w:t>{ "message": "User deactivated successfully.", "user_id": "...", "is_active": false }</w:t>
+      </w:r>
+    </w:p>
+    <w:p>
+      <w:r>
+        <w:rPr>
+          <w:b w:val="0"/>
+          <w:sz w:val="20"/>
+        </w:rPr>
+        <w:t>Call again to re-activate:</w:t>
+      </w:r>
+    </w:p>
+    <w:p>
+      <w:pPr>
+        <w:spacing w:before="40" w:after="40"/>
+        <w:ind w:left="288"/>
+        <w:shd w:val="clear" w:color="auto" w:fill="F0F0F0"/>
+      </w:pPr>
+      <w:r>
+        <w:rPr>
+          <w:rFonts w:ascii="Courier New" w:hAnsi="Courier New"/>
+          <w:color w:val="1A1A8C"/>
+          <w:sz w:val="18"/>
+        </w:rPr>
+        <w:t>{ "message": "User activated successfully.", "user_id": "...", "is_active": true }</w:t>
+      </w:r>
+    </w:p>
+    <w:p>
+      <w:pPr>
+        <w:ind w:left="288"/>
+        <w:shd w:val="clear" w:color="auto" w:fill="F8D7DA"/>
+      </w:pPr>
+      <w:r>
+        <w:rPr>
+          <w:i/>
+          <w:color w:val="7B1D1D"/>
+          <w:sz w:val="20"/>
+        </w:rPr>
+        <w:t xml:space="preserve">  🚫  Cannot toggle your own account — returns 400 with "Cannot deactivate your own account."</w:t>
+      </w:r>
+    </w:p>
+    <w:p>
+      <w:pPr>
+        <w:pStyle w:val="Heading2"/>
+      </w:pPr>
+      <w:r>
+        <w:t>STEP 53 — Search Filter Tests  (Admin)</w:t>
+      </w:r>
+    </w:p>
+    <w:p>
+      <w:r>
+        <w:rPr>
+          <w:b w:val="0"/>
+          <w:sz w:val="22"/>
+        </w:rPr>
+        <w:t>Test the filter params on both admin endpoints:</w:t>
+      </w:r>
+    </w:p>
+    <w:p>
+      <w:pPr>
+        <w:spacing w:before="40" w:after="40"/>
+        <w:ind w:left="288"/>
+        <w:shd w:val="clear" w:color="auto" w:fill="F0F0F0"/>
+      </w:pPr>
+      <w:r>
+        <w:rPr>
+          <w:rFonts w:ascii="Courier New" w:hAnsi="Courier New"/>
+          <w:color w:val="1A1A8C"/>
+          <w:sz w:val="18"/>
+        </w:rPr>
+        <w:t># Filter stores by verification status</w:t>
+        <w:br/>
+        <w:t>GET /admin-panel/stores/?is_verified=false</w:t>
+        <w:br/>
+        <w:br/>
+        <w:t># Filter stores by category</w:t>
+        <w:br/>
+        <w:t>GET /admin-panel/stores/?category=fashion</w:t>
+        <w:br/>
+        <w:br/>
+        <w:t># Search stores by name or owner phone</w:t>
+        <w:br/>
+        <w:t>GET /admin-panel/stores/?search=chennai</w:t>
+        <w:br/>
+        <w:br/>
+        <w:t># Filter users by role</w:t>
+        <w:br/>
+        <w:t>GET /admin-panel/users/?role=vendor</w:t>
+        <w:br/>
+        <w:br/>
+        <w:t># Search users by phone</w:t>
+        <w:br/>
+        <w:t>GET /admin-panel/users/?search=9999</w:t>
+      </w:r>
+    </w:p>
+    <w:p>
+      <w:r>
+        <w:br w:type="page"/>
+      </w:r>
+    </w:p>
+    <w:p>
+      <w:pPr>
+        <w:pStyle w:val="Heading1"/>
+      </w:pPr>
+      <w:r>
         <w:t>4. Error Cases to Test</w:t>
       </w:r>
     </w:p>
@@ -18079,7 +19559,7 @@
         <w:pStyle w:val="Heading2"/>
       </w:pPr>
       <w:r>
-        <w:t>Video Error Cases  (Sprint 4)</w:t>
+        <w:t>Analytics Error Cases  (Sprint 8)</w:t>
       </w:r>
     </w:p>
     <w:tbl>
@@ -18097,7 +19577,7 @@
       <w:tr>
         <w:tc>
           <w:tcPr>
-            <w:tcW w:type="dxa" w:w="2880"/>
+            <w:tcW w:type="dxa" w:w="2736"/>
             <w:shd w:val="clear" w:color="auto" w:fill="1F4E79"/>
           </w:tcPr>
           <w:p>
@@ -18113,7 +19593,7 @@
         </w:tc>
         <w:tc>
           <w:tcPr>
-            <w:tcW w:type="dxa" w:w="3456"/>
+            <w:tcW w:type="dxa" w:w="3744"/>
             <w:shd w:val="clear" w:color="auto" w:fill="1F4E79"/>
           </w:tcPr>
           <w:p>
@@ -18123,13 +19603,13 @@
                 <w:color w:val="FFFFFF"/>
                 <w:sz w:val="20"/>
               </w:rPr>
-              <w:t>Request</w:t>
-            </w:r>
-          </w:p>
-        </w:tc>
-        <w:tc>
-          <w:tcPr>
-            <w:tcW w:type="dxa" w:w="3168"/>
+              <w:t>Request / Situation</w:t>
+            </w:r>
+          </w:p>
+        </w:tc>
+        <w:tc>
+          <w:tcPr>
+            <w:tcW w:type="dxa" w:w="3024"/>
             <w:shd w:val="clear" w:color="auto" w:fill="1F4E79"/>
           </w:tcPr>
           <w:p>
@@ -18147,7 +19627,7 @@
       <w:tr>
         <w:tc>
           <w:tcPr>
-            <w:tcW w:type="dxa" w:w="2880"/>
+            <w:tcW w:type="dxa" w:w="2736"/>
             <w:shd w:val="clear" w:color="auto" w:fill="DEEAF1"/>
           </w:tcPr>
           <w:p>
@@ -18155,13 +19635,13 @@
               <w:rPr>
                 <w:sz w:val="19"/>
               </w:rPr>
-              <w:t>No store — request upload</w:t>
-            </w:r>
-          </w:p>
-        </w:tc>
-        <w:tc>
-          <w:tcPr>
-            <w:tcW w:type="dxa" w:w="3456"/>
+              <w:t>Vendor Dashboard — no store</w:t>
+            </w:r>
+          </w:p>
+        </w:tc>
+        <w:tc>
+          <w:tcPr>
+            <w:tcW w:type="dxa" w:w="3744"/>
             <w:shd w:val="clear" w:color="auto" w:fill="DEEAF1"/>
           </w:tcPr>
           <w:p>
@@ -18169,13 +19649,13 @@
               <w:rPr>
                 <w:sz w:val="19"/>
               </w:rPr>
-              <w:t>POST /videos/request-upload/ before store created</w:t>
-            </w:r>
-          </w:p>
-        </w:tc>
-        <w:tc>
-          <w:tcPr>
-            <w:tcW w:type="dxa" w:w="3168"/>
+              <w:t>GET /analytics/vendor/ — vendor with no store</w:t>
+            </w:r>
+          </w:p>
+        </w:tc>
+        <w:tc>
+          <w:tcPr>
+            <w:tcW w:type="dxa" w:w="3024"/>
             <w:shd w:val="clear" w:color="auto" w:fill="DEEAF1"/>
           </w:tcPr>
           <w:p>
@@ -18191,40 +19671,40 @@
       <w:tr>
         <w:tc>
           <w:tcPr>
-            <w:tcW w:type="dxa" w:w="2880"/>
-          </w:tcPr>
-          <w:p>
-            <w:r>
-              <w:rPr>
-                <w:sz w:val="19"/>
-              </w:rPr>
-              <w:t>Missing title</w:t>
-            </w:r>
-          </w:p>
-        </w:tc>
-        <w:tc>
-          <w:tcPr>
-            <w:tcW w:type="dxa" w:w="3456"/>
-          </w:tcPr>
-          <w:p>
-            <w:r>
-              <w:rPr>
-                <w:sz w:val="19"/>
-              </w:rPr>
-              <w:t>POST /videos/request-upload/ with no title field</w:t>
-            </w:r>
-          </w:p>
-        </w:tc>
-        <w:tc>
-          <w:tcPr>
-            <w:tcW w:type="dxa" w:w="3168"/>
-          </w:tcPr>
-          <w:p>
-            <w:r>
-              <w:rPr>
-                <w:sz w:val="19"/>
-              </w:rPr>
-              <w:t>400 — This field is required</w:t>
+            <w:tcW w:type="dxa" w:w="2736"/>
+          </w:tcPr>
+          <w:p>
+            <w:r>
+              <w:rPr>
+                <w:sz w:val="19"/>
+              </w:rPr>
+              <w:t>Dashboard — no auth</w:t>
+            </w:r>
+          </w:p>
+        </w:tc>
+        <w:tc>
+          <w:tcPr>
+            <w:tcW w:type="dxa" w:w="3744"/>
+          </w:tcPr>
+          <w:p>
+            <w:r>
+              <w:rPr>
+                <w:sz w:val="19"/>
+              </w:rPr>
+              <w:t>GET /analytics/vendor/ — no Authorization header</w:t>
+            </w:r>
+          </w:p>
+        </w:tc>
+        <w:tc>
+          <w:tcPr>
+            <w:tcW w:type="dxa" w:w="3024"/>
+          </w:tcPr>
+          <w:p>
+            <w:r>
+              <w:rPr>
+                <w:sz w:val="19"/>
+              </w:rPr>
+              <w:t>401 — authentication_failed</w:t>
             </w:r>
           </w:p>
         </w:tc>
@@ -18232,7 +19712,7 @@
       <w:tr>
         <w:tc>
           <w:tcPr>
-            <w:tcW w:type="dxa" w:w="2880"/>
+            <w:tcW w:type="dxa" w:w="2736"/>
             <w:shd w:val="clear" w:color="auto" w:fill="DEEAF1"/>
           </w:tcPr>
           <w:p>
@@ -18240,13 +19720,13 @@
               <w:rPr>
                 <w:sz w:val="19"/>
               </w:rPr>
-              <w:t>Customer calls request-upload</w:t>
-            </w:r>
-          </w:p>
-        </w:tc>
-        <w:tc>
-          <w:tcPr>
-            <w:tcW w:type="dxa" w:w="3456"/>
+              <w:t>Dashboard — customer token</w:t>
+            </w:r>
+          </w:p>
+        </w:tc>
+        <w:tc>
+          <w:tcPr>
+            <w:tcW w:type="dxa" w:w="3744"/>
             <w:shd w:val="clear" w:color="auto" w:fill="DEEAF1"/>
           </w:tcPr>
           <w:p>
@@ -18254,13 +19734,13 @@
               <w:rPr>
                 <w:sz w:val="19"/>
               </w:rPr>
-              <w:t>POST /videos/request-upload/ with customer token</w:t>
-            </w:r>
-          </w:p>
-        </w:tc>
-        <w:tc>
-          <w:tcPr>
-            <w:tcW w:type="dxa" w:w="3168"/>
+              <w:t>GET /analytics/vendor/ — customer token</w:t>
+            </w:r>
+          </w:p>
+        </w:tc>
+        <w:tc>
+          <w:tcPr>
+            <w:tcW w:type="dxa" w:w="3024"/>
             <w:shd w:val="clear" w:color="auto" w:fill="DEEAF1"/>
           </w:tcPr>
           <w:p>
@@ -18276,40 +19756,40 @@
       <w:tr>
         <w:tc>
           <w:tcPr>
-            <w:tcW w:type="dxa" w:w="2880"/>
-          </w:tcPr>
-          <w:p>
-            <w:r>
-              <w:rPr>
-                <w:sz w:val="19"/>
-              </w:rPr>
-              <w:t>Confirm already-ready video</w:t>
-            </w:r>
-          </w:p>
-        </w:tc>
-        <w:tc>
-          <w:tcPr>
-            <w:tcW w:type="dxa" w:w="3456"/>
-          </w:tcPr>
-          <w:p>
-            <w:r>
-              <w:rPr>
-                <w:sz w:val="19"/>
-              </w:rPr>
-              <w:t>POST /videos/&lt;id&gt;/confirm-upload/ on ready video</w:t>
-            </w:r>
-          </w:p>
-        </w:tc>
-        <w:tc>
-          <w:tcPr>
-            <w:tcW w:type="dxa" w:w="3168"/>
-          </w:tcPr>
-          <w:p>
-            <w:r>
-              <w:rPr>
-                <w:sz w:val="19"/>
-              </w:rPr>
-              <w:t>400 — Video already in "ready" state</w:t>
+            <w:tcW w:type="dxa" w:w="2736"/>
+          </w:tcPr>
+          <w:p>
+            <w:r>
+              <w:rPr>
+                <w:sz w:val="19"/>
+              </w:rPr>
+              <w:t>Admin stats — vendor token</w:t>
+            </w:r>
+          </w:p>
+        </w:tc>
+        <w:tc>
+          <w:tcPr>
+            <w:tcW w:type="dxa" w:w="3744"/>
+          </w:tcPr>
+          <w:p>
+            <w:r>
+              <w:rPr>
+                <w:sz w:val="19"/>
+              </w:rPr>
+              <w:t>GET /admin-panel/stats/ — vendor token</w:t>
+            </w:r>
+          </w:p>
+        </w:tc>
+        <w:tc>
+          <w:tcPr>
+            <w:tcW w:type="dxa" w:w="3024"/>
+          </w:tcPr>
+          <w:p>
+            <w:r>
+              <w:rPr>
+                <w:sz w:val="19"/>
+              </w:rPr>
+              <w:t>403 — permission_denied</w:t>
             </w:r>
           </w:p>
         </w:tc>
@@ -18317,7 +19797,7 @@
       <w:tr>
         <w:tc>
           <w:tcPr>
-            <w:tcW w:type="dxa" w:w="2880"/>
+            <w:tcW w:type="dxa" w:w="2736"/>
             <w:shd w:val="clear" w:color="auto" w:fill="DEEAF1"/>
           </w:tcPr>
           <w:p>
@@ -18325,13 +19805,13 @@
               <w:rPr>
                 <w:sz w:val="19"/>
               </w:rPr>
-              <w:t>Duration too long</w:t>
-            </w:r>
-          </w:p>
-        </w:tc>
-        <w:tc>
-          <w:tcPr>
-            <w:tcW w:type="dxa" w:w="3456"/>
+              <w:t>Admin stats — no auth</w:t>
+            </w:r>
+          </w:p>
+        </w:tc>
+        <w:tc>
+          <w:tcPr>
+            <w:tcW w:type="dxa" w:w="3744"/>
             <w:shd w:val="clear" w:color="auto" w:fill="DEEAF1"/>
           </w:tcPr>
           <w:p>
@@ -18339,13 +19819,13 @@
               <w:rPr>
                 <w:sz w:val="19"/>
               </w:rPr>
-              <w:t>POST /videos/&lt;id&gt;/confirm-upload/ — duration_seconds=120</w:t>
-            </w:r>
-          </w:p>
-        </w:tc>
-        <w:tc>
-          <w:tcPr>
-            <w:tcW w:type="dxa" w:w="3168"/>
+              <w:t>GET /admin-panel/stats/ — no header</w:t>
+            </w:r>
+          </w:p>
+        </w:tc>
+        <w:tc>
+          <w:tcPr>
+            <w:tcW w:type="dxa" w:w="3024"/>
             <w:shd w:val="clear" w:color="auto" w:fill="DEEAF1"/>
           </w:tcPr>
           <w:p>
@@ -18353,7 +19833,7 @@
               <w:rPr>
                 <w:sz w:val="19"/>
               </w:rPr>
-              <w:t>400 — cannot exceed 60 seconds</w:t>
+              <w:t>401 — authentication_failed</w:t>
             </w:r>
           </w:p>
         </w:tc>
@@ -18361,40 +19841,40 @@
       <w:tr>
         <w:tc>
           <w:tcPr>
-            <w:tcW w:type="dxa" w:w="2880"/>
-          </w:tcPr>
-          <w:p>
-            <w:r>
-              <w:rPr>
-                <w:sz w:val="19"/>
-              </w:rPr>
-              <w:t>Confirm another vendor video</w:t>
-            </w:r>
-          </w:p>
-        </w:tc>
-        <w:tc>
-          <w:tcPr>
-            <w:tcW w:type="dxa" w:w="3456"/>
-          </w:tcPr>
-          <w:p>
-            <w:r>
-              <w:rPr>
-                <w:sz w:val="19"/>
-              </w:rPr>
-              <w:t>POST /videos/&lt;id&gt;/confirm-upload/ — wrong vendor</w:t>
-            </w:r>
-          </w:p>
-        </w:tc>
-        <w:tc>
-          <w:tcPr>
-            <w:tcW w:type="dxa" w:w="3168"/>
-          </w:tcPr>
-          <w:p>
-            <w:r>
-              <w:rPr>
-                <w:sz w:val="19"/>
-              </w:rPr>
-              <w:t>404 — not_found</w:t>
+            <w:tcW w:type="dxa" w:w="2736"/>
+          </w:tcPr>
+          <w:p>
+            <w:r>
+              <w:rPr>
+                <w:sz w:val="19"/>
+              </w:rPr>
+              <w:t>Store update — wrong UUID</w:t>
+            </w:r>
+          </w:p>
+        </w:tc>
+        <w:tc>
+          <w:tcPr>
+            <w:tcW w:type="dxa" w:w="3744"/>
+          </w:tcPr>
+          <w:p>
+            <w:r>
+              <w:rPr>
+                <w:sz w:val="19"/>
+              </w:rPr>
+              <w:t>PATCH /admin-panel/stores/&lt;bad_uuid&gt;/</w:t>
+            </w:r>
+          </w:p>
+        </w:tc>
+        <w:tc>
+          <w:tcPr>
+            <w:tcW w:type="dxa" w:w="3024"/>
+          </w:tcPr>
+          <w:p>
+            <w:r>
+              <w:rPr>
+                <w:sz w:val="19"/>
+              </w:rPr>
+              <w:t>404 — Store not found</w:t>
             </w:r>
           </w:p>
         </w:tc>
@@ -18402,7 +19882,7 @@
       <w:tr>
         <w:tc>
           <w:tcPr>
-            <w:tcW w:type="dxa" w:w="2880"/>
+            <w:tcW w:type="dxa" w:w="2736"/>
             <w:shd w:val="clear" w:color="auto" w:fill="DEEAF1"/>
           </w:tcPr>
           <w:p>
@@ -18410,13 +19890,13 @@
               <w:rPr>
                 <w:sz w:val="19"/>
               </w:rPr>
-              <w:t>Feed without lat/lng</w:t>
-            </w:r>
-          </w:p>
-        </w:tc>
-        <w:tc>
-          <w:tcPr>
-            <w:tcW w:type="dxa" w:w="3456"/>
+              <w:t>User not found</w:t>
+            </w:r>
+          </w:p>
+        </w:tc>
+        <w:tc>
+          <w:tcPr>
+            <w:tcW w:type="dxa" w:w="3744"/>
             <w:shd w:val="clear" w:color="auto" w:fill="DEEAF1"/>
           </w:tcPr>
           <w:p>
@@ -18424,13 +19904,13 @@
               <w:rPr>
                 <w:sz w:val="19"/>
               </w:rPr>
-              <w:t>GET /videos/feed/ — no ?lat=&amp;lng= params</w:t>
-            </w:r>
-          </w:p>
-        </w:tc>
-        <w:tc>
-          <w:tcPr>
-            <w:tcW w:type="dxa" w:w="3168"/>
+              <w:t>POST /admin-panel/users/&lt;bad_uuid&gt;/toggle-active/</w:t>
+            </w:r>
+          </w:p>
+        </w:tc>
+        <w:tc>
+          <w:tcPr>
+            <w:tcW w:type="dxa" w:w="3024"/>
             <w:shd w:val="clear" w:color="auto" w:fill="DEEAF1"/>
           </w:tcPr>
           <w:p>
@@ -18438,7 +19918,7 @@
               <w:rPr>
                 <w:sz w:val="19"/>
               </w:rPr>
-              <w:t>400 — lat and lng are required numbers</w:t>
+              <w:t>404 — User not found</w:t>
             </w:r>
           </w:p>
         </w:tc>
@@ -18446,40 +19926,40 @@
       <w:tr>
         <w:tc>
           <w:tcPr>
-            <w:tcW w:type="dxa" w:w="2880"/>
-          </w:tcPr>
-          <w:p>
-            <w:r>
-              <w:rPr>
-                <w:sz w:val="19"/>
-              </w:rPr>
-              <w:t>Detail on processing video</w:t>
-            </w:r>
-          </w:p>
-        </w:tc>
-        <w:tc>
-          <w:tcPr>
-            <w:tcW w:type="dxa" w:w="3456"/>
-          </w:tcPr>
-          <w:p>
-            <w:r>
-              <w:rPr>
-                <w:sz w:val="19"/>
-              </w:rPr>
-              <w:t>GET /videos/&lt;id&gt;/ while status=processing</w:t>
-            </w:r>
-          </w:p>
-        </w:tc>
-        <w:tc>
-          <w:tcPr>
-            <w:tcW w:type="dxa" w:w="3168"/>
-          </w:tcPr>
-          <w:p>
-            <w:r>
-              <w:rPr>
-                <w:sz w:val="19"/>
-              </w:rPr>
-              <w:t>404 — not_found (only ready shown)</w:t>
+            <w:tcW w:type="dxa" w:w="2736"/>
+          </w:tcPr>
+          <w:p>
+            <w:r>
+              <w:rPr>
+                <w:sz w:val="19"/>
+              </w:rPr>
+              <w:t>Toggle own account</w:t>
+            </w:r>
+          </w:p>
+        </w:tc>
+        <w:tc>
+          <w:tcPr>
+            <w:tcW w:type="dxa" w:w="3744"/>
+          </w:tcPr>
+          <w:p>
+            <w:r>
+              <w:rPr>
+                <w:sz w:val="19"/>
+              </w:rPr>
+              <w:t>POST /admin-panel/users/&lt;own_id&gt;/toggle-active/</w:t>
+            </w:r>
+          </w:p>
+        </w:tc>
+        <w:tc>
+          <w:tcPr>
+            <w:tcW w:type="dxa" w:w="3024"/>
+          </w:tcPr>
+          <w:p>
+            <w:r>
+              <w:rPr>
+                <w:sz w:val="19"/>
+              </w:rPr>
+              <w:t>400 — Cannot deactivate your own account</w:t>
             </w:r>
           </w:p>
         </w:tc>
@@ -18487,7 +19967,7 @@
       <w:tr>
         <w:tc>
           <w:tcPr>
-            <w:tcW w:type="dxa" w:w="2880"/>
+            <w:tcW w:type="dxa" w:w="2736"/>
             <w:shd w:val="clear" w:color="auto" w:fill="DEEAF1"/>
           </w:tcPr>
           <w:p>
@@ -18495,13 +19975,13 @@
               <w:rPr>
                 <w:sz w:val="19"/>
               </w:rPr>
-              <w:t>Like without auth</w:t>
-            </w:r>
-          </w:p>
-        </w:tc>
-        <w:tc>
-          <w:tcPr>
-            <w:tcW w:type="dxa" w:w="3456"/>
+              <w:t>Store list — vendor token</w:t>
+            </w:r>
+          </w:p>
+        </w:tc>
+        <w:tc>
+          <w:tcPr>
+            <w:tcW w:type="dxa" w:w="3744"/>
             <w:shd w:val="clear" w:color="auto" w:fill="DEEAF1"/>
           </w:tcPr>
           <w:p>
@@ -18509,13 +19989,13 @@
               <w:rPr>
                 <w:sz w:val="19"/>
               </w:rPr>
-              <w:t>POST /videos/&lt;id&gt;/like/ — no auth header</w:t>
-            </w:r>
-          </w:p>
-        </w:tc>
-        <w:tc>
-          <w:tcPr>
-            <w:tcW w:type="dxa" w:w="3168"/>
+              <w:t>GET /admin-panel/stores/ — vendor token</w:t>
+            </w:r>
+          </w:p>
+        </w:tc>
+        <w:tc>
+          <w:tcPr>
+            <w:tcW w:type="dxa" w:w="3024"/>
             <w:shd w:val="clear" w:color="auto" w:fill="DEEAF1"/>
           </w:tcPr>
           <w:p>
@@ -18523,7 +20003,7 @@
               <w:rPr>
                 <w:sz w:val="19"/>
               </w:rPr>
-              <w:t>401 — authentication_failed</w:t>
+              <w:t>403 — permission_denied</w:t>
             </w:r>
           </w:p>
         </w:tc>
@@ -18531,125 +20011,40 @@
       <w:tr>
         <w:tc>
           <w:tcPr>
-            <w:tcW w:type="dxa" w:w="2880"/>
-          </w:tcPr>
-          <w:p>
-            <w:r>
-              <w:rPr>
-                <w:sz w:val="19"/>
-              </w:rPr>
-              <w:t>Update another vendor video</w:t>
-            </w:r>
-          </w:p>
-        </w:tc>
-        <w:tc>
-          <w:tcPr>
-            <w:tcW w:type="dxa" w:w="3456"/>
-          </w:tcPr>
-          <w:p>
-            <w:r>
-              <w:rPr>
-                <w:sz w:val="19"/>
-              </w:rPr>
-              <w:t>PATCH /videos/&lt;id&gt;/update/ — different vendor token</w:t>
-            </w:r>
-          </w:p>
-        </w:tc>
-        <w:tc>
-          <w:tcPr>
-            <w:tcW w:type="dxa" w:w="3168"/>
-          </w:tcPr>
-          <w:p>
-            <w:r>
-              <w:rPr>
-                <w:sz w:val="19"/>
-              </w:rPr>
-              <w:t>404 — not_found</w:t>
-            </w:r>
-          </w:p>
-        </w:tc>
-      </w:tr>
-      <w:tr>
-        <w:tc>
-          <w:tcPr>
-            <w:tcW w:type="dxa" w:w="2880"/>
-            <w:shd w:val="clear" w:color="auto" w:fill="DEEAF1"/>
-          </w:tcPr>
-          <w:p>
-            <w:r>
-              <w:rPr>
-                <w:sz w:val="19"/>
-              </w:rPr>
-              <w:t>Delete another vendor video</w:t>
-            </w:r>
-          </w:p>
-        </w:tc>
-        <w:tc>
-          <w:tcPr>
-            <w:tcW w:type="dxa" w:w="3456"/>
-            <w:shd w:val="clear" w:color="auto" w:fill="DEEAF1"/>
-          </w:tcPr>
-          <w:p>
-            <w:r>
-              <w:rPr>
-                <w:sz w:val="19"/>
-              </w:rPr>
-              <w:t>DELETE /videos/&lt;id&gt;/delete/ — different vendor</w:t>
-            </w:r>
-          </w:p>
-        </w:tc>
-        <w:tc>
-          <w:tcPr>
-            <w:tcW w:type="dxa" w:w="3168"/>
-            <w:shd w:val="clear" w:color="auto" w:fill="DEEAF1"/>
-          </w:tcPr>
-          <w:p>
-            <w:r>
-              <w:rPr>
-                <w:sz w:val="19"/>
-              </w:rPr>
-              <w:t>404 — not_found</w:t>
-            </w:r>
-          </w:p>
-        </w:tc>
-      </w:tr>
-      <w:tr>
-        <w:tc>
-          <w:tcPr>
-            <w:tcW w:type="dxa" w:w="2880"/>
-          </w:tcPr>
-          <w:p>
-            <w:r>
-              <w:rPr>
-                <w:sz w:val="19"/>
-              </w:rPr>
-              <w:t>Delete with customer token</w:t>
-            </w:r>
-          </w:p>
-        </w:tc>
-        <w:tc>
-          <w:tcPr>
-            <w:tcW w:type="dxa" w:w="3456"/>
-          </w:tcPr>
-          <w:p>
-            <w:r>
-              <w:rPr>
-                <w:sz w:val="19"/>
-              </w:rPr>
-              <w:t>DELETE /videos/&lt;id&gt;/delete/ — customer token</w:t>
-            </w:r>
-          </w:p>
-        </w:tc>
-        <w:tc>
-          <w:tcPr>
-            <w:tcW w:type="dxa" w:w="3168"/>
-          </w:tcPr>
-          <w:p>
-            <w:r>
-              <w:rPr>
-                <w:sz w:val="19"/>
-              </w:rPr>
-              <w:t>403 — Vendor access only</w:t>
+            <w:tcW w:type="dxa" w:w="2736"/>
+          </w:tcPr>
+          <w:p>
+            <w:r>
+              <w:rPr>
+                <w:sz w:val="19"/>
+              </w:rPr>
+              <w:t>User list — vendor token</w:t>
+            </w:r>
+          </w:p>
+        </w:tc>
+        <w:tc>
+          <w:tcPr>
+            <w:tcW w:type="dxa" w:w="3744"/>
+          </w:tcPr>
+          <w:p>
+            <w:r>
+              <w:rPr>
+                <w:sz w:val="19"/>
+              </w:rPr>
+              <w:t>GET /admin-panel/users/ — vendor token</w:t>
+            </w:r>
+          </w:p>
+        </w:tc>
+        <w:tc>
+          <w:tcPr>
+            <w:tcW w:type="dxa" w:w="3024"/>
+          </w:tcPr>
+          <w:p>
+            <w:r>
+              <w:rPr>
+                <w:sz w:val="19"/>
+              </w:rPr>
+              <w:t>403 — permission_denied</w:t>
             </w:r>
           </w:p>
         </w:tc>
@@ -18657,541 +20052,11 @@
     </w:tbl>
     <w:p/>
     <w:p>
-      <w:r>
-        <w:br w:type="page"/>
-      </w:r>
-    </w:p>
-    <w:p>
-      <w:pPr>
-        <w:pStyle w:val="Heading1"/>
-      </w:pPr>
-      <w:r>
-        <w:t>5. Postman Quick Setup</w:t>
-      </w:r>
-    </w:p>
-    <w:p>
       <w:pPr>
         <w:pStyle w:val="Heading2"/>
       </w:pPr>
       <w:r>
-        <w:t>Collection Folder Structure (recommended)</w:t>
-      </w:r>
-    </w:p>
-    <w:p>
-      <w:pPr>
-        <w:spacing w:before="40" w:after="40"/>
-        <w:ind w:left="288"/>
-        <w:shd w:val="clear" w:color="auto" w:fill="F0F0F0"/>
-      </w:pPr>
-      <w:r>
-        <w:rPr>
-          <w:rFonts w:ascii="Courier New" w:hAnsi="Courier New"/>
-          <w:color w:val="1A1A8C"/>
-          <w:sz w:val="18"/>
-        </w:rPr>
-        <w:t>NearKart Local</w:t>
-        <w:br/>
-        <w:t>├── 0. Setup</w:t>
-        <w:br/>
-        <w:t>│   └── Health Check</w:t>
-        <w:br/>
-        <w:t>├── 1. Auth</w:t>
-        <w:br/>
-        <w:t>│   ├── Send OTP (Vendor)</w:t>
-        <w:br/>
-        <w:t>│   ├── Verify OTP (Vendor) ← Tests script saves vendor_token</w:t>
-        <w:br/>
-        <w:t>│   ├── Send OTP (Customer)</w:t>
-        <w:br/>
-        <w:t>│   ├── Verify OTP (Customer) ← Tests script saves customer_token + customer_id</w:t>
-        <w:br/>
-        <w:t>│   ├── Get Profile</w:t>
-        <w:br/>
-        <w:t>│   ├── Update Profile</w:t>
-        <w:br/>
-        <w:t>│   ├── Update Location</w:t>
-        <w:br/>
-        <w:t>│   ├── Refresh Token</w:t>
-        <w:br/>
-        <w:t>│   └── Logout</w:t>
-        <w:br/>
-        <w:t>├── 2. Stores</w:t>
-        <w:br/>
-        <w:t>│   ├── Create Store ← Tests script saves store_id</w:t>
-        <w:br/>
-        <w:t>│   ├── Nearby Stores</w:t>
-        <w:br/>
-        <w:t>│   ├── Store Detail</w:t>
-        <w:br/>
-        <w:t>│   ├── Update Store</w:t>
-        <w:br/>
-        <w:t>│   ├── Follow Store</w:t>
-        <w:br/>
-        <w:t>│   ├── Review Store</w:t>
-        <w:br/>
-        <w:t>│   └── QR Code</w:t>
-        <w:br/>
-        <w:t>├── 3. Products</w:t>
-        <w:br/>
-        <w:t>│   ├── Create Product ← Tests script saves product_id</w:t>
-        <w:br/>
-        <w:t>│   ├── Nearby Products</w:t>
-        <w:br/>
-        <w:t>│   ├── Search Products</w:t>
-        <w:br/>
-        <w:t>│   ├── Product Detail</w:t>
-        <w:br/>
-        <w:t>│   ├── Update Product</w:t>
-        <w:br/>
-        <w:t>│   ├── Delete Product</w:t>
-        <w:br/>
-        <w:t>│   └── Wishlist Toggle</w:t>
-        <w:br/>
-        <w:t>├── 4. Videos</w:t>
-        <w:br/>
-        <w:t>│   ├── Request Upload URL ← Tests script saves video_id</w:t>
-        <w:br/>
-        <w:t>│   ├── Confirm Upload</w:t>
-        <w:br/>
-        <w:t>│   ├── My Videos (Vendor Library)</w:t>
-        <w:br/>
-        <w:t>│   ├── Update Video</w:t>
-        <w:br/>
-        <w:t>│   ├── Video Feed</w:t>
-        <w:br/>
-        <w:t>│   ├── Video Detail</w:t>
-        <w:br/>
-        <w:t>│   ├── Like / Unlike Video</w:t>
-        <w:br/>
-        <w:t>│   └── Delete Video</w:t>
-        <w:br/>
-        <w:t>├── 5. Chat</w:t>
-        <w:br/>
-        <w:t>│   ├── Start Conversation ← Tests script saves conversation_id</w:t>
-        <w:br/>
-        <w:t>│   ├── List Conversations (Inbox)</w:t>
-        <w:br/>
-        <w:t>│   ├── Message History</w:t>
-        <w:br/>
-        <w:t>│   ├── Mark as Read</w:t>
-        <w:br/>
-        <w:t>│   └── [WebSocket] Connect + Send  (use Postman WS tab or wscat)</w:t>
-        <w:br/>
-        <w:t>├── 6. Blacklist</w:t>
-        <w:br/>
-        <w:t>│   ├── Block Customer  (vendor token + store_id + customer_id)</w:t>
-        <w:br/>
-        <w:t>│   ├── List Blocked Customers  (vendor token + store_id)</w:t>
-        <w:br/>
-        <w:t>│   └── Unblock Customer  (same endpoint as Block — toggle)</w:t>
-        <w:br/>
-        <w:t>└── 7. Billing</w:t>
-        <w:br/>
-        <w:t xml:space="preserve">    ├── List Plans  (no auth required)</w:t>
-        <w:br/>
-        <w:t xml:space="preserve">    ├── Wallet Balance  (vendor token)</w:t>
-        <w:br/>
-        <w:t xml:space="preserve">    ├── Top Up Wallet  (vendor token + {"amount": "1000.00"})</w:t>
-        <w:br/>
-        <w:t xml:space="preserve">    ├── Subscribe to Plan  (vendor token + {"plan_name": "basic"})</w:t>
-        <w:br/>
-        <w:t xml:space="preserve">    ├── Subscription Status  (vendor token)</w:t>
-        <w:br/>
-        <w:t xml:space="preserve">    └── Transaction History  (vendor token)</w:t>
-      </w:r>
-    </w:p>
-    <w:p>
-      <w:pPr>
-        <w:pStyle w:val="Heading2"/>
-      </w:pPr>
-      <w:r>
-        <w:t>Auto-Save Token Script  (paste in Tests tab of Verify OTP request)</w:t>
-      </w:r>
-    </w:p>
-    <w:p>
-      <w:pPr>
-        <w:spacing w:before="40" w:after="40"/>
-        <w:ind w:left="288"/>
-        <w:shd w:val="clear" w:color="auto" w:fill="F0F0F0"/>
-      </w:pPr>
-      <w:r>
-        <w:rPr>
-          <w:rFonts w:ascii="Courier New" w:hAnsi="Courier New"/>
-          <w:color w:val="1A1A8C"/>
-          <w:sz w:val="18"/>
-        </w:rPr>
-        <w:t>// For VENDOR verify OTP request:</w:t>
-        <w:br/>
-        <w:t>const r = pm.response.json();</w:t>
-        <w:br/>
-        <w:t>if (r.access) {</w:t>
-        <w:br/>
-        <w:t xml:space="preserve">    pm.environment.set("vendor_token", r.access);</w:t>
-        <w:br/>
-        <w:t xml:space="preserve">    pm.environment.set("vendor_refresh", r.refresh);</w:t>
-        <w:br/>
-        <w:t xml:space="preserve">    console.log("Vendor token saved:", r.access.substring(0, 30) + "...");</w:t>
-        <w:br/>
-        <w:t>}</w:t>
-        <w:br/>
-        <w:br/>
-        <w:t>// For CUSTOMER verify OTP request — use this instead:</w:t>
-        <w:br/>
-        <w:t>// pm.environment.set("customer_token", r.access);</w:t>
-        <w:br/>
-        <w:t>// pm.environment.set("customer_refresh", r.refresh);</w:t>
-      </w:r>
-    </w:p>
-    <w:p>
-      <w:pPr>
-        <w:pStyle w:val="Heading2"/>
-      </w:pPr>
-      <w:r>
-        <w:t>Auto-Save Store ID  (paste in Tests tab of Create Store request)</w:t>
-      </w:r>
-    </w:p>
-    <w:p>
-      <w:pPr>
-        <w:spacing w:before="40" w:after="40"/>
-        <w:ind w:left="288"/>
-        <w:shd w:val="clear" w:color="auto" w:fill="F0F0F0"/>
-      </w:pPr>
-      <w:r>
-        <w:rPr>
-          <w:rFonts w:ascii="Courier New" w:hAnsi="Courier New"/>
-          <w:color w:val="1A1A8C"/>
-          <w:sz w:val="18"/>
-        </w:rPr>
-        <w:t>const r = pm.response.json();</w:t>
-        <w:br/>
-        <w:t>if (r.id) {</w:t>
-        <w:br/>
-        <w:t xml:space="preserve">    pm.environment.set("store_id", r.id);</w:t>
-        <w:br/>
-        <w:t xml:space="preserve">    console.log("store_id saved:", r.id);</w:t>
-        <w:br/>
-        <w:t>}</w:t>
-      </w:r>
-    </w:p>
-    <w:p>
-      <w:pPr>
-        <w:pStyle w:val="Heading2"/>
-      </w:pPr>
-      <w:r>
-        <w:t>Auto-Save Product ID  (paste in Tests tab of Create Product request)</w:t>
-      </w:r>
-    </w:p>
-    <w:p>
-      <w:pPr>
-        <w:spacing w:before="40" w:after="40"/>
-        <w:ind w:left="288"/>
-        <w:shd w:val="clear" w:color="auto" w:fill="F0F0F0"/>
-      </w:pPr>
-      <w:r>
-        <w:rPr>
-          <w:rFonts w:ascii="Courier New" w:hAnsi="Courier New"/>
-          <w:color w:val="1A1A8C"/>
-          <w:sz w:val="18"/>
-        </w:rPr>
-        <w:t>const r = pm.response.json();</w:t>
-        <w:br/>
-        <w:t>if (r.id) {</w:t>
-        <w:br/>
-        <w:t xml:space="preserve">    pm.environment.set("product_id", r.id);</w:t>
-        <w:br/>
-        <w:t xml:space="preserve">    console.log("product_id saved:", r.id);</w:t>
-        <w:br/>
-        <w:t>}</w:t>
-      </w:r>
-    </w:p>
-    <w:p>
-      <w:pPr>
-        <w:pStyle w:val="Heading2"/>
-      </w:pPr>
-      <w:r>
-        <w:t>Auto-Save Video ID  (paste in Tests tab of Request Upload URL request)</w:t>
-      </w:r>
-    </w:p>
-    <w:p>
-      <w:pPr>
-        <w:spacing w:before="40" w:after="40"/>
-        <w:ind w:left="288"/>
-        <w:shd w:val="clear" w:color="auto" w:fill="F0F0F0"/>
-      </w:pPr>
-      <w:r>
-        <w:rPr>
-          <w:rFonts w:ascii="Courier New" w:hAnsi="Courier New"/>
-          <w:color w:val="1A1A8C"/>
-          <w:sz w:val="18"/>
-        </w:rPr>
-        <w:t>const r = pm.response.json();</w:t>
-        <w:br/>
-        <w:t>if (r.video_id) {</w:t>
-        <w:br/>
-        <w:t xml:space="preserve">    pm.environment.set("video_id", r.video_id);</w:t>
-        <w:br/>
-        <w:t xml:space="preserve">    pm.environment.set("upload_url", r.upload_url);</w:t>
-        <w:br/>
-        <w:t xml:space="preserve">    console.log("video_id saved:", r.video_id);</w:t>
-        <w:br/>
-        <w:t>}</w:t>
-      </w:r>
-    </w:p>
-    <w:p>
-      <w:pPr>
-        <w:pStyle w:val="Heading2"/>
-      </w:pPr>
-      <w:r>
-        <w:t>Auto-Save Conversation ID  (paste in Tests tab of Start Conversation request)</w:t>
-      </w:r>
-    </w:p>
-    <w:p>
-      <w:pPr>
-        <w:spacing w:before="40" w:after="40"/>
-        <w:ind w:left="288"/>
-        <w:shd w:val="clear" w:color="auto" w:fill="F0F0F0"/>
-      </w:pPr>
-      <w:r>
-        <w:rPr>
-          <w:rFonts w:ascii="Courier New" w:hAnsi="Courier New"/>
-          <w:color w:val="1A1A8C"/>
-          <w:sz w:val="18"/>
-        </w:rPr>
-        <w:t>const r = pm.response.json();</w:t>
-        <w:br/>
-        <w:t>if (r.id) {</w:t>
-        <w:br/>
-        <w:t xml:space="preserve">    pm.environment.set("conversation_id", r.id);</w:t>
-        <w:br/>
-        <w:t xml:space="preserve">    console.log("conversation_id saved:", r.id);</w:t>
-        <w:br/>
-        <w:t>}</w:t>
-      </w:r>
-    </w:p>
-    <w:p>
-      <w:pPr>
-        <w:pStyle w:val="Heading2"/>
-      </w:pPr>
-      <w:r>
-        <w:t>Auto-Save Customer ID  (paste in Tests tab of Verify OTP Customer request)</w:t>
-      </w:r>
-    </w:p>
-    <w:p>
-      <w:pPr>
-        <w:spacing w:before="40" w:after="40"/>
-        <w:ind w:left="288"/>
-        <w:shd w:val="clear" w:color="auto" w:fill="F0F0F0"/>
-      </w:pPr>
-      <w:r>
-        <w:rPr>
-          <w:rFonts w:ascii="Courier New" w:hAnsi="Courier New"/>
-          <w:color w:val="1A1A8C"/>
-          <w:sz w:val="18"/>
-        </w:rPr>
-        <w:t>// Add this to the existing customer verify OTP Tests script:</w:t>
-        <w:br/>
-        <w:t>const r = pm.response.json();</w:t>
-        <w:br/>
-        <w:t>if (r.user &amp;&amp; r.user.id) {</w:t>
-        <w:br/>
-        <w:t xml:space="preserve">    pm.environment.set("customer_id", r.user.id);</w:t>
-        <w:br/>
-        <w:t xml:space="preserve">    console.log("customer_id saved:", r.user.id);</w:t>
-        <w:br/>
-        <w:t>}</w:t>
-      </w:r>
-    </w:p>
-    <w:p>
-      <w:pPr>
-        <w:ind w:left="288"/>
-        <w:shd w:val="clear" w:color="auto" w:fill="D1ECF1"/>
-      </w:pPr>
-      <w:r>
-        <w:rPr>
-          <w:i/>
-          <w:color w:val="0C5460"/>
-          <w:sz w:val="20"/>
-        </w:rPr>
-        <w:t xml:space="preserve">  💡  customer_id is needed for Sprint 6 blacklist endpoint:</w:t>
-        <w:br/>
-        <w:t xml:space="preserve">  POST /stores/{{store_id}}/blacklist/{{customer_id}}/</w:t>
-      </w:r>
-    </w:p>
-    <w:p>
-      <w:pPr>
-        <w:pStyle w:val="Heading2"/>
-      </w:pPr>
-      <w:r>
-        <w:t>Quick Test — All Public Endpoints via curl</w:t>
-      </w:r>
-    </w:p>
-    <w:p>
-      <w:r>
-        <w:rPr>
-          <w:b w:val="0"/>
-          <w:sz w:val="22"/>
-        </w:rPr>
-        <w:t>Copy-paste these into terminal to test without Postman:</w:t>
-      </w:r>
-    </w:p>
-    <w:p>
-      <w:pPr>
-        <w:spacing w:before="40" w:after="40"/>
-        <w:ind w:left="288"/>
-        <w:shd w:val="clear" w:color="auto" w:fill="F0F0F0"/>
-      </w:pPr>
-      <w:r>
-        <w:rPr>
-          <w:rFonts w:ascii="Courier New" w:hAnsi="Courier New"/>
-          <w:color w:val="1A1A8C"/>
-          <w:sz w:val="18"/>
-        </w:rPr>
-        <w:t># Health check</w:t>
-        <w:br/>
-        <w:t>curl -s http://localhost:8000/api/v1/health/ | python3 -m json.tool</w:t>
-        <w:br/>
-        <w:br/>
-        <w:t># Send OTP</w:t>
-        <w:br/>
-        <w:t>curl -s -X POST http://localhost:8000/api/v1/auth/otp/send/ \</w:t>
-        <w:br/>
-        <w:t xml:space="preserve">  -H "Content-Type: application/json" \</w:t>
-        <w:br/>
-        <w:t xml:space="preserve">  -d '{"phone_number": "+919999999999"}'</w:t>
-        <w:br/>
-        <w:br/>
-        <w:t># Verify OTP (copy access token from response)</w:t>
-        <w:br/>
-        <w:t>curl -s -X POST http://localhost:8000/api/v1/auth/otp/verify/ \</w:t>
-        <w:br/>
-        <w:t xml:space="preserve">  -H "Content-Type: application/json" \</w:t>
-        <w:br/>
-        <w:t xml:space="preserve">  -d '{"phone_number": "+919999999999", "otp": "123456"}'</w:t>
-        <w:br/>
-        <w:br/>
-        <w:t># Get profile (replace TOKEN with your access token)</w:t>
-        <w:br/>
-        <w:t>curl -s http://localhost:8000/api/v1/auth/me/ \</w:t>
-        <w:br/>
-        <w:t xml:space="preserve">  -H "Authorization: Bearer TOKEN"</w:t>
-      </w:r>
-    </w:p>
-    <w:p>
-      <w:r>
-        <w:br w:type="page"/>
-      </w:r>
-    </w:p>
-    <w:p>
-      <w:pPr>
-        <w:pStyle w:val="Heading1"/>
-      </w:pPr>
-      <w:r>
-        <w:t>6. How to Update This Document (Future Sprints)</w:t>
-      </w:r>
-    </w:p>
-    <w:p>
-      <w:pPr>
-        <w:ind w:left="288"/>
-        <w:shd w:val="clear" w:color="auto" w:fill="D1ECF1"/>
-      </w:pPr>
-      <w:r>
-        <w:rPr>
-          <w:i/>
-          <w:color w:val="0C5460"/>
-          <w:sz w:val="20"/>
-        </w:rPr>
-        <w:t xml:space="preserve">  📌  IMPORTANT: When a new sprint adds new API endpoints, update this document.</w:t>
-        <w:br/>
-        <w:t xml:space="preserve">     Do NOT create a separate doc — keep everything in this single file.</w:t>
-      </w:r>
-    </w:p>
-    <w:p/>
-    <w:p>
-      <w:pPr>
-        <w:pStyle w:val="Heading2"/>
-      </w:pPr>
-      <w:r>
-        <w:t>Checklist for each new sprint:</w:t>
-      </w:r>
-    </w:p>
-    <w:p>
-      <w:pPr>
-        <w:pStyle w:val="ListBullet"/>
-        <w:ind w:left="432"/>
-      </w:pPr>
-      <w:r>
-        <w:rPr>
-          <w:sz w:val="21"/>
-        </w:rPr>
-        <w:t>Add new endpoint rows to Section 2 — Complete API Reference table</w:t>
-      </w:r>
-    </w:p>
-    <w:p>
-      <w:pPr>
-        <w:pStyle w:val="ListBullet"/>
-        <w:ind w:left="432"/>
-      </w:pPr>
-      <w:r>
-        <w:rPr>
-          <w:sz w:val="21"/>
-        </w:rPr>
-        <w:t>Add new STEP sections in Section 3 — Step-by-Step Test Flow</w:t>
-      </w:r>
-    </w:p>
-    <w:p>
-      <w:pPr>
-        <w:pStyle w:val="ListBullet"/>
-        <w:ind w:left="432"/>
-      </w:pPr>
-      <w:r>
-        <w:rPr>
-          <w:sz w:val="21"/>
-        </w:rPr>
-        <w:t>Add new error cases in Section 4 — Error Cases to Test</w:t>
-      </w:r>
-    </w:p>
-    <w:p>
-      <w:pPr>
-        <w:pStyle w:val="ListBullet"/>
-        <w:ind w:left="432"/>
-      </w:pPr>
-      <w:r>
-        <w:rPr>
-          <w:sz w:val="21"/>
-        </w:rPr>
-        <w:t>Add new Postman folder in Section 5 — Postman Quick Setup</w:t>
-      </w:r>
-    </w:p>
-    <w:p>
-      <w:pPr>
-        <w:pStyle w:val="ListBullet"/>
-        <w:ind w:left="432"/>
-      </w:pPr>
-      <w:r>
-        <w:rPr>
-          <w:sz w:val="21"/>
-        </w:rPr>
-        <w:t>Update the cover page "Last updated" date and sprint range</w:t>
-      </w:r>
-    </w:p>
-    <w:p>
-      <w:pPr>
-        <w:pStyle w:val="ListBullet"/>
-        <w:ind w:left="432"/>
-      </w:pPr>
-      <w:r>
-        <w:rPr>
-          <w:sz w:val="21"/>
-        </w:rPr>
-        <w:t>If new field types are introduced (e.g. file uploads), add a format rules subsection in Section 1</w:t>
-      </w:r>
-    </w:p>
-    <w:p>
-      <w:pPr>
-        <w:pStyle w:val="Heading2"/>
-      </w:pPr>
-      <w:r>
-        <w:t>Upcoming Sprints to Add Here</w:t>
+        <w:t>Video Error Cases  (Sprint 4)</w:t>
       </w:r>
     </w:p>
     <w:tbl>
@@ -19209,7 +20074,7 @@
       <w:tr>
         <w:tc>
           <w:tcPr>
-            <w:tcW w:type="dxa" w:w="1152"/>
+            <w:tcW w:type="dxa" w:w="2880"/>
             <w:shd w:val="clear" w:color="auto" w:fill="1F4E79"/>
           </w:tcPr>
           <w:p>
@@ -19219,13 +20084,13 @@
                 <w:color w:val="FFFFFF"/>
                 <w:sz w:val="20"/>
               </w:rPr>
-              <w:t>Sprint</w:t>
-            </w:r>
-          </w:p>
-        </w:tc>
-        <w:tc>
-          <w:tcPr>
-            <w:tcW w:type="dxa" w:w="2160"/>
+              <w:t>Test</w:t>
+            </w:r>
+          </w:p>
+        </w:tc>
+        <w:tc>
+          <w:tcPr>
+            <w:tcW w:type="dxa" w:w="3456"/>
             <w:shd w:val="clear" w:color="auto" w:fill="1F4E79"/>
           </w:tcPr>
           <w:p>
@@ -19235,13 +20100,13 @@
                 <w:color w:val="FFFFFF"/>
                 <w:sz w:val="20"/>
               </w:rPr>
-              <w:t>Module</w:t>
-            </w:r>
-          </w:p>
-        </w:tc>
-        <w:tc>
-          <w:tcPr>
-            <w:tcW w:type="dxa" w:w="6048"/>
+              <w:t>Request</w:t>
+            </w:r>
+          </w:p>
+        </w:tc>
+        <w:tc>
+          <w:tcPr>
+            <w:tcW w:type="dxa" w:w="3168"/>
             <w:shd w:val="clear" w:color="auto" w:fill="1F4E79"/>
           </w:tcPr>
           <w:p>
@@ -19251,7 +20116,7 @@
                 <w:color w:val="FFFFFF"/>
                 <w:sz w:val="20"/>
               </w:rPr>
-              <w:t>APIs to Add</w:t>
+              <w:t>Expected Response</w:t>
             </w:r>
           </w:p>
         </w:tc>
@@ -19259,6 +20124,1136 @@
       <w:tr>
         <w:tc>
           <w:tcPr>
+            <w:tcW w:type="dxa" w:w="2880"/>
+            <w:shd w:val="clear" w:color="auto" w:fill="DEEAF1"/>
+          </w:tcPr>
+          <w:p>
+            <w:r>
+              <w:rPr>
+                <w:sz w:val="19"/>
+              </w:rPr>
+              <w:t>No store — request upload</w:t>
+            </w:r>
+          </w:p>
+        </w:tc>
+        <w:tc>
+          <w:tcPr>
+            <w:tcW w:type="dxa" w:w="3456"/>
+            <w:shd w:val="clear" w:color="auto" w:fill="DEEAF1"/>
+          </w:tcPr>
+          <w:p>
+            <w:r>
+              <w:rPr>
+                <w:sz w:val="19"/>
+              </w:rPr>
+              <w:t>POST /videos/request-upload/ before store created</w:t>
+            </w:r>
+          </w:p>
+        </w:tc>
+        <w:tc>
+          <w:tcPr>
+            <w:tcW w:type="dxa" w:w="3168"/>
+            <w:shd w:val="clear" w:color="auto" w:fill="DEEAF1"/>
+          </w:tcPr>
+          <w:p>
+            <w:r>
+              <w:rPr>
+                <w:sz w:val="19"/>
+              </w:rPr>
+              <w:t>400 — Create a store first</w:t>
+            </w:r>
+          </w:p>
+        </w:tc>
+      </w:tr>
+      <w:tr>
+        <w:tc>
+          <w:tcPr>
+            <w:tcW w:type="dxa" w:w="2880"/>
+          </w:tcPr>
+          <w:p>
+            <w:r>
+              <w:rPr>
+                <w:sz w:val="19"/>
+              </w:rPr>
+              <w:t>Missing title</w:t>
+            </w:r>
+          </w:p>
+        </w:tc>
+        <w:tc>
+          <w:tcPr>
+            <w:tcW w:type="dxa" w:w="3456"/>
+          </w:tcPr>
+          <w:p>
+            <w:r>
+              <w:rPr>
+                <w:sz w:val="19"/>
+              </w:rPr>
+              <w:t>POST /videos/request-upload/ with no title field</w:t>
+            </w:r>
+          </w:p>
+        </w:tc>
+        <w:tc>
+          <w:tcPr>
+            <w:tcW w:type="dxa" w:w="3168"/>
+          </w:tcPr>
+          <w:p>
+            <w:r>
+              <w:rPr>
+                <w:sz w:val="19"/>
+              </w:rPr>
+              <w:t>400 — This field is required</w:t>
+            </w:r>
+          </w:p>
+        </w:tc>
+      </w:tr>
+      <w:tr>
+        <w:tc>
+          <w:tcPr>
+            <w:tcW w:type="dxa" w:w="2880"/>
+            <w:shd w:val="clear" w:color="auto" w:fill="DEEAF1"/>
+          </w:tcPr>
+          <w:p>
+            <w:r>
+              <w:rPr>
+                <w:sz w:val="19"/>
+              </w:rPr>
+              <w:t>Customer calls request-upload</w:t>
+            </w:r>
+          </w:p>
+        </w:tc>
+        <w:tc>
+          <w:tcPr>
+            <w:tcW w:type="dxa" w:w="3456"/>
+            <w:shd w:val="clear" w:color="auto" w:fill="DEEAF1"/>
+          </w:tcPr>
+          <w:p>
+            <w:r>
+              <w:rPr>
+                <w:sz w:val="19"/>
+              </w:rPr>
+              <w:t>POST /videos/request-upload/ with customer token</w:t>
+            </w:r>
+          </w:p>
+        </w:tc>
+        <w:tc>
+          <w:tcPr>
+            <w:tcW w:type="dxa" w:w="3168"/>
+            <w:shd w:val="clear" w:color="auto" w:fill="DEEAF1"/>
+          </w:tcPr>
+          <w:p>
+            <w:r>
+              <w:rPr>
+                <w:sz w:val="19"/>
+              </w:rPr>
+              <w:t>403 — Vendor access only</w:t>
+            </w:r>
+          </w:p>
+        </w:tc>
+      </w:tr>
+      <w:tr>
+        <w:tc>
+          <w:tcPr>
+            <w:tcW w:type="dxa" w:w="2880"/>
+          </w:tcPr>
+          <w:p>
+            <w:r>
+              <w:rPr>
+                <w:sz w:val="19"/>
+              </w:rPr>
+              <w:t>Confirm already-ready video</w:t>
+            </w:r>
+          </w:p>
+        </w:tc>
+        <w:tc>
+          <w:tcPr>
+            <w:tcW w:type="dxa" w:w="3456"/>
+          </w:tcPr>
+          <w:p>
+            <w:r>
+              <w:rPr>
+                <w:sz w:val="19"/>
+              </w:rPr>
+              <w:t>POST /videos/&lt;id&gt;/confirm-upload/ on ready video</w:t>
+            </w:r>
+          </w:p>
+        </w:tc>
+        <w:tc>
+          <w:tcPr>
+            <w:tcW w:type="dxa" w:w="3168"/>
+          </w:tcPr>
+          <w:p>
+            <w:r>
+              <w:rPr>
+                <w:sz w:val="19"/>
+              </w:rPr>
+              <w:t>400 — Video already in "ready" state</w:t>
+            </w:r>
+          </w:p>
+        </w:tc>
+      </w:tr>
+      <w:tr>
+        <w:tc>
+          <w:tcPr>
+            <w:tcW w:type="dxa" w:w="2880"/>
+            <w:shd w:val="clear" w:color="auto" w:fill="DEEAF1"/>
+          </w:tcPr>
+          <w:p>
+            <w:r>
+              <w:rPr>
+                <w:sz w:val="19"/>
+              </w:rPr>
+              <w:t>Duration too long</w:t>
+            </w:r>
+          </w:p>
+        </w:tc>
+        <w:tc>
+          <w:tcPr>
+            <w:tcW w:type="dxa" w:w="3456"/>
+            <w:shd w:val="clear" w:color="auto" w:fill="DEEAF1"/>
+          </w:tcPr>
+          <w:p>
+            <w:r>
+              <w:rPr>
+                <w:sz w:val="19"/>
+              </w:rPr>
+              <w:t>POST /videos/&lt;id&gt;/confirm-upload/ — duration_seconds=120</w:t>
+            </w:r>
+          </w:p>
+        </w:tc>
+        <w:tc>
+          <w:tcPr>
+            <w:tcW w:type="dxa" w:w="3168"/>
+            <w:shd w:val="clear" w:color="auto" w:fill="DEEAF1"/>
+          </w:tcPr>
+          <w:p>
+            <w:r>
+              <w:rPr>
+                <w:sz w:val="19"/>
+              </w:rPr>
+              <w:t>400 — cannot exceed 60 seconds</w:t>
+            </w:r>
+          </w:p>
+        </w:tc>
+      </w:tr>
+      <w:tr>
+        <w:tc>
+          <w:tcPr>
+            <w:tcW w:type="dxa" w:w="2880"/>
+          </w:tcPr>
+          <w:p>
+            <w:r>
+              <w:rPr>
+                <w:sz w:val="19"/>
+              </w:rPr>
+              <w:t>Confirm another vendor video</w:t>
+            </w:r>
+          </w:p>
+        </w:tc>
+        <w:tc>
+          <w:tcPr>
+            <w:tcW w:type="dxa" w:w="3456"/>
+          </w:tcPr>
+          <w:p>
+            <w:r>
+              <w:rPr>
+                <w:sz w:val="19"/>
+              </w:rPr>
+              <w:t>POST /videos/&lt;id&gt;/confirm-upload/ — wrong vendor</w:t>
+            </w:r>
+          </w:p>
+        </w:tc>
+        <w:tc>
+          <w:tcPr>
+            <w:tcW w:type="dxa" w:w="3168"/>
+          </w:tcPr>
+          <w:p>
+            <w:r>
+              <w:rPr>
+                <w:sz w:val="19"/>
+              </w:rPr>
+              <w:t>404 — not_found</w:t>
+            </w:r>
+          </w:p>
+        </w:tc>
+      </w:tr>
+      <w:tr>
+        <w:tc>
+          <w:tcPr>
+            <w:tcW w:type="dxa" w:w="2880"/>
+            <w:shd w:val="clear" w:color="auto" w:fill="DEEAF1"/>
+          </w:tcPr>
+          <w:p>
+            <w:r>
+              <w:rPr>
+                <w:sz w:val="19"/>
+              </w:rPr>
+              <w:t>Feed without lat/lng</w:t>
+            </w:r>
+          </w:p>
+        </w:tc>
+        <w:tc>
+          <w:tcPr>
+            <w:tcW w:type="dxa" w:w="3456"/>
+            <w:shd w:val="clear" w:color="auto" w:fill="DEEAF1"/>
+          </w:tcPr>
+          <w:p>
+            <w:r>
+              <w:rPr>
+                <w:sz w:val="19"/>
+              </w:rPr>
+              <w:t>GET /videos/feed/ — no ?lat=&amp;lng= params</w:t>
+            </w:r>
+          </w:p>
+        </w:tc>
+        <w:tc>
+          <w:tcPr>
+            <w:tcW w:type="dxa" w:w="3168"/>
+            <w:shd w:val="clear" w:color="auto" w:fill="DEEAF1"/>
+          </w:tcPr>
+          <w:p>
+            <w:r>
+              <w:rPr>
+                <w:sz w:val="19"/>
+              </w:rPr>
+              <w:t>400 — lat and lng are required numbers</w:t>
+            </w:r>
+          </w:p>
+        </w:tc>
+      </w:tr>
+      <w:tr>
+        <w:tc>
+          <w:tcPr>
+            <w:tcW w:type="dxa" w:w="2880"/>
+          </w:tcPr>
+          <w:p>
+            <w:r>
+              <w:rPr>
+                <w:sz w:val="19"/>
+              </w:rPr>
+              <w:t>Detail on processing video</w:t>
+            </w:r>
+          </w:p>
+        </w:tc>
+        <w:tc>
+          <w:tcPr>
+            <w:tcW w:type="dxa" w:w="3456"/>
+          </w:tcPr>
+          <w:p>
+            <w:r>
+              <w:rPr>
+                <w:sz w:val="19"/>
+              </w:rPr>
+              <w:t>GET /videos/&lt;id&gt;/ while status=processing</w:t>
+            </w:r>
+          </w:p>
+        </w:tc>
+        <w:tc>
+          <w:tcPr>
+            <w:tcW w:type="dxa" w:w="3168"/>
+          </w:tcPr>
+          <w:p>
+            <w:r>
+              <w:rPr>
+                <w:sz w:val="19"/>
+              </w:rPr>
+              <w:t>404 — not_found (only ready shown)</w:t>
+            </w:r>
+          </w:p>
+        </w:tc>
+      </w:tr>
+      <w:tr>
+        <w:tc>
+          <w:tcPr>
+            <w:tcW w:type="dxa" w:w="2880"/>
+            <w:shd w:val="clear" w:color="auto" w:fill="DEEAF1"/>
+          </w:tcPr>
+          <w:p>
+            <w:r>
+              <w:rPr>
+                <w:sz w:val="19"/>
+              </w:rPr>
+              <w:t>Like without auth</w:t>
+            </w:r>
+          </w:p>
+        </w:tc>
+        <w:tc>
+          <w:tcPr>
+            <w:tcW w:type="dxa" w:w="3456"/>
+            <w:shd w:val="clear" w:color="auto" w:fill="DEEAF1"/>
+          </w:tcPr>
+          <w:p>
+            <w:r>
+              <w:rPr>
+                <w:sz w:val="19"/>
+              </w:rPr>
+              <w:t>POST /videos/&lt;id&gt;/like/ — no auth header</w:t>
+            </w:r>
+          </w:p>
+        </w:tc>
+        <w:tc>
+          <w:tcPr>
+            <w:tcW w:type="dxa" w:w="3168"/>
+            <w:shd w:val="clear" w:color="auto" w:fill="DEEAF1"/>
+          </w:tcPr>
+          <w:p>
+            <w:r>
+              <w:rPr>
+                <w:sz w:val="19"/>
+              </w:rPr>
+              <w:t>401 — authentication_failed</w:t>
+            </w:r>
+          </w:p>
+        </w:tc>
+      </w:tr>
+      <w:tr>
+        <w:tc>
+          <w:tcPr>
+            <w:tcW w:type="dxa" w:w="2880"/>
+          </w:tcPr>
+          <w:p>
+            <w:r>
+              <w:rPr>
+                <w:sz w:val="19"/>
+              </w:rPr>
+              <w:t>Update another vendor video</w:t>
+            </w:r>
+          </w:p>
+        </w:tc>
+        <w:tc>
+          <w:tcPr>
+            <w:tcW w:type="dxa" w:w="3456"/>
+          </w:tcPr>
+          <w:p>
+            <w:r>
+              <w:rPr>
+                <w:sz w:val="19"/>
+              </w:rPr>
+              <w:t>PATCH /videos/&lt;id&gt;/update/ — different vendor token</w:t>
+            </w:r>
+          </w:p>
+        </w:tc>
+        <w:tc>
+          <w:tcPr>
+            <w:tcW w:type="dxa" w:w="3168"/>
+          </w:tcPr>
+          <w:p>
+            <w:r>
+              <w:rPr>
+                <w:sz w:val="19"/>
+              </w:rPr>
+              <w:t>404 — not_found</w:t>
+            </w:r>
+          </w:p>
+        </w:tc>
+      </w:tr>
+      <w:tr>
+        <w:tc>
+          <w:tcPr>
+            <w:tcW w:type="dxa" w:w="2880"/>
+            <w:shd w:val="clear" w:color="auto" w:fill="DEEAF1"/>
+          </w:tcPr>
+          <w:p>
+            <w:r>
+              <w:rPr>
+                <w:sz w:val="19"/>
+              </w:rPr>
+              <w:t>Delete another vendor video</w:t>
+            </w:r>
+          </w:p>
+        </w:tc>
+        <w:tc>
+          <w:tcPr>
+            <w:tcW w:type="dxa" w:w="3456"/>
+            <w:shd w:val="clear" w:color="auto" w:fill="DEEAF1"/>
+          </w:tcPr>
+          <w:p>
+            <w:r>
+              <w:rPr>
+                <w:sz w:val="19"/>
+              </w:rPr>
+              <w:t>DELETE /videos/&lt;id&gt;/delete/ — different vendor</w:t>
+            </w:r>
+          </w:p>
+        </w:tc>
+        <w:tc>
+          <w:tcPr>
+            <w:tcW w:type="dxa" w:w="3168"/>
+            <w:shd w:val="clear" w:color="auto" w:fill="DEEAF1"/>
+          </w:tcPr>
+          <w:p>
+            <w:r>
+              <w:rPr>
+                <w:sz w:val="19"/>
+              </w:rPr>
+              <w:t>404 — not_found</w:t>
+            </w:r>
+          </w:p>
+        </w:tc>
+      </w:tr>
+      <w:tr>
+        <w:tc>
+          <w:tcPr>
+            <w:tcW w:type="dxa" w:w="2880"/>
+          </w:tcPr>
+          <w:p>
+            <w:r>
+              <w:rPr>
+                <w:sz w:val="19"/>
+              </w:rPr>
+              <w:t>Delete with customer token</w:t>
+            </w:r>
+          </w:p>
+        </w:tc>
+        <w:tc>
+          <w:tcPr>
+            <w:tcW w:type="dxa" w:w="3456"/>
+          </w:tcPr>
+          <w:p>
+            <w:r>
+              <w:rPr>
+                <w:sz w:val="19"/>
+              </w:rPr>
+              <w:t>DELETE /videos/&lt;id&gt;/delete/ — customer token</w:t>
+            </w:r>
+          </w:p>
+        </w:tc>
+        <w:tc>
+          <w:tcPr>
+            <w:tcW w:type="dxa" w:w="3168"/>
+          </w:tcPr>
+          <w:p>
+            <w:r>
+              <w:rPr>
+                <w:sz w:val="19"/>
+              </w:rPr>
+              <w:t>403 — Vendor access only</w:t>
+            </w:r>
+          </w:p>
+        </w:tc>
+      </w:tr>
+    </w:tbl>
+    <w:p/>
+    <w:p>
+      <w:r>
+        <w:br w:type="page"/>
+      </w:r>
+    </w:p>
+    <w:p>
+      <w:pPr>
+        <w:pStyle w:val="Heading1"/>
+      </w:pPr>
+      <w:r>
+        <w:t>5. Postman Quick Setup</w:t>
+      </w:r>
+    </w:p>
+    <w:p>
+      <w:pPr>
+        <w:pStyle w:val="Heading2"/>
+      </w:pPr>
+      <w:r>
+        <w:t>Collection Folder Structure (recommended)</w:t>
+      </w:r>
+    </w:p>
+    <w:p>
+      <w:pPr>
+        <w:spacing w:before="40" w:after="40"/>
+        <w:ind w:left="288"/>
+        <w:shd w:val="clear" w:color="auto" w:fill="F0F0F0"/>
+      </w:pPr>
+      <w:r>
+        <w:rPr>
+          <w:rFonts w:ascii="Courier New" w:hAnsi="Courier New"/>
+          <w:color w:val="1A1A8C"/>
+          <w:sz w:val="18"/>
+        </w:rPr>
+        <w:t>NearKart Local</w:t>
+        <w:br/>
+        <w:t>├── 0. Setup</w:t>
+        <w:br/>
+        <w:t>│   └── Health Check</w:t>
+        <w:br/>
+        <w:t>├── 1. Auth</w:t>
+        <w:br/>
+        <w:t>│   ├── Send OTP (Vendor)</w:t>
+        <w:br/>
+        <w:t>│   ├── Verify OTP (Vendor) ← Tests script saves vendor_token</w:t>
+        <w:br/>
+        <w:t>│   ├── Send OTP (Customer)</w:t>
+        <w:br/>
+        <w:t>│   ├── Verify OTP (Customer) ← Tests script saves customer_token + customer_id</w:t>
+        <w:br/>
+        <w:t>│   ├── Get Profile</w:t>
+        <w:br/>
+        <w:t>│   ├── Update Profile</w:t>
+        <w:br/>
+        <w:t>│   ├── Update Location</w:t>
+        <w:br/>
+        <w:t>│   ├── Refresh Token</w:t>
+        <w:br/>
+        <w:t>│   └── Logout</w:t>
+        <w:br/>
+        <w:t>├── 2. Stores</w:t>
+        <w:br/>
+        <w:t>│   ├── Create Store ← Tests script saves store_id</w:t>
+        <w:br/>
+        <w:t>│   ├── Nearby Stores</w:t>
+        <w:br/>
+        <w:t>│   ├── Store Detail</w:t>
+        <w:br/>
+        <w:t>│   ├── Update Store</w:t>
+        <w:br/>
+        <w:t>│   ├── Follow Store</w:t>
+        <w:br/>
+        <w:t>│   ├── Review Store</w:t>
+        <w:br/>
+        <w:t>│   └── QR Code</w:t>
+        <w:br/>
+        <w:t>├── 3. Products</w:t>
+        <w:br/>
+        <w:t>│   ├── Create Product ← Tests script saves product_id</w:t>
+        <w:br/>
+        <w:t>│   ├── Nearby Products</w:t>
+        <w:br/>
+        <w:t>│   ├── Search Products</w:t>
+        <w:br/>
+        <w:t>│   ├── Product Detail</w:t>
+        <w:br/>
+        <w:t>│   ├── Update Product</w:t>
+        <w:br/>
+        <w:t>│   ├── Delete Product</w:t>
+        <w:br/>
+        <w:t>│   └── Wishlist Toggle</w:t>
+        <w:br/>
+        <w:t>├── 4. Videos</w:t>
+        <w:br/>
+        <w:t>│   ├── Request Upload URL ← Tests script saves video_id</w:t>
+        <w:br/>
+        <w:t>│   ├── Confirm Upload</w:t>
+        <w:br/>
+        <w:t>│   ├── My Videos (Vendor Library)</w:t>
+        <w:br/>
+        <w:t>│   ├── Update Video</w:t>
+        <w:br/>
+        <w:t>│   ├── Video Feed</w:t>
+        <w:br/>
+        <w:t>│   ├── Video Detail</w:t>
+        <w:br/>
+        <w:t>│   ├── Like / Unlike Video</w:t>
+        <w:br/>
+        <w:t>│   └── Delete Video</w:t>
+        <w:br/>
+        <w:t>├── 5. Chat</w:t>
+        <w:br/>
+        <w:t>│   ├── Start Conversation ← Tests script saves conversation_id</w:t>
+        <w:br/>
+        <w:t>│   ├── List Conversations (Inbox)</w:t>
+        <w:br/>
+        <w:t>│   ├── Message History</w:t>
+        <w:br/>
+        <w:t>│   ├── Mark as Read</w:t>
+        <w:br/>
+        <w:t>│   └── [WebSocket] Connect + Send  (use Postman WS tab or wscat)</w:t>
+        <w:br/>
+        <w:t>├── 6. Blacklist</w:t>
+        <w:br/>
+        <w:t>│   ├── Block Customer  (vendor token + store_id + customer_id)</w:t>
+        <w:br/>
+        <w:t>│   ├── List Blocked Customers  (vendor token + store_id)</w:t>
+        <w:br/>
+        <w:t>│   └── Unblock Customer  (same endpoint as Block — toggle)</w:t>
+        <w:br/>
+        <w:t>├── 7. Billing</w:t>
+        <w:br/>
+        <w:t>│   ├── List Plans  (no auth required)</w:t>
+        <w:br/>
+        <w:t>│   ├── Wallet Balance  (vendor token)</w:t>
+        <w:br/>
+        <w:t>│   ├── Top Up Wallet  (vendor token + {"amount": "1000.00"})</w:t>
+        <w:br/>
+        <w:t>│   ├── Subscribe to Plan  (vendor token + {"plan_name": "basic"})</w:t>
+        <w:br/>
+        <w:t>│   ├── Subscription Status  (vendor token)</w:t>
+        <w:br/>
+        <w:t>│   └── Transaction History  (vendor token)</w:t>
+        <w:br/>
+        <w:t>└── 8. Analytics + Admin</w:t>
+        <w:br/>
+        <w:t xml:space="preserve">    ├── [Analytics] Vendor Dashboard  (vendor token)</w:t>
+        <w:br/>
+        <w:t xml:space="preserve">    ├── [Analytics] Vendor Video Stats  (vendor token)</w:t>
+        <w:br/>
+        <w:t xml:space="preserve">    ├── [Analytics] Vendor Product Stats  (vendor token)</w:t>
+        <w:br/>
+        <w:t xml:space="preserve">    ├── [Admin] Platform Stats  (admin_token)</w:t>
+        <w:br/>
+        <w:t xml:space="preserve">    ├── [Admin] List All Stores  (admin_token)</w:t>
+        <w:br/>
+        <w:t xml:space="preserve">    ├── [Admin] Verify Store  (admin_token + PATCH {"is_verified": true})</w:t>
+        <w:br/>
+        <w:t xml:space="preserve">    ├── [Admin] List All Users  (admin_token)</w:t>
+        <w:br/>
+        <w:t xml:space="preserve">    └── [Admin] Toggle User Active  (admin_token + POST empty body)</w:t>
+      </w:r>
+    </w:p>
+    <w:p>
+      <w:pPr>
+        <w:pStyle w:val="Heading2"/>
+      </w:pPr>
+      <w:r>
+        <w:t>Auto-Save Token Script  (paste in Tests tab of Verify OTP request)</w:t>
+      </w:r>
+    </w:p>
+    <w:p>
+      <w:pPr>
+        <w:spacing w:before="40" w:after="40"/>
+        <w:ind w:left="288"/>
+        <w:shd w:val="clear" w:color="auto" w:fill="F0F0F0"/>
+      </w:pPr>
+      <w:r>
+        <w:rPr>
+          <w:rFonts w:ascii="Courier New" w:hAnsi="Courier New"/>
+          <w:color w:val="1A1A8C"/>
+          <w:sz w:val="18"/>
+        </w:rPr>
+        <w:t>// For VENDOR verify OTP request:</w:t>
+        <w:br/>
+        <w:t>const r = pm.response.json();</w:t>
+        <w:br/>
+        <w:t>if (r.access) {</w:t>
+        <w:br/>
+        <w:t xml:space="preserve">    pm.environment.set("vendor_token", r.access);</w:t>
+        <w:br/>
+        <w:t xml:space="preserve">    pm.environment.set("vendor_refresh", r.refresh);</w:t>
+        <w:br/>
+        <w:t xml:space="preserve">    console.log("Vendor token saved:", r.access.substring(0, 30) + "...");</w:t>
+        <w:br/>
+        <w:t>}</w:t>
+        <w:br/>
+        <w:br/>
+        <w:t>// For CUSTOMER verify OTP request — use this instead:</w:t>
+        <w:br/>
+        <w:t>// pm.environment.set("customer_token", r.access);</w:t>
+        <w:br/>
+        <w:t>// pm.environment.set("customer_refresh", r.refresh);</w:t>
+      </w:r>
+    </w:p>
+    <w:p>
+      <w:pPr>
+        <w:pStyle w:val="Heading2"/>
+      </w:pPr>
+      <w:r>
+        <w:t>Auto-Save Store ID  (paste in Tests tab of Create Store request)</w:t>
+      </w:r>
+    </w:p>
+    <w:p>
+      <w:pPr>
+        <w:spacing w:before="40" w:after="40"/>
+        <w:ind w:left="288"/>
+        <w:shd w:val="clear" w:color="auto" w:fill="F0F0F0"/>
+      </w:pPr>
+      <w:r>
+        <w:rPr>
+          <w:rFonts w:ascii="Courier New" w:hAnsi="Courier New"/>
+          <w:color w:val="1A1A8C"/>
+          <w:sz w:val="18"/>
+        </w:rPr>
+        <w:t>const r = pm.response.json();</w:t>
+        <w:br/>
+        <w:t>if (r.id) {</w:t>
+        <w:br/>
+        <w:t xml:space="preserve">    pm.environment.set("store_id", r.id);</w:t>
+        <w:br/>
+        <w:t xml:space="preserve">    console.log("store_id saved:", r.id);</w:t>
+        <w:br/>
+        <w:t>}</w:t>
+      </w:r>
+    </w:p>
+    <w:p>
+      <w:pPr>
+        <w:pStyle w:val="Heading2"/>
+      </w:pPr>
+      <w:r>
+        <w:t>Auto-Save Product ID  (paste in Tests tab of Create Product request)</w:t>
+      </w:r>
+    </w:p>
+    <w:p>
+      <w:pPr>
+        <w:spacing w:before="40" w:after="40"/>
+        <w:ind w:left="288"/>
+        <w:shd w:val="clear" w:color="auto" w:fill="F0F0F0"/>
+      </w:pPr>
+      <w:r>
+        <w:rPr>
+          <w:rFonts w:ascii="Courier New" w:hAnsi="Courier New"/>
+          <w:color w:val="1A1A8C"/>
+          <w:sz w:val="18"/>
+        </w:rPr>
+        <w:t>const r = pm.response.json();</w:t>
+        <w:br/>
+        <w:t>if (r.id) {</w:t>
+        <w:br/>
+        <w:t xml:space="preserve">    pm.environment.set("product_id", r.id);</w:t>
+        <w:br/>
+        <w:t xml:space="preserve">    console.log("product_id saved:", r.id);</w:t>
+        <w:br/>
+        <w:t>}</w:t>
+      </w:r>
+    </w:p>
+    <w:p>
+      <w:pPr>
+        <w:pStyle w:val="Heading2"/>
+      </w:pPr>
+      <w:r>
+        <w:t>Auto-Save Video ID  (paste in Tests tab of Request Upload URL request)</w:t>
+      </w:r>
+    </w:p>
+    <w:p>
+      <w:pPr>
+        <w:spacing w:before="40" w:after="40"/>
+        <w:ind w:left="288"/>
+        <w:shd w:val="clear" w:color="auto" w:fill="F0F0F0"/>
+      </w:pPr>
+      <w:r>
+        <w:rPr>
+          <w:rFonts w:ascii="Courier New" w:hAnsi="Courier New"/>
+          <w:color w:val="1A1A8C"/>
+          <w:sz w:val="18"/>
+        </w:rPr>
+        <w:t>const r = pm.response.json();</w:t>
+        <w:br/>
+        <w:t>if (r.video_id) {</w:t>
+        <w:br/>
+        <w:t xml:space="preserve">    pm.environment.set("video_id", r.video_id);</w:t>
+        <w:br/>
+        <w:t xml:space="preserve">    pm.environment.set("upload_url", r.upload_url);</w:t>
+        <w:br/>
+        <w:t xml:space="preserve">    console.log("video_id saved:", r.video_id);</w:t>
+        <w:br/>
+        <w:t>}</w:t>
+      </w:r>
+    </w:p>
+    <w:p>
+      <w:pPr>
+        <w:pStyle w:val="Heading2"/>
+      </w:pPr>
+      <w:r>
+        <w:t>Auto-Save Conversation ID  (paste in Tests tab of Start Conversation request)</w:t>
+      </w:r>
+    </w:p>
+    <w:p>
+      <w:pPr>
+        <w:spacing w:before="40" w:after="40"/>
+        <w:ind w:left="288"/>
+        <w:shd w:val="clear" w:color="auto" w:fill="F0F0F0"/>
+      </w:pPr>
+      <w:r>
+        <w:rPr>
+          <w:rFonts w:ascii="Courier New" w:hAnsi="Courier New"/>
+          <w:color w:val="1A1A8C"/>
+          <w:sz w:val="18"/>
+        </w:rPr>
+        <w:t>const r = pm.response.json();</w:t>
+        <w:br/>
+        <w:t>if (r.id) {</w:t>
+        <w:br/>
+        <w:t xml:space="preserve">    pm.environment.set("conversation_id", r.id);</w:t>
+        <w:br/>
+        <w:t xml:space="preserve">    console.log("conversation_id saved:", r.id);</w:t>
+        <w:br/>
+        <w:t>}</w:t>
+      </w:r>
+    </w:p>
+    <w:p>
+      <w:pPr>
+        <w:pStyle w:val="Heading2"/>
+      </w:pPr>
+      <w:r>
+        <w:t>Auto-Save Customer ID  (paste in Tests tab of Verify OTP Customer request)</w:t>
+      </w:r>
+    </w:p>
+    <w:p>
+      <w:pPr>
+        <w:spacing w:before="40" w:after="40"/>
+        <w:ind w:left="288"/>
+        <w:shd w:val="clear" w:color="auto" w:fill="F0F0F0"/>
+      </w:pPr>
+      <w:r>
+        <w:rPr>
+          <w:rFonts w:ascii="Courier New" w:hAnsi="Courier New"/>
+          <w:color w:val="1A1A8C"/>
+          <w:sz w:val="18"/>
+        </w:rPr>
+        <w:t>// Add this to the existing customer verify OTP Tests script:</w:t>
+        <w:br/>
+        <w:t>const r = pm.response.json();</w:t>
+        <w:br/>
+        <w:t>if (r.user &amp;&amp; r.user.id) {</w:t>
+        <w:br/>
+        <w:t xml:space="preserve">    pm.environment.set("customer_id", r.user.id);</w:t>
+        <w:br/>
+        <w:t xml:space="preserve">    console.log("customer_id saved:", r.user.id);</w:t>
+        <w:br/>
+        <w:t>}</w:t>
+      </w:r>
+    </w:p>
+    <w:p>
+      <w:pPr>
+        <w:ind w:left="288"/>
+        <w:shd w:val="clear" w:color="auto" w:fill="D1ECF1"/>
+      </w:pPr>
+      <w:r>
+        <w:rPr>
+          <w:i/>
+          <w:color w:val="0C5460"/>
+          <w:sz w:val="20"/>
+        </w:rPr>
+        <w:t xml:space="preserve">  💡  customer_id is needed for Sprint 6 blacklist endpoint:</w:t>
+        <w:br/>
+        <w:t xml:space="preserve">  POST /stores/{{store_id}}/blacklist/{{customer_id}}/</w:t>
+      </w:r>
+    </w:p>
+    <w:p>
+      <w:pPr>
+        <w:pStyle w:val="Heading2"/>
+      </w:pPr>
+      <w:r>
+        <w:t>Quick Test — All Public Endpoints via curl</w:t>
+      </w:r>
+    </w:p>
+    <w:p>
+      <w:r>
+        <w:rPr>
+          <w:b w:val="0"/>
+          <w:sz w:val="22"/>
+        </w:rPr>
+        <w:t>Copy-paste these into terminal to test without Postman:</w:t>
+      </w:r>
+    </w:p>
+    <w:p>
+      <w:pPr>
+        <w:spacing w:before="40" w:after="40"/>
+        <w:ind w:left="288"/>
+        <w:shd w:val="clear" w:color="auto" w:fill="F0F0F0"/>
+      </w:pPr>
+      <w:r>
+        <w:rPr>
+          <w:rFonts w:ascii="Courier New" w:hAnsi="Courier New"/>
+          <w:color w:val="1A1A8C"/>
+          <w:sz w:val="18"/>
+        </w:rPr>
+        <w:t># Health check</w:t>
+        <w:br/>
+        <w:t>curl -s http://localhost:8000/api/v1/health/ | python3 -m json.tool</w:t>
+        <w:br/>
+        <w:br/>
+        <w:t># Send OTP</w:t>
+        <w:br/>
+        <w:t>curl -s -X POST http://localhost:8000/api/v1/auth/otp/send/ \</w:t>
+        <w:br/>
+        <w:t xml:space="preserve">  -H "Content-Type: application/json" \</w:t>
+        <w:br/>
+        <w:t xml:space="preserve">  -d '{"phone_number": "+919999999999"}'</w:t>
+        <w:br/>
+        <w:br/>
+        <w:t># Verify OTP (copy access token from response)</w:t>
+        <w:br/>
+        <w:t>curl -s -X POST http://localhost:8000/api/v1/auth/otp/verify/ \</w:t>
+        <w:br/>
+        <w:t xml:space="preserve">  -H "Content-Type: application/json" \</w:t>
+        <w:br/>
+        <w:t xml:space="preserve">  -d '{"phone_number": "+919999999999", "otp": "123456"}'</w:t>
+        <w:br/>
+        <w:br/>
+        <w:t># Get profile (replace TOKEN with your access token)</w:t>
+        <w:br/>
+        <w:t>curl -s http://localhost:8000/api/v1/auth/me/ \</w:t>
+        <w:br/>
+        <w:t xml:space="preserve">  -H "Authorization: Bearer TOKEN"</w:t>
+      </w:r>
+    </w:p>
+    <w:p>
+      <w:r>
+        <w:br w:type="page"/>
+      </w:r>
+    </w:p>
+    <w:p>
+      <w:pPr>
+        <w:pStyle w:val="Heading1"/>
+      </w:pPr>
+      <w:r>
+        <w:t>6. How to Update This Document (Future Sprints)</w:t>
+      </w:r>
+    </w:p>
+    <w:p>
+      <w:pPr>
+        <w:ind w:left="288"/>
+        <w:shd w:val="clear" w:color="auto" w:fill="D1ECF1"/>
+      </w:pPr>
+      <w:r>
+        <w:rPr>
+          <w:i/>
+          <w:color w:val="0C5460"/>
+          <w:sz w:val="20"/>
+        </w:rPr>
+        <w:t xml:space="preserve">  📌  IMPORTANT: When a new sprint adds new API endpoints, update this document.</w:t>
+        <w:br/>
+        <w:t xml:space="preserve">     Do NOT create a separate doc — keep everything in this single file.</w:t>
+      </w:r>
+    </w:p>
+    <w:p/>
+    <w:p>
+      <w:pPr>
+        <w:pStyle w:val="Heading2"/>
+      </w:pPr>
+      <w:r>
+        <w:t>Checklist for each new sprint:</w:t>
+      </w:r>
+    </w:p>
+    <w:p>
+      <w:pPr>
+        <w:pStyle w:val="ListBullet"/>
+        <w:ind w:left="432"/>
+      </w:pPr>
+      <w:r>
+        <w:rPr>
+          <w:sz w:val="21"/>
+        </w:rPr>
+        <w:t>Add new endpoint rows to Section 2 — Complete API Reference table</w:t>
+      </w:r>
+    </w:p>
+    <w:p>
+      <w:pPr>
+        <w:pStyle w:val="ListBullet"/>
+        <w:ind w:left="432"/>
+      </w:pPr>
+      <w:r>
+        <w:rPr>
+          <w:sz w:val="21"/>
+        </w:rPr>
+        <w:t>Add new STEP sections in Section 3 — Step-by-Step Test Flow</w:t>
+      </w:r>
+    </w:p>
+    <w:p>
+      <w:pPr>
+        <w:pStyle w:val="ListBullet"/>
+        <w:ind w:left="432"/>
+      </w:pPr>
+      <w:r>
+        <w:rPr>
+          <w:sz w:val="21"/>
+        </w:rPr>
+        <w:t>Add new error cases in Section 4 — Error Cases to Test</w:t>
+      </w:r>
+    </w:p>
+    <w:p>
+      <w:pPr>
+        <w:pStyle w:val="ListBullet"/>
+        <w:ind w:left="432"/>
+      </w:pPr>
+      <w:r>
+        <w:rPr>
+          <w:sz w:val="21"/>
+        </w:rPr>
+        <w:t>Add new Postman folder in Section 5 — Postman Quick Setup</w:t>
+      </w:r>
+    </w:p>
+    <w:p>
+      <w:pPr>
+        <w:pStyle w:val="ListBullet"/>
+        <w:ind w:left="432"/>
+      </w:pPr>
+      <w:r>
+        <w:rPr>
+          <w:sz w:val="21"/>
+        </w:rPr>
+        <w:t>Update the cover page "Last updated" date and sprint range</w:t>
+      </w:r>
+    </w:p>
+    <w:p>
+      <w:pPr>
+        <w:pStyle w:val="ListBullet"/>
+        <w:ind w:left="432"/>
+      </w:pPr>
+      <w:r>
+        <w:rPr>
+          <w:sz w:val="21"/>
+        </w:rPr>
+        <w:t>If new field types are introduced (e.g. file uploads), add a format rules subsection in Section 1</w:t>
+      </w:r>
+    </w:p>
+    <w:p>
+      <w:pPr>
+        <w:pStyle w:val="Heading2"/>
+      </w:pPr>
+      <w:r>
+        <w:t>Upcoming Sprints to Add Here</w:t>
+      </w:r>
+    </w:p>
+    <w:tbl>
+      <w:tblPr>
+        <w:tblStyle w:val="TableGrid"/>
+        <w:tblW w:type="auto" w:w="0"/>
+        <w:jc w:val="left"/>
+        <w:tblLook w:firstColumn="1" w:firstRow="1" w:lastColumn="0" w:lastRow="0" w:noHBand="0" w:noVBand="1" w:val="04A0"/>
+      </w:tblPr>
+      <w:tblGrid>
+        <w:gridCol w:w="3216"/>
+        <w:gridCol w:w="3216"/>
+        <w:gridCol w:w="3216"/>
+      </w:tblGrid>
+      <w:tr>
+        <w:tc>
+          <w:tcPr>
+            <w:tcW w:type="dxa" w:w="1152"/>
+            <w:shd w:val="clear" w:color="auto" w:fill="1F4E79"/>
+          </w:tcPr>
+          <w:p>
+            <w:r>
+              <w:rPr>
+                <w:b/>
+                <w:color w:val="FFFFFF"/>
+                <w:sz w:val="20"/>
+              </w:rPr>
+              <w:t>Sprint</w:t>
+            </w:r>
+          </w:p>
+        </w:tc>
+        <w:tc>
+          <w:tcPr>
+            <w:tcW w:type="dxa" w:w="2160"/>
+            <w:shd w:val="clear" w:color="auto" w:fill="1F4E79"/>
+          </w:tcPr>
+          <w:p>
+            <w:r>
+              <w:rPr>
+                <w:b/>
+                <w:color w:val="FFFFFF"/>
+                <w:sz w:val="20"/>
+              </w:rPr>
+              <w:t>Module</w:t>
+            </w:r>
+          </w:p>
+        </w:tc>
+        <w:tc>
+          <w:tcPr>
+            <w:tcW w:type="dxa" w:w="6048"/>
+            <w:shd w:val="clear" w:color="auto" w:fill="1F4E79"/>
+          </w:tcPr>
+          <w:p>
+            <w:r>
+              <w:rPr>
+                <w:b/>
+                <w:color w:val="FFFFFF"/>
+                <w:sz w:val="20"/>
+              </w:rPr>
+              <w:t>APIs to Add</w:t>
+            </w:r>
+          </w:p>
+        </w:tc>
+      </w:tr>
+      <w:tr>
+        <w:tc>
+          <w:tcPr>
             <w:tcW w:type="dxa" w:w="1152"/>
             <w:shd w:val="clear" w:color="auto" w:fill="DEEAF1"/>
           </w:tcPr>
@@ -19451,7 +21446,7 @@
               <w:rPr>
                 <w:sz w:val="19"/>
               </w:rPr>
-              <w:t>Reservations</w:t>
+              <w:t>Analytics + Admin</w:t>
             </w:r>
           </w:p>
         </w:tc>
@@ -19465,7 +21460,7 @@
               <w:rPr>
                 <w:sz w:val="19"/>
               </w:rPr>
-              <w:t>POST /reservations/, GET /reservations/, PUT /reservations/&lt;id&gt;/status/</w:t>
+              <w:t>✅ DONE — Steps 45–53 in this document</w:t>
             </w:r>
           </w:p>
         </w:tc>
@@ -19493,7 +21488,7 @@
               <w:rPr>
                 <w:sz w:val="19"/>
               </w:rPr>
-              <w:t>Analytics</w:t>
+              <w:t>Reservations</w:t>
             </w:r>
           </w:p>
         </w:tc>
@@ -19506,7 +21501,7 @@
               <w:rPr>
                 <w:sz w:val="19"/>
               </w:rPr>
-              <w:t>GET /analytics/store/, GET /analytics/products/, GET /analytics/views/</w:t>
+              <w:t>POST /reservations/, GET /reservations/, PUT /reservations/&lt;id&gt;/status/</w:t>
             </w:r>
           </w:p>
         </w:tc>
@@ -19522,7 +21517,7 @@
               <w:rPr>
                 <w:sz w:val="19"/>
               </w:rPr>
-              <w:t>Sprint 10</w:t>
+              <w:t>Sprint 9</w:t>
             </w:r>
           </w:p>
         </w:tc>
@@ -19536,7 +21531,7 @@
               <w:rPr>
                 <w:sz w:val="19"/>
               </w:rPr>
-              <w:t>Groups</w:t>
+              <w:t>Analytics</w:t>
             </w:r>
           </w:p>
         </w:tc>
@@ -19550,7 +21545,7 @@
               <w:rPr>
                 <w:sz w:val="19"/>
               </w:rPr>
-              <w:t>POST /groups/, GET /groups/, POST /groups/&lt;id&gt;/join/</w:t>
+              <w:t>GET /analytics/store/, GET /analytics/products/, GET /analytics/views/</w:t>
             </w:r>
           </w:p>
         </w:tc>
@@ -19565,7 +21560,7 @@
               <w:rPr>
                 <w:sz w:val="19"/>
               </w:rPr>
-              <w:t>Sprint 11</w:t>
+              <w:t>Sprint 10</w:t>
             </w:r>
           </w:p>
         </w:tc>
@@ -19578,7 +21573,7 @@
               <w:rPr>
                 <w:sz w:val="19"/>
               </w:rPr>
-              <w:t>Notifications</w:t>
+              <w:t>Groups</w:t>
             </w:r>
           </w:p>
         </w:tc>
@@ -19591,7 +21586,7 @@
               <w:rPr>
                 <w:sz w:val="19"/>
               </w:rPr>
-              <w:t>POST /notifications/device-token/, GET /notifications/</w:t>
+              <w:t>POST /groups/, GET /groups/, POST /groups/&lt;id&gt;/join/</w:t>
             </w:r>
           </w:p>
         </w:tc>
@@ -19607,7 +21602,7 @@
               <w:rPr>
                 <w:sz w:val="19"/>
               </w:rPr>
-              <w:t>Sprint 12</w:t>
+              <w:t>Sprint 11</w:t>
             </w:r>
           </w:p>
         </w:tc>
@@ -19621,7 +21616,7 @@
               <w:rPr>
                 <w:sz w:val="19"/>
               </w:rPr>
-              <w:t>Admin Panel</w:t>
+              <w:t>Notifications</w:t>
             </w:r>
           </w:p>
         </w:tc>
@@ -19635,7 +21630,7 @@
               <w:rPr>
                 <w:sz w:val="19"/>
               </w:rPr>
-              <w:t>GET /admin-panel/stores/, PUT /admin-panel/stores/&lt;id&gt;/verify/</w:t>
+              <w:t>POST /notifications/device-token/, GET /notifications/</w:t>
             </w:r>
           </w:p>
         </w:tc>
@@ -19650,6 +21645,48 @@
               <w:rPr>
                 <w:sz w:val="19"/>
               </w:rPr>
+              <w:t>Sprint 12</w:t>
+            </w:r>
+          </w:p>
+        </w:tc>
+        <w:tc>
+          <w:tcPr>
+            <w:tcW w:type="dxa" w:w="2160"/>
+          </w:tcPr>
+          <w:p>
+            <w:r>
+              <w:rPr>
+                <w:sz w:val="19"/>
+              </w:rPr>
+              <w:t>Admin Panel</w:t>
+            </w:r>
+          </w:p>
+        </w:tc>
+        <w:tc>
+          <w:tcPr>
+            <w:tcW w:type="dxa" w:w="6048"/>
+          </w:tcPr>
+          <w:p>
+            <w:r>
+              <w:rPr>
+                <w:sz w:val="19"/>
+              </w:rPr>
+              <w:t>GET /admin-panel/stores/, PUT /admin-panel/stores/&lt;id&gt;/verify/</w:t>
+            </w:r>
+          </w:p>
+        </w:tc>
+      </w:tr>
+      <w:tr>
+        <w:tc>
+          <w:tcPr>
+            <w:tcW w:type="dxa" w:w="1152"/>
+            <w:shd w:val="clear" w:color="auto" w:fill="DEEAF1"/>
+          </w:tcPr>
+          <w:p>
+            <w:r>
+              <w:rPr>
+                <w:sz w:val="19"/>
+              </w:rPr>
               <w:t>Sprint 13</w:t>
             </w:r>
           </w:p>
@@ -19657,6 +21694,7 @@
         <w:tc>
           <w:tcPr>
             <w:tcW w:type="dxa" w:w="2160"/>
+            <w:shd w:val="clear" w:color="auto" w:fill="DEEAF1"/>
           </w:tcPr>
           <w:p>
             <w:r>
@@ -19670,6 +21708,7 @@
         <w:tc>
           <w:tcPr>
             <w:tcW w:type="dxa" w:w="6048"/>
+            <w:shd w:val="clear" w:color="auto" w:fill="DEEAF1"/>
           </w:tcPr>
           <w:p>
             <w:r>
@@ -19694,7 +21733,7 @@
           <w:color w:val="999999"/>
           <w:sz w:val="18"/>
         </w:rPr>
-        <w:t>NearKart Backend — Master API Testing Guide   |   Sprint 1–7   |   Use Postman or curl for testing</w:t>
+        <w:t>NearKart Backend — Master API Testing Guide   |   Sprint 1–8   |   Use Postman or curl for testing</w:t>
       </w:r>
     </w:p>
     <w:sectPr>

</xml_diff>

<commit_message>
feat(sprint9): implement Reservations module
Customers reserve products at stores for a 2-hour hold. Vendors confirm,
reject, or mark completed. Celery expires stale pending holds every hour.
Blacklist enforcement prevents blocked customers from reserving.

- apps/reservations: Reservation model, ReservationService, 5 REST endpoints
- apps/reservations: expire_reservations Celery task (time_limit=300)
- config/settings/base.py: expire-reservations-hourly Celery Beat schedule
- docs/sprint_9_reservations/: README, TESTING_CHECKLIST, POSTMAN_GUIDE
- docs/NearKart_Master_API_Testing_Guide.docx: updated to Sprint 1-9 (55 endpoints)

Co-Authored-By: Claude Sonnet 4.6 <noreply@anthropic.com>
</commit_message>
<xml_diff>
--- a/nearkart_backend/docs/NearKart_Master_API_Testing_Guide.docx
+++ b/nearkart_backend/docs/NearKart_Master_API_Testing_Guide.docx
@@ -50,7 +50,7 @@
           <w:color w:val="888888"/>
           <w:sz w:val="20"/>
         </w:rPr>
-        <w:t>Sprint 1 → Sprint 8   |   Last updated: May 2026</w:t>
+        <w:t>Sprint 1 → Sprint 9   |   Last updated: May 2026</w:t>
       </w:r>
     </w:p>
     <w:p/>
@@ -6489,6 +6489,356 @@
           </w:p>
         </w:tc>
       </w:tr>
+      <w:tr>
+        <w:tc>
+          <w:tcPr>
+            <w:tcW w:type="dxa" w:w="432"/>
+            <w:shd w:val="clear" w:color="auto" w:fill="DEEAF1"/>
+          </w:tcPr>
+          <w:p>
+            <w:r>
+              <w:rPr>
+                <w:sz w:val="19"/>
+              </w:rPr>
+              <w:t>51</w:t>
+            </w:r>
+          </w:p>
+        </w:tc>
+        <w:tc>
+          <w:tcPr>
+            <w:tcW w:type="dxa" w:w="1008"/>
+            <w:shd w:val="clear" w:color="auto" w:fill="DEEAF1"/>
+          </w:tcPr>
+          <w:p>
+            <w:r>
+              <w:rPr>
+                <w:sz w:val="19"/>
+              </w:rPr>
+              <w:t>POST</w:t>
+            </w:r>
+          </w:p>
+        </w:tc>
+        <w:tc>
+          <w:tcPr>
+            <w:tcW w:type="dxa" w:w="4032"/>
+            <w:shd w:val="clear" w:color="auto" w:fill="DEEAF1"/>
+          </w:tcPr>
+          <w:p>
+            <w:r>
+              <w:rPr>
+                <w:sz w:val="19"/>
+              </w:rPr>
+              <w:t>/reservations/</w:t>
+            </w:r>
+          </w:p>
+        </w:tc>
+        <w:tc>
+          <w:tcPr>
+            <w:tcW w:type="dxa" w:w="2016"/>
+            <w:shd w:val="clear" w:color="auto" w:fill="DEEAF1"/>
+          </w:tcPr>
+          <w:p>
+            <w:r>
+              <w:rPr>
+                <w:sz w:val="19"/>
+              </w:rPr>
+              <w:t>Bearer JWT</w:t>
+            </w:r>
+          </w:p>
+        </w:tc>
+        <w:tc>
+          <w:tcPr>
+            <w:tcW w:type="dxa" w:w="576"/>
+            <w:shd w:val="clear" w:color="auto" w:fill="DEEAF1"/>
+          </w:tcPr>
+          <w:p>
+            <w:r>
+              <w:rPr>
+                <w:sz w:val="19"/>
+              </w:rPr>
+              <w:t>S9</w:t>
+            </w:r>
+          </w:p>
+        </w:tc>
+      </w:tr>
+      <w:tr>
+        <w:tc>
+          <w:tcPr>
+            <w:tcW w:type="dxa" w:w="432"/>
+          </w:tcPr>
+          <w:p>
+            <w:r>
+              <w:rPr>
+                <w:sz w:val="19"/>
+              </w:rPr>
+              <w:t>52</w:t>
+            </w:r>
+          </w:p>
+        </w:tc>
+        <w:tc>
+          <w:tcPr>
+            <w:tcW w:type="dxa" w:w="1008"/>
+          </w:tcPr>
+          <w:p>
+            <w:r>
+              <w:rPr>
+                <w:sz w:val="19"/>
+              </w:rPr>
+              <w:t>GET</w:t>
+            </w:r>
+          </w:p>
+        </w:tc>
+        <w:tc>
+          <w:tcPr>
+            <w:tcW w:type="dxa" w:w="4032"/>
+          </w:tcPr>
+          <w:p>
+            <w:r>
+              <w:rPr>
+                <w:sz w:val="19"/>
+              </w:rPr>
+              <w:t>/reservations/list/</w:t>
+            </w:r>
+          </w:p>
+        </w:tc>
+        <w:tc>
+          <w:tcPr>
+            <w:tcW w:type="dxa" w:w="2016"/>
+          </w:tcPr>
+          <w:p>
+            <w:r>
+              <w:rPr>
+                <w:sz w:val="19"/>
+              </w:rPr>
+              <w:t>Bearer JWT</w:t>
+            </w:r>
+          </w:p>
+        </w:tc>
+        <w:tc>
+          <w:tcPr>
+            <w:tcW w:type="dxa" w:w="576"/>
+          </w:tcPr>
+          <w:p>
+            <w:r>
+              <w:rPr>
+                <w:sz w:val="19"/>
+              </w:rPr>
+              <w:t>S9</w:t>
+            </w:r>
+          </w:p>
+        </w:tc>
+      </w:tr>
+      <w:tr>
+        <w:tc>
+          <w:tcPr>
+            <w:tcW w:type="dxa" w:w="432"/>
+            <w:shd w:val="clear" w:color="auto" w:fill="DEEAF1"/>
+          </w:tcPr>
+          <w:p>
+            <w:r>
+              <w:rPr>
+                <w:sz w:val="19"/>
+              </w:rPr>
+              <w:t>53</w:t>
+            </w:r>
+          </w:p>
+        </w:tc>
+        <w:tc>
+          <w:tcPr>
+            <w:tcW w:type="dxa" w:w="1008"/>
+            <w:shd w:val="clear" w:color="auto" w:fill="DEEAF1"/>
+          </w:tcPr>
+          <w:p>
+            <w:r>
+              <w:rPr>
+                <w:sz w:val="19"/>
+              </w:rPr>
+              <w:t>GET</w:t>
+            </w:r>
+          </w:p>
+        </w:tc>
+        <w:tc>
+          <w:tcPr>
+            <w:tcW w:type="dxa" w:w="4032"/>
+            <w:shd w:val="clear" w:color="auto" w:fill="DEEAF1"/>
+          </w:tcPr>
+          <w:p>
+            <w:r>
+              <w:rPr>
+                <w:sz w:val="19"/>
+              </w:rPr>
+              <w:t>/reservations/&lt;uuid&gt;/</w:t>
+            </w:r>
+          </w:p>
+        </w:tc>
+        <w:tc>
+          <w:tcPr>
+            <w:tcW w:type="dxa" w:w="2016"/>
+            <w:shd w:val="clear" w:color="auto" w:fill="DEEAF1"/>
+          </w:tcPr>
+          <w:p>
+            <w:r>
+              <w:rPr>
+                <w:sz w:val="19"/>
+              </w:rPr>
+              <w:t>Bearer JWT</w:t>
+            </w:r>
+          </w:p>
+        </w:tc>
+        <w:tc>
+          <w:tcPr>
+            <w:tcW w:type="dxa" w:w="576"/>
+            <w:shd w:val="clear" w:color="auto" w:fill="DEEAF1"/>
+          </w:tcPr>
+          <w:p>
+            <w:r>
+              <w:rPr>
+                <w:sz w:val="19"/>
+              </w:rPr>
+              <w:t>S9</w:t>
+            </w:r>
+          </w:p>
+        </w:tc>
+      </w:tr>
+      <w:tr>
+        <w:tc>
+          <w:tcPr>
+            <w:tcW w:type="dxa" w:w="432"/>
+          </w:tcPr>
+          <w:p>
+            <w:r>
+              <w:rPr>
+                <w:sz w:val="19"/>
+              </w:rPr>
+              <w:t>54</w:t>
+            </w:r>
+          </w:p>
+        </w:tc>
+        <w:tc>
+          <w:tcPr>
+            <w:tcW w:type="dxa" w:w="1008"/>
+          </w:tcPr>
+          <w:p>
+            <w:r>
+              <w:rPr>
+                <w:sz w:val="19"/>
+              </w:rPr>
+              <w:t>PATCH</w:t>
+            </w:r>
+          </w:p>
+        </w:tc>
+        <w:tc>
+          <w:tcPr>
+            <w:tcW w:type="dxa" w:w="4032"/>
+          </w:tcPr>
+          <w:p>
+            <w:r>
+              <w:rPr>
+                <w:sz w:val="19"/>
+              </w:rPr>
+              <w:t>/reservations/&lt;uuid&gt;/status/</w:t>
+            </w:r>
+          </w:p>
+        </w:tc>
+        <w:tc>
+          <w:tcPr>
+            <w:tcW w:type="dxa" w:w="2016"/>
+          </w:tcPr>
+          <w:p>
+            <w:r>
+              <w:rPr>
+                <w:sz w:val="19"/>
+              </w:rPr>
+              <w:t>Vendor JWT only</w:t>
+            </w:r>
+          </w:p>
+        </w:tc>
+        <w:tc>
+          <w:tcPr>
+            <w:tcW w:type="dxa" w:w="576"/>
+          </w:tcPr>
+          <w:p>
+            <w:r>
+              <w:rPr>
+                <w:sz w:val="19"/>
+              </w:rPr>
+              <w:t>S9</w:t>
+            </w:r>
+          </w:p>
+        </w:tc>
+      </w:tr>
+      <w:tr>
+        <w:tc>
+          <w:tcPr>
+            <w:tcW w:type="dxa" w:w="432"/>
+            <w:shd w:val="clear" w:color="auto" w:fill="DEEAF1"/>
+          </w:tcPr>
+          <w:p>
+            <w:r>
+              <w:rPr>
+                <w:sz w:val="19"/>
+              </w:rPr>
+              <w:t>55</w:t>
+            </w:r>
+          </w:p>
+        </w:tc>
+        <w:tc>
+          <w:tcPr>
+            <w:tcW w:type="dxa" w:w="1008"/>
+            <w:shd w:val="clear" w:color="auto" w:fill="DEEAF1"/>
+          </w:tcPr>
+          <w:p>
+            <w:r>
+              <w:rPr>
+                <w:sz w:val="19"/>
+              </w:rPr>
+              <w:t>POST</w:t>
+            </w:r>
+          </w:p>
+        </w:tc>
+        <w:tc>
+          <w:tcPr>
+            <w:tcW w:type="dxa" w:w="4032"/>
+            <w:shd w:val="clear" w:color="auto" w:fill="DEEAF1"/>
+          </w:tcPr>
+          <w:p>
+            <w:r>
+              <w:rPr>
+                <w:sz w:val="19"/>
+              </w:rPr>
+              <w:t>/reservations/&lt;uuid&gt;/cancel/</w:t>
+            </w:r>
+          </w:p>
+        </w:tc>
+        <w:tc>
+          <w:tcPr>
+            <w:tcW w:type="dxa" w:w="2016"/>
+            <w:shd w:val="clear" w:color="auto" w:fill="DEEAF1"/>
+          </w:tcPr>
+          <w:p>
+            <w:r>
+              <w:rPr>
+                <w:sz w:val="19"/>
+              </w:rPr>
+              <w:t>Bearer JWT</w:t>
+            </w:r>
+          </w:p>
+        </w:tc>
+        <w:tc>
+          <w:tcPr>
+            <w:tcW w:type="dxa" w:w="576"/>
+            <w:shd w:val="clear" w:color="auto" w:fill="DEEAF1"/>
+          </w:tcPr>
+          <w:p>
+            <w:r>
+              <w:rPr>
+                <w:sz w:val="19"/>
+              </w:rPr>
+              <w:t>S9</w:t>
+            </w:r>
+          </w:p>
+        </w:tc>
+      </w:tr>
     </w:tbl>
     <w:p/>
     <w:p>
@@ -16419,6 +16769,580 @@
         <w:pStyle w:val="Heading1"/>
       </w:pPr>
       <w:r>
+        <w:t>Sprint 9 — Reservations  (Steps 54–58)</w:t>
+      </w:r>
+    </w:p>
+    <w:p>
+      <w:r>
+        <w:rPr>
+          <w:b w:val="0"/>
+          <w:sz w:val="22"/>
+        </w:rPr>
+        <w:t>Customers hold a product for 2 hours. Vendor confirms or rejects. Celery expires stale holds.</w:t>
+      </w:r>
+    </w:p>
+    <w:p>
+      <w:pPr>
+        <w:ind w:left="288"/>
+        <w:shd w:val="clear" w:color="auto" w:fill="D1ECF1"/>
+      </w:pPr>
+      <w:r>
+        <w:rPr>
+          <w:i/>
+          <w:color w:val="0C5460"/>
+          <w:sz w:val="20"/>
+        </w:rPr>
+        <w:t xml:space="preserve">  💡  Hold duration: 2h by default. Controlled via RESERVATION_HOLD_HOURS in .env</w:t>
+      </w:r>
+    </w:p>
+    <w:p>
+      <w:pPr>
+        <w:pStyle w:val="Heading2"/>
+      </w:pPr>
+      <w:r>
+        <w:t>STEP 54 — Create Reservation  (Customer)</w:t>
+      </w:r>
+    </w:p>
+    <w:p>
+      <w:pPr>
+        <w:spacing w:before="120"/>
+        <w:shd w:val="clear" w:color="auto" w:fill="CCE5FF"/>
+      </w:pPr>
+      <w:r>
+        <w:rPr>
+          <w:b/>
+          <w:color w:val="004DAA"/>
+          <w:sz w:val="20"/>
+        </w:rPr>
+        <w:t xml:space="preserve">  POST  </w:t>
+      </w:r>
+      <w:r>
+        <w:rPr>
+          <w:b/>
+          <w:color w:val="1F4E79"/>
+          <w:sz w:val="20"/>
+        </w:rPr>
+        <w:t xml:space="preserve">  {{base_url}}/reservations/</w:t>
+      </w:r>
+      <w:r>
+        <w:rPr>
+          <w:i/>
+          <w:color w:val="777777"/>
+          <w:sz w:val="18"/>
+        </w:rPr>
+        <w:t xml:space="preserve">   [Bearer JWT]   [Sprint 9]</w:t>
+      </w:r>
+    </w:p>
+    <w:p>
+      <w:r>
+        <w:rPr>
+          <w:b/>
+          <w:sz w:val="20"/>
+        </w:rPr>
+        <w:t>Body:</w:t>
+      </w:r>
+    </w:p>
+    <w:p>
+      <w:pPr>
+        <w:spacing w:before="40" w:after="40"/>
+        <w:ind w:left="288"/>
+        <w:shd w:val="clear" w:color="auto" w:fill="F0F0F0"/>
+      </w:pPr>
+      <w:r>
+        <w:rPr>
+          <w:rFonts w:ascii="Courier New" w:hAnsi="Courier New"/>
+          <w:color w:val="1A1A8C"/>
+          <w:sz w:val="18"/>
+        </w:rPr>
+        <w:t>{</w:t>
+        <w:br/>
+        <w:t xml:space="preserve">  "store_id":   "{{store_id}}",</w:t>
+        <w:br/>
+        <w:t xml:space="preserve">  "product_id": "{{product_id}}",</w:t>
+        <w:br/>
+        <w:t xml:space="preserve">  "quantity":   2,</w:t>
+        <w:br/>
+        <w:t xml:space="preserve">  "note":       "Please keep ready by 6 PM"</w:t>
+        <w:br/>
+        <w:t>}</w:t>
+      </w:r>
+    </w:p>
+    <w:p>
+      <w:r>
+        <w:rPr>
+          <w:b/>
+          <w:sz w:val="20"/>
+        </w:rPr>
+        <w:t>Auto-save Tests script:</w:t>
+      </w:r>
+    </w:p>
+    <w:p>
+      <w:pPr>
+        <w:spacing w:before="40" w:after="40"/>
+        <w:ind w:left="288"/>
+        <w:shd w:val="clear" w:color="auto" w:fill="F0F0F0"/>
+      </w:pPr>
+      <w:r>
+        <w:rPr>
+          <w:rFonts w:ascii="Courier New" w:hAnsi="Courier New"/>
+          <w:color w:val="1A1A8C"/>
+          <w:sz w:val="18"/>
+        </w:rPr>
+        <w:t>const r = pm.response.json();</w:t>
+        <w:br/>
+        <w:t>if (r.id) { pm.environment.set("reservation_id", r.id); }</w:t>
+      </w:r>
+    </w:p>
+    <w:p>
+      <w:r>
+        <w:rPr>
+          <w:b/>
+          <w:sz w:val="20"/>
+        </w:rPr>
+        <w:t>Expected Response  201 Created:</w:t>
+      </w:r>
+    </w:p>
+    <w:p>
+      <w:pPr>
+        <w:spacing w:before="40" w:after="40"/>
+        <w:ind w:left="288"/>
+        <w:shd w:val="clear" w:color="auto" w:fill="F0F0F0"/>
+      </w:pPr>
+      <w:r>
+        <w:rPr>
+          <w:rFonts w:ascii="Courier New" w:hAnsi="Courier New"/>
+          <w:color w:val="1A1A8C"/>
+          <w:sz w:val="18"/>
+        </w:rPr>
+        <w:t>{</w:t>
+        <w:br/>
+        <w:t xml:space="preserve">  "id": "...",</w:t>
+        <w:br/>
+        <w:t xml:space="preserve">  "store":    { "id": "...", "name": "Chennai Silk House", "locality": "...", "phone": "..." },</w:t>
+        <w:br/>
+        <w:t xml:space="preserve">  "customer": { "id": "...", "phone_number": "+916000000001", "full_name": "" },</w:t>
+        <w:br/>
+        <w:t xml:space="preserve">  "product":  { "id": "...", "name": "Kanchipuram Silk Saree", "base_price": "4500.00" },</w:t>
+        <w:br/>
+        <w:t xml:space="preserve">  "quantity": 2,</w:t>
+        <w:br/>
+        <w:t xml:space="preserve">  "note": "Please keep ready by 6 PM",</w:t>
+        <w:br/>
+        <w:t xml:space="preserve">  "vendor_note": "",</w:t>
+        <w:br/>
+        <w:t xml:space="preserve">  "status": "pending",</w:t>
+        <w:br/>
+        <w:t xml:space="preserve">  "expires_at": "2026-05-15T23:25:49Z",</w:t>
+        <w:br/>
+        <w:t xml:space="preserve">  "hours_left": 2.0,</w:t>
+        <w:br/>
+        <w:t xml:space="preserve">  "created_at": "..."</w:t>
+        <w:br/>
+        <w:t>}</w:t>
+      </w:r>
+    </w:p>
+    <w:p>
+      <w:pPr>
+        <w:ind w:left="288"/>
+        <w:shd w:val="clear" w:color="auto" w:fill="D4EDDA"/>
+      </w:pPr>
+      <w:r>
+        <w:rPr>
+          <w:i/>
+          <w:color w:val="155724"/>
+          <w:sz w:val="20"/>
+        </w:rPr>
+        <w:t xml:space="preserve">  ✅  hours_left = 2.0 on fresh creation. Decreases as time passes. 0 when expired.</w:t>
+      </w:r>
+    </w:p>
+    <w:p>
+      <w:pPr>
+        <w:pStyle w:val="Heading2"/>
+      </w:pPr>
+      <w:r>
+        <w:t>STEP 55 — List Reservations</w:t>
+      </w:r>
+    </w:p>
+    <w:p>
+      <w:pPr>
+        <w:spacing w:before="120"/>
+        <w:shd w:val="clear" w:color="auto" w:fill="D4EDDA"/>
+      </w:pPr>
+      <w:r>
+        <w:rPr>
+          <w:b/>
+          <w:color w:val="155524"/>
+          <w:sz w:val="20"/>
+        </w:rPr>
+        <w:t xml:space="preserve">  GET  </w:t>
+      </w:r>
+      <w:r>
+        <w:rPr>
+          <w:b/>
+          <w:color w:val="1F4E79"/>
+          <w:sz w:val="20"/>
+        </w:rPr>
+        <w:t xml:space="preserve">  {{base_url}}/reservations/list/</w:t>
+      </w:r>
+      <w:r>
+        <w:rPr>
+          <w:i/>
+          <w:color w:val="777777"/>
+          <w:sz w:val="18"/>
+        </w:rPr>
+        <w:t xml:space="preserve">   [Bearer JWT]   [Sprint 9]</w:t>
+      </w:r>
+    </w:p>
+    <w:p>
+      <w:r>
+        <w:rPr>
+          <w:b w:val="0"/>
+          <w:sz w:val="22"/>
+        </w:rPr>
+        <w:t>No body. Behavior differs by role:</w:t>
+      </w:r>
+    </w:p>
+    <w:p>
+      <w:r>
+        <w:rPr>
+          <w:b w:val="0"/>
+          <w:sz w:val="20"/>
+        </w:rPr>
+        <w:t xml:space="preserve">  • Customer token → returns only their own reservations</w:t>
+      </w:r>
+    </w:p>
+    <w:p>
+      <w:r>
+        <w:rPr>
+          <w:b w:val="0"/>
+          <w:sz w:val="20"/>
+        </w:rPr>
+        <w:t xml:space="preserve">  • Vendor token → returns all reservations received by their store</w:t>
+      </w:r>
+    </w:p>
+    <w:p>
+      <w:r>
+        <w:rPr>
+          <w:b/>
+          <w:sz w:val="20"/>
+        </w:rPr>
+        <w:t>Expected Response  200 OK:</w:t>
+      </w:r>
+    </w:p>
+    <w:p>
+      <w:pPr>
+        <w:spacing w:before="40" w:after="40"/>
+        <w:ind w:left="288"/>
+        <w:shd w:val="clear" w:color="auto" w:fill="F0F0F0"/>
+      </w:pPr>
+      <w:r>
+        <w:rPr>
+          <w:rFonts w:ascii="Courier New" w:hAnsi="Courier New"/>
+          <w:color w:val="1A1A8C"/>
+          <w:sz w:val="18"/>
+        </w:rPr>
+        <w:t>[</w:t>
+        <w:br/>
+        <w:t xml:space="preserve">  { "id": "...", "status": "pending", "quantity": 2, "product": { "name": "..." }, ... }</w:t>
+        <w:br/>
+        <w:t>]</w:t>
+      </w:r>
+    </w:p>
+    <w:p>
+      <w:pPr>
+        <w:pStyle w:val="Heading2"/>
+      </w:pPr>
+      <w:r>
+        <w:t>STEP 56 — Vendor Confirms Reservation</w:t>
+      </w:r>
+    </w:p>
+    <w:p>
+      <w:pPr>
+        <w:spacing w:before="120"/>
+        <w:shd w:val="clear" w:color="auto" w:fill="FFF3CD"/>
+      </w:pPr>
+      <w:r>
+        <w:rPr>
+          <w:b/>
+          <w:color w:val="7D4E00"/>
+          <w:sz w:val="20"/>
+        </w:rPr>
+        <w:t xml:space="preserve">  PATCH  </w:t>
+      </w:r>
+      <w:r>
+        <w:rPr>
+          <w:b/>
+          <w:color w:val="1F4E79"/>
+          <w:sz w:val="20"/>
+        </w:rPr>
+        <w:t xml:space="preserve">  {{base_url}}/reservations/{{reservation_id}}/status/</w:t>
+      </w:r>
+      <w:r>
+        <w:rPr>
+          <w:i/>
+          <w:color w:val="777777"/>
+          <w:sz w:val="18"/>
+        </w:rPr>
+        <w:t xml:space="preserve">   [Vendor JWT]   [Sprint 9]</w:t>
+      </w:r>
+    </w:p>
+    <w:p>
+      <w:r>
+        <w:rPr>
+          <w:b/>
+          <w:sz w:val="20"/>
+        </w:rPr>
+        <w:t>Body:</w:t>
+      </w:r>
+    </w:p>
+    <w:p>
+      <w:pPr>
+        <w:spacing w:before="40" w:after="40"/>
+        <w:ind w:left="288"/>
+        <w:shd w:val="clear" w:color="auto" w:fill="F0F0F0"/>
+      </w:pPr>
+      <w:r>
+        <w:rPr>
+          <w:rFonts w:ascii="Courier New" w:hAnsi="Courier New"/>
+          <w:color w:val="1A1A8C"/>
+          <w:sz w:val="18"/>
+        </w:rPr>
+        <w:t>{ "status": "confirmed", "vendor_note": "Ready for pickup after 5 PM!" }</w:t>
+      </w:r>
+    </w:p>
+    <w:p>
+      <w:r>
+        <w:rPr>
+          <w:b/>
+          <w:sz w:val="20"/>
+        </w:rPr>
+        <w:t>Expected Response  200 OK:</w:t>
+      </w:r>
+    </w:p>
+    <w:p>
+      <w:pPr>
+        <w:spacing w:before="40" w:after="40"/>
+        <w:ind w:left="288"/>
+        <w:shd w:val="clear" w:color="auto" w:fill="F0F0F0"/>
+      </w:pPr>
+      <w:r>
+        <w:rPr>
+          <w:rFonts w:ascii="Courier New" w:hAnsi="Courier New"/>
+          <w:color w:val="1A1A8C"/>
+          <w:sz w:val="18"/>
+        </w:rPr>
+        <w:t>{ "status": "confirmed", "vendor_note": "Ready for pickup after 5 PM!", ... }</w:t>
+      </w:r>
+    </w:p>
+    <w:p>
+      <w:pPr>
+        <w:ind w:left="288"/>
+        <w:shd w:val="clear" w:color="auto" w:fill="D1ECF1"/>
+      </w:pPr>
+      <w:r>
+        <w:rPr>
+          <w:i/>
+          <w:color w:val="0C5460"/>
+          <w:sz w:val="20"/>
+        </w:rPr>
+        <w:t xml:space="preserve">  💡  Vendor can also send: {"status": "cancelled", "vendor_note": "Out of stock, sorry."} to reject.</w:t>
+      </w:r>
+    </w:p>
+    <w:p>
+      <w:pPr>
+        <w:pStyle w:val="Heading2"/>
+      </w:pPr>
+      <w:r>
+        <w:t>STEP 57 — Vendor Marks Completed</w:t>
+      </w:r>
+    </w:p>
+    <w:p>
+      <w:pPr>
+        <w:spacing w:before="120"/>
+        <w:shd w:val="clear" w:color="auto" w:fill="FFF3CD"/>
+      </w:pPr>
+      <w:r>
+        <w:rPr>
+          <w:b/>
+          <w:color w:val="7D4E00"/>
+          <w:sz w:val="20"/>
+        </w:rPr>
+        <w:t xml:space="preserve">  PATCH  </w:t>
+      </w:r>
+      <w:r>
+        <w:rPr>
+          <w:b/>
+          <w:color w:val="1F4E79"/>
+          <w:sz w:val="20"/>
+        </w:rPr>
+        <w:t xml:space="preserve">  {{base_url}}/reservations/{{reservation_id}}/status/</w:t>
+      </w:r>
+      <w:r>
+        <w:rPr>
+          <w:i/>
+          <w:color w:val="777777"/>
+          <w:sz w:val="18"/>
+        </w:rPr>
+        <w:t xml:space="preserve">   [Vendor JWT]   [Sprint 9]</w:t>
+      </w:r>
+    </w:p>
+    <w:p>
+      <w:r>
+        <w:rPr>
+          <w:b/>
+          <w:sz w:val="20"/>
+        </w:rPr>
+        <w:t>Body:</w:t>
+      </w:r>
+    </w:p>
+    <w:p>
+      <w:pPr>
+        <w:spacing w:before="40" w:after="40"/>
+        <w:ind w:left="288"/>
+        <w:shd w:val="clear" w:color="auto" w:fill="F0F0F0"/>
+      </w:pPr>
+      <w:r>
+        <w:rPr>
+          <w:rFonts w:ascii="Courier New" w:hAnsi="Courier New"/>
+          <w:color w:val="1A1A8C"/>
+          <w:sz w:val="18"/>
+        </w:rPr>
+        <w:t>{ "status": "completed" }</w:t>
+      </w:r>
+    </w:p>
+    <w:p>
+      <w:r>
+        <w:rPr>
+          <w:b/>
+          <w:sz w:val="20"/>
+        </w:rPr>
+        <w:t>Expected Response  200 OK:</w:t>
+      </w:r>
+    </w:p>
+    <w:p>
+      <w:pPr>
+        <w:spacing w:before="40" w:after="40"/>
+        <w:ind w:left="288"/>
+        <w:shd w:val="clear" w:color="auto" w:fill="F0F0F0"/>
+      </w:pPr>
+      <w:r>
+        <w:rPr>
+          <w:rFonts w:ascii="Courier New" w:hAnsi="Courier New"/>
+          <w:color w:val="1A1A8C"/>
+          <w:sz w:val="18"/>
+        </w:rPr>
+        <w:t>{ "status": "completed", ... }</w:t>
+      </w:r>
+    </w:p>
+    <w:p>
+      <w:pPr>
+        <w:ind w:left="288"/>
+        <w:shd w:val="clear" w:color="auto" w:fill="F8D7DA"/>
+      </w:pPr>
+      <w:r>
+        <w:rPr>
+          <w:i/>
+          <w:color w:val="7B1D1D"/>
+          <w:sz w:val="20"/>
+        </w:rPr>
+        <w:t xml:space="preserve">  🚫  Must be confirmed first. Trying to complete a pending → 400 — Only confirmed reservations can be completed.</w:t>
+      </w:r>
+    </w:p>
+    <w:p>
+      <w:pPr>
+        <w:pStyle w:val="Heading2"/>
+      </w:pPr>
+      <w:r>
+        <w:t>STEP 58 — Customer Cancels Reservation</w:t>
+      </w:r>
+    </w:p>
+    <w:p>
+      <w:pPr>
+        <w:spacing w:before="120"/>
+        <w:shd w:val="clear" w:color="auto" w:fill="CCE5FF"/>
+      </w:pPr>
+      <w:r>
+        <w:rPr>
+          <w:b/>
+          <w:color w:val="004DAA"/>
+          <w:sz w:val="20"/>
+        </w:rPr>
+        <w:t xml:space="preserve">  POST  </w:t>
+      </w:r>
+      <w:r>
+        <w:rPr>
+          <w:b/>
+          <w:color w:val="1F4E79"/>
+          <w:sz w:val="20"/>
+        </w:rPr>
+        <w:t xml:space="preserve">  {{base_url}}/reservations/{{reservation_id}}/cancel/</w:t>
+      </w:r>
+      <w:r>
+        <w:rPr>
+          <w:i/>
+          <w:color w:val="777777"/>
+          <w:sz w:val="18"/>
+        </w:rPr>
+        <w:t xml:space="preserve">   [Bearer JWT]   [Sprint 9]</w:t>
+      </w:r>
+    </w:p>
+    <w:p>
+      <w:r>
+        <w:rPr>
+          <w:b w:val="0"/>
+          <w:sz w:val="22"/>
+        </w:rPr>
+        <w:t>No body. Customer can only cancel their own pending reservation.</w:t>
+      </w:r>
+    </w:p>
+    <w:p>
+      <w:r>
+        <w:rPr>
+          <w:b/>
+          <w:sz w:val="20"/>
+        </w:rPr>
+        <w:t>Expected Response  200 OK:</w:t>
+      </w:r>
+    </w:p>
+    <w:p>
+      <w:pPr>
+        <w:spacing w:before="40" w:after="40"/>
+        <w:ind w:left="288"/>
+        <w:shd w:val="clear" w:color="auto" w:fill="F0F0F0"/>
+      </w:pPr>
+      <w:r>
+        <w:rPr>
+          <w:rFonts w:ascii="Courier New" w:hAnsi="Courier New"/>
+          <w:color w:val="1A1A8C"/>
+          <w:sz w:val="18"/>
+        </w:rPr>
+        <w:t>{ "status": "cancelled", ... }</w:t>
+      </w:r>
+    </w:p>
+    <w:p>
+      <w:pPr>
+        <w:ind w:left="288"/>
+        <w:shd w:val="clear" w:color="auto" w:fill="F8D7DA"/>
+      </w:pPr>
+      <w:r>
+        <w:rPr>
+          <w:i/>
+          <w:color w:val="7B1D1D"/>
+          <w:sz w:val="20"/>
+        </w:rPr>
+        <w:t xml:space="preserve">  🚫  Cannot cancel a confirmed or completed reservation — returns 400.</w:t>
+      </w:r>
+    </w:p>
+    <w:p>
+      <w:r>
+        <w:br w:type="page"/>
+      </w:r>
+    </w:p>
+    <w:p>
+      <w:pPr>
+        <w:pStyle w:val="Heading1"/>
+      </w:pPr>
+      <w:r>
         <w:t>4. Error Cases to Test</w:t>
       </w:r>
     </w:p>
@@ -19559,7 +20483,7 @@
         <w:pStyle w:val="Heading2"/>
       </w:pPr>
       <w:r>
-        <w:t>Analytics Error Cases  (Sprint 8)</w:t>
+        <w:t>Reservation Error Cases  (Sprint 9)</w:t>
       </w:r>
     </w:p>
     <w:tbl>
@@ -19635,7 +20559,7 @@
               <w:rPr>
                 <w:sz w:val="19"/>
               </w:rPr>
-              <w:t>Vendor Dashboard — no store</w:t>
+              <w:t>Invalid product</w:t>
             </w:r>
           </w:p>
         </w:tc>
@@ -19649,7 +20573,7 @@
               <w:rPr>
                 <w:sz w:val="19"/>
               </w:rPr>
-              <w:t>GET /analytics/vendor/ — vendor with no store</w:t>
+              <w:t>POST /reservations/ — product_id not in store</w:t>
             </w:r>
           </w:p>
         </w:tc>
@@ -19663,7 +20587,7 @@
               <w:rPr>
                 <w:sz w:val="19"/>
               </w:rPr>
-              <w:t>400 — Create a store first</w:t>
+              <w:t>404 — Product not found or not available</w:t>
             </w:r>
           </w:p>
         </w:tc>
@@ -19678,7 +20602,7 @@
               <w:rPr>
                 <w:sz w:val="19"/>
               </w:rPr>
-              <w:t>Dashboard — no auth</w:t>
+              <w:t>Draft product</w:t>
             </w:r>
           </w:p>
         </w:tc>
@@ -19691,7 +20615,7 @@
               <w:rPr>
                 <w:sz w:val="19"/>
               </w:rPr>
-              <w:t>GET /analytics/vendor/ — no Authorization header</w:t>
+              <w:t>POST /reservations/ — product status=draft</w:t>
             </w:r>
           </w:p>
         </w:tc>
@@ -19704,7 +20628,7 @@
               <w:rPr>
                 <w:sz w:val="19"/>
               </w:rPr>
-              <w:t>401 — authentication_failed</w:t>
+              <w:t>404 — Product not found or not available</w:t>
             </w:r>
           </w:p>
         </w:tc>
@@ -19720,7 +20644,7 @@
               <w:rPr>
                 <w:sz w:val="19"/>
               </w:rPr>
-              <w:t>Dashboard — customer token</w:t>
+              <w:t>Invalid store</w:t>
             </w:r>
           </w:p>
         </w:tc>
@@ -19734,7 +20658,7 @@
               <w:rPr>
                 <w:sz w:val="19"/>
               </w:rPr>
-              <w:t>GET /analytics/vendor/ — customer token</w:t>
+              <w:t>POST /reservations/ — wrong store_id</w:t>
             </w:r>
           </w:p>
         </w:tc>
@@ -19748,7 +20672,7 @@
               <w:rPr>
                 <w:sz w:val="19"/>
               </w:rPr>
-              <w:t>403 — Vendor access only</w:t>
+              <w:t>404 — Store not found</w:t>
             </w:r>
           </w:p>
         </w:tc>
@@ -19763,7 +20687,7 @@
               <w:rPr>
                 <w:sz w:val="19"/>
               </w:rPr>
-              <w:t>Admin stats — vendor token</w:t>
+              <w:t>Blacklisted customer</w:t>
             </w:r>
           </w:p>
         </w:tc>
@@ -19776,7 +20700,7 @@
               <w:rPr>
                 <w:sz w:val="19"/>
               </w:rPr>
-              <w:t>GET /admin-panel/stats/ — vendor token</w:t>
+              <w:t>POST /reservations/ — blocked by store</w:t>
             </w:r>
           </w:p>
         </w:tc>
@@ -19789,7 +20713,7 @@
               <w:rPr>
                 <w:sz w:val="19"/>
               </w:rPr>
-              <w:t>403 — permission_denied</w:t>
+              <w:t>403 — blacklisted</w:t>
             </w:r>
           </w:p>
         </w:tc>
@@ -19805,7 +20729,7 @@
               <w:rPr>
                 <w:sz w:val="19"/>
               </w:rPr>
-              <w:t>Admin stats — no auth</w:t>
+              <w:t>No auth</w:t>
             </w:r>
           </w:p>
         </w:tc>
@@ -19819,7 +20743,7 @@
               <w:rPr>
                 <w:sz w:val="19"/>
               </w:rPr>
-              <w:t>GET /admin-panel/stats/ — no header</w:t>
+              <w:t>POST /reservations/ — no Authorization header</w:t>
             </w:r>
           </w:p>
         </w:tc>
@@ -19848,7 +20772,7 @@
               <w:rPr>
                 <w:sz w:val="19"/>
               </w:rPr>
-              <w:t>Store update — wrong UUID</w:t>
+              <w:t>Confirm already-confirmed</w:t>
             </w:r>
           </w:p>
         </w:tc>
@@ -19861,7 +20785,7 @@
               <w:rPr>
                 <w:sz w:val="19"/>
               </w:rPr>
-              <w:t>PATCH /admin-panel/stores/&lt;bad_uuid&gt;/</w:t>
+              <w:t>PATCH /status/ {"status":"confirmed"} — already done</w:t>
             </w:r>
           </w:p>
         </w:tc>
@@ -19874,7 +20798,7 @@
               <w:rPr>
                 <w:sz w:val="19"/>
               </w:rPr>
-              <w:t>404 — Store not found</w:t>
+              <w:t>400 — Cannot confirmed a confirmed reservation</w:t>
             </w:r>
           </w:p>
         </w:tc>
@@ -19890,7 +20814,7 @@
               <w:rPr>
                 <w:sz w:val="19"/>
               </w:rPr>
-              <w:t>User not found</w:t>
+              <w:t>Complete a pending</w:t>
             </w:r>
           </w:p>
         </w:tc>
@@ -19904,7 +20828,7 @@
               <w:rPr>
                 <w:sz w:val="19"/>
               </w:rPr>
-              <w:t>POST /admin-panel/users/&lt;bad_uuid&gt;/toggle-active/</w:t>
+              <w:t>PATCH /status/ {"status":"completed"} — pending res</w:t>
             </w:r>
           </w:p>
         </w:tc>
@@ -19918,7 +20842,7 @@
               <w:rPr>
                 <w:sz w:val="19"/>
               </w:rPr>
-              <w:t>404 — User not found</w:t>
+              <w:t>400 — Only confirmed reservations can be completed</w:t>
             </w:r>
           </w:p>
         </w:tc>
@@ -19933,7 +20857,7 @@
               <w:rPr>
                 <w:sz w:val="19"/>
               </w:rPr>
-              <w:t>Toggle own account</w:t>
+              <w:t>Cancel confirmed</w:t>
             </w:r>
           </w:p>
         </w:tc>
@@ -19946,7 +20870,7 @@
               <w:rPr>
                 <w:sz w:val="19"/>
               </w:rPr>
-              <w:t>POST /admin-panel/users/&lt;own_id&gt;/toggle-active/</w:t>
+              <w:t>POST /cancel/ — reservation is confirmed</w:t>
             </w:r>
           </w:p>
         </w:tc>
@@ -19959,7 +20883,7 @@
               <w:rPr>
                 <w:sz w:val="19"/>
               </w:rPr>
-              <w:t>400 — Cannot deactivate your own account</w:t>
+              <w:t>400 — Cannot cancel a confirmed reservation</w:t>
             </w:r>
           </w:p>
         </w:tc>
@@ -19975,7 +20899,7 @@
               <w:rPr>
                 <w:sz w:val="19"/>
               </w:rPr>
-              <w:t>Store list — vendor token</w:t>
+              <w:t>Cancel other customer</w:t>
             </w:r>
           </w:p>
         </w:tc>
@@ -19989,7 +20913,7 @@
               <w:rPr>
                 <w:sz w:val="19"/>
               </w:rPr>
-              <w:t>GET /admin-panel/stores/ — vendor token</w:t>
+              <w:t>POST /cancel/ — different customer token</w:t>
             </w:r>
           </w:p>
         </w:tc>
@@ -20003,7 +20927,7 @@
               <w:rPr>
                 <w:sz w:val="19"/>
               </w:rPr>
-              <w:t>403 — permission_denied</w:t>
+              <w:t>404 — Reservation not found</w:t>
             </w:r>
           </w:p>
         </w:tc>
@@ -20018,7 +20942,7 @@
               <w:rPr>
                 <w:sz w:val="19"/>
               </w:rPr>
-              <w:t>User list — vendor token</w:t>
+              <w:t>Vendor updates own res</w:t>
             </w:r>
           </w:p>
         </w:tc>
@@ -20031,7 +20955,7 @@
               <w:rPr>
                 <w:sz w:val="19"/>
               </w:rPr>
-              <w:t>GET /admin-panel/users/ — vendor token</w:t>
+              <w:t>PATCH /status/ with wrong vendor token</w:t>
             </w:r>
           </w:p>
         </w:tc>
@@ -20044,7 +20968,51 @@
               <w:rPr>
                 <w:sz w:val="19"/>
               </w:rPr>
-              <w:t>403 — permission_denied</w:t>
+              <w:t>404 — Reservation not found</w:t>
+            </w:r>
+          </w:p>
+        </w:tc>
+      </w:tr>
+      <w:tr>
+        <w:tc>
+          <w:tcPr>
+            <w:tcW w:type="dxa" w:w="2736"/>
+            <w:shd w:val="clear" w:color="auto" w:fill="DEEAF1"/>
+          </w:tcPr>
+          <w:p>
+            <w:r>
+              <w:rPr>
+                <w:sz w:val="19"/>
+              </w:rPr>
+              <w:t>Customer calls /status/</w:t>
+            </w:r>
+          </w:p>
+        </w:tc>
+        <w:tc>
+          <w:tcPr>
+            <w:tcW w:type="dxa" w:w="3744"/>
+            <w:shd w:val="clear" w:color="auto" w:fill="DEEAF1"/>
+          </w:tcPr>
+          <w:p>
+            <w:r>
+              <w:rPr>
+                <w:sz w:val="19"/>
+              </w:rPr>
+              <w:t>PATCH /status/ with customer token</w:t>
+            </w:r>
+          </w:p>
+        </w:tc>
+        <w:tc>
+          <w:tcPr>
+            <w:tcW w:type="dxa" w:w="3024"/>
+            <w:shd w:val="clear" w:color="auto" w:fill="DEEAF1"/>
+          </w:tcPr>
+          <w:p>
+            <w:r>
+              <w:rPr>
+                <w:sz w:val="19"/>
+              </w:rPr>
+              <w:t>403 — Vendor access only</w:t>
             </w:r>
           </w:p>
         </w:tc>
@@ -20056,7 +21024,7 @@
         <w:pStyle w:val="Heading2"/>
       </w:pPr>
       <w:r>
-        <w:t>Video Error Cases  (Sprint 4)</w:t>
+        <w:t>Analytics Error Cases  (Sprint 8)</w:t>
       </w:r>
     </w:p>
     <w:tbl>
@@ -20074,7 +21042,7 @@
       <w:tr>
         <w:tc>
           <w:tcPr>
-            <w:tcW w:type="dxa" w:w="2880"/>
+            <w:tcW w:type="dxa" w:w="2736"/>
             <w:shd w:val="clear" w:color="auto" w:fill="1F4E79"/>
           </w:tcPr>
           <w:p>
@@ -20090,7 +21058,7 @@
         </w:tc>
         <w:tc>
           <w:tcPr>
-            <w:tcW w:type="dxa" w:w="3456"/>
+            <w:tcW w:type="dxa" w:w="3744"/>
             <w:shd w:val="clear" w:color="auto" w:fill="1F4E79"/>
           </w:tcPr>
           <w:p>
@@ -20100,13 +21068,13 @@
                 <w:color w:val="FFFFFF"/>
                 <w:sz w:val="20"/>
               </w:rPr>
-              <w:t>Request</w:t>
-            </w:r>
-          </w:p>
-        </w:tc>
-        <w:tc>
-          <w:tcPr>
-            <w:tcW w:type="dxa" w:w="3168"/>
+              <w:t>Request / Situation</w:t>
+            </w:r>
+          </w:p>
+        </w:tc>
+        <w:tc>
+          <w:tcPr>
+            <w:tcW w:type="dxa" w:w="3024"/>
             <w:shd w:val="clear" w:color="auto" w:fill="1F4E79"/>
           </w:tcPr>
           <w:p>
@@ -20124,7 +21092,7 @@
       <w:tr>
         <w:tc>
           <w:tcPr>
-            <w:tcW w:type="dxa" w:w="2880"/>
+            <w:tcW w:type="dxa" w:w="2736"/>
             <w:shd w:val="clear" w:color="auto" w:fill="DEEAF1"/>
           </w:tcPr>
           <w:p>
@@ -20132,13 +21100,13 @@
               <w:rPr>
                 <w:sz w:val="19"/>
               </w:rPr>
-              <w:t>No store — request upload</w:t>
-            </w:r>
-          </w:p>
-        </w:tc>
-        <w:tc>
-          <w:tcPr>
-            <w:tcW w:type="dxa" w:w="3456"/>
+              <w:t>Vendor Dashboard — no store</w:t>
+            </w:r>
+          </w:p>
+        </w:tc>
+        <w:tc>
+          <w:tcPr>
+            <w:tcW w:type="dxa" w:w="3744"/>
             <w:shd w:val="clear" w:color="auto" w:fill="DEEAF1"/>
           </w:tcPr>
           <w:p>
@@ -20146,13 +21114,13 @@
               <w:rPr>
                 <w:sz w:val="19"/>
               </w:rPr>
-              <w:t>POST /videos/request-upload/ before store created</w:t>
-            </w:r>
-          </w:p>
-        </w:tc>
-        <w:tc>
-          <w:tcPr>
-            <w:tcW w:type="dxa" w:w="3168"/>
+              <w:t>GET /analytics/vendor/ — vendor with no store</w:t>
+            </w:r>
+          </w:p>
+        </w:tc>
+        <w:tc>
+          <w:tcPr>
+            <w:tcW w:type="dxa" w:w="3024"/>
             <w:shd w:val="clear" w:color="auto" w:fill="DEEAF1"/>
           </w:tcPr>
           <w:p>
@@ -20168,40 +21136,40 @@
       <w:tr>
         <w:tc>
           <w:tcPr>
-            <w:tcW w:type="dxa" w:w="2880"/>
-          </w:tcPr>
-          <w:p>
-            <w:r>
-              <w:rPr>
-                <w:sz w:val="19"/>
-              </w:rPr>
-              <w:t>Missing title</w:t>
-            </w:r>
-          </w:p>
-        </w:tc>
-        <w:tc>
-          <w:tcPr>
-            <w:tcW w:type="dxa" w:w="3456"/>
-          </w:tcPr>
-          <w:p>
-            <w:r>
-              <w:rPr>
-                <w:sz w:val="19"/>
-              </w:rPr>
-              <w:t>POST /videos/request-upload/ with no title field</w:t>
-            </w:r>
-          </w:p>
-        </w:tc>
-        <w:tc>
-          <w:tcPr>
-            <w:tcW w:type="dxa" w:w="3168"/>
-          </w:tcPr>
-          <w:p>
-            <w:r>
-              <w:rPr>
-                <w:sz w:val="19"/>
-              </w:rPr>
-              <w:t>400 — This field is required</w:t>
+            <w:tcW w:type="dxa" w:w="2736"/>
+          </w:tcPr>
+          <w:p>
+            <w:r>
+              <w:rPr>
+                <w:sz w:val="19"/>
+              </w:rPr>
+              <w:t>Dashboard — no auth</w:t>
+            </w:r>
+          </w:p>
+        </w:tc>
+        <w:tc>
+          <w:tcPr>
+            <w:tcW w:type="dxa" w:w="3744"/>
+          </w:tcPr>
+          <w:p>
+            <w:r>
+              <w:rPr>
+                <w:sz w:val="19"/>
+              </w:rPr>
+              <w:t>GET /analytics/vendor/ — no Authorization header</w:t>
+            </w:r>
+          </w:p>
+        </w:tc>
+        <w:tc>
+          <w:tcPr>
+            <w:tcW w:type="dxa" w:w="3024"/>
+          </w:tcPr>
+          <w:p>
+            <w:r>
+              <w:rPr>
+                <w:sz w:val="19"/>
+              </w:rPr>
+              <w:t>401 — authentication_failed</w:t>
             </w:r>
           </w:p>
         </w:tc>
@@ -20209,7 +21177,7 @@
       <w:tr>
         <w:tc>
           <w:tcPr>
-            <w:tcW w:type="dxa" w:w="2880"/>
+            <w:tcW w:type="dxa" w:w="2736"/>
             <w:shd w:val="clear" w:color="auto" w:fill="DEEAF1"/>
           </w:tcPr>
           <w:p>
@@ -20217,13 +21185,13 @@
               <w:rPr>
                 <w:sz w:val="19"/>
               </w:rPr>
-              <w:t>Customer calls request-upload</w:t>
-            </w:r>
-          </w:p>
-        </w:tc>
-        <w:tc>
-          <w:tcPr>
-            <w:tcW w:type="dxa" w:w="3456"/>
+              <w:t>Dashboard — customer token</w:t>
+            </w:r>
+          </w:p>
+        </w:tc>
+        <w:tc>
+          <w:tcPr>
+            <w:tcW w:type="dxa" w:w="3744"/>
             <w:shd w:val="clear" w:color="auto" w:fill="DEEAF1"/>
           </w:tcPr>
           <w:p>
@@ -20231,13 +21199,13 @@
               <w:rPr>
                 <w:sz w:val="19"/>
               </w:rPr>
-              <w:t>POST /videos/request-upload/ with customer token</w:t>
-            </w:r>
-          </w:p>
-        </w:tc>
-        <w:tc>
-          <w:tcPr>
-            <w:tcW w:type="dxa" w:w="3168"/>
+              <w:t>GET /analytics/vendor/ — customer token</w:t>
+            </w:r>
+          </w:p>
+        </w:tc>
+        <w:tc>
+          <w:tcPr>
+            <w:tcW w:type="dxa" w:w="3024"/>
             <w:shd w:val="clear" w:color="auto" w:fill="DEEAF1"/>
           </w:tcPr>
           <w:p>
@@ -20253,40 +21221,40 @@
       <w:tr>
         <w:tc>
           <w:tcPr>
-            <w:tcW w:type="dxa" w:w="2880"/>
-          </w:tcPr>
-          <w:p>
-            <w:r>
-              <w:rPr>
-                <w:sz w:val="19"/>
-              </w:rPr>
-              <w:t>Confirm already-ready video</w:t>
-            </w:r>
-          </w:p>
-        </w:tc>
-        <w:tc>
-          <w:tcPr>
-            <w:tcW w:type="dxa" w:w="3456"/>
-          </w:tcPr>
-          <w:p>
-            <w:r>
-              <w:rPr>
-                <w:sz w:val="19"/>
-              </w:rPr>
-              <w:t>POST /videos/&lt;id&gt;/confirm-upload/ on ready video</w:t>
-            </w:r>
-          </w:p>
-        </w:tc>
-        <w:tc>
-          <w:tcPr>
-            <w:tcW w:type="dxa" w:w="3168"/>
-          </w:tcPr>
-          <w:p>
-            <w:r>
-              <w:rPr>
-                <w:sz w:val="19"/>
-              </w:rPr>
-              <w:t>400 — Video already in "ready" state</w:t>
+            <w:tcW w:type="dxa" w:w="2736"/>
+          </w:tcPr>
+          <w:p>
+            <w:r>
+              <w:rPr>
+                <w:sz w:val="19"/>
+              </w:rPr>
+              <w:t>Admin stats — vendor token</w:t>
+            </w:r>
+          </w:p>
+        </w:tc>
+        <w:tc>
+          <w:tcPr>
+            <w:tcW w:type="dxa" w:w="3744"/>
+          </w:tcPr>
+          <w:p>
+            <w:r>
+              <w:rPr>
+                <w:sz w:val="19"/>
+              </w:rPr>
+              <w:t>GET /admin-panel/stats/ — vendor token</w:t>
+            </w:r>
+          </w:p>
+        </w:tc>
+        <w:tc>
+          <w:tcPr>
+            <w:tcW w:type="dxa" w:w="3024"/>
+          </w:tcPr>
+          <w:p>
+            <w:r>
+              <w:rPr>
+                <w:sz w:val="19"/>
+              </w:rPr>
+              <w:t>403 — permission_denied</w:t>
             </w:r>
           </w:p>
         </w:tc>
@@ -20294,7 +21262,7 @@
       <w:tr>
         <w:tc>
           <w:tcPr>
-            <w:tcW w:type="dxa" w:w="2880"/>
+            <w:tcW w:type="dxa" w:w="2736"/>
             <w:shd w:val="clear" w:color="auto" w:fill="DEEAF1"/>
           </w:tcPr>
           <w:p>
@@ -20302,13 +21270,13 @@
               <w:rPr>
                 <w:sz w:val="19"/>
               </w:rPr>
-              <w:t>Duration too long</w:t>
-            </w:r>
-          </w:p>
-        </w:tc>
-        <w:tc>
-          <w:tcPr>
-            <w:tcW w:type="dxa" w:w="3456"/>
+              <w:t>Admin stats — no auth</w:t>
+            </w:r>
+          </w:p>
+        </w:tc>
+        <w:tc>
+          <w:tcPr>
+            <w:tcW w:type="dxa" w:w="3744"/>
             <w:shd w:val="clear" w:color="auto" w:fill="DEEAF1"/>
           </w:tcPr>
           <w:p>
@@ -20316,13 +21284,13 @@
               <w:rPr>
                 <w:sz w:val="19"/>
               </w:rPr>
-              <w:t>POST /videos/&lt;id&gt;/confirm-upload/ — duration_seconds=120</w:t>
-            </w:r>
-          </w:p>
-        </w:tc>
-        <w:tc>
-          <w:tcPr>
-            <w:tcW w:type="dxa" w:w="3168"/>
+              <w:t>GET /admin-panel/stats/ — no header</w:t>
+            </w:r>
+          </w:p>
+        </w:tc>
+        <w:tc>
+          <w:tcPr>
+            <w:tcW w:type="dxa" w:w="3024"/>
             <w:shd w:val="clear" w:color="auto" w:fill="DEEAF1"/>
           </w:tcPr>
           <w:p>
@@ -20330,7 +21298,7 @@
               <w:rPr>
                 <w:sz w:val="19"/>
               </w:rPr>
-              <w:t>400 — cannot exceed 60 seconds</w:t>
+              <w:t>401 — authentication_failed</w:t>
             </w:r>
           </w:p>
         </w:tc>
@@ -20338,40 +21306,40 @@
       <w:tr>
         <w:tc>
           <w:tcPr>
-            <w:tcW w:type="dxa" w:w="2880"/>
-          </w:tcPr>
-          <w:p>
-            <w:r>
-              <w:rPr>
-                <w:sz w:val="19"/>
-              </w:rPr>
-              <w:t>Confirm another vendor video</w:t>
-            </w:r>
-          </w:p>
-        </w:tc>
-        <w:tc>
-          <w:tcPr>
-            <w:tcW w:type="dxa" w:w="3456"/>
-          </w:tcPr>
-          <w:p>
-            <w:r>
-              <w:rPr>
-                <w:sz w:val="19"/>
-              </w:rPr>
-              <w:t>POST /videos/&lt;id&gt;/confirm-upload/ — wrong vendor</w:t>
-            </w:r>
-          </w:p>
-        </w:tc>
-        <w:tc>
-          <w:tcPr>
-            <w:tcW w:type="dxa" w:w="3168"/>
-          </w:tcPr>
-          <w:p>
-            <w:r>
-              <w:rPr>
-                <w:sz w:val="19"/>
-              </w:rPr>
-              <w:t>404 — not_found</w:t>
+            <w:tcW w:type="dxa" w:w="2736"/>
+          </w:tcPr>
+          <w:p>
+            <w:r>
+              <w:rPr>
+                <w:sz w:val="19"/>
+              </w:rPr>
+              <w:t>Store update — wrong UUID</w:t>
+            </w:r>
+          </w:p>
+        </w:tc>
+        <w:tc>
+          <w:tcPr>
+            <w:tcW w:type="dxa" w:w="3744"/>
+          </w:tcPr>
+          <w:p>
+            <w:r>
+              <w:rPr>
+                <w:sz w:val="19"/>
+              </w:rPr>
+              <w:t>PATCH /admin-panel/stores/&lt;bad_uuid&gt;/</w:t>
+            </w:r>
+          </w:p>
+        </w:tc>
+        <w:tc>
+          <w:tcPr>
+            <w:tcW w:type="dxa" w:w="3024"/>
+          </w:tcPr>
+          <w:p>
+            <w:r>
+              <w:rPr>
+                <w:sz w:val="19"/>
+              </w:rPr>
+              <w:t>404 — Store not found</w:t>
             </w:r>
           </w:p>
         </w:tc>
@@ -20379,7 +21347,7 @@
       <w:tr>
         <w:tc>
           <w:tcPr>
-            <w:tcW w:type="dxa" w:w="2880"/>
+            <w:tcW w:type="dxa" w:w="2736"/>
             <w:shd w:val="clear" w:color="auto" w:fill="DEEAF1"/>
           </w:tcPr>
           <w:p>
@@ -20387,13 +21355,13 @@
               <w:rPr>
                 <w:sz w:val="19"/>
               </w:rPr>
-              <w:t>Feed without lat/lng</w:t>
-            </w:r>
-          </w:p>
-        </w:tc>
-        <w:tc>
-          <w:tcPr>
-            <w:tcW w:type="dxa" w:w="3456"/>
+              <w:t>User not found</w:t>
+            </w:r>
+          </w:p>
+        </w:tc>
+        <w:tc>
+          <w:tcPr>
+            <w:tcW w:type="dxa" w:w="3744"/>
             <w:shd w:val="clear" w:color="auto" w:fill="DEEAF1"/>
           </w:tcPr>
           <w:p>
@@ -20401,13 +21369,13 @@
               <w:rPr>
                 <w:sz w:val="19"/>
               </w:rPr>
-              <w:t>GET /videos/feed/ — no ?lat=&amp;lng= params</w:t>
-            </w:r>
-          </w:p>
-        </w:tc>
-        <w:tc>
-          <w:tcPr>
-            <w:tcW w:type="dxa" w:w="3168"/>
+              <w:t>POST /admin-panel/users/&lt;bad_uuid&gt;/toggle-active/</w:t>
+            </w:r>
+          </w:p>
+        </w:tc>
+        <w:tc>
+          <w:tcPr>
+            <w:tcW w:type="dxa" w:w="3024"/>
             <w:shd w:val="clear" w:color="auto" w:fill="DEEAF1"/>
           </w:tcPr>
           <w:p>
@@ -20415,7 +21383,7 @@
               <w:rPr>
                 <w:sz w:val="19"/>
               </w:rPr>
-              <w:t>400 — lat and lng are required numbers</w:t>
+              <w:t>404 — User not found</w:t>
             </w:r>
           </w:p>
         </w:tc>
@@ -20423,40 +21391,40 @@
       <w:tr>
         <w:tc>
           <w:tcPr>
-            <w:tcW w:type="dxa" w:w="2880"/>
-          </w:tcPr>
-          <w:p>
-            <w:r>
-              <w:rPr>
-                <w:sz w:val="19"/>
-              </w:rPr>
-              <w:t>Detail on processing video</w:t>
-            </w:r>
-          </w:p>
-        </w:tc>
-        <w:tc>
-          <w:tcPr>
-            <w:tcW w:type="dxa" w:w="3456"/>
-          </w:tcPr>
-          <w:p>
-            <w:r>
-              <w:rPr>
-                <w:sz w:val="19"/>
-              </w:rPr>
-              <w:t>GET /videos/&lt;id&gt;/ while status=processing</w:t>
-            </w:r>
-          </w:p>
-        </w:tc>
-        <w:tc>
-          <w:tcPr>
-            <w:tcW w:type="dxa" w:w="3168"/>
-          </w:tcPr>
-          <w:p>
-            <w:r>
-              <w:rPr>
-                <w:sz w:val="19"/>
-              </w:rPr>
-              <w:t>404 — not_found (only ready shown)</w:t>
+            <w:tcW w:type="dxa" w:w="2736"/>
+          </w:tcPr>
+          <w:p>
+            <w:r>
+              <w:rPr>
+                <w:sz w:val="19"/>
+              </w:rPr>
+              <w:t>Toggle own account</w:t>
+            </w:r>
+          </w:p>
+        </w:tc>
+        <w:tc>
+          <w:tcPr>
+            <w:tcW w:type="dxa" w:w="3744"/>
+          </w:tcPr>
+          <w:p>
+            <w:r>
+              <w:rPr>
+                <w:sz w:val="19"/>
+              </w:rPr>
+              <w:t>POST /admin-panel/users/&lt;own_id&gt;/toggle-active/</w:t>
+            </w:r>
+          </w:p>
+        </w:tc>
+        <w:tc>
+          <w:tcPr>
+            <w:tcW w:type="dxa" w:w="3024"/>
+          </w:tcPr>
+          <w:p>
+            <w:r>
+              <w:rPr>
+                <w:sz w:val="19"/>
+              </w:rPr>
+              <w:t>400 — Cannot deactivate your own account</w:t>
             </w:r>
           </w:p>
         </w:tc>
@@ -20464,7 +21432,7 @@
       <w:tr>
         <w:tc>
           <w:tcPr>
-            <w:tcW w:type="dxa" w:w="2880"/>
+            <w:tcW w:type="dxa" w:w="2736"/>
             <w:shd w:val="clear" w:color="auto" w:fill="DEEAF1"/>
           </w:tcPr>
           <w:p>
@@ -20472,13 +21440,13 @@
               <w:rPr>
                 <w:sz w:val="19"/>
               </w:rPr>
-              <w:t>Like without auth</w:t>
-            </w:r>
-          </w:p>
-        </w:tc>
-        <w:tc>
-          <w:tcPr>
-            <w:tcW w:type="dxa" w:w="3456"/>
+              <w:t>Store list — vendor token</w:t>
+            </w:r>
+          </w:p>
+        </w:tc>
+        <w:tc>
+          <w:tcPr>
+            <w:tcW w:type="dxa" w:w="3744"/>
             <w:shd w:val="clear" w:color="auto" w:fill="DEEAF1"/>
           </w:tcPr>
           <w:p>
@@ -20486,13 +21454,13 @@
               <w:rPr>
                 <w:sz w:val="19"/>
               </w:rPr>
-              <w:t>POST /videos/&lt;id&gt;/like/ — no auth header</w:t>
-            </w:r>
-          </w:p>
-        </w:tc>
-        <w:tc>
-          <w:tcPr>
-            <w:tcW w:type="dxa" w:w="3168"/>
+              <w:t>GET /admin-panel/stores/ — vendor token</w:t>
+            </w:r>
+          </w:p>
+        </w:tc>
+        <w:tc>
+          <w:tcPr>
+            <w:tcW w:type="dxa" w:w="3024"/>
             <w:shd w:val="clear" w:color="auto" w:fill="DEEAF1"/>
           </w:tcPr>
           <w:p>
@@ -20500,7 +21468,7 @@
               <w:rPr>
                 <w:sz w:val="19"/>
               </w:rPr>
-              <w:t>401 — authentication_failed</w:t>
+              <w:t>403 — permission_denied</w:t>
             </w:r>
           </w:p>
         </w:tc>
@@ -20508,125 +21476,40 @@
       <w:tr>
         <w:tc>
           <w:tcPr>
-            <w:tcW w:type="dxa" w:w="2880"/>
-          </w:tcPr>
-          <w:p>
-            <w:r>
-              <w:rPr>
-                <w:sz w:val="19"/>
-              </w:rPr>
-              <w:t>Update another vendor video</w:t>
-            </w:r>
-          </w:p>
-        </w:tc>
-        <w:tc>
-          <w:tcPr>
-            <w:tcW w:type="dxa" w:w="3456"/>
-          </w:tcPr>
-          <w:p>
-            <w:r>
-              <w:rPr>
-                <w:sz w:val="19"/>
-              </w:rPr>
-              <w:t>PATCH /videos/&lt;id&gt;/update/ — different vendor token</w:t>
-            </w:r>
-          </w:p>
-        </w:tc>
-        <w:tc>
-          <w:tcPr>
-            <w:tcW w:type="dxa" w:w="3168"/>
-          </w:tcPr>
-          <w:p>
-            <w:r>
-              <w:rPr>
-                <w:sz w:val="19"/>
-              </w:rPr>
-              <w:t>404 — not_found</w:t>
-            </w:r>
-          </w:p>
-        </w:tc>
-      </w:tr>
-      <w:tr>
-        <w:tc>
-          <w:tcPr>
-            <w:tcW w:type="dxa" w:w="2880"/>
-            <w:shd w:val="clear" w:color="auto" w:fill="DEEAF1"/>
-          </w:tcPr>
-          <w:p>
-            <w:r>
-              <w:rPr>
-                <w:sz w:val="19"/>
-              </w:rPr>
-              <w:t>Delete another vendor video</w:t>
-            </w:r>
-          </w:p>
-        </w:tc>
-        <w:tc>
-          <w:tcPr>
-            <w:tcW w:type="dxa" w:w="3456"/>
-            <w:shd w:val="clear" w:color="auto" w:fill="DEEAF1"/>
-          </w:tcPr>
-          <w:p>
-            <w:r>
-              <w:rPr>
-                <w:sz w:val="19"/>
-              </w:rPr>
-              <w:t>DELETE /videos/&lt;id&gt;/delete/ — different vendor</w:t>
-            </w:r>
-          </w:p>
-        </w:tc>
-        <w:tc>
-          <w:tcPr>
-            <w:tcW w:type="dxa" w:w="3168"/>
-            <w:shd w:val="clear" w:color="auto" w:fill="DEEAF1"/>
-          </w:tcPr>
-          <w:p>
-            <w:r>
-              <w:rPr>
-                <w:sz w:val="19"/>
-              </w:rPr>
-              <w:t>404 — not_found</w:t>
-            </w:r>
-          </w:p>
-        </w:tc>
-      </w:tr>
-      <w:tr>
-        <w:tc>
-          <w:tcPr>
-            <w:tcW w:type="dxa" w:w="2880"/>
-          </w:tcPr>
-          <w:p>
-            <w:r>
-              <w:rPr>
-                <w:sz w:val="19"/>
-              </w:rPr>
-              <w:t>Delete with customer token</w:t>
-            </w:r>
-          </w:p>
-        </w:tc>
-        <w:tc>
-          <w:tcPr>
-            <w:tcW w:type="dxa" w:w="3456"/>
-          </w:tcPr>
-          <w:p>
-            <w:r>
-              <w:rPr>
-                <w:sz w:val="19"/>
-              </w:rPr>
-              <w:t>DELETE /videos/&lt;id&gt;/delete/ — customer token</w:t>
-            </w:r>
-          </w:p>
-        </w:tc>
-        <w:tc>
-          <w:tcPr>
-            <w:tcW w:type="dxa" w:w="3168"/>
-          </w:tcPr>
-          <w:p>
-            <w:r>
-              <w:rPr>
-                <w:sz w:val="19"/>
-              </w:rPr>
-              <w:t>403 — Vendor access only</w:t>
+            <w:tcW w:type="dxa" w:w="2736"/>
+          </w:tcPr>
+          <w:p>
+            <w:r>
+              <w:rPr>
+                <w:sz w:val="19"/>
+              </w:rPr>
+              <w:t>User list — vendor token</w:t>
+            </w:r>
+          </w:p>
+        </w:tc>
+        <w:tc>
+          <w:tcPr>
+            <w:tcW w:type="dxa" w:w="3744"/>
+          </w:tcPr>
+          <w:p>
+            <w:r>
+              <w:rPr>
+                <w:sz w:val="19"/>
+              </w:rPr>
+              <w:t>GET /admin-panel/users/ — vendor token</w:t>
+            </w:r>
+          </w:p>
+        </w:tc>
+        <w:tc>
+          <w:tcPr>
+            <w:tcW w:type="dxa" w:w="3024"/>
+          </w:tcPr>
+          <w:p>
+            <w:r>
+              <w:rPr>
+                <w:sz w:val="19"/>
+              </w:rPr>
+              <w:t>403 — permission_denied</w:t>
             </w:r>
           </w:p>
         </w:tc>
@@ -20634,559 +21517,11 @@
     </w:tbl>
     <w:p/>
     <w:p>
-      <w:r>
-        <w:br w:type="page"/>
-      </w:r>
-    </w:p>
-    <w:p>
-      <w:pPr>
-        <w:pStyle w:val="Heading1"/>
-      </w:pPr>
-      <w:r>
-        <w:t>5. Postman Quick Setup</w:t>
-      </w:r>
-    </w:p>
-    <w:p>
       <w:pPr>
         <w:pStyle w:val="Heading2"/>
       </w:pPr>
       <w:r>
-        <w:t>Collection Folder Structure (recommended)</w:t>
-      </w:r>
-    </w:p>
-    <w:p>
-      <w:pPr>
-        <w:spacing w:before="40" w:after="40"/>
-        <w:ind w:left="288"/>
-        <w:shd w:val="clear" w:color="auto" w:fill="F0F0F0"/>
-      </w:pPr>
-      <w:r>
-        <w:rPr>
-          <w:rFonts w:ascii="Courier New" w:hAnsi="Courier New"/>
-          <w:color w:val="1A1A8C"/>
-          <w:sz w:val="18"/>
-        </w:rPr>
-        <w:t>NearKart Local</w:t>
-        <w:br/>
-        <w:t>├── 0. Setup</w:t>
-        <w:br/>
-        <w:t>│   └── Health Check</w:t>
-        <w:br/>
-        <w:t>├── 1. Auth</w:t>
-        <w:br/>
-        <w:t>│   ├── Send OTP (Vendor)</w:t>
-        <w:br/>
-        <w:t>│   ├── Verify OTP (Vendor) ← Tests script saves vendor_token</w:t>
-        <w:br/>
-        <w:t>│   ├── Send OTP (Customer)</w:t>
-        <w:br/>
-        <w:t>│   ├── Verify OTP (Customer) ← Tests script saves customer_token + customer_id</w:t>
-        <w:br/>
-        <w:t>│   ├── Get Profile</w:t>
-        <w:br/>
-        <w:t>│   ├── Update Profile</w:t>
-        <w:br/>
-        <w:t>│   ├── Update Location</w:t>
-        <w:br/>
-        <w:t>│   ├── Refresh Token</w:t>
-        <w:br/>
-        <w:t>│   └── Logout</w:t>
-        <w:br/>
-        <w:t>├── 2. Stores</w:t>
-        <w:br/>
-        <w:t>│   ├── Create Store ← Tests script saves store_id</w:t>
-        <w:br/>
-        <w:t>│   ├── Nearby Stores</w:t>
-        <w:br/>
-        <w:t>│   ├── Store Detail</w:t>
-        <w:br/>
-        <w:t>│   ├── Update Store</w:t>
-        <w:br/>
-        <w:t>│   ├── Follow Store</w:t>
-        <w:br/>
-        <w:t>│   ├── Review Store</w:t>
-        <w:br/>
-        <w:t>│   └── QR Code</w:t>
-        <w:br/>
-        <w:t>├── 3. Products</w:t>
-        <w:br/>
-        <w:t>│   ├── Create Product ← Tests script saves product_id</w:t>
-        <w:br/>
-        <w:t>│   ├── Nearby Products</w:t>
-        <w:br/>
-        <w:t>│   ├── Search Products</w:t>
-        <w:br/>
-        <w:t>│   ├── Product Detail</w:t>
-        <w:br/>
-        <w:t>│   ├── Update Product</w:t>
-        <w:br/>
-        <w:t>│   ├── Delete Product</w:t>
-        <w:br/>
-        <w:t>│   └── Wishlist Toggle</w:t>
-        <w:br/>
-        <w:t>├── 4. Videos</w:t>
-        <w:br/>
-        <w:t>│   ├── Request Upload URL ← Tests script saves video_id</w:t>
-        <w:br/>
-        <w:t>│   ├── Confirm Upload</w:t>
-        <w:br/>
-        <w:t>│   ├── My Videos (Vendor Library)</w:t>
-        <w:br/>
-        <w:t>│   ├── Update Video</w:t>
-        <w:br/>
-        <w:t>│   ├── Video Feed</w:t>
-        <w:br/>
-        <w:t>│   ├── Video Detail</w:t>
-        <w:br/>
-        <w:t>│   ├── Like / Unlike Video</w:t>
-        <w:br/>
-        <w:t>│   └── Delete Video</w:t>
-        <w:br/>
-        <w:t>├── 5. Chat</w:t>
-        <w:br/>
-        <w:t>│   ├── Start Conversation ← Tests script saves conversation_id</w:t>
-        <w:br/>
-        <w:t>│   ├── List Conversations (Inbox)</w:t>
-        <w:br/>
-        <w:t>│   ├── Message History</w:t>
-        <w:br/>
-        <w:t>│   ├── Mark as Read</w:t>
-        <w:br/>
-        <w:t>│   └── [WebSocket] Connect + Send  (use Postman WS tab or wscat)</w:t>
-        <w:br/>
-        <w:t>├── 6. Blacklist</w:t>
-        <w:br/>
-        <w:t>│   ├── Block Customer  (vendor token + store_id + customer_id)</w:t>
-        <w:br/>
-        <w:t>│   ├── List Blocked Customers  (vendor token + store_id)</w:t>
-        <w:br/>
-        <w:t>│   └── Unblock Customer  (same endpoint as Block — toggle)</w:t>
-        <w:br/>
-        <w:t>├── 7. Billing</w:t>
-        <w:br/>
-        <w:t>│   ├── List Plans  (no auth required)</w:t>
-        <w:br/>
-        <w:t>│   ├── Wallet Balance  (vendor token)</w:t>
-        <w:br/>
-        <w:t>│   ├── Top Up Wallet  (vendor token + {"amount": "1000.00"})</w:t>
-        <w:br/>
-        <w:t>│   ├── Subscribe to Plan  (vendor token + {"plan_name": "basic"})</w:t>
-        <w:br/>
-        <w:t>│   ├── Subscription Status  (vendor token)</w:t>
-        <w:br/>
-        <w:t>│   └── Transaction History  (vendor token)</w:t>
-        <w:br/>
-        <w:t>└── 8. Analytics + Admin</w:t>
-        <w:br/>
-        <w:t xml:space="preserve">    ├── [Analytics] Vendor Dashboard  (vendor token)</w:t>
-        <w:br/>
-        <w:t xml:space="preserve">    ├── [Analytics] Vendor Video Stats  (vendor token)</w:t>
-        <w:br/>
-        <w:t xml:space="preserve">    ├── [Analytics] Vendor Product Stats  (vendor token)</w:t>
-        <w:br/>
-        <w:t xml:space="preserve">    ├── [Admin] Platform Stats  (admin_token)</w:t>
-        <w:br/>
-        <w:t xml:space="preserve">    ├── [Admin] List All Stores  (admin_token)</w:t>
-        <w:br/>
-        <w:t xml:space="preserve">    ├── [Admin] Verify Store  (admin_token + PATCH {"is_verified": true})</w:t>
-        <w:br/>
-        <w:t xml:space="preserve">    ├── [Admin] List All Users  (admin_token)</w:t>
-        <w:br/>
-        <w:t xml:space="preserve">    └── [Admin] Toggle User Active  (admin_token + POST empty body)</w:t>
-      </w:r>
-    </w:p>
-    <w:p>
-      <w:pPr>
-        <w:pStyle w:val="Heading2"/>
-      </w:pPr>
-      <w:r>
-        <w:t>Auto-Save Token Script  (paste in Tests tab of Verify OTP request)</w:t>
-      </w:r>
-    </w:p>
-    <w:p>
-      <w:pPr>
-        <w:spacing w:before="40" w:after="40"/>
-        <w:ind w:left="288"/>
-        <w:shd w:val="clear" w:color="auto" w:fill="F0F0F0"/>
-      </w:pPr>
-      <w:r>
-        <w:rPr>
-          <w:rFonts w:ascii="Courier New" w:hAnsi="Courier New"/>
-          <w:color w:val="1A1A8C"/>
-          <w:sz w:val="18"/>
-        </w:rPr>
-        <w:t>// For VENDOR verify OTP request:</w:t>
-        <w:br/>
-        <w:t>const r = pm.response.json();</w:t>
-        <w:br/>
-        <w:t>if (r.access) {</w:t>
-        <w:br/>
-        <w:t xml:space="preserve">    pm.environment.set("vendor_token", r.access);</w:t>
-        <w:br/>
-        <w:t xml:space="preserve">    pm.environment.set("vendor_refresh", r.refresh);</w:t>
-        <w:br/>
-        <w:t xml:space="preserve">    console.log("Vendor token saved:", r.access.substring(0, 30) + "...");</w:t>
-        <w:br/>
-        <w:t>}</w:t>
-        <w:br/>
-        <w:br/>
-        <w:t>// For CUSTOMER verify OTP request — use this instead:</w:t>
-        <w:br/>
-        <w:t>// pm.environment.set("customer_token", r.access);</w:t>
-        <w:br/>
-        <w:t>// pm.environment.set("customer_refresh", r.refresh);</w:t>
-      </w:r>
-    </w:p>
-    <w:p>
-      <w:pPr>
-        <w:pStyle w:val="Heading2"/>
-      </w:pPr>
-      <w:r>
-        <w:t>Auto-Save Store ID  (paste in Tests tab of Create Store request)</w:t>
-      </w:r>
-    </w:p>
-    <w:p>
-      <w:pPr>
-        <w:spacing w:before="40" w:after="40"/>
-        <w:ind w:left="288"/>
-        <w:shd w:val="clear" w:color="auto" w:fill="F0F0F0"/>
-      </w:pPr>
-      <w:r>
-        <w:rPr>
-          <w:rFonts w:ascii="Courier New" w:hAnsi="Courier New"/>
-          <w:color w:val="1A1A8C"/>
-          <w:sz w:val="18"/>
-        </w:rPr>
-        <w:t>const r = pm.response.json();</w:t>
-        <w:br/>
-        <w:t>if (r.id) {</w:t>
-        <w:br/>
-        <w:t xml:space="preserve">    pm.environment.set("store_id", r.id);</w:t>
-        <w:br/>
-        <w:t xml:space="preserve">    console.log("store_id saved:", r.id);</w:t>
-        <w:br/>
-        <w:t>}</w:t>
-      </w:r>
-    </w:p>
-    <w:p>
-      <w:pPr>
-        <w:pStyle w:val="Heading2"/>
-      </w:pPr>
-      <w:r>
-        <w:t>Auto-Save Product ID  (paste in Tests tab of Create Product request)</w:t>
-      </w:r>
-    </w:p>
-    <w:p>
-      <w:pPr>
-        <w:spacing w:before="40" w:after="40"/>
-        <w:ind w:left="288"/>
-        <w:shd w:val="clear" w:color="auto" w:fill="F0F0F0"/>
-      </w:pPr>
-      <w:r>
-        <w:rPr>
-          <w:rFonts w:ascii="Courier New" w:hAnsi="Courier New"/>
-          <w:color w:val="1A1A8C"/>
-          <w:sz w:val="18"/>
-        </w:rPr>
-        <w:t>const r = pm.response.json();</w:t>
-        <w:br/>
-        <w:t>if (r.id) {</w:t>
-        <w:br/>
-        <w:t xml:space="preserve">    pm.environment.set("product_id", r.id);</w:t>
-        <w:br/>
-        <w:t xml:space="preserve">    console.log("product_id saved:", r.id);</w:t>
-        <w:br/>
-        <w:t>}</w:t>
-      </w:r>
-    </w:p>
-    <w:p>
-      <w:pPr>
-        <w:pStyle w:val="Heading2"/>
-      </w:pPr>
-      <w:r>
-        <w:t>Auto-Save Video ID  (paste in Tests tab of Request Upload URL request)</w:t>
-      </w:r>
-    </w:p>
-    <w:p>
-      <w:pPr>
-        <w:spacing w:before="40" w:after="40"/>
-        <w:ind w:left="288"/>
-        <w:shd w:val="clear" w:color="auto" w:fill="F0F0F0"/>
-      </w:pPr>
-      <w:r>
-        <w:rPr>
-          <w:rFonts w:ascii="Courier New" w:hAnsi="Courier New"/>
-          <w:color w:val="1A1A8C"/>
-          <w:sz w:val="18"/>
-        </w:rPr>
-        <w:t>const r = pm.response.json();</w:t>
-        <w:br/>
-        <w:t>if (r.video_id) {</w:t>
-        <w:br/>
-        <w:t xml:space="preserve">    pm.environment.set("video_id", r.video_id);</w:t>
-        <w:br/>
-        <w:t xml:space="preserve">    pm.environment.set("upload_url", r.upload_url);</w:t>
-        <w:br/>
-        <w:t xml:space="preserve">    console.log("video_id saved:", r.video_id);</w:t>
-        <w:br/>
-        <w:t>}</w:t>
-      </w:r>
-    </w:p>
-    <w:p>
-      <w:pPr>
-        <w:pStyle w:val="Heading2"/>
-      </w:pPr>
-      <w:r>
-        <w:t>Auto-Save Conversation ID  (paste in Tests tab of Start Conversation request)</w:t>
-      </w:r>
-    </w:p>
-    <w:p>
-      <w:pPr>
-        <w:spacing w:before="40" w:after="40"/>
-        <w:ind w:left="288"/>
-        <w:shd w:val="clear" w:color="auto" w:fill="F0F0F0"/>
-      </w:pPr>
-      <w:r>
-        <w:rPr>
-          <w:rFonts w:ascii="Courier New" w:hAnsi="Courier New"/>
-          <w:color w:val="1A1A8C"/>
-          <w:sz w:val="18"/>
-        </w:rPr>
-        <w:t>const r = pm.response.json();</w:t>
-        <w:br/>
-        <w:t>if (r.id) {</w:t>
-        <w:br/>
-        <w:t xml:space="preserve">    pm.environment.set("conversation_id", r.id);</w:t>
-        <w:br/>
-        <w:t xml:space="preserve">    console.log("conversation_id saved:", r.id);</w:t>
-        <w:br/>
-        <w:t>}</w:t>
-      </w:r>
-    </w:p>
-    <w:p>
-      <w:pPr>
-        <w:pStyle w:val="Heading2"/>
-      </w:pPr>
-      <w:r>
-        <w:t>Auto-Save Customer ID  (paste in Tests tab of Verify OTP Customer request)</w:t>
-      </w:r>
-    </w:p>
-    <w:p>
-      <w:pPr>
-        <w:spacing w:before="40" w:after="40"/>
-        <w:ind w:left="288"/>
-        <w:shd w:val="clear" w:color="auto" w:fill="F0F0F0"/>
-      </w:pPr>
-      <w:r>
-        <w:rPr>
-          <w:rFonts w:ascii="Courier New" w:hAnsi="Courier New"/>
-          <w:color w:val="1A1A8C"/>
-          <w:sz w:val="18"/>
-        </w:rPr>
-        <w:t>// Add this to the existing customer verify OTP Tests script:</w:t>
-        <w:br/>
-        <w:t>const r = pm.response.json();</w:t>
-        <w:br/>
-        <w:t>if (r.user &amp;&amp; r.user.id) {</w:t>
-        <w:br/>
-        <w:t xml:space="preserve">    pm.environment.set("customer_id", r.user.id);</w:t>
-        <w:br/>
-        <w:t xml:space="preserve">    console.log("customer_id saved:", r.user.id);</w:t>
-        <w:br/>
-        <w:t>}</w:t>
-      </w:r>
-    </w:p>
-    <w:p>
-      <w:pPr>
-        <w:ind w:left="288"/>
-        <w:shd w:val="clear" w:color="auto" w:fill="D1ECF1"/>
-      </w:pPr>
-      <w:r>
-        <w:rPr>
-          <w:i/>
-          <w:color w:val="0C5460"/>
-          <w:sz w:val="20"/>
-        </w:rPr>
-        <w:t xml:space="preserve">  💡  customer_id is needed for Sprint 6 blacklist endpoint:</w:t>
-        <w:br/>
-        <w:t xml:space="preserve">  POST /stores/{{store_id}}/blacklist/{{customer_id}}/</w:t>
-      </w:r>
-    </w:p>
-    <w:p>
-      <w:pPr>
-        <w:pStyle w:val="Heading2"/>
-      </w:pPr>
-      <w:r>
-        <w:t>Quick Test — All Public Endpoints via curl</w:t>
-      </w:r>
-    </w:p>
-    <w:p>
-      <w:r>
-        <w:rPr>
-          <w:b w:val="0"/>
-          <w:sz w:val="22"/>
-        </w:rPr>
-        <w:t>Copy-paste these into terminal to test without Postman:</w:t>
-      </w:r>
-    </w:p>
-    <w:p>
-      <w:pPr>
-        <w:spacing w:before="40" w:after="40"/>
-        <w:ind w:left="288"/>
-        <w:shd w:val="clear" w:color="auto" w:fill="F0F0F0"/>
-      </w:pPr>
-      <w:r>
-        <w:rPr>
-          <w:rFonts w:ascii="Courier New" w:hAnsi="Courier New"/>
-          <w:color w:val="1A1A8C"/>
-          <w:sz w:val="18"/>
-        </w:rPr>
-        <w:t># Health check</w:t>
-        <w:br/>
-        <w:t>curl -s http://localhost:8000/api/v1/health/ | python3 -m json.tool</w:t>
-        <w:br/>
-        <w:br/>
-        <w:t># Send OTP</w:t>
-        <w:br/>
-        <w:t>curl -s -X POST http://localhost:8000/api/v1/auth/otp/send/ \</w:t>
-        <w:br/>
-        <w:t xml:space="preserve">  -H "Content-Type: application/json" \</w:t>
-        <w:br/>
-        <w:t xml:space="preserve">  -d '{"phone_number": "+919999999999"}'</w:t>
-        <w:br/>
-        <w:br/>
-        <w:t># Verify OTP (copy access token from response)</w:t>
-        <w:br/>
-        <w:t>curl -s -X POST http://localhost:8000/api/v1/auth/otp/verify/ \</w:t>
-        <w:br/>
-        <w:t xml:space="preserve">  -H "Content-Type: application/json" \</w:t>
-        <w:br/>
-        <w:t xml:space="preserve">  -d '{"phone_number": "+919999999999", "otp": "123456"}'</w:t>
-        <w:br/>
-        <w:br/>
-        <w:t># Get profile (replace TOKEN with your access token)</w:t>
-        <w:br/>
-        <w:t>curl -s http://localhost:8000/api/v1/auth/me/ \</w:t>
-        <w:br/>
-        <w:t xml:space="preserve">  -H "Authorization: Bearer TOKEN"</w:t>
-      </w:r>
-    </w:p>
-    <w:p>
-      <w:r>
-        <w:br w:type="page"/>
-      </w:r>
-    </w:p>
-    <w:p>
-      <w:pPr>
-        <w:pStyle w:val="Heading1"/>
-      </w:pPr>
-      <w:r>
-        <w:t>6. How to Update This Document (Future Sprints)</w:t>
-      </w:r>
-    </w:p>
-    <w:p>
-      <w:pPr>
-        <w:ind w:left="288"/>
-        <w:shd w:val="clear" w:color="auto" w:fill="D1ECF1"/>
-      </w:pPr>
-      <w:r>
-        <w:rPr>
-          <w:i/>
-          <w:color w:val="0C5460"/>
-          <w:sz w:val="20"/>
-        </w:rPr>
-        <w:t xml:space="preserve">  📌  IMPORTANT: When a new sprint adds new API endpoints, update this document.</w:t>
-        <w:br/>
-        <w:t xml:space="preserve">     Do NOT create a separate doc — keep everything in this single file.</w:t>
-      </w:r>
-    </w:p>
-    <w:p/>
-    <w:p>
-      <w:pPr>
-        <w:pStyle w:val="Heading2"/>
-      </w:pPr>
-      <w:r>
-        <w:t>Checklist for each new sprint:</w:t>
-      </w:r>
-    </w:p>
-    <w:p>
-      <w:pPr>
-        <w:pStyle w:val="ListBullet"/>
-        <w:ind w:left="432"/>
-      </w:pPr>
-      <w:r>
-        <w:rPr>
-          <w:sz w:val="21"/>
-        </w:rPr>
-        <w:t>Add new endpoint rows to Section 2 — Complete API Reference table</w:t>
-      </w:r>
-    </w:p>
-    <w:p>
-      <w:pPr>
-        <w:pStyle w:val="ListBullet"/>
-        <w:ind w:left="432"/>
-      </w:pPr>
-      <w:r>
-        <w:rPr>
-          <w:sz w:val="21"/>
-        </w:rPr>
-        <w:t>Add new STEP sections in Section 3 — Step-by-Step Test Flow</w:t>
-      </w:r>
-    </w:p>
-    <w:p>
-      <w:pPr>
-        <w:pStyle w:val="ListBullet"/>
-        <w:ind w:left="432"/>
-      </w:pPr>
-      <w:r>
-        <w:rPr>
-          <w:sz w:val="21"/>
-        </w:rPr>
-        <w:t>Add new error cases in Section 4 — Error Cases to Test</w:t>
-      </w:r>
-    </w:p>
-    <w:p>
-      <w:pPr>
-        <w:pStyle w:val="ListBullet"/>
-        <w:ind w:left="432"/>
-      </w:pPr>
-      <w:r>
-        <w:rPr>
-          <w:sz w:val="21"/>
-        </w:rPr>
-        <w:t>Add new Postman folder in Section 5 — Postman Quick Setup</w:t>
-      </w:r>
-    </w:p>
-    <w:p>
-      <w:pPr>
-        <w:pStyle w:val="ListBullet"/>
-        <w:ind w:left="432"/>
-      </w:pPr>
-      <w:r>
-        <w:rPr>
-          <w:sz w:val="21"/>
-        </w:rPr>
-        <w:t>Update the cover page "Last updated" date and sprint range</w:t>
-      </w:r>
-    </w:p>
-    <w:p>
-      <w:pPr>
-        <w:pStyle w:val="ListBullet"/>
-        <w:ind w:left="432"/>
-      </w:pPr>
-      <w:r>
-        <w:rPr>
-          <w:sz w:val="21"/>
-        </w:rPr>
-        <w:t>If new field types are introduced (e.g. file uploads), add a format rules subsection in Section 1</w:t>
-      </w:r>
-    </w:p>
-    <w:p>
-      <w:pPr>
-        <w:pStyle w:val="Heading2"/>
-      </w:pPr>
-      <w:r>
-        <w:t>Upcoming Sprints to Add Here</w:t>
+        <w:t>Video Error Cases  (Sprint 4)</w:t>
       </w:r>
     </w:p>
     <w:tbl>
@@ -21204,7 +21539,7 @@
       <w:tr>
         <w:tc>
           <w:tcPr>
-            <w:tcW w:type="dxa" w:w="1152"/>
+            <w:tcW w:type="dxa" w:w="2880"/>
             <w:shd w:val="clear" w:color="auto" w:fill="1F4E79"/>
           </w:tcPr>
           <w:p>
@@ -21214,13 +21549,13 @@
                 <w:color w:val="FFFFFF"/>
                 <w:sz w:val="20"/>
               </w:rPr>
-              <w:t>Sprint</w:t>
-            </w:r>
-          </w:p>
-        </w:tc>
-        <w:tc>
-          <w:tcPr>
-            <w:tcW w:type="dxa" w:w="2160"/>
+              <w:t>Test</w:t>
+            </w:r>
+          </w:p>
+        </w:tc>
+        <w:tc>
+          <w:tcPr>
+            <w:tcW w:type="dxa" w:w="3456"/>
             <w:shd w:val="clear" w:color="auto" w:fill="1F4E79"/>
           </w:tcPr>
           <w:p>
@@ -21230,13 +21565,13 @@
                 <w:color w:val="FFFFFF"/>
                 <w:sz w:val="20"/>
               </w:rPr>
-              <w:t>Module</w:t>
-            </w:r>
-          </w:p>
-        </w:tc>
-        <w:tc>
-          <w:tcPr>
-            <w:tcW w:type="dxa" w:w="6048"/>
+              <w:t>Request</w:t>
+            </w:r>
+          </w:p>
+        </w:tc>
+        <w:tc>
+          <w:tcPr>
+            <w:tcW w:type="dxa" w:w="3168"/>
             <w:shd w:val="clear" w:color="auto" w:fill="1F4E79"/>
           </w:tcPr>
           <w:p>
@@ -21246,7 +21581,7 @@
                 <w:color w:val="FFFFFF"/>
                 <w:sz w:val="20"/>
               </w:rPr>
-              <w:t>APIs to Add</w:t>
+              <w:t>Expected Response</w:t>
             </w:r>
           </w:p>
         </w:tc>
@@ -21254,6 +21589,1152 @@
       <w:tr>
         <w:tc>
           <w:tcPr>
+            <w:tcW w:type="dxa" w:w="2880"/>
+            <w:shd w:val="clear" w:color="auto" w:fill="DEEAF1"/>
+          </w:tcPr>
+          <w:p>
+            <w:r>
+              <w:rPr>
+                <w:sz w:val="19"/>
+              </w:rPr>
+              <w:t>No store — request upload</w:t>
+            </w:r>
+          </w:p>
+        </w:tc>
+        <w:tc>
+          <w:tcPr>
+            <w:tcW w:type="dxa" w:w="3456"/>
+            <w:shd w:val="clear" w:color="auto" w:fill="DEEAF1"/>
+          </w:tcPr>
+          <w:p>
+            <w:r>
+              <w:rPr>
+                <w:sz w:val="19"/>
+              </w:rPr>
+              <w:t>POST /videos/request-upload/ before store created</w:t>
+            </w:r>
+          </w:p>
+        </w:tc>
+        <w:tc>
+          <w:tcPr>
+            <w:tcW w:type="dxa" w:w="3168"/>
+            <w:shd w:val="clear" w:color="auto" w:fill="DEEAF1"/>
+          </w:tcPr>
+          <w:p>
+            <w:r>
+              <w:rPr>
+                <w:sz w:val="19"/>
+              </w:rPr>
+              <w:t>400 — Create a store first</w:t>
+            </w:r>
+          </w:p>
+        </w:tc>
+      </w:tr>
+      <w:tr>
+        <w:tc>
+          <w:tcPr>
+            <w:tcW w:type="dxa" w:w="2880"/>
+          </w:tcPr>
+          <w:p>
+            <w:r>
+              <w:rPr>
+                <w:sz w:val="19"/>
+              </w:rPr>
+              <w:t>Missing title</w:t>
+            </w:r>
+          </w:p>
+        </w:tc>
+        <w:tc>
+          <w:tcPr>
+            <w:tcW w:type="dxa" w:w="3456"/>
+          </w:tcPr>
+          <w:p>
+            <w:r>
+              <w:rPr>
+                <w:sz w:val="19"/>
+              </w:rPr>
+              <w:t>POST /videos/request-upload/ with no title field</w:t>
+            </w:r>
+          </w:p>
+        </w:tc>
+        <w:tc>
+          <w:tcPr>
+            <w:tcW w:type="dxa" w:w="3168"/>
+          </w:tcPr>
+          <w:p>
+            <w:r>
+              <w:rPr>
+                <w:sz w:val="19"/>
+              </w:rPr>
+              <w:t>400 — This field is required</w:t>
+            </w:r>
+          </w:p>
+        </w:tc>
+      </w:tr>
+      <w:tr>
+        <w:tc>
+          <w:tcPr>
+            <w:tcW w:type="dxa" w:w="2880"/>
+            <w:shd w:val="clear" w:color="auto" w:fill="DEEAF1"/>
+          </w:tcPr>
+          <w:p>
+            <w:r>
+              <w:rPr>
+                <w:sz w:val="19"/>
+              </w:rPr>
+              <w:t>Customer calls request-upload</w:t>
+            </w:r>
+          </w:p>
+        </w:tc>
+        <w:tc>
+          <w:tcPr>
+            <w:tcW w:type="dxa" w:w="3456"/>
+            <w:shd w:val="clear" w:color="auto" w:fill="DEEAF1"/>
+          </w:tcPr>
+          <w:p>
+            <w:r>
+              <w:rPr>
+                <w:sz w:val="19"/>
+              </w:rPr>
+              <w:t>POST /videos/request-upload/ with customer token</w:t>
+            </w:r>
+          </w:p>
+        </w:tc>
+        <w:tc>
+          <w:tcPr>
+            <w:tcW w:type="dxa" w:w="3168"/>
+            <w:shd w:val="clear" w:color="auto" w:fill="DEEAF1"/>
+          </w:tcPr>
+          <w:p>
+            <w:r>
+              <w:rPr>
+                <w:sz w:val="19"/>
+              </w:rPr>
+              <w:t>403 — Vendor access only</w:t>
+            </w:r>
+          </w:p>
+        </w:tc>
+      </w:tr>
+      <w:tr>
+        <w:tc>
+          <w:tcPr>
+            <w:tcW w:type="dxa" w:w="2880"/>
+          </w:tcPr>
+          <w:p>
+            <w:r>
+              <w:rPr>
+                <w:sz w:val="19"/>
+              </w:rPr>
+              <w:t>Confirm already-ready video</w:t>
+            </w:r>
+          </w:p>
+        </w:tc>
+        <w:tc>
+          <w:tcPr>
+            <w:tcW w:type="dxa" w:w="3456"/>
+          </w:tcPr>
+          <w:p>
+            <w:r>
+              <w:rPr>
+                <w:sz w:val="19"/>
+              </w:rPr>
+              <w:t>POST /videos/&lt;id&gt;/confirm-upload/ on ready video</w:t>
+            </w:r>
+          </w:p>
+        </w:tc>
+        <w:tc>
+          <w:tcPr>
+            <w:tcW w:type="dxa" w:w="3168"/>
+          </w:tcPr>
+          <w:p>
+            <w:r>
+              <w:rPr>
+                <w:sz w:val="19"/>
+              </w:rPr>
+              <w:t>400 — Video already in "ready" state</w:t>
+            </w:r>
+          </w:p>
+        </w:tc>
+      </w:tr>
+      <w:tr>
+        <w:tc>
+          <w:tcPr>
+            <w:tcW w:type="dxa" w:w="2880"/>
+            <w:shd w:val="clear" w:color="auto" w:fill="DEEAF1"/>
+          </w:tcPr>
+          <w:p>
+            <w:r>
+              <w:rPr>
+                <w:sz w:val="19"/>
+              </w:rPr>
+              <w:t>Duration too long</w:t>
+            </w:r>
+          </w:p>
+        </w:tc>
+        <w:tc>
+          <w:tcPr>
+            <w:tcW w:type="dxa" w:w="3456"/>
+            <w:shd w:val="clear" w:color="auto" w:fill="DEEAF1"/>
+          </w:tcPr>
+          <w:p>
+            <w:r>
+              <w:rPr>
+                <w:sz w:val="19"/>
+              </w:rPr>
+              <w:t>POST /videos/&lt;id&gt;/confirm-upload/ — duration_seconds=120</w:t>
+            </w:r>
+          </w:p>
+        </w:tc>
+        <w:tc>
+          <w:tcPr>
+            <w:tcW w:type="dxa" w:w="3168"/>
+            <w:shd w:val="clear" w:color="auto" w:fill="DEEAF1"/>
+          </w:tcPr>
+          <w:p>
+            <w:r>
+              <w:rPr>
+                <w:sz w:val="19"/>
+              </w:rPr>
+              <w:t>400 — cannot exceed 60 seconds</w:t>
+            </w:r>
+          </w:p>
+        </w:tc>
+      </w:tr>
+      <w:tr>
+        <w:tc>
+          <w:tcPr>
+            <w:tcW w:type="dxa" w:w="2880"/>
+          </w:tcPr>
+          <w:p>
+            <w:r>
+              <w:rPr>
+                <w:sz w:val="19"/>
+              </w:rPr>
+              <w:t>Confirm another vendor video</w:t>
+            </w:r>
+          </w:p>
+        </w:tc>
+        <w:tc>
+          <w:tcPr>
+            <w:tcW w:type="dxa" w:w="3456"/>
+          </w:tcPr>
+          <w:p>
+            <w:r>
+              <w:rPr>
+                <w:sz w:val="19"/>
+              </w:rPr>
+              <w:t>POST /videos/&lt;id&gt;/confirm-upload/ — wrong vendor</w:t>
+            </w:r>
+          </w:p>
+        </w:tc>
+        <w:tc>
+          <w:tcPr>
+            <w:tcW w:type="dxa" w:w="3168"/>
+          </w:tcPr>
+          <w:p>
+            <w:r>
+              <w:rPr>
+                <w:sz w:val="19"/>
+              </w:rPr>
+              <w:t>404 — not_found</w:t>
+            </w:r>
+          </w:p>
+        </w:tc>
+      </w:tr>
+      <w:tr>
+        <w:tc>
+          <w:tcPr>
+            <w:tcW w:type="dxa" w:w="2880"/>
+            <w:shd w:val="clear" w:color="auto" w:fill="DEEAF1"/>
+          </w:tcPr>
+          <w:p>
+            <w:r>
+              <w:rPr>
+                <w:sz w:val="19"/>
+              </w:rPr>
+              <w:t>Feed without lat/lng</w:t>
+            </w:r>
+          </w:p>
+        </w:tc>
+        <w:tc>
+          <w:tcPr>
+            <w:tcW w:type="dxa" w:w="3456"/>
+            <w:shd w:val="clear" w:color="auto" w:fill="DEEAF1"/>
+          </w:tcPr>
+          <w:p>
+            <w:r>
+              <w:rPr>
+                <w:sz w:val="19"/>
+              </w:rPr>
+              <w:t>GET /videos/feed/ — no ?lat=&amp;lng= params</w:t>
+            </w:r>
+          </w:p>
+        </w:tc>
+        <w:tc>
+          <w:tcPr>
+            <w:tcW w:type="dxa" w:w="3168"/>
+            <w:shd w:val="clear" w:color="auto" w:fill="DEEAF1"/>
+          </w:tcPr>
+          <w:p>
+            <w:r>
+              <w:rPr>
+                <w:sz w:val="19"/>
+              </w:rPr>
+              <w:t>400 — lat and lng are required numbers</w:t>
+            </w:r>
+          </w:p>
+        </w:tc>
+      </w:tr>
+      <w:tr>
+        <w:tc>
+          <w:tcPr>
+            <w:tcW w:type="dxa" w:w="2880"/>
+          </w:tcPr>
+          <w:p>
+            <w:r>
+              <w:rPr>
+                <w:sz w:val="19"/>
+              </w:rPr>
+              <w:t>Detail on processing video</w:t>
+            </w:r>
+          </w:p>
+        </w:tc>
+        <w:tc>
+          <w:tcPr>
+            <w:tcW w:type="dxa" w:w="3456"/>
+          </w:tcPr>
+          <w:p>
+            <w:r>
+              <w:rPr>
+                <w:sz w:val="19"/>
+              </w:rPr>
+              <w:t>GET /videos/&lt;id&gt;/ while status=processing</w:t>
+            </w:r>
+          </w:p>
+        </w:tc>
+        <w:tc>
+          <w:tcPr>
+            <w:tcW w:type="dxa" w:w="3168"/>
+          </w:tcPr>
+          <w:p>
+            <w:r>
+              <w:rPr>
+                <w:sz w:val="19"/>
+              </w:rPr>
+              <w:t>404 — not_found (only ready shown)</w:t>
+            </w:r>
+          </w:p>
+        </w:tc>
+      </w:tr>
+      <w:tr>
+        <w:tc>
+          <w:tcPr>
+            <w:tcW w:type="dxa" w:w="2880"/>
+            <w:shd w:val="clear" w:color="auto" w:fill="DEEAF1"/>
+          </w:tcPr>
+          <w:p>
+            <w:r>
+              <w:rPr>
+                <w:sz w:val="19"/>
+              </w:rPr>
+              <w:t>Like without auth</w:t>
+            </w:r>
+          </w:p>
+        </w:tc>
+        <w:tc>
+          <w:tcPr>
+            <w:tcW w:type="dxa" w:w="3456"/>
+            <w:shd w:val="clear" w:color="auto" w:fill="DEEAF1"/>
+          </w:tcPr>
+          <w:p>
+            <w:r>
+              <w:rPr>
+                <w:sz w:val="19"/>
+              </w:rPr>
+              <w:t>POST /videos/&lt;id&gt;/like/ — no auth header</w:t>
+            </w:r>
+          </w:p>
+        </w:tc>
+        <w:tc>
+          <w:tcPr>
+            <w:tcW w:type="dxa" w:w="3168"/>
+            <w:shd w:val="clear" w:color="auto" w:fill="DEEAF1"/>
+          </w:tcPr>
+          <w:p>
+            <w:r>
+              <w:rPr>
+                <w:sz w:val="19"/>
+              </w:rPr>
+              <w:t>401 — authentication_failed</w:t>
+            </w:r>
+          </w:p>
+        </w:tc>
+      </w:tr>
+      <w:tr>
+        <w:tc>
+          <w:tcPr>
+            <w:tcW w:type="dxa" w:w="2880"/>
+          </w:tcPr>
+          <w:p>
+            <w:r>
+              <w:rPr>
+                <w:sz w:val="19"/>
+              </w:rPr>
+              <w:t>Update another vendor video</w:t>
+            </w:r>
+          </w:p>
+        </w:tc>
+        <w:tc>
+          <w:tcPr>
+            <w:tcW w:type="dxa" w:w="3456"/>
+          </w:tcPr>
+          <w:p>
+            <w:r>
+              <w:rPr>
+                <w:sz w:val="19"/>
+              </w:rPr>
+              <w:t>PATCH /videos/&lt;id&gt;/update/ — different vendor token</w:t>
+            </w:r>
+          </w:p>
+        </w:tc>
+        <w:tc>
+          <w:tcPr>
+            <w:tcW w:type="dxa" w:w="3168"/>
+          </w:tcPr>
+          <w:p>
+            <w:r>
+              <w:rPr>
+                <w:sz w:val="19"/>
+              </w:rPr>
+              <w:t>404 — not_found</w:t>
+            </w:r>
+          </w:p>
+        </w:tc>
+      </w:tr>
+      <w:tr>
+        <w:tc>
+          <w:tcPr>
+            <w:tcW w:type="dxa" w:w="2880"/>
+            <w:shd w:val="clear" w:color="auto" w:fill="DEEAF1"/>
+          </w:tcPr>
+          <w:p>
+            <w:r>
+              <w:rPr>
+                <w:sz w:val="19"/>
+              </w:rPr>
+              <w:t>Delete another vendor video</w:t>
+            </w:r>
+          </w:p>
+        </w:tc>
+        <w:tc>
+          <w:tcPr>
+            <w:tcW w:type="dxa" w:w="3456"/>
+            <w:shd w:val="clear" w:color="auto" w:fill="DEEAF1"/>
+          </w:tcPr>
+          <w:p>
+            <w:r>
+              <w:rPr>
+                <w:sz w:val="19"/>
+              </w:rPr>
+              <w:t>DELETE /videos/&lt;id&gt;/delete/ — different vendor</w:t>
+            </w:r>
+          </w:p>
+        </w:tc>
+        <w:tc>
+          <w:tcPr>
+            <w:tcW w:type="dxa" w:w="3168"/>
+            <w:shd w:val="clear" w:color="auto" w:fill="DEEAF1"/>
+          </w:tcPr>
+          <w:p>
+            <w:r>
+              <w:rPr>
+                <w:sz w:val="19"/>
+              </w:rPr>
+              <w:t>404 — not_found</w:t>
+            </w:r>
+          </w:p>
+        </w:tc>
+      </w:tr>
+      <w:tr>
+        <w:tc>
+          <w:tcPr>
+            <w:tcW w:type="dxa" w:w="2880"/>
+          </w:tcPr>
+          <w:p>
+            <w:r>
+              <w:rPr>
+                <w:sz w:val="19"/>
+              </w:rPr>
+              <w:t>Delete with customer token</w:t>
+            </w:r>
+          </w:p>
+        </w:tc>
+        <w:tc>
+          <w:tcPr>
+            <w:tcW w:type="dxa" w:w="3456"/>
+          </w:tcPr>
+          <w:p>
+            <w:r>
+              <w:rPr>
+                <w:sz w:val="19"/>
+              </w:rPr>
+              <w:t>DELETE /videos/&lt;id&gt;/delete/ — customer token</w:t>
+            </w:r>
+          </w:p>
+        </w:tc>
+        <w:tc>
+          <w:tcPr>
+            <w:tcW w:type="dxa" w:w="3168"/>
+          </w:tcPr>
+          <w:p>
+            <w:r>
+              <w:rPr>
+                <w:sz w:val="19"/>
+              </w:rPr>
+              <w:t>403 — Vendor access only</w:t>
+            </w:r>
+          </w:p>
+        </w:tc>
+      </w:tr>
+    </w:tbl>
+    <w:p/>
+    <w:p>
+      <w:r>
+        <w:br w:type="page"/>
+      </w:r>
+    </w:p>
+    <w:p>
+      <w:pPr>
+        <w:pStyle w:val="Heading1"/>
+      </w:pPr>
+      <w:r>
+        <w:t>5. Postman Quick Setup</w:t>
+      </w:r>
+    </w:p>
+    <w:p>
+      <w:pPr>
+        <w:pStyle w:val="Heading2"/>
+      </w:pPr>
+      <w:r>
+        <w:t>Collection Folder Structure (recommended)</w:t>
+      </w:r>
+    </w:p>
+    <w:p>
+      <w:pPr>
+        <w:spacing w:before="40" w:after="40"/>
+        <w:ind w:left="288"/>
+        <w:shd w:val="clear" w:color="auto" w:fill="F0F0F0"/>
+      </w:pPr>
+      <w:r>
+        <w:rPr>
+          <w:rFonts w:ascii="Courier New" w:hAnsi="Courier New"/>
+          <w:color w:val="1A1A8C"/>
+          <w:sz w:val="18"/>
+        </w:rPr>
+        <w:t>NearKart Local</w:t>
+        <w:br/>
+        <w:t>├── 0. Setup</w:t>
+        <w:br/>
+        <w:t>│   └── Health Check</w:t>
+        <w:br/>
+        <w:t>├── 1. Auth</w:t>
+        <w:br/>
+        <w:t>│   ├── Send OTP (Vendor)</w:t>
+        <w:br/>
+        <w:t>│   ├── Verify OTP (Vendor) ← Tests script saves vendor_token</w:t>
+        <w:br/>
+        <w:t>│   ├── Send OTP (Customer)</w:t>
+        <w:br/>
+        <w:t>│   ├── Verify OTP (Customer) ← Tests script saves customer_token + customer_id</w:t>
+        <w:br/>
+        <w:t>│   ├── Get Profile</w:t>
+        <w:br/>
+        <w:t>│   ├── Update Profile</w:t>
+        <w:br/>
+        <w:t>│   ├── Update Location</w:t>
+        <w:br/>
+        <w:t>│   ├── Refresh Token</w:t>
+        <w:br/>
+        <w:t>│   └── Logout</w:t>
+        <w:br/>
+        <w:t>├── 2. Stores</w:t>
+        <w:br/>
+        <w:t>│   ├── Create Store ← Tests script saves store_id</w:t>
+        <w:br/>
+        <w:t>│   ├── Nearby Stores</w:t>
+        <w:br/>
+        <w:t>│   ├── Store Detail</w:t>
+        <w:br/>
+        <w:t>│   ├── Update Store</w:t>
+        <w:br/>
+        <w:t>│   ├── Follow Store</w:t>
+        <w:br/>
+        <w:t>│   ├── Review Store</w:t>
+        <w:br/>
+        <w:t>│   └── QR Code</w:t>
+        <w:br/>
+        <w:t>├── 3. Products</w:t>
+        <w:br/>
+        <w:t>│   ├── Create Product ← Tests script saves product_id</w:t>
+        <w:br/>
+        <w:t>│   ├── Nearby Products</w:t>
+        <w:br/>
+        <w:t>│   ├── Search Products</w:t>
+        <w:br/>
+        <w:t>│   ├── Product Detail</w:t>
+        <w:br/>
+        <w:t>│   ├── Update Product</w:t>
+        <w:br/>
+        <w:t>│   ├── Delete Product</w:t>
+        <w:br/>
+        <w:t>│   └── Wishlist Toggle</w:t>
+        <w:br/>
+        <w:t>├── 4. Videos</w:t>
+        <w:br/>
+        <w:t>│   ├── Request Upload URL ← Tests script saves video_id</w:t>
+        <w:br/>
+        <w:t>│   ├── Confirm Upload</w:t>
+        <w:br/>
+        <w:t>│   ├── My Videos (Vendor Library)</w:t>
+        <w:br/>
+        <w:t>│   ├── Update Video</w:t>
+        <w:br/>
+        <w:t>│   ├── Video Feed</w:t>
+        <w:br/>
+        <w:t>│   ├── Video Detail</w:t>
+        <w:br/>
+        <w:t>│   ├── Like / Unlike Video</w:t>
+        <w:br/>
+        <w:t>│   └── Delete Video</w:t>
+        <w:br/>
+        <w:t>├── 5. Chat</w:t>
+        <w:br/>
+        <w:t>│   ├── Start Conversation ← Tests script saves conversation_id</w:t>
+        <w:br/>
+        <w:t>│   ├── List Conversations (Inbox)</w:t>
+        <w:br/>
+        <w:t>│   ├── Message History</w:t>
+        <w:br/>
+        <w:t>│   ├── Mark as Read</w:t>
+        <w:br/>
+        <w:t>│   └── [WebSocket] Connect + Send  (use Postman WS tab or wscat)</w:t>
+        <w:br/>
+        <w:t>├── 6. Blacklist</w:t>
+        <w:br/>
+        <w:t>│   ├── Block Customer  (vendor token + store_id + customer_id)</w:t>
+        <w:br/>
+        <w:t>│   ├── List Blocked Customers  (vendor token + store_id)</w:t>
+        <w:br/>
+        <w:t>│   └── Unblock Customer  (same endpoint as Block — toggle)</w:t>
+        <w:br/>
+        <w:t>├── 7. Billing</w:t>
+        <w:br/>
+        <w:t>│   ├── List Plans  (no auth required)</w:t>
+        <w:br/>
+        <w:t>│   ├── Wallet Balance  (vendor token)</w:t>
+        <w:br/>
+        <w:t>│   ├── Top Up Wallet  (vendor token + {"amount": "1000.00"})</w:t>
+        <w:br/>
+        <w:t>│   ├── Subscribe to Plan  (vendor token + {"plan_name": "basic"})</w:t>
+        <w:br/>
+        <w:t>│   ├── Subscription Status  (vendor token)</w:t>
+        <w:br/>
+        <w:t>│   └── Transaction History  (vendor token)</w:t>
+        <w:br/>
+        <w:t>├── 8. Analytics + Admin</w:t>
+        <w:br/>
+        <w:t>│   ├── [Analytics] Vendor Dashboard  (vendor token)</w:t>
+        <w:br/>
+        <w:t>│   ├── [Analytics] Vendor Video Stats  (vendor token)</w:t>
+        <w:br/>
+        <w:t>│   ├── [Analytics] Vendor Product Stats  (vendor token)</w:t>
+        <w:br/>
+        <w:t>│   ├── [Admin] Platform Stats  (admin_token)</w:t>
+        <w:br/>
+        <w:t>│   ├── [Admin] List All Stores  (admin_token)</w:t>
+        <w:br/>
+        <w:t>│   ├── [Admin] Verify Store  (admin_token + PATCH {"is_verified": true})</w:t>
+        <w:br/>
+        <w:t>│   ├── [Admin] List All Users  (admin_token)</w:t>
+        <w:br/>
+        <w:t>│   └── [Admin] Toggle User Active  (admin_token + POST empty body)</w:t>
+        <w:br/>
+        <w:t>└── 9. Reservations</w:t>
+        <w:br/>
+        <w:t xml:space="preserve">    ├── Create Reservation  (customer_token + store_id + product_id)</w:t>
+        <w:br/>
+        <w:t xml:space="preserve">    ├── List Reservations  (customer_token → own / vendor_token → store's)</w:t>
+        <w:br/>
+        <w:t xml:space="preserve">    ├── Reservation Detail  (customer_token or vendor_token)</w:t>
+        <w:br/>
+        <w:t xml:space="preserve">    ├── Update Status — Confirm  (vendor_token + {"status": "confirmed"})</w:t>
+        <w:br/>
+        <w:t xml:space="preserve">    ├── Update Status — Complete  (vendor_token + {"status": "completed"})</w:t>
+        <w:br/>
+        <w:t xml:space="preserve">    ├── Update Status — Cancel  (vendor_token + {"status": "cancelled"})</w:t>
+        <w:br/>
+        <w:t xml:space="preserve">    └── Customer Cancel  (customer_token + POST empty body)</w:t>
+      </w:r>
+    </w:p>
+    <w:p>
+      <w:pPr>
+        <w:pStyle w:val="Heading2"/>
+      </w:pPr>
+      <w:r>
+        <w:t>Auto-Save Token Script  (paste in Tests tab of Verify OTP request)</w:t>
+      </w:r>
+    </w:p>
+    <w:p>
+      <w:pPr>
+        <w:spacing w:before="40" w:after="40"/>
+        <w:ind w:left="288"/>
+        <w:shd w:val="clear" w:color="auto" w:fill="F0F0F0"/>
+      </w:pPr>
+      <w:r>
+        <w:rPr>
+          <w:rFonts w:ascii="Courier New" w:hAnsi="Courier New"/>
+          <w:color w:val="1A1A8C"/>
+          <w:sz w:val="18"/>
+        </w:rPr>
+        <w:t>// For VENDOR verify OTP request:</w:t>
+        <w:br/>
+        <w:t>const r = pm.response.json();</w:t>
+        <w:br/>
+        <w:t>if (r.access) {</w:t>
+        <w:br/>
+        <w:t xml:space="preserve">    pm.environment.set("vendor_token", r.access);</w:t>
+        <w:br/>
+        <w:t xml:space="preserve">    pm.environment.set("vendor_refresh", r.refresh);</w:t>
+        <w:br/>
+        <w:t xml:space="preserve">    console.log("Vendor token saved:", r.access.substring(0, 30) + "...");</w:t>
+        <w:br/>
+        <w:t>}</w:t>
+        <w:br/>
+        <w:br/>
+        <w:t>// For CUSTOMER verify OTP request — use this instead:</w:t>
+        <w:br/>
+        <w:t>// pm.environment.set("customer_token", r.access);</w:t>
+        <w:br/>
+        <w:t>// pm.environment.set("customer_refresh", r.refresh);</w:t>
+      </w:r>
+    </w:p>
+    <w:p>
+      <w:pPr>
+        <w:pStyle w:val="Heading2"/>
+      </w:pPr>
+      <w:r>
+        <w:t>Auto-Save Store ID  (paste in Tests tab of Create Store request)</w:t>
+      </w:r>
+    </w:p>
+    <w:p>
+      <w:pPr>
+        <w:spacing w:before="40" w:after="40"/>
+        <w:ind w:left="288"/>
+        <w:shd w:val="clear" w:color="auto" w:fill="F0F0F0"/>
+      </w:pPr>
+      <w:r>
+        <w:rPr>
+          <w:rFonts w:ascii="Courier New" w:hAnsi="Courier New"/>
+          <w:color w:val="1A1A8C"/>
+          <w:sz w:val="18"/>
+        </w:rPr>
+        <w:t>const r = pm.response.json();</w:t>
+        <w:br/>
+        <w:t>if (r.id) {</w:t>
+        <w:br/>
+        <w:t xml:space="preserve">    pm.environment.set("store_id", r.id);</w:t>
+        <w:br/>
+        <w:t xml:space="preserve">    console.log("store_id saved:", r.id);</w:t>
+        <w:br/>
+        <w:t>}</w:t>
+      </w:r>
+    </w:p>
+    <w:p>
+      <w:pPr>
+        <w:pStyle w:val="Heading2"/>
+      </w:pPr>
+      <w:r>
+        <w:t>Auto-Save Product ID  (paste in Tests tab of Create Product request)</w:t>
+      </w:r>
+    </w:p>
+    <w:p>
+      <w:pPr>
+        <w:spacing w:before="40" w:after="40"/>
+        <w:ind w:left="288"/>
+        <w:shd w:val="clear" w:color="auto" w:fill="F0F0F0"/>
+      </w:pPr>
+      <w:r>
+        <w:rPr>
+          <w:rFonts w:ascii="Courier New" w:hAnsi="Courier New"/>
+          <w:color w:val="1A1A8C"/>
+          <w:sz w:val="18"/>
+        </w:rPr>
+        <w:t>const r = pm.response.json();</w:t>
+        <w:br/>
+        <w:t>if (r.id) {</w:t>
+        <w:br/>
+        <w:t xml:space="preserve">    pm.environment.set("product_id", r.id);</w:t>
+        <w:br/>
+        <w:t xml:space="preserve">    console.log("product_id saved:", r.id);</w:t>
+        <w:br/>
+        <w:t>}</w:t>
+      </w:r>
+    </w:p>
+    <w:p>
+      <w:pPr>
+        <w:pStyle w:val="Heading2"/>
+      </w:pPr>
+      <w:r>
+        <w:t>Auto-Save Video ID  (paste in Tests tab of Request Upload URL request)</w:t>
+      </w:r>
+    </w:p>
+    <w:p>
+      <w:pPr>
+        <w:spacing w:before="40" w:after="40"/>
+        <w:ind w:left="288"/>
+        <w:shd w:val="clear" w:color="auto" w:fill="F0F0F0"/>
+      </w:pPr>
+      <w:r>
+        <w:rPr>
+          <w:rFonts w:ascii="Courier New" w:hAnsi="Courier New"/>
+          <w:color w:val="1A1A8C"/>
+          <w:sz w:val="18"/>
+        </w:rPr>
+        <w:t>const r = pm.response.json();</w:t>
+        <w:br/>
+        <w:t>if (r.video_id) {</w:t>
+        <w:br/>
+        <w:t xml:space="preserve">    pm.environment.set("video_id", r.video_id);</w:t>
+        <w:br/>
+        <w:t xml:space="preserve">    pm.environment.set("upload_url", r.upload_url);</w:t>
+        <w:br/>
+        <w:t xml:space="preserve">    console.log("video_id saved:", r.video_id);</w:t>
+        <w:br/>
+        <w:t>}</w:t>
+      </w:r>
+    </w:p>
+    <w:p>
+      <w:pPr>
+        <w:pStyle w:val="Heading2"/>
+      </w:pPr>
+      <w:r>
+        <w:t>Auto-Save Conversation ID  (paste in Tests tab of Start Conversation request)</w:t>
+      </w:r>
+    </w:p>
+    <w:p>
+      <w:pPr>
+        <w:spacing w:before="40" w:after="40"/>
+        <w:ind w:left="288"/>
+        <w:shd w:val="clear" w:color="auto" w:fill="F0F0F0"/>
+      </w:pPr>
+      <w:r>
+        <w:rPr>
+          <w:rFonts w:ascii="Courier New" w:hAnsi="Courier New"/>
+          <w:color w:val="1A1A8C"/>
+          <w:sz w:val="18"/>
+        </w:rPr>
+        <w:t>const r = pm.response.json();</w:t>
+        <w:br/>
+        <w:t>if (r.id) {</w:t>
+        <w:br/>
+        <w:t xml:space="preserve">    pm.environment.set("conversation_id", r.id);</w:t>
+        <w:br/>
+        <w:t xml:space="preserve">    console.log("conversation_id saved:", r.id);</w:t>
+        <w:br/>
+        <w:t>}</w:t>
+      </w:r>
+    </w:p>
+    <w:p>
+      <w:pPr>
+        <w:pStyle w:val="Heading2"/>
+      </w:pPr>
+      <w:r>
+        <w:t>Auto-Save Customer ID  (paste in Tests tab of Verify OTP Customer request)</w:t>
+      </w:r>
+    </w:p>
+    <w:p>
+      <w:pPr>
+        <w:spacing w:before="40" w:after="40"/>
+        <w:ind w:left="288"/>
+        <w:shd w:val="clear" w:color="auto" w:fill="F0F0F0"/>
+      </w:pPr>
+      <w:r>
+        <w:rPr>
+          <w:rFonts w:ascii="Courier New" w:hAnsi="Courier New"/>
+          <w:color w:val="1A1A8C"/>
+          <w:sz w:val="18"/>
+        </w:rPr>
+        <w:t>// Add this to the existing customer verify OTP Tests script:</w:t>
+        <w:br/>
+        <w:t>const r = pm.response.json();</w:t>
+        <w:br/>
+        <w:t>if (r.user &amp;&amp; r.user.id) {</w:t>
+        <w:br/>
+        <w:t xml:space="preserve">    pm.environment.set("customer_id", r.user.id);</w:t>
+        <w:br/>
+        <w:t xml:space="preserve">    console.log("customer_id saved:", r.user.id);</w:t>
+        <w:br/>
+        <w:t>}</w:t>
+      </w:r>
+    </w:p>
+    <w:p>
+      <w:pPr>
+        <w:ind w:left="288"/>
+        <w:shd w:val="clear" w:color="auto" w:fill="D1ECF1"/>
+      </w:pPr>
+      <w:r>
+        <w:rPr>
+          <w:i/>
+          <w:color w:val="0C5460"/>
+          <w:sz w:val="20"/>
+        </w:rPr>
+        <w:t xml:space="preserve">  💡  customer_id is needed for Sprint 6 blacklist endpoint:</w:t>
+        <w:br/>
+        <w:t xml:space="preserve">  POST /stores/{{store_id}}/blacklist/{{customer_id}}/</w:t>
+      </w:r>
+    </w:p>
+    <w:p>
+      <w:pPr>
+        <w:pStyle w:val="Heading2"/>
+      </w:pPr>
+      <w:r>
+        <w:t>Quick Test — All Public Endpoints via curl</w:t>
+      </w:r>
+    </w:p>
+    <w:p>
+      <w:r>
+        <w:rPr>
+          <w:b w:val="0"/>
+          <w:sz w:val="22"/>
+        </w:rPr>
+        <w:t>Copy-paste these into terminal to test without Postman:</w:t>
+      </w:r>
+    </w:p>
+    <w:p>
+      <w:pPr>
+        <w:spacing w:before="40" w:after="40"/>
+        <w:ind w:left="288"/>
+        <w:shd w:val="clear" w:color="auto" w:fill="F0F0F0"/>
+      </w:pPr>
+      <w:r>
+        <w:rPr>
+          <w:rFonts w:ascii="Courier New" w:hAnsi="Courier New"/>
+          <w:color w:val="1A1A8C"/>
+          <w:sz w:val="18"/>
+        </w:rPr>
+        <w:t># Health check</w:t>
+        <w:br/>
+        <w:t>curl -s http://localhost:8000/api/v1/health/ | python3 -m json.tool</w:t>
+        <w:br/>
+        <w:br/>
+        <w:t># Send OTP</w:t>
+        <w:br/>
+        <w:t>curl -s -X POST http://localhost:8000/api/v1/auth/otp/send/ \</w:t>
+        <w:br/>
+        <w:t xml:space="preserve">  -H "Content-Type: application/json" \</w:t>
+        <w:br/>
+        <w:t xml:space="preserve">  -d '{"phone_number": "+919999999999"}'</w:t>
+        <w:br/>
+        <w:br/>
+        <w:t># Verify OTP (copy access token from response)</w:t>
+        <w:br/>
+        <w:t>curl -s -X POST http://localhost:8000/api/v1/auth/otp/verify/ \</w:t>
+        <w:br/>
+        <w:t xml:space="preserve">  -H "Content-Type: application/json" \</w:t>
+        <w:br/>
+        <w:t xml:space="preserve">  -d '{"phone_number": "+919999999999", "otp": "123456"}'</w:t>
+        <w:br/>
+        <w:br/>
+        <w:t># Get profile (replace TOKEN with your access token)</w:t>
+        <w:br/>
+        <w:t>curl -s http://localhost:8000/api/v1/auth/me/ \</w:t>
+        <w:br/>
+        <w:t xml:space="preserve">  -H "Authorization: Bearer TOKEN"</w:t>
+      </w:r>
+    </w:p>
+    <w:p>
+      <w:r>
+        <w:br w:type="page"/>
+      </w:r>
+    </w:p>
+    <w:p>
+      <w:pPr>
+        <w:pStyle w:val="Heading1"/>
+      </w:pPr>
+      <w:r>
+        <w:t>6. How to Update This Document (Future Sprints)</w:t>
+      </w:r>
+    </w:p>
+    <w:p>
+      <w:pPr>
+        <w:ind w:left="288"/>
+        <w:shd w:val="clear" w:color="auto" w:fill="D1ECF1"/>
+      </w:pPr>
+      <w:r>
+        <w:rPr>
+          <w:i/>
+          <w:color w:val="0C5460"/>
+          <w:sz w:val="20"/>
+        </w:rPr>
+        <w:t xml:space="preserve">  📌  IMPORTANT: When a new sprint adds new API endpoints, update this document.</w:t>
+        <w:br/>
+        <w:t xml:space="preserve">     Do NOT create a separate doc — keep everything in this single file.</w:t>
+      </w:r>
+    </w:p>
+    <w:p/>
+    <w:p>
+      <w:pPr>
+        <w:pStyle w:val="Heading2"/>
+      </w:pPr>
+      <w:r>
+        <w:t>Checklist for each new sprint:</w:t>
+      </w:r>
+    </w:p>
+    <w:p>
+      <w:pPr>
+        <w:pStyle w:val="ListBullet"/>
+        <w:ind w:left="432"/>
+      </w:pPr>
+      <w:r>
+        <w:rPr>
+          <w:sz w:val="21"/>
+        </w:rPr>
+        <w:t>Add new endpoint rows to Section 2 — Complete API Reference table</w:t>
+      </w:r>
+    </w:p>
+    <w:p>
+      <w:pPr>
+        <w:pStyle w:val="ListBullet"/>
+        <w:ind w:left="432"/>
+      </w:pPr>
+      <w:r>
+        <w:rPr>
+          <w:sz w:val="21"/>
+        </w:rPr>
+        <w:t>Add new STEP sections in Section 3 — Step-by-Step Test Flow</w:t>
+      </w:r>
+    </w:p>
+    <w:p>
+      <w:pPr>
+        <w:pStyle w:val="ListBullet"/>
+        <w:ind w:left="432"/>
+      </w:pPr>
+      <w:r>
+        <w:rPr>
+          <w:sz w:val="21"/>
+        </w:rPr>
+        <w:t>Add new error cases in Section 4 — Error Cases to Test</w:t>
+      </w:r>
+    </w:p>
+    <w:p>
+      <w:pPr>
+        <w:pStyle w:val="ListBullet"/>
+        <w:ind w:left="432"/>
+      </w:pPr>
+      <w:r>
+        <w:rPr>
+          <w:sz w:val="21"/>
+        </w:rPr>
+        <w:t>Add new Postman folder in Section 5 — Postman Quick Setup</w:t>
+      </w:r>
+    </w:p>
+    <w:p>
+      <w:pPr>
+        <w:pStyle w:val="ListBullet"/>
+        <w:ind w:left="432"/>
+      </w:pPr>
+      <w:r>
+        <w:rPr>
+          <w:sz w:val="21"/>
+        </w:rPr>
+        <w:t>Update the cover page "Last updated" date and sprint range</w:t>
+      </w:r>
+    </w:p>
+    <w:p>
+      <w:pPr>
+        <w:pStyle w:val="ListBullet"/>
+        <w:ind w:left="432"/>
+      </w:pPr>
+      <w:r>
+        <w:rPr>
+          <w:sz w:val="21"/>
+        </w:rPr>
+        <w:t>If new field types are introduced (e.g. file uploads), add a format rules subsection in Section 1</w:t>
+      </w:r>
+    </w:p>
+    <w:p>
+      <w:pPr>
+        <w:pStyle w:val="Heading2"/>
+      </w:pPr>
+      <w:r>
+        <w:t>Upcoming Sprints to Add Here</w:t>
+      </w:r>
+    </w:p>
+    <w:tbl>
+      <w:tblPr>
+        <w:tblStyle w:val="TableGrid"/>
+        <w:tblW w:type="auto" w:w="0"/>
+        <w:jc w:val="left"/>
+        <w:tblLook w:firstColumn="1" w:firstRow="1" w:lastColumn="0" w:lastRow="0" w:noHBand="0" w:noVBand="1" w:val="04A0"/>
+      </w:tblPr>
+      <w:tblGrid>
+        <w:gridCol w:w="3216"/>
+        <w:gridCol w:w="3216"/>
+        <w:gridCol w:w="3216"/>
+      </w:tblGrid>
+      <w:tr>
+        <w:tc>
+          <w:tcPr>
+            <w:tcW w:type="dxa" w:w="1152"/>
+            <w:shd w:val="clear" w:color="auto" w:fill="1F4E79"/>
+          </w:tcPr>
+          <w:p>
+            <w:r>
+              <w:rPr>
+                <w:b/>
+                <w:color w:val="FFFFFF"/>
+                <w:sz w:val="20"/>
+              </w:rPr>
+              <w:t>Sprint</w:t>
+            </w:r>
+          </w:p>
+        </w:tc>
+        <w:tc>
+          <w:tcPr>
+            <w:tcW w:type="dxa" w:w="2160"/>
+            <w:shd w:val="clear" w:color="auto" w:fill="1F4E79"/>
+          </w:tcPr>
+          <w:p>
+            <w:r>
+              <w:rPr>
+                <w:b/>
+                <w:color w:val="FFFFFF"/>
+                <w:sz w:val="20"/>
+              </w:rPr>
+              <w:t>Module</w:t>
+            </w:r>
+          </w:p>
+        </w:tc>
+        <w:tc>
+          <w:tcPr>
+            <w:tcW w:type="dxa" w:w="6048"/>
+            <w:shd w:val="clear" w:color="auto" w:fill="1F4E79"/>
+          </w:tcPr>
+          <w:p>
+            <w:r>
+              <w:rPr>
+                <w:b/>
+                <w:color w:val="FFFFFF"/>
+                <w:sz w:val="20"/>
+              </w:rPr>
+              <w:t>APIs to Add</w:t>
+            </w:r>
+          </w:p>
+        </w:tc>
+      </w:tr>
+      <w:tr>
+        <w:tc>
+          <w:tcPr>
             <w:tcW w:type="dxa" w:w="1152"/>
             <w:shd w:val="clear" w:color="auto" w:fill="DEEAF1"/>
           </w:tcPr>
@@ -21501,7 +22982,7 @@
               <w:rPr>
                 <w:sz w:val="19"/>
               </w:rPr>
-              <w:t>POST /reservations/, GET /reservations/, PUT /reservations/&lt;id&gt;/status/</w:t>
+              <w:t>✅ DONE — Steps 54–58 in this document</w:t>
             </w:r>
           </w:p>
         </w:tc>
@@ -21733,7 +23214,7 @@
           <w:color w:val="999999"/>
           <w:sz w:val="18"/>
         </w:rPr>
-        <w:t>NearKart Backend — Master API Testing Guide   |   Sprint 1–8   |   Use Postman or curl for testing</w:t>
+        <w:t>NearKart Backend — Master API Testing Guide   |   Sprint 1–9   |   Use Postman or curl for testing</w:t>
       </w:r>
     </w:p>
     <w:sectPr>

</xml_diff>

<commit_message>
Docs: add Mobile Sprint 3 API appendix (Steps 80–85) to Master Guide
- Mobile Sprint 3 section: search products, store detail, follow,
  product detail, reserve, and wishlist endpoints with request/response
  examples and Postman tips
- Roadmap table updated to include Mobile Sprint 3 as Done ✅
- Footer updated to Sprint 1–12 + Mobile Sprint 3

Co-Authored-By: Claude Sonnet 4.6 <noreply@anthropic.com>
</commit_message>
<xml_diff>
--- a/nearkart_backend/docs/NearKart_Master_API_Testing_Guide.docx
+++ b/nearkart_backend/docs/NearKart_Master_API_Testing_Guide.docx
@@ -31522,6 +31522,1743 @@
           </w:p>
         </w:tc>
       </w:tr>
+      <w:tr>
+        <w:tc>
+          <w:tcPr>
+            <w:tcW w:type="dxa" w:w="1152"/>
+          </w:tcPr>
+          <w:p>
+            <w:r>
+              <w:rPr>
+                <w:sz w:val="19"/>
+              </w:rPr>
+              <w:t>Mobile S3</w:t>
+            </w:r>
+          </w:p>
+        </w:tc>
+        <w:tc>
+          <w:tcPr>
+            <w:tcW w:type="dxa" w:w="2160"/>
+          </w:tcPr>
+          <w:p>
+            <w:r>
+              <w:rPr>
+                <w:sz w:val="19"/>
+              </w:rPr>
+              <w:t>Search + Store + Product</w:t>
+            </w:r>
+          </w:p>
+        </w:tc>
+        <w:tc>
+          <w:tcPr>
+            <w:tcW w:type="dxa" w:w="6048"/>
+          </w:tcPr>
+          <w:p>
+            <w:r>
+              <w:rPr>
+                <w:sz w:val="19"/>
+              </w:rPr>
+              <w:t>✅ DONE — Steps 80–85 in this document</w:t>
+            </w:r>
+          </w:p>
+        </w:tc>
+      </w:tr>
+    </w:tbl>
+    <w:p/>
+    <w:p>
+      <w:r>
+        <w:br w:type="page"/>
+      </w:r>
+    </w:p>
+    <w:p>
+      <w:pPr>
+        <w:pStyle w:val="Heading1"/>
+      </w:pPr>
+      <w:r>
+        <w:t>Mobile Sprint 3 — Search · Store Detail · Product Detail</w:t>
+      </w:r>
+    </w:p>
+    <w:p>
+      <w:r>
+        <w:rPr>
+          <w:b w:val="0"/>
+          <w:sz w:val="22"/>
+        </w:rPr>
+        <w:t>These steps map to Customer Screens C8, C9, C10 in the Android (Kotlin + Compose) app.</w:t>
+      </w:r>
+    </w:p>
+    <w:p>
+      <w:pPr>
+        <w:ind w:left="288"/>
+      </w:pPr>
+      <w:r>
+        <w:rPr>
+          <w:b w:val="0"/>
+          <w:sz w:val="20"/>
+        </w:rPr>
+        <w:t>All endpoints require Bearer JWT from Step 1 (OTP verify). Location params: lat=17.4948 lng=78.3996 (Hyderabad default).</w:t>
+      </w:r>
+    </w:p>
+    <w:p>
+      <w:pPr>
+        <w:ind w:left="288"/>
+        <w:shd w:val="clear" w:color="auto" w:fill="FFF3CD"/>
+      </w:pPr>
+      <w:r>
+        <w:rPr>
+          <w:i/>
+          <w:color w:val="7D4E00"/>
+          <w:sz w:val="20"/>
+        </w:rPr>
+        <w:t xml:space="preserve">  Branch: sprint-3-search-store-product  |  Screens: C8 (Search), C9 (Store Detail), C10 (Product Detail)</w:t>
+      </w:r>
+    </w:p>
+    <w:p>
+      <w:pPr>
+        <w:spacing w:before="40" w:after="40"/>
+      </w:pPr>
+      <w:r>
+        <w:rPr>
+          <w:color w:val="CCCCCC"/>
+          <w:sz w:val="14"/>
+        </w:rPr>
+        <w:t>──────────────────────────────────────────────────────────────────────────────────────────</w:t>
+      </w:r>
+    </w:p>
+    <w:p>
+      <w:pPr>
+        <w:pStyle w:val="Heading2"/>
+      </w:pPr>
+      <w:r>
+        <w:t>STEP 80 — Search Products Nearby  (C8 Search Screen)</w:t>
+      </w:r>
+    </w:p>
+    <w:p>
+      <w:pPr>
+        <w:spacing w:before="120"/>
+        <w:shd w:val="clear" w:color="auto" w:fill="D4EDDA"/>
+      </w:pPr>
+      <w:r>
+        <w:rPr>
+          <w:b/>
+          <w:color w:val="155524"/>
+          <w:sz w:val="20"/>
+        </w:rPr>
+        <w:t xml:space="preserve">  GET  </w:t>
+      </w:r>
+      <w:r>
+        <w:rPr>
+          <w:b/>
+          <w:color w:val="1F4E79"/>
+          <w:sz w:val="20"/>
+        </w:rPr>
+        <w:t xml:space="preserve">  {{base_url}}/products/search/</w:t>
+      </w:r>
+      <w:r>
+        <w:rPr>
+          <w:i/>
+          <w:color w:val="777777"/>
+          <w:sz w:val="18"/>
+        </w:rPr>
+        <w:t xml:space="preserve">   [Customer JWT]   [Mobile Sprint 3]</w:t>
+      </w:r>
+    </w:p>
+    <w:p>
+      <w:pPr>
+        <w:ind w:left="288"/>
+      </w:pPr>
+      <w:r>
+        <w:rPr>
+          <w:b w:val="0"/>
+          <w:sz w:val="20"/>
+        </w:rPr>
+        <w:t>Authorization: Bearer {{customer_token}}</w:t>
+      </w:r>
+    </w:p>
+    <w:tbl>
+      <w:tblPr>
+        <w:tblStyle w:val="TableGrid"/>
+        <w:tblW w:type="auto" w:w="0"/>
+        <w:jc w:val="left"/>
+        <w:tblLook w:firstColumn="1" w:firstRow="1" w:lastColumn="0" w:lastRow="0" w:noHBand="0" w:noVBand="1" w:val="04A0"/>
+      </w:tblPr>
+      <w:tblGrid>
+        <w:gridCol w:w="2412"/>
+        <w:gridCol w:w="2412"/>
+        <w:gridCol w:w="2412"/>
+        <w:gridCol w:w="2412"/>
+      </w:tblGrid>
+      <w:tr>
+        <w:tc>
+          <w:tcPr>
+            <w:tcW w:type="dxa" w:w="1440"/>
+            <w:shd w:val="clear" w:color="auto" w:fill="1F4E79"/>
+          </w:tcPr>
+          <w:p>
+            <w:r>
+              <w:rPr>
+                <w:b/>
+                <w:color w:val="FFFFFF"/>
+                <w:sz w:val="20"/>
+              </w:rPr>
+              <w:t>Query Param</w:t>
+            </w:r>
+          </w:p>
+        </w:tc>
+        <w:tc>
+          <w:tcPr>
+            <w:tcW w:type="dxa" w:w="1008"/>
+            <w:shd w:val="clear" w:color="auto" w:fill="1F4E79"/>
+          </w:tcPr>
+          <w:p>
+            <w:r>
+              <w:rPr>
+                <w:b/>
+                <w:color w:val="FFFFFF"/>
+                <w:sz w:val="20"/>
+              </w:rPr>
+              <w:t>Required</w:t>
+            </w:r>
+          </w:p>
+        </w:tc>
+        <w:tc>
+          <w:tcPr>
+            <w:tcW w:type="dxa" w:w="1440"/>
+            <w:shd w:val="clear" w:color="auto" w:fill="1F4E79"/>
+          </w:tcPr>
+          <w:p>
+            <w:r>
+              <w:rPr>
+                <w:b/>
+                <w:color w:val="FFFFFF"/>
+                <w:sz w:val="20"/>
+              </w:rPr>
+              <w:t>Example</w:t>
+            </w:r>
+          </w:p>
+        </w:tc>
+        <w:tc>
+          <w:tcPr>
+            <w:tcW w:type="dxa" w:w="5472"/>
+            <w:shd w:val="clear" w:color="auto" w:fill="1F4E79"/>
+          </w:tcPr>
+          <w:p>
+            <w:r>
+              <w:rPr>
+                <w:b/>
+                <w:color w:val="FFFFFF"/>
+                <w:sz w:val="20"/>
+              </w:rPr>
+              <w:t>Notes</w:t>
+            </w:r>
+          </w:p>
+        </w:tc>
+      </w:tr>
+      <w:tr>
+        <w:tc>
+          <w:tcPr>
+            <w:tcW w:type="dxa" w:w="1440"/>
+            <w:shd w:val="clear" w:color="auto" w:fill="DEEAF1"/>
+          </w:tcPr>
+          <w:p>
+            <w:r>
+              <w:rPr>
+                <w:sz w:val="19"/>
+              </w:rPr>
+              <w:t>q</w:t>
+            </w:r>
+          </w:p>
+        </w:tc>
+        <w:tc>
+          <w:tcPr>
+            <w:tcW w:type="dxa" w:w="1008"/>
+            <w:shd w:val="clear" w:color="auto" w:fill="DEEAF1"/>
+          </w:tcPr>
+          <w:p>
+            <w:r>
+              <w:rPr>
+                <w:sz w:val="19"/>
+              </w:rPr>
+              <w:t>Yes</w:t>
+            </w:r>
+          </w:p>
+        </w:tc>
+        <w:tc>
+          <w:tcPr>
+            <w:tcW w:type="dxa" w:w="1440"/>
+            <w:shd w:val="clear" w:color="auto" w:fill="DEEAF1"/>
+          </w:tcPr>
+          <w:p>
+            <w:r>
+              <w:rPr>
+                <w:sz w:val="19"/>
+              </w:rPr>
+              <w:t>kurta</w:t>
+            </w:r>
+          </w:p>
+        </w:tc>
+        <w:tc>
+          <w:tcPr>
+            <w:tcW w:type="dxa" w:w="5472"/>
+            <w:shd w:val="clear" w:color="auto" w:fill="DEEAF1"/>
+          </w:tcPr>
+          <w:p>
+            <w:r>
+              <w:rPr>
+                <w:sz w:val="19"/>
+              </w:rPr>
+              <w:t>Search keyword — pg_trgm fuzzy match on backend</w:t>
+            </w:r>
+          </w:p>
+        </w:tc>
+      </w:tr>
+      <w:tr>
+        <w:tc>
+          <w:tcPr>
+            <w:tcW w:type="dxa" w:w="1440"/>
+          </w:tcPr>
+          <w:p>
+            <w:r>
+              <w:rPr>
+                <w:sz w:val="19"/>
+              </w:rPr>
+              <w:t>lat</w:t>
+            </w:r>
+          </w:p>
+        </w:tc>
+        <w:tc>
+          <w:tcPr>
+            <w:tcW w:type="dxa" w:w="1008"/>
+          </w:tcPr>
+          <w:p>
+            <w:r>
+              <w:rPr>
+                <w:sz w:val="19"/>
+              </w:rPr>
+              <w:t>Yes</w:t>
+            </w:r>
+          </w:p>
+        </w:tc>
+        <w:tc>
+          <w:tcPr>
+            <w:tcW w:type="dxa" w:w="1440"/>
+          </w:tcPr>
+          <w:p>
+            <w:r>
+              <w:rPr>
+                <w:sz w:val="19"/>
+              </w:rPr>
+              <w:t>17.4948</w:t>
+            </w:r>
+          </w:p>
+        </w:tc>
+        <w:tc>
+          <w:tcPr>
+            <w:tcW w:type="dxa" w:w="5472"/>
+          </w:tcPr>
+          <w:p>
+            <w:r>
+              <w:rPr>
+                <w:sz w:val="19"/>
+              </w:rPr>
+              <w:t>Latitude — from device GPS or EncryptedSharedPreferences</w:t>
+            </w:r>
+          </w:p>
+        </w:tc>
+      </w:tr>
+      <w:tr>
+        <w:tc>
+          <w:tcPr>
+            <w:tcW w:type="dxa" w:w="1440"/>
+            <w:shd w:val="clear" w:color="auto" w:fill="DEEAF1"/>
+          </w:tcPr>
+          <w:p>
+            <w:r>
+              <w:rPr>
+                <w:sz w:val="19"/>
+              </w:rPr>
+              <w:t>lng</w:t>
+            </w:r>
+          </w:p>
+        </w:tc>
+        <w:tc>
+          <w:tcPr>
+            <w:tcW w:type="dxa" w:w="1008"/>
+            <w:shd w:val="clear" w:color="auto" w:fill="DEEAF1"/>
+          </w:tcPr>
+          <w:p>
+            <w:r>
+              <w:rPr>
+                <w:sz w:val="19"/>
+              </w:rPr>
+              <w:t>Yes</w:t>
+            </w:r>
+          </w:p>
+        </w:tc>
+        <w:tc>
+          <w:tcPr>
+            <w:tcW w:type="dxa" w:w="1440"/>
+            <w:shd w:val="clear" w:color="auto" w:fill="DEEAF1"/>
+          </w:tcPr>
+          <w:p>
+            <w:r>
+              <w:rPr>
+                <w:sz w:val="19"/>
+              </w:rPr>
+              <w:t>78.3996</w:t>
+            </w:r>
+          </w:p>
+        </w:tc>
+        <w:tc>
+          <w:tcPr>
+            <w:tcW w:type="dxa" w:w="5472"/>
+            <w:shd w:val="clear" w:color="auto" w:fill="DEEAF1"/>
+          </w:tcPr>
+          <w:p>
+            <w:r>
+              <w:rPr>
+                <w:sz w:val="19"/>
+              </w:rPr>
+              <w:t>Longitude</w:t>
+            </w:r>
+          </w:p>
+        </w:tc>
+      </w:tr>
+      <w:tr>
+        <w:tc>
+          <w:tcPr>
+            <w:tcW w:type="dxa" w:w="1440"/>
+          </w:tcPr>
+          <w:p>
+            <w:r>
+              <w:rPr>
+                <w:sz w:val="19"/>
+              </w:rPr>
+              <w:t>category</w:t>
+            </w:r>
+          </w:p>
+        </w:tc>
+        <w:tc>
+          <w:tcPr>
+            <w:tcW w:type="dxa" w:w="1008"/>
+          </w:tcPr>
+          <w:p>
+            <w:r>
+              <w:rPr>
+                <w:sz w:val="19"/>
+              </w:rPr>
+              <w:t>No</w:t>
+            </w:r>
+          </w:p>
+        </w:tc>
+        <w:tc>
+          <w:tcPr>
+            <w:tcW w:type="dxa" w:w="1440"/>
+          </w:tcPr>
+          <w:p>
+            <w:r>
+              <w:rPr>
+                <w:sz w:val="19"/>
+              </w:rPr>
+              <w:t>clothing</w:t>
+            </w:r>
+          </w:p>
+        </w:tc>
+        <w:tc>
+          <w:tcPr>
+            <w:tcW w:type="dxa" w:w="5472"/>
+          </w:tcPr>
+          <w:p>
+            <w:r>
+              <w:rPr>
+                <w:sz w:val="19"/>
+              </w:rPr>
+              <w:t>Filter by category slug</w:t>
+            </w:r>
+          </w:p>
+        </w:tc>
+      </w:tr>
+      <w:tr>
+        <w:tc>
+          <w:tcPr>
+            <w:tcW w:type="dxa" w:w="1440"/>
+            <w:shd w:val="clear" w:color="auto" w:fill="DEEAF1"/>
+          </w:tcPr>
+          <w:p>
+            <w:r>
+              <w:rPr>
+                <w:sz w:val="19"/>
+              </w:rPr>
+              <w:t>has_offer</w:t>
+            </w:r>
+          </w:p>
+        </w:tc>
+        <w:tc>
+          <w:tcPr>
+            <w:tcW w:type="dxa" w:w="1008"/>
+            <w:shd w:val="clear" w:color="auto" w:fill="DEEAF1"/>
+          </w:tcPr>
+          <w:p>
+            <w:r>
+              <w:rPr>
+                <w:sz w:val="19"/>
+              </w:rPr>
+              <w:t>No</w:t>
+            </w:r>
+          </w:p>
+        </w:tc>
+        <w:tc>
+          <w:tcPr>
+            <w:tcW w:type="dxa" w:w="1440"/>
+            <w:shd w:val="clear" w:color="auto" w:fill="DEEAF1"/>
+          </w:tcPr>
+          <w:p>
+            <w:r>
+              <w:rPr>
+                <w:sz w:val="19"/>
+              </w:rPr>
+              <w:t>true</w:t>
+            </w:r>
+          </w:p>
+        </w:tc>
+        <w:tc>
+          <w:tcPr>
+            <w:tcW w:type="dxa" w:w="5472"/>
+            <w:shd w:val="clear" w:color="auto" w:fill="DEEAF1"/>
+          </w:tcPr>
+          <w:p>
+            <w:r>
+              <w:rPr>
+                <w:sz w:val="19"/>
+              </w:rPr>
+              <w:t>On-sale products only</w:t>
+            </w:r>
+          </w:p>
+        </w:tc>
+      </w:tr>
+      <w:tr>
+        <w:tc>
+          <w:tcPr>
+            <w:tcW w:type="dxa" w:w="1440"/>
+          </w:tcPr>
+          <w:p>
+            <w:r>
+              <w:rPr>
+                <w:sz w:val="19"/>
+              </w:rPr>
+              <w:t>ordering</w:t>
+            </w:r>
+          </w:p>
+        </w:tc>
+        <w:tc>
+          <w:tcPr>
+            <w:tcW w:type="dxa" w:w="1008"/>
+          </w:tcPr>
+          <w:p>
+            <w:r>
+              <w:rPr>
+                <w:sz w:val="19"/>
+              </w:rPr>
+              <w:t>No</w:t>
+            </w:r>
+          </w:p>
+        </w:tc>
+        <w:tc>
+          <w:tcPr>
+            <w:tcW w:type="dxa" w:w="1440"/>
+          </w:tcPr>
+          <w:p>
+            <w:r>
+              <w:rPr>
+                <w:sz w:val="19"/>
+              </w:rPr>
+              <w:t>distance</w:t>
+            </w:r>
+          </w:p>
+        </w:tc>
+        <w:tc>
+          <w:tcPr>
+            <w:tcW w:type="dxa" w:w="5472"/>
+          </w:tcPr>
+          <w:p>
+            <w:r>
+              <w:rPr>
+                <w:sz w:val="19"/>
+              </w:rPr>
+              <w:t>distance | price | -price | rating | -discount</w:t>
+            </w:r>
+          </w:p>
+        </w:tc>
+      </w:tr>
+    </w:tbl>
+    <w:p/>
+    <w:p>
+      <w:pPr>
+        <w:spacing w:before="40" w:after="40"/>
+        <w:ind w:left="288"/>
+        <w:shd w:val="clear" w:color="auto" w:fill="F0F0F0"/>
+      </w:pPr>
+      <w:r>
+        <w:rPr>
+          <w:rFonts w:ascii="Courier New" w:hAnsi="Courier New"/>
+          <w:color w:val="1A1A8C"/>
+          <w:sz w:val="18"/>
+        </w:rPr>
+        <w:t>GET {{base_url}}/products/search/?q=kurta&amp;lat=17.4948&amp;lng=78.3996&amp;category=clothing</w:t>
+      </w:r>
+    </w:p>
+    <w:p>
+      <w:r>
+        <w:rPr>
+          <w:b/>
+          <w:sz w:val="20"/>
+        </w:rPr>
+        <w:t>Expected Response  200 OK:</w:t>
+      </w:r>
+    </w:p>
+    <w:p>
+      <w:pPr>
+        <w:spacing w:before="40" w:after="40"/>
+        <w:ind w:left="288"/>
+        <w:shd w:val="clear" w:color="auto" w:fill="F0F0F0"/>
+      </w:pPr>
+      <w:r>
+        <w:rPr>
+          <w:rFonts w:ascii="Courier New" w:hAnsi="Courier New"/>
+          <w:color w:val="1A1A8C"/>
+          <w:sz w:val="18"/>
+        </w:rPr>
+        <w:t>{</w:t>
+        <w:br/>
+        <w:t xml:space="preserve">  "count": 24,</w:t>
+        <w:br/>
+        <w:t xml:space="preserve">  "next": null,</w:t>
+        <w:br/>
+        <w:t xml:space="preserve">  "previous": null,</w:t>
+        <w:br/>
+        <w:t xml:space="preserve">  "results": [</w:t>
+        <w:br/>
+        <w:t xml:space="preserve">    {</w:t>
+        <w:br/>
+        <w:t xml:space="preserve">      "id": "abc123",</w:t>
+        <w:br/>
+        <w:t xml:space="preserve">      "name": "Blue Cotton Kurta",</w:t>
+        <w:br/>
+        <w:t xml:space="preserve">      "price": 450.0,</w:t>
+        <w:br/>
+        <w:t xml:space="preserve">      "sale_price": null,</w:t>
+        <w:br/>
+        <w:t xml:space="preserve">      "image": "https://...",</w:t>
+        <w:br/>
+        <w:t xml:space="preserve">      "store": { "id": "...", "name": "Riya Boutique" },</w:t>
+        <w:br/>
+        <w:t xml:space="preserve">      "category": "clothing",</w:t>
+        <w:br/>
+        <w:t xml:space="preserve">      "is_on_sale": false</w:t>
+        <w:br/>
+        <w:t xml:space="preserve">    }</w:t>
+        <w:br/>
+        <w:t xml:space="preserve">  ]</w:t>
+        <w:br/>
+        <w:t>}</w:t>
+      </w:r>
+    </w:p>
+    <w:p>
+      <w:pPr>
+        <w:ind w:left="288"/>
+        <w:shd w:val="clear" w:color="auto" w:fill="D1ECF1"/>
+      </w:pPr>
+      <w:r>
+        <w:rPr>
+          <w:i/>
+          <w:color w:val="0C5460"/>
+          <w:sz w:val="20"/>
+        </w:rPr>
+        <w:t xml:space="preserve">  💡  Mobile debounces the query by 400ms before calling this endpoint.</w:t>
+        <w:br/>
+        <w:t>Results rendered in a 2-column LazyVerticalStaggeredGrid with distance overlay tags.</w:t>
+      </w:r>
+    </w:p>
+    <w:p>
+      <w:pPr>
+        <w:ind w:left="288"/>
+        <w:shd w:val="clear" w:color="auto" w:fill="F8D7DA"/>
+      </w:pPr>
+      <w:r>
+        <w:rPr>
+          <w:i/>
+          <w:color w:val="7B1D1D"/>
+          <w:sz w:val="20"/>
+        </w:rPr>
+        <w:t xml:space="preserve">  🚫  401 — expired token, re-authenticate.</w:t>
+        <w:br/>
+        <w:t>400 — missing q, lat, or lng params.</w:t>
+      </w:r>
+    </w:p>
+    <w:p>
+      <w:pPr>
+        <w:spacing w:before="40" w:after="40"/>
+      </w:pPr>
+      <w:r>
+        <w:rPr>
+          <w:color w:val="CCCCCC"/>
+          <w:sz w:val="14"/>
+        </w:rPr>
+        <w:t>──────────────────────────────────────────────────────────────────────────────────────────</w:t>
+      </w:r>
+    </w:p>
+    <w:p>
+      <w:pPr>
+        <w:pStyle w:val="Heading2"/>
+      </w:pPr>
+      <w:r>
+        <w:t>STEP 81 — Get Store Detail  (C9 Store Detail Screen)</w:t>
+      </w:r>
+    </w:p>
+    <w:p>
+      <w:pPr>
+        <w:spacing w:before="120"/>
+        <w:shd w:val="clear" w:color="auto" w:fill="D4EDDA"/>
+      </w:pPr>
+      <w:r>
+        <w:rPr>
+          <w:b/>
+          <w:color w:val="155524"/>
+          <w:sz w:val="20"/>
+        </w:rPr>
+        <w:t xml:space="preserve">  GET  </w:t>
+      </w:r>
+      <w:r>
+        <w:rPr>
+          <w:b/>
+          <w:color w:val="1F4E79"/>
+          <w:sz w:val="20"/>
+        </w:rPr>
+        <w:t xml:space="preserve">  {{base_url}}/stores/{{store_id}}/</w:t>
+      </w:r>
+      <w:r>
+        <w:rPr>
+          <w:i/>
+          <w:color w:val="777777"/>
+          <w:sz w:val="18"/>
+        </w:rPr>
+        <w:t xml:space="preserve">   [Customer JWT]   [Mobile Sprint 3]</w:t>
+      </w:r>
+    </w:p>
+    <w:p>
+      <w:pPr>
+        <w:ind w:left="288"/>
+      </w:pPr>
+      <w:r>
+        <w:rPr>
+          <w:b w:val="0"/>
+          <w:sz w:val="20"/>
+        </w:rPr>
+        <w:t>Authorization: Bearer {{customer_token}}</w:t>
+      </w:r>
+    </w:p>
+    <w:p>
+      <w:pPr>
+        <w:ind w:left="288"/>
+      </w:pPr>
+      <w:r>
+        <w:rPr>
+          <w:b w:val="0"/>
+          <w:sz w:val="20"/>
+        </w:rPr>
+        <w:t>No body. Replace {{store_id}} with UUID from search results.</w:t>
+      </w:r>
+    </w:p>
+    <w:p>
+      <w:r>
+        <w:rPr>
+          <w:b/>
+          <w:sz w:val="20"/>
+        </w:rPr>
+        <w:t>Expected Response  200 OK:</w:t>
+      </w:r>
+    </w:p>
+    <w:p>
+      <w:pPr>
+        <w:spacing w:before="40" w:after="40"/>
+        <w:ind w:left="288"/>
+        <w:shd w:val="clear" w:color="auto" w:fill="F0F0F0"/>
+      </w:pPr>
+      <w:r>
+        <w:rPr>
+          <w:rFonts w:ascii="Courier New" w:hAnsi="Courier New"/>
+          <w:color w:val="1A1A8C"/>
+          <w:sz w:val="18"/>
+        </w:rPr>
+        <w:t>{</w:t>
+        <w:br/>
+        <w:t xml:space="preserve">  "id": "...",</w:t>
+        <w:br/>
+        <w:t xml:space="preserve">  "name": "Riya Boutique",</w:t>
+        <w:br/>
+        <w:t xml:space="preserve">  "avatar": null,</w:t>
+        <w:br/>
+        <w:t xml:space="preserve">  "cover_image": null,</w:t>
+        <w:br/>
+        <w:t xml:space="preserve">  "category": "clothing",</w:t>
+        <w:br/>
+        <w:t xml:space="preserve">  "distance_km": 1.2,</w:t>
+        <w:br/>
+        <w:t xml:space="preserve">  "is_open": true,</w:t>
+        <w:br/>
+        <w:t xml:space="preserve">  "open_status_label": "Open",</w:t>
+        <w:br/>
+        <w:t xml:space="preserve">  "todays_hours": "10:00-21:00",</w:t>
+        <w:br/>
+        <w:t xml:space="preserve">  "closes_at": "21:00",</w:t>
+        <w:br/>
+        <w:t xml:space="preserve">  "next_open": null,</w:t>
+        <w:br/>
+        <w:t xml:space="preserve">  "rating": 4.8,</w:t>
+        <w:br/>
+        <w:t xml:space="preserve">  "review_count": 47,</w:t>
+        <w:br/>
+        <w:t xml:space="preserve">  "follower_count": 89,</w:t>
+        <w:br/>
+        <w:t xml:space="preserve">  "is_followed": false,</w:t>
+        <w:br/>
+        <w:t xml:space="preserve">  "location": "Kukatpally"</w:t>
+        <w:br/>
+        <w:t>}</w:t>
+      </w:r>
+    </w:p>
+    <w:p>
+      <w:pPr>
+        <w:ind w:left="288"/>
+        <w:shd w:val="clear" w:color="auto" w:fill="D1ECF1"/>
+      </w:pPr>
+      <w:r>
+        <w:rPr>
+          <w:i/>
+          <w:color w:val="0C5460"/>
+          <w:sz w:val="20"/>
+        </w:rPr>
+        <w:t xml:space="preserve">  💡  Mobile shows Open badge (green) / Closed badge (red) based on is_open + open_status_label.</w:t>
+        <w:br/>
+        <w:t>Store avatar overlaps the 140dp hero banner by 18dp (CSS-style absolute position in Compose).</w:t>
+      </w:r>
+    </w:p>
+    <w:p>
+      <w:pPr>
+        <w:spacing w:before="40" w:after="40"/>
+      </w:pPr>
+      <w:r>
+        <w:rPr>
+          <w:color w:val="CCCCCC"/>
+          <w:sz w:val="14"/>
+        </w:rPr>
+        <w:t>──────────────────────────────────────────────────────────────────────────────────────────</w:t>
+      </w:r>
+    </w:p>
+    <w:p>
+      <w:pPr>
+        <w:pStyle w:val="Heading2"/>
+      </w:pPr>
+      <w:r>
+        <w:t>STEP 82 — Follow / Unfollow Store  (C9)</w:t>
+      </w:r>
+    </w:p>
+    <w:p>
+      <w:pPr>
+        <w:spacing w:before="120"/>
+        <w:shd w:val="clear" w:color="auto" w:fill="EEEEEE"/>
+      </w:pPr>
+      <w:r>
+        <w:rPr>
+          <w:b/>
+          <w:color w:val="333333"/>
+          <w:sz w:val="20"/>
+        </w:rPr>
+        <w:t xml:space="preserve">  POST / DELETE  </w:t>
+      </w:r>
+      <w:r>
+        <w:rPr>
+          <w:b/>
+          <w:color w:val="1F4E79"/>
+          <w:sz w:val="20"/>
+        </w:rPr>
+        <w:t xml:space="preserve">  {{base_url}}/stores/{{store_id}}/follow/</w:t>
+      </w:r>
+      <w:r>
+        <w:rPr>
+          <w:i/>
+          <w:color w:val="777777"/>
+          <w:sz w:val="18"/>
+        </w:rPr>
+        <w:t xml:space="preserve">   [Customer JWT]   [Mobile Sprint 3]</w:t>
+      </w:r>
+    </w:p>
+    <w:p>
+      <w:pPr>
+        <w:ind w:left="288"/>
+      </w:pPr>
+      <w:r>
+        <w:rPr>
+          <w:b w:val="0"/>
+          <w:sz w:val="20"/>
+        </w:rPr>
+        <w:t>Authorization: Bearer {{customer_token}}</w:t>
+      </w:r>
+    </w:p>
+    <w:p>
+      <w:pPr>
+        <w:ind w:left="288"/>
+      </w:pPr>
+      <w:r>
+        <w:rPr>
+          <w:b w:val="0"/>
+          <w:sz w:val="20"/>
+        </w:rPr>
+        <w:t>POST to follow, DELETE to unfollow. No request body.</w:t>
+      </w:r>
+    </w:p>
+    <w:p>
+      <w:r>
+        <w:rPr>
+          <w:b/>
+          <w:sz w:val="20"/>
+        </w:rPr>
+        <w:t>Expected: POST → 200 or 201  |  DELETE → 204 No Content</w:t>
+      </w:r>
+    </w:p>
+    <w:p>
+      <w:pPr>
+        <w:ind w:left="288"/>
+        <w:shd w:val="clear" w:color="auto" w:fill="D1ECF1"/>
+      </w:pPr>
+      <w:r>
+        <w:rPr>
+          <w:i/>
+          <w:color w:val="0C5460"/>
+          <w:sz w:val="20"/>
+        </w:rPr>
+        <w:t xml:space="preserve">  💡  Mobile app does an optimistic update — heart icon fills immediately, rolls back if API fails.</w:t>
+      </w:r>
+    </w:p>
+    <w:p>
+      <w:pPr>
+        <w:spacing w:before="40" w:after="40"/>
+      </w:pPr>
+      <w:r>
+        <w:rPr>
+          <w:color w:val="CCCCCC"/>
+          <w:sz w:val="14"/>
+        </w:rPr>
+        <w:t>──────────────────────────────────────────────────────────────────────────────────────────</w:t>
+      </w:r>
+    </w:p>
+    <w:p>
+      <w:pPr>
+        <w:pStyle w:val="Heading2"/>
+      </w:pPr>
+      <w:r>
+        <w:t>STEP 83 — Get Product Detail  (C10 Product Detail Screen)</w:t>
+      </w:r>
+    </w:p>
+    <w:p>
+      <w:pPr>
+        <w:spacing w:before="120"/>
+        <w:shd w:val="clear" w:color="auto" w:fill="D4EDDA"/>
+      </w:pPr>
+      <w:r>
+        <w:rPr>
+          <w:b/>
+          <w:color w:val="155524"/>
+          <w:sz w:val="20"/>
+        </w:rPr>
+        <w:t xml:space="preserve">  GET  </w:t>
+      </w:r>
+      <w:r>
+        <w:rPr>
+          <w:b/>
+          <w:color w:val="1F4E79"/>
+          <w:sz w:val="20"/>
+        </w:rPr>
+        <w:t xml:space="preserve">  {{base_url}}/products/{{product_id}}/</w:t>
+      </w:r>
+      <w:r>
+        <w:rPr>
+          <w:i/>
+          <w:color w:val="777777"/>
+          <w:sz w:val="18"/>
+        </w:rPr>
+        <w:t xml:space="preserve">   [Customer JWT]   [Mobile Sprint 3]</w:t>
+      </w:r>
+    </w:p>
+    <w:p>
+      <w:pPr>
+        <w:ind w:left="288"/>
+      </w:pPr>
+      <w:r>
+        <w:rPr>
+          <w:b w:val="0"/>
+          <w:sz w:val="20"/>
+        </w:rPr>
+        <w:t>Authorization: Bearer {{customer_token}}</w:t>
+      </w:r>
+    </w:p>
+    <w:p>
+      <w:r>
+        <w:rPr>
+          <w:b/>
+          <w:sz w:val="20"/>
+        </w:rPr>
+        <w:t>Expected Response  200 OK:</w:t>
+      </w:r>
+    </w:p>
+    <w:p>
+      <w:pPr>
+        <w:spacing w:before="40" w:after="40"/>
+        <w:ind w:left="288"/>
+        <w:shd w:val="clear" w:color="auto" w:fill="F0F0F0"/>
+      </w:pPr>
+      <w:r>
+        <w:rPr>
+          <w:rFonts w:ascii="Courier New" w:hAnsi="Courier New"/>
+          <w:color w:val="1A1A8C"/>
+          <w:sz w:val="18"/>
+        </w:rPr>
+        <w:t>{</w:t>
+        <w:br/>
+        <w:t xml:space="preserve">  "id": "...",</w:t>
+        <w:br/>
+        <w:t xml:space="preserve">  "name": "Blue Cotton Kurta",</w:t>
+        <w:br/>
+        <w:t xml:space="preserve">  "description": "...",</w:t>
+        <w:br/>
+        <w:t xml:space="preserve">  "price": 450.0,</w:t>
+        <w:br/>
+        <w:t xml:space="preserve">  "sale_price": null,</w:t>
+        <w:br/>
+        <w:t xml:space="preserve">  "images": ["https://..."],</w:t>
+        <w:br/>
+        <w:t xml:space="preserve">  "store": { "id": "...", "name": "Riya Boutique" },</w:t>
+        <w:br/>
+        <w:t xml:space="preserve">  "distance_km": 1.2,</w:t>
+        <w:br/>
+        <w:t xml:space="preserve">  "category": "clothing",</w:t>
+        <w:br/>
+        <w:t xml:space="preserve">  "sizes": [</w:t>
+        <w:br/>
+        <w:t xml:space="preserve">    { "size": "S", "stock": 3 },</w:t>
+        <w:br/>
+        <w:t xml:space="preserve">    { "size": "M", "stock": 1 },</w:t>
+        <w:br/>
+        <w:t xml:space="preserve">    { "size": "L", "stock": 0 }</w:t>
+        <w:br/>
+        <w:t xml:space="preserve">  ],</w:t>
+        <w:br/>
+        <w:t xml:space="preserve">  "colors": ["#1D4ED8", "#059669"],</w:t>
+        <w:br/>
+        <w:t xml:space="preserve">  "stock_count": 4,</w:t>
+        <w:br/>
+        <w:t xml:space="preserve">  "is_on_sale": false,</w:t>
+        <w:br/>
+        <w:t xml:space="preserve">  "is_wishlisted": false</w:t>
+        <w:br/>
+        <w:t>}</w:t>
+      </w:r>
+    </w:p>
+    <w:p>
+      <w:pPr>
+        <w:ind w:left="288"/>
+        <w:shd w:val="clear" w:color="auto" w:fill="D1ECF1"/>
+      </w:pPr>
+      <w:r>
+        <w:rPr>
+          <w:i/>
+          <w:color w:val="0C5460"/>
+          <w:sz w:val="20"/>
+        </w:rPr>
+        <w:t xml:space="preserve">  💡  Sizes with stock=0 are rendered at 35% alpha and are non-tappable in the mobile app.</w:t>
+        <w:br/>
+        <w:t>Colors are hex strings rendered as 24dp coloured circle dots.</w:t>
+      </w:r>
+    </w:p>
+    <w:p>
+      <w:pPr>
+        <w:spacing w:before="40" w:after="40"/>
+      </w:pPr>
+      <w:r>
+        <w:rPr>
+          <w:color w:val="CCCCCC"/>
+          <w:sz w:val="14"/>
+        </w:rPr>
+        <w:t>──────────────────────────────────────────────────────────────────────────────────────────</w:t>
+      </w:r>
+    </w:p>
+    <w:p>
+      <w:pPr>
+        <w:pStyle w:val="Heading2"/>
+      </w:pPr>
+      <w:r>
+        <w:t>STEP 84 — Reserve Product  (C10)</w:t>
+      </w:r>
+    </w:p>
+    <w:p>
+      <w:pPr>
+        <w:spacing w:before="120"/>
+        <w:shd w:val="clear" w:color="auto" w:fill="CCE5FF"/>
+      </w:pPr>
+      <w:r>
+        <w:rPr>
+          <w:b/>
+          <w:color w:val="004DAA"/>
+          <w:sz w:val="20"/>
+        </w:rPr>
+        <w:t xml:space="preserve">  POST  </w:t>
+      </w:r>
+      <w:r>
+        <w:rPr>
+          <w:b/>
+          <w:color w:val="1F4E79"/>
+          <w:sz w:val="20"/>
+        </w:rPr>
+        <w:t xml:space="preserve">  {{base_url}}/products/{{product_id}}/reserve/</w:t>
+      </w:r>
+      <w:r>
+        <w:rPr>
+          <w:i/>
+          <w:color w:val="777777"/>
+          <w:sz w:val="18"/>
+        </w:rPr>
+        <w:t xml:space="preserve">   [Customer JWT]   [Mobile Sprint 3]</w:t>
+      </w:r>
+    </w:p>
+    <w:p>
+      <w:pPr>
+        <w:ind w:left="288"/>
+      </w:pPr>
+      <w:r>
+        <w:rPr>
+          <w:b w:val="0"/>
+          <w:sz w:val="20"/>
+        </w:rPr>
+        <w:t>Authorization: Bearer {{customer_token}}</w:t>
+      </w:r>
+    </w:p>
+    <w:p>
+      <w:pPr>
+        <w:ind w:left="288"/>
+      </w:pPr>
+      <w:r>
+        <w:rPr>
+          <w:b w:val="0"/>
+          <w:sz w:val="20"/>
+        </w:rPr>
+        <w:t>Content-Type: application/json</w:t>
+      </w:r>
+    </w:p>
+    <w:p>
+      <w:r>
+        <w:rPr>
+          <w:b/>
+          <w:sz w:val="20"/>
+        </w:rPr>
+        <w:t>Request Body:</w:t>
+      </w:r>
+    </w:p>
+    <w:p>
+      <w:pPr>
+        <w:spacing w:before="40" w:after="40"/>
+        <w:ind w:left="288"/>
+        <w:shd w:val="clear" w:color="auto" w:fill="F0F0F0"/>
+      </w:pPr>
+      <w:r>
+        <w:rPr>
+          <w:rFonts w:ascii="Courier New" w:hAnsi="Courier New"/>
+          <w:color w:val="1A1A8C"/>
+          <w:sz w:val="18"/>
+        </w:rPr>
+        <w:t>{</w:t>
+        <w:br/>
+        <w:t xml:space="preserve">  "size": "M",</w:t>
+        <w:br/>
+        <w:t xml:space="preserve">  "quantity": 1</w:t>
+        <w:br/>
+        <w:t>}</w:t>
+      </w:r>
+    </w:p>
+    <w:p>
+      <w:r>
+        <w:rPr>
+          <w:b/>
+          <w:sz w:val="20"/>
+        </w:rPr>
+        <w:t>Expected Response  201 Created:</w:t>
+      </w:r>
+    </w:p>
+    <w:p>
+      <w:pPr>
+        <w:spacing w:before="40" w:after="40"/>
+        <w:ind w:left="288"/>
+        <w:shd w:val="clear" w:color="auto" w:fill="F0F0F0"/>
+      </w:pPr>
+      <w:r>
+        <w:rPr>
+          <w:rFonts w:ascii="Courier New" w:hAnsi="Courier New"/>
+          <w:color w:val="1A1A8C"/>
+          <w:sz w:val="18"/>
+        </w:rPr>
+        <w:t>{</w:t>
+        <w:br/>
+        <w:t xml:space="preserve">  "id": "reserve-uuid-...",</w:t>
+        <w:br/>
+        <w:t xml:space="preserve">  "expires_at": "2026-05-16T15:30:00Z",</w:t>
+        <w:br/>
+        <w:t xml:space="preserve">  "status": "active"</w:t>
+        <w:br/>
+        <w:t>}</w:t>
+      </w:r>
+    </w:p>
+    <w:p>
+      <w:pPr>
+        <w:ind w:left="288"/>
+        <w:shd w:val="clear" w:color="auto" w:fill="D4EDDA"/>
+      </w:pPr>
+      <w:r>
+        <w:rPr>
+          <w:i/>
+          <w:color w:val="155724"/>
+          <w:sz w:val="20"/>
+        </w:rPr>
+        <w:t xml:space="preserve">  ✅  Reservation holds the item for 2 hours. Mobile shows an inline green card with expiry time.</w:t>
+      </w:r>
+    </w:p>
+    <w:p>
+      <w:pPr>
+        <w:ind w:left="288"/>
+        <w:shd w:val="clear" w:color="auto" w:fill="F8D7DA"/>
+      </w:pPr>
+      <w:r>
+        <w:rPr>
+          <w:i/>
+          <w:color w:val="7B1D1D"/>
+          <w:sz w:val="20"/>
+        </w:rPr>
+        <w:t xml:space="preserve">  🚫  400 — size not provided or out of stock.</w:t>
+        <w:br/>
+        <w:t>409 — already reserved by this user.</w:t>
+      </w:r>
+    </w:p>
+    <w:p>
+      <w:pPr>
+        <w:spacing w:before="40" w:after="40"/>
+      </w:pPr>
+      <w:r>
+        <w:rPr>
+          <w:color w:val="CCCCCC"/>
+          <w:sz w:val="14"/>
+        </w:rPr>
+        <w:t>──────────────────────────────────────────────────────────────────────────────────────────</w:t>
+      </w:r>
+    </w:p>
+    <w:p>
+      <w:pPr>
+        <w:pStyle w:val="Heading2"/>
+      </w:pPr>
+      <w:r>
+        <w:t>STEP 85 — Wishlist Product  (C10)</w:t>
+      </w:r>
+    </w:p>
+    <w:p>
+      <w:pPr>
+        <w:spacing w:before="120"/>
+        <w:shd w:val="clear" w:color="auto" w:fill="EEEEEE"/>
+      </w:pPr>
+      <w:r>
+        <w:rPr>
+          <w:b/>
+          <w:color w:val="333333"/>
+          <w:sz w:val="20"/>
+        </w:rPr>
+        <w:t xml:space="preserve">  POST / DELETE  </w:t>
+      </w:r>
+      <w:r>
+        <w:rPr>
+          <w:b/>
+          <w:color w:val="1F4E79"/>
+          <w:sz w:val="20"/>
+        </w:rPr>
+        <w:t xml:space="preserve">  {{base_url}}/products/{{product_id}}/wishlist/</w:t>
+      </w:r>
+      <w:r>
+        <w:rPr>
+          <w:i/>
+          <w:color w:val="777777"/>
+          <w:sz w:val="18"/>
+        </w:rPr>
+        <w:t xml:space="preserve">   [Customer JWT]   [Mobile Sprint 3]</w:t>
+      </w:r>
+    </w:p>
+    <w:p>
+      <w:pPr>
+        <w:ind w:left="288"/>
+      </w:pPr>
+      <w:r>
+        <w:rPr>
+          <w:b w:val="0"/>
+          <w:sz w:val="20"/>
+        </w:rPr>
+        <w:t>Authorization: Bearer {{customer_token}}</w:t>
+      </w:r>
+    </w:p>
+    <w:p>
+      <w:pPr>
+        <w:ind w:left="288"/>
+      </w:pPr>
+      <w:r>
+        <w:rPr>
+          <w:b w:val="0"/>
+          <w:sz w:val="20"/>
+        </w:rPr>
+        <w:t>POST to add to wishlist, DELETE to remove. No body.</w:t>
+      </w:r>
+    </w:p>
+    <w:p>
+      <w:r>
+        <w:rPr>
+          <w:b/>
+          <w:sz w:val="20"/>
+        </w:rPr>
+        <w:t>Expected: POST → 201  |  DELETE → 204 No Content</w:t>
+      </w:r>
+    </w:p>
+    <w:p>
+      <w:pPr>
+        <w:ind w:left="288"/>
+        <w:shd w:val="clear" w:color="auto" w:fill="D1ECF1"/>
+      </w:pPr>
+      <w:r>
+        <w:rPr>
+          <w:i/>
+          <w:color w:val="0C5460"/>
+          <w:sz w:val="20"/>
+        </w:rPr>
+        <w:t xml:space="preserve">  💡  Optimistic update — heart icon fills/unfills immediately, reverts on failure.</w:t>
+      </w:r>
+    </w:p>
+    <w:p/>
+    <w:tbl>
+      <w:tblPr>
+        <w:tblStyle w:val="TableGrid"/>
+        <w:tblW w:type="auto" w:w="0"/>
+        <w:jc w:val="left"/>
+        <w:tblLook w:firstColumn="1" w:firstRow="1" w:lastColumn="0" w:lastRow="0" w:noHBand="0" w:noVBand="1" w:val="04A0"/>
+      </w:tblPr>
+      <w:tblGrid>
+        <w:gridCol w:w="2412"/>
+        <w:gridCol w:w="2412"/>
+        <w:gridCol w:w="2412"/>
+        <w:gridCol w:w="2412"/>
+      </w:tblGrid>
+      <w:tr>
+        <w:tc>
+          <w:tcPr>
+            <w:tcW w:type="dxa" w:w="720"/>
+            <w:shd w:val="clear" w:color="auto" w:fill="9B2D7F"/>
+          </w:tcPr>
+          <w:p>
+            <w:r>
+              <w:rPr>
+                <w:b/>
+                <w:color w:val="FFFFFF"/>
+                <w:sz w:val="20"/>
+              </w:rPr>
+              <w:t>Step</w:t>
+            </w:r>
+          </w:p>
+        </w:tc>
+        <w:tc>
+          <w:tcPr>
+            <w:tcW w:type="dxa" w:w="1440"/>
+            <w:shd w:val="clear" w:color="auto" w:fill="9B2D7F"/>
+          </w:tcPr>
+          <w:p>
+            <w:r>
+              <w:rPr>
+                <w:b/>
+                <w:color w:val="FFFFFF"/>
+                <w:sz w:val="20"/>
+              </w:rPr>
+              <w:t>Method</w:t>
+            </w:r>
+          </w:p>
+        </w:tc>
+        <w:tc>
+          <w:tcPr>
+            <w:tcW w:type="dxa" w:w="4032"/>
+            <w:shd w:val="clear" w:color="auto" w:fill="9B2D7F"/>
+          </w:tcPr>
+          <w:p>
+            <w:r>
+              <w:rPr>
+                <w:b/>
+                <w:color w:val="FFFFFF"/>
+                <w:sz w:val="20"/>
+              </w:rPr>
+              <w:t>Endpoint</w:t>
+            </w:r>
+          </w:p>
+        </w:tc>
+        <w:tc>
+          <w:tcPr>
+            <w:tcW w:type="dxa" w:w="3168"/>
+            <w:shd w:val="clear" w:color="auto" w:fill="9B2D7F"/>
+          </w:tcPr>
+          <w:p>
+            <w:r>
+              <w:rPr>
+                <w:b/>
+                <w:color w:val="FFFFFF"/>
+                <w:sz w:val="20"/>
+              </w:rPr>
+              <w:t>Screen</w:t>
+            </w:r>
+          </w:p>
+        </w:tc>
+      </w:tr>
+      <w:tr>
+        <w:tc>
+          <w:tcPr>
+            <w:tcW w:type="dxa" w:w="720"/>
+            <w:shd w:val="clear" w:color="auto" w:fill="DEEAF1"/>
+          </w:tcPr>
+          <w:p>
+            <w:r>
+              <w:rPr>
+                <w:sz w:val="19"/>
+              </w:rPr>
+              <w:t>80</w:t>
+            </w:r>
+          </w:p>
+        </w:tc>
+        <w:tc>
+          <w:tcPr>
+            <w:tcW w:type="dxa" w:w="1440"/>
+            <w:shd w:val="clear" w:color="auto" w:fill="DEEAF1"/>
+          </w:tcPr>
+          <w:p>
+            <w:r>
+              <w:rPr>
+                <w:sz w:val="19"/>
+              </w:rPr>
+              <w:t>GET</w:t>
+            </w:r>
+          </w:p>
+        </w:tc>
+        <w:tc>
+          <w:tcPr>
+            <w:tcW w:type="dxa" w:w="4032"/>
+            <w:shd w:val="clear" w:color="auto" w:fill="DEEAF1"/>
+          </w:tcPr>
+          <w:p>
+            <w:r>
+              <w:rPr>
+                <w:sz w:val="19"/>
+              </w:rPr>
+              <w:t>/products/search/?q=&amp;lat=&amp;lng=</w:t>
+            </w:r>
+          </w:p>
+        </w:tc>
+        <w:tc>
+          <w:tcPr>
+            <w:tcW w:type="dxa" w:w="3168"/>
+            <w:shd w:val="clear" w:color="auto" w:fill="DEEAF1"/>
+          </w:tcPr>
+          <w:p>
+            <w:r>
+              <w:rPr>
+                <w:sz w:val="19"/>
+              </w:rPr>
+              <w:t>C8 Search</w:t>
+            </w:r>
+          </w:p>
+        </w:tc>
+      </w:tr>
+      <w:tr>
+        <w:tc>
+          <w:tcPr>
+            <w:tcW w:type="dxa" w:w="720"/>
+          </w:tcPr>
+          <w:p>
+            <w:r>
+              <w:rPr>
+                <w:sz w:val="19"/>
+              </w:rPr>
+              <w:t>81</w:t>
+            </w:r>
+          </w:p>
+        </w:tc>
+        <w:tc>
+          <w:tcPr>
+            <w:tcW w:type="dxa" w:w="1440"/>
+          </w:tcPr>
+          <w:p>
+            <w:r>
+              <w:rPr>
+                <w:sz w:val="19"/>
+              </w:rPr>
+              <w:t>GET</w:t>
+            </w:r>
+          </w:p>
+        </w:tc>
+        <w:tc>
+          <w:tcPr>
+            <w:tcW w:type="dxa" w:w="4032"/>
+          </w:tcPr>
+          <w:p>
+            <w:r>
+              <w:rPr>
+                <w:sz w:val="19"/>
+              </w:rPr>
+              <w:t>/stores/{id}/</w:t>
+            </w:r>
+          </w:p>
+        </w:tc>
+        <w:tc>
+          <w:tcPr>
+            <w:tcW w:type="dxa" w:w="3168"/>
+          </w:tcPr>
+          <w:p>
+            <w:r>
+              <w:rPr>
+                <w:sz w:val="19"/>
+              </w:rPr>
+              <w:t>C9 Store Detail</w:t>
+            </w:r>
+          </w:p>
+        </w:tc>
+      </w:tr>
+      <w:tr>
+        <w:tc>
+          <w:tcPr>
+            <w:tcW w:type="dxa" w:w="720"/>
+            <w:shd w:val="clear" w:color="auto" w:fill="DEEAF1"/>
+          </w:tcPr>
+          <w:p>
+            <w:r>
+              <w:rPr>
+                <w:sz w:val="19"/>
+              </w:rPr>
+              <w:t>82</w:t>
+            </w:r>
+          </w:p>
+        </w:tc>
+        <w:tc>
+          <w:tcPr>
+            <w:tcW w:type="dxa" w:w="1440"/>
+            <w:shd w:val="clear" w:color="auto" w:fill="DEEAF1"/>
+          </w:tcPr>
+          <w:p>
+            <w:r>
+              <w:rPr>
+                <w:sz w:val="19"/>
+              </w:rPr>
+              <w:t>POST/DELETE</w:t>
+            </w:r>
+          </w:p>
+        </w:tc>
+        <w:tc>
+          <w:tcPr>
+            <w:tcW w:type="dxa" w:w="4032"/>
+            <w:shd w:val="clear" w:color="auto" w:fill="DEEAF1"/>
+          </w:tcPr>
+          <w:p>
+            <w:r>
+              <w:rPr>
+                <w:sz w:val="19"/>
+              </w:rPr>
+              <w:t>/stores/{id}/follow/</w:t>
+            </w:r>
+          </w:p>
+        </w:tc>
+        <w:tc>
+          <w:tcPr>
+            <w:tcW w:type="dxa" w:w="3168"/>
+            <w:shd w:val="clear" w:color="auto" w:fill="DEEAF1"/>
+          </w:tcPr>
+          <w:p>
+            <w:r>
+              <w:rPr>
+                <w:sz w:val="19"/>
+              </w:rPr>
+              <w:t>C9 Follow</w:t>
+            </w:r>
+          </w:p>
+        </w:tc>
+      </w:tr>
+      <w:tr>
+        <w:tc>
+          <w:tcPr>
+            <w:tcW w:type="dxa" w:w="720"/>
+          </w:tcPr>
+          <w:p>
+            <w:r>
+              <w:rPr>
+                <w:sz w:val="19"/>
+              </w:rPr>
+              <w:t>83</w:t>
+            </w:r>
+          </w:p>
+        </w:tc>
+        <w:tc>
+          <w:tcPr>
+            <w:tcW w:type="dxa" w:w="1440"/>
+          </w:tcPr>
+          <w:p>
+            <w:r>
+              <w:rPr>
+                <w:sz w:val="19"/>
+              </w:rPr>
+              <w:t>GET</w:t>
+            </w:r>
+          </w:p>
+        </w:tc>
+        <w:tc>
+          <w:tcPr>
+            <w:tcW w:type="dxa" w:w="4032"/>
+          </w:tcPr>
+          <w:p>
+            <w:r>
+              <w:rPr>
+                <w:sz w:val="19"/>
+              </w:rPr>
+              <w:t>/products/{id}/</w:t>
+            </w:r>
+          </w:p>
+        </w:tc>
+        <w:tc>
+          <w:tcPr>
+            <w:tcW w:type="dxa" w:w="3168"/>
+          </w:tcPr>
+          <w:p>
+            <w:r>
+              <w:rPr>
+                <w:sz w:val="19"/>
+              </w:rPr>
+              <w:t>C10 Product Detail</w:t>
+            </w:r>
+          </w:p>
+        </w:tc>
+      </w:tr>
+      <w:tr>
+        <w:tc>
+          <w:tcPr>
+            <w:tcW w:type="dxa" w:w="720"/>
+            <w:shd w:val="clear" w:color="auto" w:fill="DEEAF1"/>
+          </w:tcPr>
+          <w:p>
+            <w:r>
+              <w:rPr>
+                <w:sz w:val="19"/>
+              </w:rPr>
+              <w:t>84</w:t>
+            </w:r>
+          </w:p>
+        </w:tc>
+        <w:tc>
+          <w:tcPr>
+            <w:tcW w:type="dxa" w:w="1440"/>
+            <w:shd w:val="clear" w:color="auto" w:fill="DEEAF1"/>
+          </w:tcPr>
+          <w:p>
+            <w:r>
+              <w:rPr>
+                <w:sz w:val="19"/>
+              </w:rPr>
+              <w:t>POST</w:t>
+            </w:r>
+          </w:p>
+        </w:tc>
+        <w:tc>
+          <w:tcPr>
+            <w:tcW w:type="dxa" w:w="4032"/>
+            <w:shd w:val="clear" w:color="auto" w:fill="DEEAF1"/>
+          </w:tcPr>
+          <w:p>
+            <w:r>
+              <w:rPr>
+                <w:sz w:val="19"/>
+              </w:rPr>
+              <w:t>/products/{id}/reserve/</w:t>
+            </w:r>
+          </w:p>
+        </w:tc>
+        <w:tc>
+          <w:tcPr>
+            <w:tcW w:type="dxa" w:w="3168"/>
+            <w:shd w:val="clear" w:color="auto" w:fill="DEEAF1"/>
+          </w:tcPr>
+          <w:p>
+            <w:r>
+              <w:rPr>
+                <w:sz w:val="19"/>
+              </w:rPr>
+              <w:t>C10 Reserve</w:t>
+            </w:r>
+          </w:p>
+        </w:tc>
+      </w:tr>
+      <w:tr>
+        <w:tc>
+          <w:tcPr>
+            <w:tcW w:type="dxa" w:w="720"/>
+          </w:tcPr>
+          <w:p>
+            <w:r>
+              <w:rPr>
+                <w:sz w:val="19"/>
+              </w:rPr>
+              <w:t>85</w:t>
+            </w:r>
+          </w:p>
+        </w:tc>
+        <w:tc>
+          <w:tcPr>
+            <w:tcW w:type="dxa" w:w="1440"/>
+          </w:tcPr>
+          <w:p>
+            <w:r>
+              <w:rPr>
+                <w:sz w:val="19"/>
+              </w:rPr>
+              <w:t>POST/DELETE</w:t>
+            </w:r>
+          </w:p>
+        </w:tc>
+        <w:tc>
+          <w:tcPr>
+            <w:tcW w:type="dxa" w:w="4032"/>
+          </w:tcPr>
+          <w:p>
+            <w:r>
+              <w:rPr>
+                <w:sz w:val="19"/>
+              </w:rPr>
+              <w:t>/products/{id}/wishlist/</w:t>
+            </w:r>
+          </w:p>
+        </w:tc>
+        <w:tc>
+          <w:tcPr>
+            <w:tcW w:type="dxa" w:w="3168"/>
+          </w:tcPr>
+          <w:p>
+            <w:r>
+              <w:rPr>
+                <w:sz w:val="19"/>
+              </w:rPr>
+              <w:t>C10 Wishlist</w:t>
+            </w:r>
+          </w:p>
+        </w:tc>
+      </w:tr>
     </w:tbl>
     <w:p/>
     <w:p/>
@@ -31535,7 +33272,7 @@
           <w:color w:val="999999"/>
           <w:sz w:val="18"/>
         </w:rPr>
-        <w:t>NearKart Backend — Master API Testing Guide   |   Sprint 1–12   |   Use Postman or curl for testing</w:t>
+        <w:t>NearKart — Master API Testing Guide   |   Backend Sprint 1–12  +  Mobile Sprint 3   |   Use Postman or curl for testing</w:t>
       </w:r>
     </w:p>
     <w:sectPr>

</xml_diff>

<commit_message>
docs: update master API guide through Sprint 15
- Subtitle updated: Sprint 1 → Sprint 15
- Added Sprint 13 section (algorithms, no new endpoints)
- Added Sprint 14 section (FCM token reminder, QR scanner note)
- Added Sprint 15 section: STEP 86–90 (loyalty balance, history,
  apply referral, redeem points, reserve with loyalty discount)
- Added Loyalty Error Cases block in Section 4
- Footer updated to Sprint 1–15 + Mobile Sprint 3–15

Co-Authored-By: Claude Sonnet 4.6 <noreply@anthropic.com>
</commit_message>
<xml_diff>
--- a/nearkart_backend/docs/NearKart_Master_API_Testing_Guide.docx
+++ b/nearkart_backend/docs/NearKart_Master_API_Testing_Guide.docx
@@ -50,7 +50,7 @@
           <w:color w:val="888888"/>
           <w:sz w:val="20"/>
         </w:rPr>
-        <w:t>Sprint 1 → Sprint 12   |   Last updated: May 2026</w:t>
+        <w:t>Sprint 1 → Sprint 15   |   Last updated: May 2026</w:t>
       </w:r>
     </w:p>
     <w:p/>
@@ -32843,7 +32843,6 @@
         <w:t xml:space="preserve">  💡  Optimistic update — heart icon fills/unfills immediately, reverts on failure.</w:t>
       </w:r>
     </w:p>
-    <w:p/>
     <w:tbl>
       <w:tblPr>
         <w:tblStyle w:val="TableGrid"/>
@@ -33260,19 +33259,732 @@
         </w:tc>
       </w:tr>
     </w:tbl>
+    <w:p>
+      <w:pPr>
+        <w:pStyle w:val="Heading1"/>
+      </w:pPr>
+      <w:r>
+        <w:t>Sprint 13 — Performance Algorithms + Test Infrastructure</w:t>
+      </w:r>
+    </w:p>
+    <w:p>
+      <w:pPr/>
+      <w:r>
+        <w:t>Sprint 13 added backend performance algorithms and a comprehensive automated test suite. No new customer-facing API endpoints were introduced.</w:t>
+      </w:r>
+    </w:p>
+    <w:p>
+      <w:pPr/>
+      <w:r>
+        <w:t>Algorithms added to backend (transparent to API consumers):</w:t>
+      </w:r>
+    </w:p>
+    <w:p>
+      <w:pPr/>
+      <w:r>
+        <w:t xml:space="preserve">  • Geo-Proximity Sort — haversine-distance ranking for /stores/nearby/ and /products/nearby/</w:t>
+        <w:br/>
+        <w:t xml:space="preserve">  • Smart Search Ranking — TF-IDF-style relevance scoring on product search</w:t>
+        <w:br/>
+        <w:t xml:space="preserve">  • Circuit Breaker — protects WebSocket / external service calls</w:t>
+        <w:br/>
+        <w:t xml:space="preserve">  • Reservation Expiry Sweep — Celery Beat task auto-expires stale holds</w:t>
+        <w:br/>
+        <w:t xml:space="preserve">  • Trending Products — weighted time-decay score for home feed ranking</w:t>
+      </w:r>
+    </w:p>
+    <w:p>
+      <w:pPr/>
+      <w:r>
+        <w:t>Existing endpoints unaffected — results are now faster and better ranked.</w:t>
+      </w:r>
+    </w:p>
+    <w:p>
+      <w:pPr/>
+      <w:r>
+        <w:t>──────────────────────────────────────────────────────────────────────────────────────────</w:t>
+      </w:r>
+    </w:p>
+    <w:p>
+      <w:pPr>
+        <w:pStyle w:val="Heading1"/>
+      </w:pPr>
+      <w:r>
+        <w:t>Sprint 14 — FCM Push Notifications + Edit Profile + QR Scanner  (Mobile)</w:t>
+      </w:r>
+    </w:p>
+    <w:p>
+      <w:pPr/>
+      <w:r>
+        <w:t>Sprint 14 completed mobile-only features. The device-token endpoint (STEP 70) was already available from Sprint 11. Sprint 14 wired it up in the Android app automatically on login.</w:t>
+      </w:r>
+    </w:p>
+    <w:p>
+      <w:pPr>
+        <w:pStyle w:val="Heading2"/>
+      </w:pPr>
+      <w:r>
+        <w:t>STEP 70 (updated) — Register Device FCM Token  (reminder)</w:t>
+      </w:r>
+    </w:p>
+    <w:p>
+      <w:pPr/>
+      <w:r>
+        <w:t xml:space="preserve">  POST    {{base_url}}/notifications/device-token/   [Bearer JWT]   [Sprint 11 / Sprint 14]</w:t>
+      </w:r>
+    </w:p>
+    <w:p>
+      <w:pPr/>
+      <w:r>
+        <w:t>Authorization: Bearer {{access_token}}</w:t>
+      </w:r>
+    </w:p>
+    <w:p>
+      <w:pPr/>
+      <w:r>
+        <w:t>Content-Type: application/json</w:t>
+      </w:r>
+    </w:p>
+    <w:p>
+      <w:pPr/>
+      <w:r>
+        <w:t>Request Body:</w:t>
+      </w:r>
+    </w:p>
+    <w:p>
+      <w:pPr/>
+      <w:r>
+        <w:rPr>
+          <w:rFonts w:ascii="Courier New" w:hAnsi="Courier New"/>
+          <w:sz w:val="18"/>
+        </w:rPr>
+        <w:t>{</w:t>
+        <w:br/>
+        <w:t xml:space="preserve">  "fcm_token": "your-firebase-fcm-token",</w:t>
+        <w:br/>
+        <w:t xml:space="preserve">  "device_type": "android"</w:t>
+        <w:br/>
+        <w:t>}</w:t>
+      </w:r>
+    </w:p>
+    <w:p>
+      <w:pPr/>
+      <w:r>
+        <w:t>Expected Response  200 OK:</w:t>
+      </w:r>
+    </w:p>
+    <w:p>
+      <w:pPr/>
+      <w:r>
+        <w:rPr>
+          <w:rFonts w:ascii="Courier New" w:hAnsi="Courier New"/>
+          <w:sz w:val="18"/>
+        </w:rPr>
+        <w:t>{</w:t>
+        <w:br/>
+        <w:t xml:space="preserve">  "message": "Device token registered."</w:t>
+        <w:br/>
+        <w:t>}</w:t>
+      </w:r>
+    </w:p>
+    <w:p>
+      <w:pPr/>
+      <w:r>
+        <w:t xml:space="preserve">  💡  Mobile app calls this automatically after login and on each app launch (via FirebaseMessagingService).</w:t>
+      </w:r>
+    </w:p>
+    <w:p>
+      <w:pPr/>
+      <w:r>
+        <w:t>──────────────────────────────────────────────────────────────────────────────────────────</w:t>
+      </w:r>
+    </w:p>
+    <w:p>
+      <w:pPr>
+        <w:pStyle w:val="Heading2"/>
+      </w:pPr>
+      <w:r>
+        <w:t>QR Code — Scan Store QR  (Mobile Sprint 14)</w:t>
+      </w:r>
+    </w:p>
+    <w:p>
+      <w:pPr/>
+      <w:r>
+        <w:t>The mobile QR Scanner reads a NearKart store QR code (format: https://nearkart.in/stores/&lt;uuid&gt;) and navigates directly to that store detail screen. No new backend endpoint — uses GET /stores/&lt;id&gt;/ (STEP 12).</w:t>
+      </w:r>
+    </w:p>
+    <w:p>
+      <w:pPr/>
+      <w:r>
+        <w:t>──────────────────────────────────────────────────────────────────────────────────────────</w:t>
+      </w:r>
+    </w:p>
+    <w:p>
+      <w:pPr>
+        <w:pStyle w:val="Heading1"/>
+      </w:pPr>
+      <w:r>
+        <w:t>Sprint 15 — Loyalty Points + Referral System  (Steps 86–90)</w:t>
+      </w:r>
+    </w:p>
+    <w:p>
+      <w:pPr/>
+      <w:r>
+        <w:t>Business Rules:</w:t>
+      </w:r>
+    </w:p>
+    <w:p>
+      <w:pPr/>
+      <w:r>
+        <w:t xml:space="preserve">  • 10 points = ₹1 discount</w:t>
+        <w:br/>
+        <w:t xml:space="preserve">  • Referral earns 50 pts (customer) or 100 pts (vendor) for the referrer</w:t>
+        <w:br/>
+        <w:t xml:space="preserve">  • Min redemption: 50 pts  |  Max redemption: 500 pts per transaction</w:t>
+        <w:br/>
+        <w:t xml:space="preserve">  • Each user may only apply one referral code (one-time)</w:t>
+        <w:br/>
+        <w:t xml:space="preserve">  • Referral code format: NK + 6 alphanumeric uppercase chars (e.g. NKABC12)</w:t>
+      </w:r>
+    </w:p>
+    <w:p>
+      <w:pPr/>
+      <w:r>
+        <w:t>──────────────────────────────────────────────────────────────────────────────────────────</w:t>
+      </w:r>
+    </w:p>
+    <w:p>
+      <w:pPr>
+        <w:pStyle w:val="Heading2"/>
+      </w:pPr>
+      <w:r>
+        <w:t>STEP 86 — Get Loyalty Balance + Referral Code  (Customer / Vendor)</w:t>
+      </w:r>
+    </w:p>
+    <w:p>
+      <w:pPr/>
+      <w:r>
+        <w:t xml:space="preserve">  GET    {{base_url}}/loyalty/   [Bearer JWT]   [Sprint 15]</w:t>
+      </w:r>
+    </w:p>
+    <w:p>
+      <w:pPr/>
+      <w:r>
+        <w:t>Authorization: Bearer {{access_token}}</w:t>
+      </w:r>
+    </w:p>
+    <w:p>
+      <w:pPr/>
+      <w:r>
+        <w:t>No request body.</w:t>
+      </w:r>
+    </w:p>
+    <w:p>
+      <w:pPr/>
+      <w:r>
+        <w:t>Expected Response  200 OK:</w:t>
+      </w:r>
+    </w:p>
+    <w:p>
+      <w:pPr/>
+      <w:r>
+        <w:rPr>
+          <w:rFonts w:ascii="Courier New" w:hAnsi="Courier New"/>
+          <w:sz w:val="18"/>
+        </w:rPr>
+        <w:t>{</w:t>
+        <w:br/>
+        <w:t xml:space="preserve">  "balance": 150,</w:t>
+        <w:br/>
+        <w:t xml:space="preserve">  "total_earned": 200,</w:t>
+        <w:br/>
+        <w:t xml:space="preserve">  "total_redeemed": 50,</w:t>
+        <w:br/>
+        <w:t xml:space="preserve">  "referral_code": "NKABC123",</w:t>
+        <w:br/>
+        <w:t xml:space="preserve">  "points_value_rupees": 15,</w:t>
+        <w:br/>
+        <w:t xml:space="preserve">  "referrals_count": 2</w:t>
+        <w:br/>
+        <w:t>}</w:t>
+      </w:r>
+    </w:p>
+    <w:p>
+      <w:pPr/>
+      <w:r>
+        <w:t xml:space="preserve">  💡  A LoyaltyAccount is created automatically on first call — no setup needed.</w:t>
+      </w:r>
+    </w:p>
+    <w:p>
+      <w:pPr/>
+      <w:r>
+        <w:t xml:space="preserve">  Mobile profile screen shows "balance" as the loyalty card number. "referral_code" is displayed in the Refer &amp; Earn screen.  ⭐</w:t>
+      </w:r>
+    </w:p>
+    <w:p>
+      <w:pPr/>
+      <w:r>
+        <w:t>──────────────────────────────────────────────────────────────────────────────────────────</w:t>
+      </w:r>
+    </w:p>
+    <w:p>
+      <w:pPr>
+        <w:pStyle w:val="Heading2"/>
+      </w:pPr>
+      <w:r>
+        <w:t>STEP 87 — Loyalty Transaction History</w:t>
+      </w:r>
+    </w:p>
+    <w:p>
+      <w:pPr/>
+      <w:r>
+        <w:t xml:space="preserve">  GET    {{base_url}}/loyalty/history/   [Bearer JWT]   [Sprint 15]</w:t>
+      </w:r>
+    </w:p>
+    <w:p>
+      <w:pPr/>
+      <w:r>
+        <w:t>Authorization: Bearer {{access_token}}</w:t>
+      </w:r>
+    </w:p>
+    <w:p>
+      <w:pPr/>
+      <w:r>
+        <w:t>No request body. Returns last 50 transactions, newest first.</w:t>
+      </w:r>
+    </w:p>
+    <w:p>
+      <w:pPr/>
+      <w:r>
+        <w:t>Expected Response  200 OK:</w:t>
+      </w:r>
+    </w:p>
+    <w:p>
+      <w:pPr/>
+      <w:r>
+        <w:rPr>
+          <w:rFonts w:ascii="Courier New" w:hAnsi="Courier New"/>
+          <w:sz w:val="18"/>
+        </w:rPr>
+        <w:t>[</w:t>
+        <w:br/>
+        <w:t xml:space="preserve">  {</w:t>
+        <w:br/>
+        <w:t xml:space="preserve">    "id": "uuid",</w:t>
+        <w:br/>
+        <w:t xml:space="preserve">    "transaction_type": "earn",</w:t>
+        <w:br/>
+        <w:t xml:space="preserve">    "source": "referral",</w:t>
+        <w:br/>
+        <w:t xml:space="preserve">    "points": 50,</w:t>
+        <w:br/>
+        <w:t xml:space="preserve">    "description": "Referral bonus — friend +919000000003 joined",</w:t>
+        <w:br/>
+        <w:t xml:space="preserve">    "balance_after": 50,</w:t>
+        <w:br/>
+        <w:t xml:space="preserve">    "created_at": "2026-05-23T10:00:00Z"</w:t>
+        <w:br/>
+        <w:t xml:space="preserve">  },</w:t>
+        <w:br/>
+        <w:t xml:space="preserve">  {</w:t>
+        <w:br/>
+        <w:t xml:space="preserve">    "id": "uuid",</w:t>
+        <w:br/>
+        <w:t xml:space="preserve">    "transaction_type": "redeem",</w:t>
+        <w:br/>
+        <w:t xml:space="preserve">    "source": "redemption",</w:t>
+        <w:br/>
+        <w:t xml:space="preserve">    "points": 50,</w:t>
+        <w:br/>
+        <w:t xml:space="preserve">    "description": "Discount on reservation — Blue Kurta",</w:t>
+        <w:br/>
+        <w:t xml:space="preserve">    "balance_after": 0,</w:t>
+        <w:br/>
+        <w:t xml:space="preserve">    "created_at": "2026-05-23T11:00:00Z"</w:t>
+        <w:br/>
+        <w:t xml:space="preserve">  }</w:t>
+        <w:br/>
+        <w:t>]</w:t>
+      </w:r>
+    </w:p>
+    <w:p>
+      <w:pPr/>
+      <w:r>
+        <w:t xml:space="preserve">  💡  transaction_type is either "earn" or "redeem". Mobile shows green "+" for earn, red "-" for redeem.</w:t>
+      </w:r>
+    </w:p>
+    <w:p>
+      <w:pPr/>
+      <w:r>
+        <w:t>──────────────────────────────────────────────────────────────────────────────────────────</w:t>
+      </w:r>
+    </w:p>
+    <w:p>
+      <w:pPr>
+        <w:pStyle w:val="Heading2"/>
+      </w:pPr>
+      <w:r>
+        <w:t>STEP 88 — Apply a Referral Code  (One-time per user)</w:t>
+      </w:r>
+    </w:p>
+    <w:p>
+      <w:pPr/>
+      <w:r>
+        <w:t xml:space="preserve">  POST    {{base_url}}/loyalty/apply-referral/   [Bearer JWT]   [Sprint 15]</w:t>
+      </w:r>
+    </w:p>
+    <w:p>
+      <w:pPr/>
+      <w:r>
+        <w:t>Authorization: Bearer {{access_token}}</w:t>
+      </w:r>
+    </w:p>
+    <w:p>
+      <w:pPr/>
+      <w:r>
+        <w:t>Content-Type: application/json</w:t>
+      </w:r>
+    </w:p>
+    <w:p>
+      <w:pPr/>
+      <w:r>
+        <w:t>Request Body:</w:t>
+      </w:r>
+    </w:p>
+    <w:p>
+      <w:pPr/>
+      <w:r>
+        <w:rPr>
+          <w:rFonts w:ascii="Courier New" w:hAnsi="Courier New"/>
+          <w:sz w:val="18"/>
+        </w:rPr>
+        <w:t>{</w:t>
+        <w:br/>
+        <w:t xml:space="preserve">  "referral_code": "NKABC123"</w:t>
+        <w:br/>
+        <w:t>}</w:t>
+      </w:r>
+    </w:p>
+    <w:p>
+      <w:pPr/>
+      <w:r>
+        <w:t>Expected Response  200 OK:</w:t>
+      </w:r>
+    </w:p>
+    <w:p>
+      <w:pPr/>
+      <w:r>
+        <w:rPr>
+          <w:rFonts w:ascii="Courier New" w:hAnsi="Courier New"/>
+          <w:sz w:val="18"/>
+        </w:rPr>
+        <w:t>{</w:t>
+        <w:br/>
+        <w:t xml:space="preserve">  "message": "Referral applied! Your friend earned 50 loyalty points.",</w:t>
+        <w:br/>
+        <w:t xml:space="preserve">  "points_awarded": 50</w:t>
+        <w:br/>
+        <w:t>}</w:t>
+      </w:r>
+    </w:p>
+    <w:p>
+      <w:pPr/>
+      <w:r>
+        <w:t>Error cases:</w:t>
+      </w:r>
+    </w:p>
+    <w:p>
+      <w:pPr/>
+      <w:r>
+        <w:t xml:space="preserve">  🚫  400 — code not found: {"error": "invalid_referral", "message": "Invalid referral code."}</w:t>
+        <w:br/>
+        <w:t xml:space="preserve">  🚫  400 — already used: {"error": "invalid_referral", "message": "You have already applied a referral code."}</w:t>
+        <w:br/>
+        <w:t xml:space="preserve">  🚫  400 — own code: {"error": "invalid_referral", "message": "You cannot apply your own referral code."}</w:t>
+      </w:r>
+    </w:p>
+    <w:p>
+      <w:pPr/>
+      <w:r>
+        <w:t xml:space="preserve">  💡  The referrer (code owner) receives the points, not the user applying the code.</w:t>
+      </w:r>
+    </w:p>
+    <w:p>
+      <w:pPr/>
+      <w:r>
+        <w:t>──────────────────────────────────────────────────────────────────────────────────────────</w:t>
+      </w:r>
+    </w:p>
+    <w:p>
+      <w:pPr>
+        <w:pStyle w:val="Heading2"/>
+      </w:pPr>
+      <w:r>
+        <w:t>STEP 89 — Standalone Points Redemption</w:t>
+      </w:r>
+    </w:p>
+    <w:p>
+      <w:pPr/>
+      <w:r>
+        <w:t xml:space="preserve">  POST    {{base_url}}/loyalty/redeem/   [Bearer JWT]   [Sprint 15]</w:t>
+      </w:r>
+    </w:p>
+    <w:p>
+      <w:pPr/>
+      <w:r>
+        <w:t>Authorization: Bearer {{access_token}}</w:t>
+      </w:r>
+    </w:p>
+    <w:p>
+      <w:pPr/>
+      <w:r>
+        <w:t>Content-Type: application/json</w:t>
+      </w:r>
+    </w:p>
+    <w:p>
+      <w:pPr/>
+      <w:r>
+        <w:t>Request Body:</w:t>
+      </w:r>
+    </w:p>
+    <w:p>
+      <w:pPr/>
+      <w:r>
+        <w:rPr>
+          <w:rFonts w:ascii="Courier New" w:hAnsi="Courier New"/>
+          <w:sz w:val="18"/>
+        </w:rPr>
+        <w:t>{</w:t>
+        <w:br/>
+        <w:t xml:space="preserve">  "points": 100,</w:t>
+        <w:br/>
+        <w:t xml:space="preserve">  "description": "Discount on reservation"</w:t>
+        <w:br/>
+        <w:t>}</w:t>
+      </w:r>
+    </w:p>
+    <w:p>
+      <w:pPr/>
+      <w:r>
+        <w:t xml:space="preserve">  points: integer, min 50, max 500</w:t>
+      </w:r>
+    </w:p>
+    <w:p>
+      <w:pPr/>
+      <w:r>
+        <w:t xml:space="preserve">  description: optional string</w:t>
+      </w:r>
+    </w:p>
+    <w:p>
+      <w:pPr/>
+      <w:r>
+        <w:t>Expected Response  200 OK:</w:t>
+      </w:r>
+    </w:p>
+    <w:p>
+      <w:pPr/>
+      <w:r>
+        <w:rPr>
+          <w:rFonts w:ascii="Courier New" w:hAnsi="Courier New"/>
+          <w:sz w:val="18"/>
+        </w:rPr>
+        <w:t>{</w:t>
+        <w:br/>
+        <w:t xml:space="preserve">  "message": "Redeemed 100 points for ₹10 discount.",</w:t>
+        <w:br/>
+        <w:t xml:space="preserve">  "points_redeemed": 100,</w:t>
+        <w:br/>
+        <w:t xml:space="preserve">  "discount_rupees": 10,</w:t>
+        <w:br/>
+        <w:t xml:space="preserve">  "balance_remaining": 50</w:t>
+        <w:br/>
+        <w:t>}</w:t>
+      </w:r>
+    </w:p>
+    <w:p>
+      <w:pPr/>
+      <w:r>
+        <w:t>Error cases:</w:t>
+      </w:r>
+    </w:p>
+    <w:p>
+      <w:pPr/>
+      <w:r>
+        <w:t xml:space="preserve">  🚫  400 — insufficient: {"error": "redemption_failed", "message": "Insufficient points. Available: 30, requested: 100."}</w:t>
+        <w:br/>
+        <w:t xml:space="preserve">  🚫  400 — below minimum: {"error": "redemption_failed", "message": "Minimum redemption is 50 points."}</w:t>
+      </w:r>
+    </w:p>
+    <w:p>
+      <w:pPr/>
+      <w:r>
+        <w:t xml:space="preserve">  💡  In practice the mobile app bundles redemption into the reservation request (STEP 90). Use this endpoint only for standalone testing.</w:t>
+      </w:r>
+    </w:p>
+    <w:p>
+      <w:pPr/>
+      <w:r>
+        <w:t>──────────────────────────────────────────────────────────────────────────────────────────</w:t>
+      </w:r>
+    </w:p>
+    <w:p>
+      <w:pPr>
+        <w:pStyle w:val="Heading2"/>
+      </w:pPr>
+      <w:r>
+        <w:t>STEP 90 — Reserve Product with Loyalty Points Discount  (updated STEP 84)</w:t>
+      </w:r>
+    </w:p>
+    <w:p>
+      <w:pPr/>
+      <w:r>
+        <w:t xml:space="preserve">  POST    {{base_url}}/products/{{product_id}}/reserve/   [Customer JWT]   [Sprint 15]</w:t>
+      </w:r>
+    </w:p>
+    <w:p>
+      <w:pPr/>
+      <w:r>
+        <w:t>Authorization: Bearer {{customer_token}}</w:t>
+      </w:r>
+    </w:p>
+    <w:p>
+      <w:pPr/>
+      <w:r>
+        <w:t>Content-Type: application/json</w:t>
+      </w:r>
+    </w:p>
+    <w:p>
+      <w:pPr/>
+      <w:r>
+        <w:t>Request Body (with loyalty discount):</w:t>
+      </w:r>
+    </w:p>
+    <w:p>
+      <w:pPr/>
+      <w:r>
+        <w:rPr>
+          <w:rFonts w:ascii="Courier New" w:hAnsi="Courier New"/>
+          <w:sz w:val="18"/>
+        </w:rPr>
+        <w:t>{</w:t>
+        <w:br/>
+        <w:t xml:space="preserve">  "size": "M",</w:t>
+        <w:br/>
+        <w:t xml:space="preserve">  "quantity": 1,</w:t>
+        <w:br/>
+        <w:t xml:space="preserve">  "points_to_redeem": 50</w:t>
+        <w:br/>
+        <w:t>}</w:t>
+      </w:r>
+    </w:p>
+    <w:p>
+      <w:pPr/>
+      <w:r>
+        <w:t xml:space="preserve">  points_to_redeem: optional integer (default 0). Min 50, max 500. Must not exceed current balance.</w:t>
+      </w:r>
+    </w:p>
+    <w:p>
+      <w:pPr/>
+      <w:r>
+        <w:t>Expected Response  201 Created:</w:t>
+      </w:r>
+    </w:p>
+    <w:p>
+      <w:pPr/>
+      <w:r>
+        <w:rPr>
+          <w:rFonts w:ascii="Courier New" w:hAnsi="Courier New"/>
+          <w:sz w:val="18"/>
+        </w:rPr>
+        <w:t>{</w:t>
+        <w:br/>
+        <w:t xml:space="preserve">  "id": "uuid",</w:t>
+        <w:br/>
+        <w:t xml:space="preserve">  "status": "pending",</w:t>
+        <w:br/>
+        <w:t xml:space="preserve">  "quantity": 1,</w:t>
+        <w:br/>
+        <w:t xml:space="preserve">  "points_redeemed": 50,</w:t>
+        <w:br/>
+        <w:t xml:space="preserve">  "discount_amount": "5.00",</w:t>
+        <w:br/>
+        <w:t xml:space="preserve">  "expires_at": "2026-05-23T13:00:00Z",</w:t>
+        <w:br/>
+        <w:t xml:space="preserve">  "hours_left": 2.0,</w:t>
+        <w:br/>
+        <w:t xml:space="preserve">  "store": { "id": "...", "name": "..." },</w:t>
+        <w:br/>
+        <w:t xml:space="preserve">  "product": { "id": "...", "name": "Blue Kurta", "base_price": "450.00" }</w:t>
+        <w:br/>
+        <w:t>}</w:t>
+      </w:r>
+    </w:p>
+    <w:p>
+      <w:pPr/>
+      <w:r>
+        <w:t>Error cases:</w:t>
+      </w:r>
+    </w:p>
+    <w:p>
+      <w:pPr/>
+      <w:r>
+        <w:t xml:space="preserve">  🚫  400 — loyalty_error: {"error": "loyalty_error", "message": "Insufficient points. Available: 30, requested: 50."}</w:t>
+        <w:br/>
+        <w:t xml:space="preserve">  🚫  400 — loyalty_error: {"error": "loyalty_error", "message": "Minimum redemption is 50 points."}</w:t>
+      </w:r>
+    </w:p>
+    <w:p>
+      <w:pPr/>
+      <w:r>
+        <w:t xml:space="preserve">  💡  Omit points_to_redeem (or set to 0) for a normal reservation with no discount. The mobile app shows a toggle only when balance ≥ 50 pts.</w:t>
+      </w:r>
+    </w:p>
+    <w:p>
+      <w:pPr/>
+      <w:r>
+        <w:t>──────────────────────────────────────────────────────────────────────────────────────────</w:t>
+      </w:r>
+    </w:p>
+    <w:p>
+      <w:pPr>
+        <w:pStyle w:val="Heading2"/>
+      </w:pPr>
+      <w:r>
+        <w:t>Loyalty Error Cases  (Sprint 15)</w:t>
+      </w:r>
+    </w:p>
+    <w:p>
+      <w:pPr/>
+      <w:r>
+        <w:t xml:space="preserve">  🚫  400 — applying own referral code</w:t>
+        <w:br/>
+        <w:t xml:space="preserve">  🚫  400 — applying referral code a second time</w:t>
+        <w:br/>
+        <w:t xml:space="preserve">  🚫  400 — applying non-existent code</w:t>
+        <w:br/>
+        <w:t xml:space="preserve">  🚫  400 — redeeming more points than balance</w:t>
+        <w:br/>
+        <w:t xml:space="preserve">  🚫  400 — redeeming below minimum (50 pts)</w:t>
+        <w:br/>
+        <w:t xml:space="preserve">  🚫  400 — redeeming above maximum (500 pts)</w:t>
+        <w:br/>
+        <w:t xml:space="preserve">  🚫  400 — points_to_redeem on reserve exceeds balance</w:t>
+        <w:br/>
+        <w:t xml:space="preserve">  ✅  200 — all edge-case amounts within [50, min(500, balance)] range work correctly</w:t>
+      </w:r>
+    </w:p>
+    <w:p>
+      <w:pPr/>
+      <w:r>
+        <w:t>──────────────────────────────────────────────────────────────────────────────────────────</w:t>
+      </w:r>
+    </w:p>
     <w:p/>
     <w:p/>
     <w:p>
-      <w:pPr>
-        <w:jc w:val="center"/>
-      </w:pPr>
-      <w:r>
-        <w:rPr>
-          <w:i/>
-          <w:color w:val="999999"/>
-          <w:sz w:val="18"/>
-        </w:rPr>
-        <w:t>NearKart — Master API Testing Guide   |   Backend Sprint 1–12  +  Mobile Sprint 3   |   Use Postman or curl for testing</w:t>
+      <w:pPr/>
+      <w:r>
+        <w:t>NearKart — Master API Testing Guide   |   Backend Sprint 1–15  +  Mobile Sprint 3–15   |   Use Postman or curl for testing</w:t>
       </w:r>
     </w:p>
     <w:sectPr>

</xml_diff>

<commit_message>
docs: update master API guide with Sprint 16 endpoints (Steps 91–95)
Added review endpoints: submit review (S91), list reviews (S92),
vendor reply (S93), vendor list reviews (S94), customer my reviews (S95).
Updated footer to Sprint 1–16.

Co-Authored-By: Claude Sonnet 4.6 <noreply@anthropic.com>
</commit_message>
<xml_diff>
--- a/nearkart_backend/docs/NearKart_Master_API_Testing_Guide.docx
+++ b/nearkart_backend/docs/NearKart_Master_API_Testing_Guide.docx
@@ -33984,7 +33984,399 @@
     <w:p>
       <w:pPr/>
       <w:r>
-        <w:t>NearKart — Master API Testing Guide   |   Backend Sprint 1–15  +  Mobile Sprint 3–15   |   Use Postman or curl for testing</w:t>
+        <w:t>NearKart — Master API Testing Guide   |   Backend Sprint 1–16  +  Mobile Sprint 1–16</w:t>
+      </w:r>
+    </w:p>
+    <w:p>
+      <w:pPr/>
+      <w:r>
+        <w:t>────────────────────────────────────────────────────────────────────────────────</w:t>
+      </w:r>
+    </w:p>
+    <w:p>
+      <w:pPr>
+        <w:pStyle w:val="Heading2"/>
+      </w:pPr>
+      <w:r>
+        <w:t>SPRINT 16 — Reviews &amp; Ratings</w:t>
+      </w:r>
+    </w:p>
+    <w:p>
+      <w:pPr/>
+      <w:r>
+        <w:t xml:space="preserve">  New endpoints: Submit Review (gated), Vendor Reply, Vendor List Reviews, Customer My Reviews</w:t>
+      </w:r>
+    </w:p>
+    <w:p>
+      <w:pPr/>
+      <w:r>
+        <w:t xml:space="preserve">  Business rule: customer must have ≥1 completed reservation at the store to submit a review.</w:t>
+      </w:r>
+    </w:p>
+    <w:p>
+      <w:pPr/>
+      <w:r>
+        <w:t>────────────────────────────────────────────────────────────────────────────────</w:t>
+      </w:r>
+    </w:p>
+    <w:p>
+      <w:pPr>
+        <w:pStyle w:val="Heading2"/>
+      </w:pPr>
+      <w:r>
+        <w:t>STEP 91 — Submit a Review  (customer)</w:t>
+      </w:r>
+    </w:p>
+    <w:p>
+      <w:pPr/>
+      <w:r>
+        <w:t xml:space="preserve">  POST    {{base_url}}/stores/{{store_id}}/reviews/   [Customer JWT]   [Sprint 16]</w:t>
+      </w:r>
+    </w:p>
+    <w:p>
+      <w:pPr/>
+      <w:r>
+        <w:t>Authorization: Bearer {{customer_token}}</w:t>
+        <w:br/>
+        <w:t>Content-Type: application/json</w:t>
+      </w:r>
+    </w:p>
+    <w:p>
+      <w:pPr/>
+      <w:r>
+        <w:t>Request Body:</w:t>
+      </w:r>
+    </w:p>
+    <w:p>
+      <w:pPr/>
+      <w:r>
+        <w:t>{</w:t>
+        <w:br/>
+        <w:t xml:space="preserve">  "rating": 5,</w:t>
+        <w:br/>
+        <w:t xml:space="preserve">  "comment": "Excellent service, products were exactly as described!"</w:t>
+        <w:br/>
+        <w:t>}</w:t>
+      </w:r>
+    </w:p>
+    <w:p>
+      <w:pPr/>
+      <w:r>
+        <w:t xml:space="preserve">  rating: integer 1–5 (required)</w:t>
+        <w:br/>
+        <w:t xml:space="preserve">  comment: string, max 500 chars (optional)</w:t>
+      </w:r>
+    </w:p>
+    <w:p>
+      <w:pPr/>
+      <w:r>
+        <w:t>Expected Response  200 OK:</w:t>
+      </w:r>
+    </w:p>
+    <w:p>
+      <w:pPr/>
+      <w:r>
+        <w:t>{</w:t>
+        <w:br/>
+        <w:t xml:space="preserve">  "id": "uuid",</w:t>
+        <w:br/>
+        <w:t xml:space="preserve">  "user_phone": "+91900000000X",</w:t>
+        <w:br/>
+        <w:t xml:space="preserve">  "rating": 5,</w:t>
+        <w:br/>
+        <w:t xml:space="preserve">  "comment": "Excellent service...",</w:t>
+        <w:br/>
+        <w:t xml:space="preserve">  "vendor_reply": "",</w:t>
+        <w:br/>
+        <w:t xml:space="preserve">  "vendor_reply_at": null,</w:t>
+        <w:br/>
+        <w:t xml:space="preserve">  "created_at": "2026-05-23T10:00:00Z"</w:t>
+        <w:br/>
+        <w:t>}</w:t>
+      </w:r>
+    </w:p>
+    <w:p>
+      <w:pPr/>
+      <w:r>
+        <w:t>Error cases:</w:t>
+      </w:r>
+    </w:p>
+    <w:p>
+      <w:pPr/>
+      <w:r>
+        <w:t xml:space="preserve">  🚫  403 — no_completed_reservation: customer has no completed reservation at this store</w:t>
+        <w:br/>
+        <w:t xml:space="preserve">  💡  Submitting again from the same customer upserts (replaces) their existing review.</w:t>
+      </w:r>
+    </w:p>
+    <w:p>
+      <w:pPr/>
+      <w:r>
+        <w:t>────────────────────────────────────────────────────────────────────────────────</w:t>
+      </w:r>
+    </w:p>
+    <w:p>
+      <w:pPr>
+        <w:pStyle w:val="Heading2"/>
+      </w:pPr>
+      <w:r>
+        <w:t>STEP 92 — List Store Reviews  (public)</w:t>
+      </w:r>
+    </w:p>
+    <w:p>
+      <w:pPr/>
+      <w:r>
+        <w:t xml:space="preserve">  GET    {{base_url}}/stores/{{store_id}}/reviews/   [No auth required]   [Sprint 16]</w:t>
+      </w:r>
+    </w:p>
+    <w:p>
+      <w:pPr/>
+      <w:r>
+        <w:t>Expected Response  200 OK:</w:t>
+      </w:r>
+    </w:p>
+    <w:p>
+      <w:pPr/>
+      <w:r>
+        <w:t>{</w:t>
+        <w:br/>
+        <w:t xml:space="preserve">  "results": [</w:t>
+        <w:br/>
+        <w:t xml:space="preserve">    {</w:t>
+        <w:br/>
+        <w:t xml:space="preserve">      "id": "uuid",</w:t>
+        <w:br/>
+        <w:t xml:space="preserve">      "user_name": "Arj****",</w:t>
+        <w:br/>
+        <w:t xml:space="preserve">      "rating": 5,</w:t>
+        <w:br/>
+        <w:t xml:space="preserve">      "comment": "Excellent service...",</w:t>
+        <w:br/>
+        <w:t xml:space="preserve">      "vendor_reply": "Thank you for your kind words!",</w:t>
+        <w:br/>
+        <w:t xml:space="preserve">      "vendor_reply_at": "2026-05-23T11:00:00Z",</w:t>
+        <w:br/>
+        <w:t xml:space="preserve">      "created_at": "2026-05-23T10:00:00Z"</w:t>
+        <w:br/>
+        <w:t xml:space="preserve">    }</w:t>
+        <w:br/>
+        <w:t xml:space="preserve">  ],</w:t>
+        <w:br/>
+        <w:t xml:space="preserve">  "count": 1</w:t>
+        <w:br/>
+        <w:t>}</w:t>
+      </w:r>
+    </w:p>
+    <w:p>
+      <w:pPr/>
+      <w:r>
+        <w:t xml:space="preserve">  💡  user_name is masked (e.g. "Arj****"). vendor_reply is empty string if not yet replied.</w:t>
+      </w:r>
+    </w:p>
+    <w:p>
+      <w:pPr/>
+      <w:r>
+        <w:t>────────────────────────────────────────────────────────────────────────────────</w:t>
+      </w:r>
+    </w:p>
+    <w:p>
+      <w:pPr>
+        <w:pStyle w:val="Heading2"/>
+      </w:pPr>
+      <w:r>
+        <w:t>STEP 93 — Vendor Reply to Review</w:t>
+      </w:r>
+    </w:p>
+    <w:p>
+      <w:pPr/>
+      <w:r>
+        <w:t xml:space="preserve">  POST    {{base_url}}/stores/{{store_id}}/reviews/{{review_id}}/reply/   [Vendor JWT]   [Sprint 16]</w:t>
+      </w:r>
+    </w:p>
+    <w:p>
+      <w:pPr/>
+      <w:r>
+        <w:t>Authorization: Bearer {{vendor_token}}</w:t>
+        <w:br/>
+        <w:t>Content-Type: application/json</w:t>
+      </w:r>
+    </w:p>
+    <w:p>
+      <w:pPr/>
+      <w:r>
+        <w:t>Request Body:</w:t>
+      </w:r>
+    </w:p>
+    <w:p>
+      <w:pPr/>
+      <w:r>
+        <w:t>{</w:t>
+        <w:br/>
+        <w:t xml:space="preserve">  "reply": "Thank you! We look forward to seeing you again soon."</w:t>
+        <w:br/>
+        <w:t>}</w:t>
+      </w:r>
+    </w:p>
+    <w:p>
+      <w:pPr/>
+      <w:r>
+        <w:t>Expected Response  200 OK: Returns updated review object with vendor_reply populated.</w:t>
+      </w:r>
+    </w:p>
+    <w:p>
+      <w:pPr/>
+      <w:r>
+        <w:t>Error cases:</w:t>
+      </w:r>
+    </w:p>
+    <w:p>
+      <w:pPr/>
+      <w:r>
+        <w:t xml:space="preserve">  🚫  403 — not the store owner</w:t>
+        <w:br/>
+        <w:t xml:space="preserve">  🚫  404 — review not found</w:t>
+        <w:br/>
+        <w:t xml:space="preserve">  💡  Re-posting updates the existing reply (reply is editable).</w:t>
+      </w:r>
+    </w:p>
+    <w:p>
+      <w:pPr/>
+      <w:r>
+        <w:t>────────────────────────────────────────────────────────────────────────────────</w:t>
+      </w:r>
+    </w:p>
+    <w:p>
+      <w:pPr>
+        <w:pStyle w:val="Heading2"/>
+      </w:pPr>
+      <w:r>
+        <w:t>STEP 94 — Vendor: List All Reviews for My Store</w:t>
+      </w:r>
+    </w:p>
+    <w:p>
+      <w:pPr/>
+      <w:r>
+        <w:t xml:space="preserve">  GET    {{base_url}}/stores/{{store_id}}/reviews/vendor/   [Vendor JWT]   [Sprint 16]</w:t>
+      </w:r>
+    </w:p>
+    <w:p>
+      <w:pPr/>
+      <w:r>
+        <w:t>Authorization: Bearer {{vendor_token}}</w:t>
+      </w:r>
+    </w:p>
+    <w:p>
+      <w:pPr/>
+      <w:r>
+        <w:t>Expected Response  200 OK:</w:t>
+      </w:r>
+    </w:p>
+    <w:p>
+      <w:pPr/>
+      <w:r>
+        <w:t>{</w:t>
+        <w:br/>
+        <w:t xml:space="preserve">  "results": [...],</w:t>
+        <w:br/>
+        <w:t xml:space="preserve">  "count": 3</w:t>
+        <w:br/>
+        <w:t>}</w:t>
+      </w:r>
+    </w:p>
+    <w:p>
+      <w:pPr/>
+      <w:r>
+        <w:t xml:space="preserve">  💡  Only the store owner can access this endpoint. Returns all reviews including unreplied ones.</w:t>
+      </w:r>
+    </w:p>
+    <w:p>
+      <w:pPr/>
+      <w:r>
+        <w:t>────────────────────────────────────────────────────────────────────────────────</w:t>
+      </w:r>
+    </w:p>
+    <w:p>
+      <w:pPr>
+        <w:pStyle w:val="Heading2"/>
+      </w:pPr>
+      <w:r>
+        <w:t>STEP 95 — Customer: Get My Reviews</w:t>
+      </w:r>
+    </w:p>
+    <w:p>
+      <w:pPr/>
+      <w:r>
+        <w:t xml:space="preserve">  GET    {{base_url}}/stores/mine/reviews/   [Customer JWT]   [Sprint 16]</w:t>
+      </w:r>
+    </w:p>
+    <w:p>
+      <w:pPr/>
+      <w:r>
+        <w:t>Authorization: Bearer {{customer_token}}</w:t>
+      </w:r>
+    </w:p>
+    <w:p>
+      <w:pPr/>
+      <w:r>
+        <w:t>Expected Response  200 OK:</w:t>
+      </w:r>
+    </w:p>
+    <w:p>
+      <w:pPr/>
+      <w:r>
+        <w:t>{</w:t>
+        <w:br/>
+        <w:t xml:space="preserve">  "results": [</w:t>
+        <w:br/>
+        <w:t xml:space="preserve">    {</w:t>
+        <w:br/>
+        <w:t xml:space="preserve">      "id": "uuid",</w:t>
+        <w:br/>
+        <w:t xml:space="preserve">      "rating": 5,</w:t>
+        <w:br/>
+        <w:t xml:space="preserve">      "comment": "Great store!",</w:t>
+        <w:br/>
+        <w:t xml:space="preserve">      "vendor_reply": "",</w:t>
+        <w:br/>
+        <w:t xml:space="preserve">      "vendor_reply_at": null,</w:t>
+        <w:br/>
+        <w:t xml:space="preserve">      "store_id": "uuid",</w:t>
+        <w:br/>
+        <w:t xml:space="preserve">      "store_name": "Sneha's Fashion House",</w:t>
+        <w:br/>
+        <w:t xml:space="preserve">      "created_at": "2026-05-23T10:00:00Z"</w:t>
+        <w:br/>
+        <w:t xml:space="preserve">    }</w:t>
+        <w:br/>
+        <w:t xml:space="preserve">  ],</w:t>
+        <w:br/>
+        <w:t xml:space="preserve">  "count": 1</w:t>
+        <w:br/>
+        <w:t>}</w:t>
+      </w:r>
+    </w:p>
+    <w:p>
+      <w:pPr/>
+      <w:r>
+        <w:t xml:space="preserve">  💡  Returns all reviews submitted by the authenticated customer across all stores.</w:t>
+      </w:r>
+    </w:p>
+    <w:p>
+      <w:pPr/>
+      <w:r>
+        <w:t>────────────────────────────────────────────────────────────────────────────────</w:t>
+      </w:r>
+    </w:p>
+    <w:p>
+      <w:pPr/>
+    </w:p>
+    <w:p>
+      <w:pPr/>
+    </w:p>
+    <w:p>
+      <w:pPr/>
+      <w:r>
+        <w:t>NearKart — Master API Testing Guide   |   Backend Sprint 1–16  +  Mobile Sprint 1–16</w:t>
       </w:r>
     </w:p>
     <w:sectPr>

</xml_diff>

<commit_message>
docs(S17): Store Detail Enhancement — add sprint docs, update INDEX, DOCS_MAP, PROJECT_OVERVIEW
Sprint 17 is mobile-driven (no new backend endpoints). Docs added:
README, TESTING_CHECKLIST, POSTMAN_GUIDE. Master API guide footer updated
to Backend S1–16 + Mobile S1–17.

Co-Authored-By: Claude Sonnet 4.6 <noreply@anthropic.com>
</commit_message>
<xml_diff>
--- a/nearkart_backend/docs/NearKart_Master_API_Testing_Guide.docx
+++ b/nearkart_backend/docs/NearKart_Master_API_Testing_Guide.docx
@@ -33984,7 +33984,7 @@
     <w:p>
       <w:pPr/>
       <w:r>
-        <w:t>NearKart — Master API Testing Guide   |   Backend Sprint 1–16  +  Mobile Sprint 1–16</w:t>
+        <w:t>NearKart — Master API Testing Guide   |   Backend Sprint 1–16  +  Mobile Sprint 1–17</w:t>
       </w:r>
     </w:p>
     <w:p>
@@ -34376,7 +34376,7 @@
     <w:p>
       <w:pPr/>
       <w:r>
-        <w:t>NearKart — Master API Testing Guide   |   Backend Sprint 1–16  +  Mobile Sprint 1–16</w:t>
+        <w:t>NearKart — Master API Testing Guide   |   Backend Sprint 1–16  +  Mobile Sprint 1–17</w:t>
       </w:r>
     </w:p>
     <w:sectPr>

</xml_diff>

<commit_message>
feat(s18): add rating + review_count to ProductDetail store response
- MobileProductDetailSerializer.get_store(): includes rating (Avg) and review_count (Count) via aggregate() on StoreReview
- No migration needed — computed fields from existing data
- Docs: sprint_18_ratings_refresh README, TESTING_CHECKLIST, POSTMAN_GUIDE
- Updated INDEX.md, PROJECT_OVERVIEW.md, DOCS_MAP.md, Master API Guide footer to Sprint 1–18

Co-Authored-By: Claude Sonnet 4.6 <noreply@anthropic.com>
</commit_message>
<xml_diff>
--- a/nearkart_backend/docs/NearKart_Master_API_Testing_Guide.docx
+++ b/nearkart_backend/docs/NearKart_Master_API_Testing_Guide.docx
@@ -33984,7 +33984,7 @@
     <w:p>
       <w:pPr/>
       <w:r>
-        <w:t>NearKart — Master API Testing Guide   |   Backend Sprint 1–16  +  Mobile Sprint 1–17</w:t>
+        <w:t>NearKart — Master API Testing Guide   |   Backend Sprint 1–16  +  Mobile Sprint 1–18</w:t>
       </w:r>
     </w:p>
     <w:p>
@@ -34376,7 +34376,7 @@
     <w:p>
       <w:pPr/>
       <w:r>
-        <w:t>NearKart — Master API Testing Guide   |   Backend Sprint 1–16  +  Mobile Sprint 1–17</w:t>
+        <w:t>NearKart — Master API Testing Guide   |   Backend Sprint 1–16  +  Mobile Sprint 1–18</w:t>
       </w:r>
     </w:p>
     <w:sectPr>

</xml_diff>

<commit_message>
feat(s19): search filters, following feed, vendor invoices, map radius
Option A — Search: min_price, max_price, min_rating, has_offer, ordering params in ProductSearchView + ProductService.search()
Option B — Following: GET /products/following/ returns latest products from followed stores
Option C — Invoices: Invoice model + migration 0005, InvoiceSerializer, StoreInvoiceListCreateView at GET/POST /stores/mine/invoices/
Option D — Map: no backend change (radius already supported by nearby stores endpoint)
Docs: sprint_19 README, TESTING_CHECKLIST, POSTMAN_GUIDE; updated INDEX, PROJECT_OVERVIEW, DOCS_MAP, Master API footer to Sprint 1–19

Co-Authored-By: Claude Sonnet 4.6 <noreply@anthropic.com>
</commit_message>
<xml_diff>
--- a/nearkart_backend/docs/NearKart_Master_API_Testing_Guide.docx
+++ b/nearkart_backend/docs/NearKart_Master_API_Testing_Guide.docx
@@ -33984,7 +33984,7 @@
     <w:p>
       <w:pPr/>
       <w:r>
-        <w:t>NearKart — Master API Testing Guide   |   Backend Sprint 1–16  +  Mobile Sprint 1–18</w:t>
+        <w:t>NearKart — Master API Testing Guide   |   Backend Sprint 1–16  +  Mobile Sprint 1–19</w:t>
       </w:r>
     </w:p>
     <w:p>
@@ -34376,7 +34376,7 @@
     <w:p>
       <w:pPr/>
       <w:r>
-        <w:t>NearKart — Master API Testing Guide   |   Backend Sprint 1–16  +  Mobile Sprint 1–18</w:t>
+        <w:t>NearKart — Master API Testing Guide   |   Backend Sprint 1–16  +  Mobile Sprint 1–19</w:t>
       </w:r>
     </w:p>
     <w:sectPr>

</xml_diff>

<commit_message>
docs: Update Master API Word doc — add Sprint 28 (steps 96–99)
Adds Product Demo Video GET endpoint, video upload with video_type +
product_id, Voice OTP delivery_method, and invalid delivery_method test.
Updates footer to Backend Sprint 1–28 + Mobile Sprint 1–27.

Co-Authored-By: Claude Sonnet 4.6 <noreply@anthropic.com>
</commit_message>
<xml_diff>
--- a/nearkart_backend/docs/NearKart_Master_API_Testing_Guide.docx
+++ b/nearkart_backend/docs/NearKart_Master_API_Testing_Guide.docx
@@ -34369,14 +34369,326 @@
     </w:p>
     <w:p>
       <w:pPr/>
+      <w:r>
+        <w:t>────────────────────────────────────────────────────────────────────────────────</w:t>
+      </w:r>
+    </w:p>
+    <w:p>
+      <w:pPr>
+        <w:pStyle w:val="Heading2"/>
+      </w:pPr>
+      <w:r>
+        <w:t>SPRINT 28 — Product Demo Video · Voice OTP</w:t>
+      </w:r>
     </w:p>
     <w:p>
       <w:pPr/>
+      <w:r>
+        <w:t xml:space="preserve">  Branch: sprint-13-localization-video   |   Date: 2026-06-17</w:t>
+      </w:r>
     </w:p>
     <w:p>
       <w:pPr/>
       <w:r>
-        <w:t>NearKart — Master API Testing Guide   |   Backend Sprint 1–16  +  Mobile Sprint 1–19</w:t>
+        <w:t>────────────────────────────────────────────────────────────────────────────────</w:t>
+      </w:r>
+    </w:p>
+    <w:p>
+      <w:pPr>
+        <w:pStyle w:val="Heading2"/>
+      </w:pPr>
+      <w:r>
+        <w:t>STEP 96 — Get Product Demo Video</w:t>
+      </w:r>
+    </w:p>
+    <w:p>
+      <w:pPr/>
+      <w:r>
+        <w:t xml:space="preserve">  GET    {{base_url}}/products/{{product_id}}/demo-video/   [No Auth]   [Sprint 28]</w:t>
+      </w:r>
+    </w:p>
+    <w:p>
+      <w:pPr/>
+      <w:r>
+        <w:t>Authorization: None (AllowAny)</w:t>
+      </w:r>
+    </w:p>
+    <w:p>
+      <w:pPr/>
+      <w:r>
+        <w:t>Expected Response  200 OK:</w:t>
+      </w:r>
+    </w:p>
+    <w:p>
+      <w:pPr/>
+      <w:r>
+        <w:t>{</w:t>
+        <w:br/>
+        <w:t xml:space="preserve">  "id": "uuid",</w:t>
+        <w:br/>
+        <w:t xml:space="preserve">  "title": "Kurti Demo",</w:t>
+        <w:br/>
+        <w:t xml:space="preserve">  "description": "...",</w:t>
+        <w:br/>
+        <w:t xml:space="preserve">  "video_type": "product_demo",</w:t>
+        <w:br/>
+        <w:t xml:space="preserve">  "product_id": "uuid",</w:t>
+        <w:br/>
+        <w:t xml:space="preserve">  "play_url": "https://s3.amazonaws.com/...",</w:t>
+        <w:br/>
+        <w:t xml:space="preserve">  "thumb_url": "https://s3.amazonaws.com/...",</w:t>
+        <w:br/>
+        <w:t xml:space="preserve">  "status": "ready",</w:t>
+        <w:br/>
+        <w:t xml:space="preserve">  "created_at": "2026-06-17T10:00:00Z"</w:t>
+        <w:br/>
+        <w:t>}</w:t>
+      </w:r>
+    </w:p>
+    <w:p>
+      <w:pPr/>
+      <w:r>
+        <w:t>Error cases:</w:t>
+      </w:r>
+    </w:p>
+    <w:p>
+      <w:pPr/>
+      <w:r>
+        <w:t xml:space="preserve">  🚫  404 — no demo video exists for this product</w:t>
+        <w:br/>
+        <w:t xml:space="preserve">  💡  Returns only the latest ready + visible demo video</w:t>
+      </w:r>
+    </w:p>
+    <w:p>
+      <w:pPr/>
+      <w:r>
+        <w:t>────────────────────────────────────────────────────────────────────────────────</w:t>
+      </w:r>
+    </w:p>
+    <w:p>
+      <w:pPr>
+        <w:pStyle w:val="Heading2"/>
+      </w:pPr>
+      <w:r>
+        <w:t>STEP 97 — Upload Demo Video (video_type + product_id)</w:t>
+      </w:r>
+    </w:p>
+    <w:p>
+      <w:pPr/>
+      <w:r>
+        <w:t xml:space="preserve">  POST    {{base_url}}/videos/upload/request/   [Vendor JWT]   [Sprint 28]</w:t>
+      </w:r>
+    </w:p>
+    <w:p>
+      <w:pPr/>
+      <w:r>
+        <w:t>Authorization: Bearer {{vendor_token}}</w:t>
+        <w:br/>
+        <w:t>Content-Type: application/json</w:t>
+      </w:r>
+    </w:p>
+    <w:p>
+      <w:pPr/>
+      <w:r>
+        <w:t>Request Body:</w:t>
+      </w:r>
+    </w:p>
+    <w:p>
+      <w:pPr/>
+      <w:r>
+        <w:t>{</w:t>
+        <w:br/>
+        <w:t xml:space="preserve">  "filename": "kurti_demo.mp4",</w:t>
+        <w:br/>
+        <w:t xml:space="preserve">  "content_type": "video/mp4",</w:t>
+        <w:br/>
+        <w:t xml:space="preserve">  "video_type": "product_demo",</w:t>
+        <w:br/>
+        <w:t xml:space="preserve">  "product_id": "{{product_id}}"</w:t>
+        <w:br/>
+        <w:t>}</w:t>
+      </w:r>
+    </w:p>
+    <w:p>
+      <w:pPr/>
+      <w:r>
+        <w:t>Expected Response  200 OK: Returns S3 presigned upload URL.</w:t>
+      </w:r>
+    </w:p>
+    <w:p>
+      <w:pPr/>
+      <w:r>
+        <w:t>Error cases:</w:t>
+      </w:r>
+    </w:p>
+    <w:p>
+      <w:pPr/>
+      <w:r>
+        <w:t xml:space="preserve">  🚫  400 — product_id missing when video_type is "product_demo"</w:t>
+        <w:br/>
+        <w:t xml:space="preserve">  🚫  403 — product does not belong to vendor's store</w:t>
+        <w:br/>
+        <w:t xml:space="preserve">  💡  video_type defaults to "store_promo" if omitted</w:t>
+        <w:br/>
+        <w:t xml:space="preserve">  💡  product_id is null / ignored when video_type is "store_promo"</w:t>
+      </w:r>
+    </w:p>
+    <w:p>
+      <w:pPr/>
+      <w:r>
+        <w:t>────────────────────────────────────────────────────────────────────────────────</w:t>
+      </w:r>
+    </w:p>
+    <w:p>
+      <w:pPr>
+        <w:pStyle w:val="Heading2"/>
+      </w:pPr>
+      <w:r>
+        <w:t>STEP 98 — Voice OTP (delivery_method: voice)</w:t>
+      </w:r>
+    </w:p>
+    <w:p>
+      <w:pPr/>
+      <w:r>
+        <w:t xml:space="preserve">  POST    {{base_url}}/auth/otp/send/   [No Auth]   [Sprint 28]</w:t>
+      </w:r>
+    </w:p>
+    <w:p>
+      <w:pPr/>
+      <w:r>
+        <w:t>Authorization: None</w:t>
+        <w:br/>
+        <w:t>Content-Type: application/json</w:t>
+      </w:r>
+    </w:p>
+    <w:p>
+      <w:pPr/>
+      <w:r>
+        <w:t>Request Body:</w:t>
+      </w:r>
+    </w:p>
+    <w:p>
+      <w:pPr/>
+      <w:r>
+        <w:t>{</w:t>
+        <w:br/>
+        <w:t xml:space="preserve">  "phone_number": "+919999999999",</w:t>
+        <w:br/>
+        <w:t xml:space="preserve">  "delivery_method": "voice"</w:t>
+        <w:br/>
+        <w:t>}</w:t>
+      </w:r>
+    </w:p>
+    <w:p>
+      <w:pPr/>
+      <w:r>
+        <w:t>Expected Response  200 OK:</w:t>
+      </w:r>
+    </w:p>
+    <w:p>
+      <w:pPr/>
+      <w:r>
+        <w:t>{</w:t>
+        <w:br/>
+        <w:t xml:space="preserve">  "message": "OTP sent successfully"</w:t>
+        <w:br/>
+        <w:t>}</w:t>
+      </w:r>
+    </w:p>
+    <w:p>
+      <w:pPr/>
+      <w:r>
+        <w:t>Error cases:</w:t>
+      </w:r>
+    </w:p>
+    <w:p>
+      <w:pPr/>
+      <w:r>
+        <w:t xml:space="preserve">  🚫  400 — invalid delivery_method (e.g. "telegram")</w:t>
+        <w:br/>
+        <w:t xml:space="preserve">  💡  In dev mode: voice call is skipped; OTP = 123456</w:t>
+        <w:br/>
+        <w:t xml:space="preserve">  💡  delivery_method defaults to "sms" if omitted</w:t>
+      </w:r>
+    </w:p>
+    <w:p>
+      <w:pPr/>
+      <w:r>
+        <w:t>────────────────────────────────────────────────────────────────────────────────</w:t>
+      </w:r>
+    </w:p>
+    <w:p>
+      <w:pPr>
+        <w:pStyle w:val="Heading2"/>
+      </w:pPr>
+      <w:r>
+        <w:t>STEP 99 — Voice OTP Invalid delivery_method</w:t>
+      </w:r>
+    </w:p>
+    <w:p>
+      <w:pPr/>
+      <w:r>
+        <w:t xml:space="preserve">  POST    {{base_url}}/auth/otp/send/   [No Auth]   [Sprint 28]</w:t>
+      </w:r>
+    </w:p>
+    <w:p>
+      <w:pPr/>
+      <w:r>
+        <w:t>Authorization: None</w:t>
+        <w:br/>
+        <w:t>Content-Type: application/json</w:t>
+      </w:r>
+    </w:p>
+    <w:p>
+      <w:pPr/>
+      <w:r>
+        <w:t>Request Body:</w:t>
+      </w:r>
+    </w:p>
+    <w:p>
+      <w:pPr/>
+      <w:r>
+        <w:t>{</w:t>
+        <w:br/>
+        <w:t xml:space="preserve">  "phone_number": "+919999999999",</w:t>
+        <w:br/>
+        <w:t xml:space="preserve">  "delivery_method": "telegram"</w:t>
+        <w:br/>
+        <w:t>}</w:t>
+      </w:r>
+    </w:p>
+    <w:p>
+      <w:pPr/>
+      <w:r>
+        <w:t>Expected Response  400 Bad Request:</w:t>
+      </w:r>
+    </w:p>
+    <w:p>
+      <w:pPr/>
+      <w:r>
+        <w:t>{</w:t>
+        <w:br/>
+        <w:t xml:space="preserve">  "delivery_method": ["\"telegram\" is not a valid choice."]</w:t>
+        <w:br/>
+        <w:t>}</w:t>
+      </w:r>
+    </w:p>
+    <w:p>
+      <w:pPr/>
+      <w:r>
+        <w:t>────────────────────────────────────────────────────────────────────────────────</w:t>
+      </w:r>
+    </w:p>
+    <w:p>
+      <w:pPr/>
+    </w:p>
+    <w:p>
+      <w:pPr/>
+    </w:p>
+    <w:p>
+      <w:pPr/>
+      <w:r>
+        <w:t>NearKart — Master API Testing Guide   |   Backend Sprint 1–28  +  Mobile Sprint 1–27</w:t>
       </w:r>
     </w:p>
     <w:sectPr>

</xml_diff>